<commit_message>
feat(tests): add comprehensive unit tests for pipelines, DQ integrity, and compatibility
- Add extensive tests for `pubmed.AuthorExtractor` covering authors, affiliations, and emails
- Extend tests for `_checks_integrity` module, addressing SCD and referential integrity scenarios
- Introduce tests for `delta_writer` compatibility with legacy imports
- Add tests for `FastaParser` including edge cases and header parsing

Signed-off-by: SatoryKono <821311@gmail.com>
</commit_message>
<xml_diff>
--- a/docs/02-architecture/mmd-diagrams/architecture-diagrams-with-descriptions.docx
+++ b/docs/02-architecture/mmd-diagrams/architecture-diagrams-with-descriptions.docx
@@ -63,13 +63,7 @@
         <w:rPr>
           <w:lang w:val="ru-RU"/>
         </w:rPr>
-        <w:t>Материал помогает понять границы ответственности модулей, точки интеграции и зависимости между компонент</w:t>
-      </w:r>
-      <w:r>
-        <w:rPr>
-          <w:lang w:val="ru-RU"/>
-        </w:rPr>
-        <w:t>ами в рамках сценария 01-</w:t>
+        <w:t>Материал помогает понять границы ответственности модулей, точки интеграции и зависимости между компонентами в рамках сценария 01-</w:t>
       </w:r>
       <w:r>
         <w:t>high</w:t>
@@ -113,13 +107,7 @@
         <w:rPr>
           <w:lang w:val="ru-RU"/>
         </w:rPr>
-        <w:t>Это описание задает ожидаемую интерпретацию схемы при техническом ревью и синхронизации документ</w:t>
-      </w:r>
-      <w:r>
-        <w:rPr>
-          <w:lang w:val="ru-RU"/>
-        </w:rPr>
-        <w:t xml:space="preserve">ации с кодовой базой. </w:t>
+        <w:t xml:space="preserve">Это описание задает ожидаемую интерпретацию схемы при техническом ревью и синхронизации документации с кодовой базой. </w:t>
       </w:r>
       <w:r>
         <w:t xml:space="preserve">Ключевые контейнеры/подграфы включают: External Systems, External APIs, interfaces layer, composition layer, application layer. </w:t>
@@ -128,13 +116,7 @@
         <w:rPr>
           <w:lang w:val="ru-RU"/>
         </w:rPr>
-        <w:t>Именно через эти блоки визуализированы границы слоев и маршруты передачи управления или данных. Примеры уз</w:t>
-      </w:r>
-      <w:r>
-        <w:rPr>
-          <w:lang w:val="ru-RU"/>
-        </w:rPr>
-        <w:t xml:space="preserve">лов, отражающих доменную модель и инфраструктуру: </w:t>
+        <w:t xml:space="preserve">Именно через эти блоки визуализированы границы слоев и маршруты передачи управления или данных. Примеры узлов, отражающих доменную модель и инфраструктуру: </w:t>
       </w:r>
       <w:r>
         <w:t>External</w:t>
@@ -206,13 +188,7 @@
         <w:rPr>
           <w:lang w:val="ru-RU"/>
         </w:rPr>
-        <w:t xml:space="preserve">. По этим сущностям можно проверить согласованность терминов, портов и адаптеров между диаграммой и реализацией. В метаданных указана оценка </w:t>
-      </w:r>
-      <w:r>
-        <w:rPr>
-          <w:lang w:val="ru-RU"/>
-        </w:rPr>
-        <w:t>плотности (@</w:t>
+        <w:t>. По этим сущностям можно проверить согласованность терминов, портов и адаптеров между диаграммой и реализацией. В метаданных указана оценка плотности (@</w:t>
       </w:r>
       <w:r>
         <w:t>nodes</w:t>
@@ -244,10 +220,7 @@
     </w:p>
     <w:p>
       <w:r>
-        <w:t>Source: docs/02-architecture/mmd-diagrams/architecture/01-high-level-hexagonal.mmd | Description: docs/02-architecture/diagram-desc</w:t>
-      </w:r>
-      <w:r>
-        <w:t>riptions/mmd-diagrams/architecture/01-high-level-hexagonal.md</w:t>
+        <w:t>Source: docs/02-architecture/mmd-diagrams/architecture/01-high-level-hexagonal.mmd | Description: docs/02-architecture/diagram-descriptions/mmd-diagrams/architecture/01-high-level-hexagonal.md</w:t>
       </w:r>
     </w:p>
     <w:p>
@@ -315,10 +288,7 @@
         </w:rPr>
       </w:pPr>
       <w:r>
-        <w:t>Описание: Диаграмма Hexagonal Overview показывает архитектурный срез BioETL</w:t>
-      </w:r>
-      <w:r>
-        <w:t xml:space="preserve"> на уровне System / Component и использует нотацию flowchart. </w:t>
+        <w:t xml:space="preserve">Описание: Диаграмма Hexagonal Overview показывает архитектурный срез BioETL на уровне System / Component и использует нотацию flowchart. </w:t>
       </w:r>
       <w:r>
         <w:rPr>
@@ -354,10 +324,7 @@
         <w:t xml:space="preserve">. </w:t>
       </w:r>
       <w:r>
-        <w:t>В исходном файле прямо зафиксирован контекст</w:t>
-      </w:r>
-      <w:r>
-        <w:t xml:space="preserve">: Covers 5 architectural layers, external systems, and main dependency </w:t>
+        <w:t xml:space="preserve">В исходном файле прямо зафиксирован контекст: Covers 5 architectural layers, external systems, and main dependency </w:t>
       </w:r>
       <w:proofErr w:type="gramStart"/>
       <w:r>
@@ -374,10 +341,7 @@
         <w:t xml:space="preserve">Это описание задает ожидаемую интерпретацию схемы при техническом ревью и синхронизации документации с кодовой базой. </w:t>
       </w:r>
       <w:r>
-        <w:t>Ключевые контейнеры/подграфы включают: Interfaces Laye</w:t>
-      </w:r>
-      <w:r>
-        <w:t xml:space="preserve">r, Composition Layer, Application Layer, Domain Layer, Infrastructure Layer. </w:t>
+        <w:t xml:space="preserve">Ключевые контейнеры/подграфы включают: Interfaces Layer, Composition Layer, Application Layer, Domain Layer, Infrastructure Layer. </w:t>
       </w:r>
       <w:r>
         <w:rPr>
@@ -386,10 +350,7 @@
         <w:t xml:space="preserve">Именно через эти блоки визуализированы границы слоев и маршруты передачи управления или данных. </w:t>
       </w:r>
       <w:r>
-        <w:t>Примеры узлов, отражающих доменную модель и инфраструктуру: Interfaces Layer, CLI C</w:t>
-      </w:r>
-      <w:r>
-        <w:t xml:space="preserve">ommands (Click), Orchestration, Composition Layer, Bootstrap / Assembly, Application Layer. </w:t>
+        <w:t xml:space="preserve">Примеры узлов, отражающих доменную модель и инфраструктуру: Interfaces Layer, CLI Commands (Click), Orchestration, Composition Layer, Bootstrap / Assembly, Application Layer. </w:t>
       </w:r>
       <w:r>
         <w:rPr>
@@ -404,13 +365,7 @@
         <w:rPr>
           <w:lang w:val="ru-RU"/>
         </w:rPr>
-        <w:t>=11), чт</w:t>
-      </w:r>
-      <w:r>
-        <w:rPr>
-          <w:lang w:val="ru-RU"/>
-        </w:rPr>
-        <w:t xml:space="preserve">о полезно для контроля читаемости, декомпозиции </w:t>
+        <w:t xml:space="preserve">=11), что полезно для контроля читаемости, декомпозиции </w:t>
       </w:r>
       <w:r>
         <w:t>view</w:t>
@@ -433,10 +388,7 @@
     </w:p>
     <w:p>
       <w:r>
-        <w:t>Source: docs/02-architecture/mmd-diagrams/architecture/01a-hexagonal-overview.mmd | Description: docs/02-architecture/diagram-descriptions/mmd-diagrams/arch</w:t>
-      </w:r>
-      <w:r>
-        <w:t>itecture/01a-hexagonal-overview.md</w:t>
+        <w:t>Source: docs/02-architecture/mmd-diagrams/architecture/01a-hexagonal-overview.mmd | Description: docs/02-architecture/diagram-descriptions/mmd-diagrams/architecture/01a-hexagonal-overview.md</w:t>
       </w:r>
     </w:p>
     <w:p>
@@ -504,10 +456,7 @@
         </w:rPr>
       </w:pPr>
       <w:r>
-        <w:t>Описание: Диаграмма Hexagonal Domain and Application показывает архитектурный срез Bio</w:t>
-      </w:r>
-      <w:r>
-        <w:t xml:space="preserve">ETL на уровне System / Component и использует нотацию flowchart. </w:t>
+        <w:t xml:space="preserve">Описание: Диаграмма Hexagonal Domain and Application показывает архитектурный срез BioETL на уровне System / Component и использует нотацию flowchart. </w:t>
       </w:r>
       <w:r>
         <w:rPr>
@@ -552,10 +501,7 @@
         <w:t xml:space="preserve">. </w:t>
       </w:r>
       <w:r>
-        <w:t>В исходном файле прямо зафиксирован кон</w:t>
-      </w:r>
-      <w:r>
-        <w:t xml:space="preserve">текст: Covers domain contracts and core application services that depend on </w:t>
+        <w:t xml:space="preserve">В исходном файле прямо зафиксирован контекст: Covers domain contracts and core application services that depend on </w:t>
       </w:r>
       <w:proofErr w:type="gramStart"/>
       <w:r>
@@ -581,10 +527,7 @@
         <w:t xml:space="preserve"> </w:t>
       </w:r>
       <w:r>
-        <w:t>Laye</w:t>
-      </w:r>
-      <w:r>
-        <w:t>r</w:t>
+        <w:t>Layer</w:t>
       </w:r>
       <w:r>
         <w:rPr>
@@ -611,22 +554,13 @@
         <w:t xml:space="preserve">. Именно через эти блоки визуализированы границы слоев и маршруты передачи управления или данных. </w:t>
       </w:r>
       <w:r>
-        <w:t>Примеры узлов, отражающих доменную модель и инфраструктуру: Application Layer, Core (Runner, BatchExecutor, Transformer, Writer), Services (DQ,</w:t>
-      </w:r>
-      <w:r>
-        <w:t xml:space="preserve"> Export, Health, Medallion Lifecycle), Composite Pipeline (Coordinator, Merger, FSM), Pipeline Transformers (per provider), PipelineObserver. </w:t>
-      </w:r>
-      <w:r>
-        <w:rPr>
-          <w:lang w:val="ru-RU"/>
-        </w:rPr>
-        <w:t>По этим сущностям можно проверить согласованность терминов, портов и адаптеров между диаграммой и реализацией. В м</w:t>
-      </w:r>
-      <w:r>
-        <w:rPr>
-          <w:lang w:val="ru-RU"/>
-        </w:rPr>
-        <w:t>етаданных указана оценка плотности (@</w:t>
+        <w:t xml:space="preserve">Примеры узлов, отражающих доменную модель и инфраструктуру: Application Layer, Core (Runner, BatchExecutor, Transformer, Writer), Services (DQ, Export, Health, Medallion Lifecycle), Composite Pipeline (Coordinator, Merger, FSM), Pipeline Transformers (per provider), PipelineObserver. </w:t>
+      </w:r>
+      <w:r>
+        <w:rPr>
+          <w:lang w:val="ru-RU"/>
+        </w:rPr>
+        <w:t>По этим сущностям можно проверить согласованность терминов, портов и адаптеров между диаграммой и реализацией. В метаданных указана оценка плотности (@</w:t>
       </w:r>
       <w:r>
         <w:t>nodes</w:t>
@@ -658,10 +592,7 @@
     </w:p>
     <w:p>
       <w:r>
-        <w:t>Source: docs/02-architecture/mmd-diagrams/architecture/01b-hexagonal-domain-app.mmd | Description: docs/02</w:t>
-      </w:r>
-      <w:r>
-        <w:t>-architecture/diagram-descriptions/mmd-diagrams/architecture/01b-hexagonal-domain-app.md</w:t>
+        <w:t>Source: docs/02-architecture/mmd-diagrams/architecture/01b-hexagonal-domain-app.mmd | Description: docs/02-architecture/diagram-descriptions/mmd-diagrams/architecture/01b-hexagonal-domain-app.md</w:t>
       </w:r>
     </w:p>
     <w:p>
@@ -729,22 +660,13 @@
         </w:rPr>
       </w:pPr>
       <w:r>
-        <w:t>Описание: Диаграмма Hexa</w:t>
-      </w:r>
-      <w:r>
-        <w:t xml:space="preserve">gonal Infrastructure and Composition показывает архитектурный срез BioETL на уровне System / Component и использует нотацию flowchart. </w:t>
-      </w:r>
-      <w:r>
-        <w:rPr>
-          <w:lang w:val="ru-RU"/>
-        </w:rPr>
-        <w:t>Материал помогает понять границы ответственности модулей, точки интеграции и зависимости между компонентами в рамках сцен</w:t>
-      </w:r>
-      <w:r>
-        <w:rPr>
-          <w:lang w:val="ru-RU"/>
-        </w:rPr>
-        <w:t>ария 01</w:t>
+        <w:t xml:space="preserve">Описание: Диаграмма Hexagonal Infrastructure and Composition показывает архитектурный срез BioETL на уровне System / Component и использует нотацию flowchart. </w:t>
+      </w:r>
+      <w:r>
+        <w:rPr>
+          <w:lang w:val="ru-RU"/>
+        </w:rPr>
+        <w:t>Материал помогает понять границы ответственности модулей, точки интеграции и зависимости между компонентами в рамках сценария 01</w:t>
       </w:r>
       <w:r>
         <w:t>c</w:t>
@@ -797,13 +719,7 @@
         <w:rPr>
           <w:lang w:val="ru-RU"/>
         </w:rPr>
-        <w:t xml:space="preserve">Это описание задает ожидаемую интерпретацию схемы при техническом ревью и синхронизации документации с кодовой </w:t>
-      </w:r>
-      <w:r>
-        <w:rPr>
-          <w:lang w:val="ru-RU"/>
-        </w:rPr>
-        <w:t xml:space="preserve">базой. </w:t>
+        <w:t xml:space="preserve">Это описание задает ожидаемую интерпретацию схемы при техническом ревью и синхронизации документации с кодовой базой. </w:t>
       </w:r>
       <w:r>
         <w:t xml:space="preserve">Ключевые контейнеры/подграфы включают: Composition Layer, Infrastructure Layer, Domain Layer. </w:t>
@@ -815,22 +731,13 @@
         <w:t xml:space="preserve">Именно через эти блоки визуализированы границы слоев и маршруты передачи управления или данных. </w:t>
       </w:r>
       <w:r>
-        <w:t>Примеры узлов, отражающих доменную модель и инфраструктуру:</w:t>
-      </w:r>
-      <w:r>
-        <w:t xml:space="preserve"> Composition Layer, Bootstrap / Assembly, Factories, Provider Registry, Runtime Builders, Infrastructure Layer. </w:t>
-      </w:r>
-      <w:r>
-        <w:rPr>
-          <w:lang w:val="ru-RU"/>
-        </w:rPr>
-        <w:t>По этим сущностям можно проверить согласованность терминов, портов и адаптеров между диаграммой и реализацией. В метаданных указана оценка плотн</w:t>
-      </w:r>
-      <w:r>
-        <w:rPr>
-          <w:lang w:val="ru-RU"/>
-        </w:rPr>
-        <w:t>ости (@</w:t>
+        <w:t xml:space="preserve">Примеры узлов, отражающих доменную модель и инфраструктуру: Composition Layer, Bootstrap / Assembly, Factories, Provider Registry, Runtime Builders, Infrastructure Layer. </w:t>
+      </w:r>
+      <w:r>
+        <w:rPr>
+          <w:lang w:val="ru-RU"/>
+        </w:rPr>
+        <w:t>По этим сущностям можно проверить согласованность терминов, портов и адаптеров между диаграммой и реализацией. В метаданных указана оценка плотности (@</w:t>
       </w:r>
       <w:r>
         <w:t>nodes</w:t>
@@ -862,10 +769,7 @@
     </w:p>
     <w:p>
       <w:r>
-        <w:t>Source: docs/02-architecture/mmd-diagrams/architecture/01c-hexagonal-infra-comp.mmd | Description: docs/02-architecture/diagram-descript</w:t>
-      </w:r>
-      <w:r>
-        <w:t>ions/mmd-diagrams/architecture/01c-hexagonal-infra-comp.md</w:t>
+        <w:t>Source: docs/02-architecture/mmd-diagrams/architecture/01c-hexagonal-infra-comp.mmd | Description: docs/02-architecture/diagram-descriptions/mmd-diagrams/architecture/01c-hexagonal-infra-comp.md</w:t>
       </w:r>
     </w:p>
     <w:p>
@@ -941,13 +845,7 @@
         <w:rPr>
           <w:lang w:val="ru-RU"/>
         </w:rPr>
-        <w:t>Материал помогает понять границы ответственности модулей, точки интеграции и зависимости между компонен</w:t>
-      </w:r>
-      <w:r>
-        <w:rPr>
-          <w:lang w:val="ru-RU"/>
-        </w:rPr>
-        <w:t>тами в рамках сценария 01</w:t>
+        <w:t>Материал помогает понять границы ответственности модулей, точки интеграции и зависимости между компонентами в рамках сценария 01</w:t>
       </w:r>
       <w:r>
         <w:t>d</w:t>
@@ -1000,13 +898,7 @@
         <w:rPr>
           <w:lang w:val="ru-RU"/>
         </w:rPr>
-        <w:t>Это описание задает ожидаемую интерпретацию схемы при техническом ревью и</w:t>
-      </w:r>
-      <w:r>
-        <w:rPr>
-          <w:lang w:val="ru-RU"/>
-        </w:rPr>
-        <w:t xml:space="preserve"> синхронизации документации с кодовой базой. </w:t>
+        <w:t xml:space="preserve">Это описание задает ожидаемую интерпретацию схемы при техническом ревью и синхронизации документации с кодовой базой. </w:t>
       </w:r>
       <w:r>
         <w:t xml:space="preserve">Ключевые контейнеры/подграфы включают: Interfaces Layer, Composition Layer, Application Layer, Domain Layer, Infrastructure Layer. </w:t>
@@ -1015,13 +907,7 @@
         <w:rPr>
           <w:lang w:val="ru-RU"/>
         </w:rPr>
-        <w:t>Именно через эти блоки визуализированы границы слоев и маршруты передачи управле</w:t>
-      </w:r>
-      <w:r>
-        <w:rPr>
-          <w:lang w:val="ru-RU"/>
-        </w:rPr>
-        <w:t xml:space="preserve">ния или данных. </w:t>
+        <w:t xml:space="preserve">Именно через эти блоки визуализированы границы слоев и маршруты передачи управления или данных. </w:t>
       </w:r>
       <w:r>
         <w:t xml:space="preserve">Примеры узлов, отражающих доменную модель и инфраструктуру: Interfaces Layer, CLI Commands (Click), Orchestration, Composition Layer, Bootstrap / Assembly, Application Layer. </w:t>
@@ -1030,13 +916,7 @@
         <w:rPr>
           <w:lang w:val="ru-RU"/>
         </w:rPr>
-        <w:t>По этим сущностям можно проверить согласованность терминов, порто</w:t>
-      </w:r>
-      <w:r>
-        <w:rPr>
-          <w:lang w:val="ru-RU"/>
-        </w:rPr>
-        <w:t>в и адаптеров между диаграммой и реализацией. В метаданных указана оценка плотности (@</w:t>
+        <w:t>По этим сущностям можно проверить согласованность терминов, портов и адаптеров между диаграммой и реализацией. В метаданных указана оценка плотности (@</w:t>
       </w:r>
       <w:r>
         <w:t>nodes</w:t>
@@ -1068,10 +948,7 @@
     </w:p>
     <w:p>
       <w:r>
-        <w:t>Source: docs/02-architecture/mmd-diagrams/architecture/01</w:t>
-      </w:r>
-      <w:r>
-        <w:t>d-hexagonal-overview-rounded.mmd | Description: docs/02-architecture/diagram-descriptions/mmd-diagrams/architecture/01d-hexagonal-overview-rounded.md</w:t>
+        <w:t>Source: docs/02-architecture/mmd-diagrams/architecture/01d-hexagonal-overview-rounded.mmd | Description: docs/02-architecture/diagram-descriptions/mmd-diagrams/architecture/01d-hexagonal-overview-rounded.md</w:t>
       </w:r>
     </w:p>
     <w:p>
@@ -1081,7 +958,7 @@
         </w:rPr>
         <w:drawing>
           <wp:inline distT="0" distB="0" distL="0" distR="0">
-            <wp:extent cx="9282223" cy="6581554"/>
+            <wp:extent cx="9281880" cy="5118840"/>
             <wp:effectExtent l="0" t="0" r="0" b="0"/>
             <wp:docPr id="1005" name="image5.png"/>
             <wp:cNvGraphicFramePr/>
@@ -1101,7 +978,7 @@
                   <pic:spPr>
                     <a:xfrm>
                       <a:off x="0" y="0"/>
-                      <a:ext cx="9309106" cy="6600615"/>
+                      <a:ext cx="9281880" cy="5118840"/>
                     </a:xfrm>
                     <a:prstGeom prst="rect">
                       <a:avLst/>
@@ -1135,10 +1012,7 @@
     </w:p>
     <w:p>
       <w:r>
-        <w:t>ID: 02-layer-dependency-matrix | Type: flowchart | Level: Syste</w:t>
-      </w:r>
-      <w:r>
-        <w:t>m / Component | Date: 2026-02-24</w:t>
+        <w:t>ID: 02-layer-dependency-matrix | Type: flowchart | Level: System / Component | Date: 2026-02-24</w:t>
       </w:r>
     </w:p>
     <w:p>
@@ -1154,13 +1028,7 @@
         <w:rPr>
           <w:lang w:val="ru-RU"/>
         </w:rPr>
-        <w:t>Материал помогает понять границы ответственности модулей, точки интегр</w:t>
-      </w:r>
-      <w:r>
-        <w:rPr>
-          <w:lang w:val="ru-RU"/>
-        </w:rPr>
-        <w:t>ации и зависимости между компонентами в рамках сценария 02-</w:t>
+        <w:t>Материал помогает понять границы ответственности модулей, точки интеграции и зависимости между компонентами в рамках сценария 02-</w:t>
       </w:r>
       <w:r>
         <w:t>layer</w:t>
@@ -1204,13 +1072,7 @@
         <w:rPr>
           <w:lang w:val="ru-RU"/>
         </w:rPr>
-        <w:t>Это описание задает ожидаемую интерпретацию схемы при техническом ре</w:t>
-      </w:r>
-      <w:r>
-        <w:rPr>
-          <w:lang w:val="ru-RU"/>
-        </w:rPr>
-        <w:t xml:space="preserve">вью и синхронизации документации с кодовой базой. Ключевые контейнеры/подграфы включают: </w:t>
+        <w:t xml:space="preserve">Это описание задает ожидаемую интерпретацию схемы при техническом ревью и синхронизации документации с кодовой базой. Ключевые контейнеры/подграфы включают: </w:t>
       </w:r>
       <w:r>
         <w:t>Architectural</w:t>
@@ -1231,14 +1093,16 @@
         <w:t xml:space="preserve">. Именно через эти блоки визуализированы границы слоев и маршруты передачи управления или данных. </w:t>
       </w:r>
       <w:r>
-        <w:t>Примеры узлов, отражающих доменную модель и инфра</w:t>
-      </w:r>
-      <w:r>
-        <w:t xml:space="preserve">структуру: ✅ </w:t>
+        <w:t xml:space="preserve">Примеры узлов, отражающих доменную модель и инфраструктуру: ✅ </w:t>
       </w:r>
       <w:proofErr w:type="gramStart"/>
       <w:r>
-        <w:t>Allowed, ❌ Forbidden</w:t>
+        <w:t xml:space="preserve">Allowed, </w:t>
+      </w:r>
+      <w:bookmarkStart w:id="0" w:name="_GoBack"/>
+      <w:bookmarkEnd w:id="0"/>
+      <w:r>
+        <w:t>❌ Forbidden</w:t>
       </w:r>
       <w:proofErr w:type="gramEnd"/>
       <w:r>
@@ -1248,13 +1112,7 @@
         <w:rPr>
           <w:lang w:val="ru-RU"/>
         </w:rPr>
-        <w:t>По этим сущностям можно проверить согласо</w:t>
-      </w:r>
-      <w:r>
-        <w:rPr>
-          <w:lang w:val="ru-RU"/>
-        </w:rPr>
-        <w:t>ванность терминов, портов и адаптеров между диаграммой и реализацией. В метаданных указана оценка плотности (@</w:t>
+        <w:t>По этим сущностям можно проверить согласованность терминов, портов и адаптеров между диаграммой и реализацией. В метаданных указана оценка плотности (@</w:t>
       </w:r>
       <w:r>
         <w:t>nodes</w:t>
@@ -1286,10 +1144,7 @@
     </w:p>
     <w:p>
       <w:r>
-        <w:t>Source: docs/02-architecture/mmd-d</w:t>
-      </w:r>
-      <w:r>
-        <w:t>iagrams/architecture/02-layer-dependency-matrix.mmd | Description: docs/02-architecture/diagram-descriptions/mmd-diagrams/architecture/02-layer-dependency-matrix.md</w:t>
+        <w:t>Source: docs/02-architecture/mmd-diagrams/architecture/02-layer-dependency-matrix.mmd | Description: docs/02-architecture/diagram-descriptions/mmd-diagrams/architecture/02-layer-dependency-matrix.md</w:t>
       </w:r>
     </w:p>
     <w:p>
@@ -1365,10 +1220,7 @@
     </w:p>
     <w:p>
       <w:r>
-        <w:t>ID: 03-medallion-data-flo</w:t>
-      </w:r>
-      <w:r>
-        <w:t>w | Type: flowchart | Level: System / Component | Date: 2026-02-24</w:t>
+        <w:t>ID: 03-medallion-data-flow | Type: flowchart | Level: System / Component | Date: 2026-02-24</w:t>
       </w:r>
     </w:p>
     <w:p>
@@ -1384,13 +1236,7 @@
         <w:rPr>
           <w:lang w:val="ru-RU"/>
         </w:rPr>
-        <w:t>Материал помо</w:t>
-      </w:r>
-      <w:r>
-        <w:rPr>
-          <w:lang w:val="ru-RU"/>
-        </w:rPr>
-        <w:t>гает понять границы ответственности модулей, точки интеграции и зависимости между компонентами в рамках сценария 03-</w:t>
+        <w:t>Материал помогает понять границы ответственности модулей, точки интеграции и зависимости между компонентами в рамках сценария 03-</w:t>
       </w:r>
       <w:r>
         <w:t>medallion</w:t>
@@ -1434,13 +1280,7 @@
         <w:rPr>
           <w:lang w:val="ru-RU"/>
         </w:rPr>
-        <w:t>Это описание за</w:t>
-      </w:r>
-      <w:r>
-        <w:rPr>
-          <w:lang w:val="ru-RU"/>
-        </w:rPr>
-        <w:t xml:space="preserve">дает ожидаемую интерпретацию схемы при техническом ревью и синхронизации документации с кодовой базой. </w:t>
+        <w:t xml:space="preserve">Это описание задает ожидаемую интерпретацию схемы при техническом ревью и синхронизации документации с кодовой базой. </w:t>
       </w:r>
       <w:r>
         <w:t xml:space="preserve">Ключевые контейнеры/подграфы включают: External Data Sources, Data Ingestion, Bronze Layer (Raw), Transformation, Silver Layer (Normalized). </w:t>
@@ -1449,13 +1289,7 @@
         <w:rPr>
           <w:lang w:val="ru-RU"/>
         </w:rPr>
-        <w:t>Именно через</w:t>
-      </w:r>
-      <w:r>
-        <w:rPr>
-          <w:lang w:val="ru-RU"/>
-        </w:rPr>
-        <w:t xml:space="preserve"> эти блоки визуализированы границы слоев и маршруты передачи управления или данных. </w:t>
+        <w:t xml:space="preserve">Именно через эти блоки визуализированы границы слоев и маршруты передачи управления или данных. </w:t>
       </w:r>
       <w:r>
         <w:t xml:space="preserve">Примеры узлов, отражающих доменную модель и инфраструктуру: External Data Sources, Semantic Scholar API, Data Ingestion, DataSourcePort </w:t>
@@ -1466,10 +1300,7 @@
       </w:r>
       <w:proofErr w:type="gramEnd"/>
       <w:r>
-        <w:t>) / fetch_filtered(), RateLimi</w:t>
-      </w:r>
-      <w:r>
-        <w:t xml:space="preserve">ter (TokenBucket), CircuitBreaker. </w:t>
+        <w:t xml:space="preserve">) / fetch_filtered(), RateLimiter (TokenBucket), CircuitBreaker. </w:t>
       </w:r>
       <w:r>
         <w:rPr>
@@ -1493,13 +1324,7 @@
         <w:rPr>
           <w:lang w:val="ru-RU"/>
         </w:rPr>
-        <w:t>-слое</w:t>
-      </w:r>
-      <w:r>
-        <w:rPr>
-          <w:lang w:val="ru-RU"/>
-        </w:rPr>
-        <w:t xml:space="preserve">в и стабильного рендеринга в </w:t>
+        <w:t xml:space="preserve">-слоев и стабильного рендеринга в </w:t>
       </w:r>
       <w:r>
         <w:t>CI</w:t>
@@ -1566,10 +1391,7 @@
         <w:pStyle w:val="Heading1"/>
       </w:pPr>
       <w:r>
-        <w:t>08. Medallion Laye</w:t>
-      </w:r>
-      <w:r>
-        <w:t>rs Overview</w:t>
+        <w:t>08. Medallion Layers Overview</w:t>
       </w:r>
     </w:p>
     <w:p>
@@ -1590,13 +1412,7 @@
         <w:rPr>
           <w:lang w:val="ru-RU"/>
         </w:rPr>
-        <w:t>Материал помогает понять границы ответственности модулей, точки интеграции и зависимости между компонентами в ра</w:t>
-      </w:r>
-      <w:r>
-        <w:rPr>
-          <w:lang w:val="ru-RU"/>
-        </w:rPr>
-        <w:t>мках сценария 03</w:t>
+        <w:t>Материал помогает понять границы ответственности модулей, точки интеграции и зависимости между компонентами в рамках сценария 03</w:t>
       </w:r>
       <w:r>
         <w:t>a</w:t>
@@ -1641,13 +1457,7 @@
         <w:rPr>
           <w:lang w:val="ru-RU"/>
         </w:rPr>
-        <w:t>Это описание задает ожидаемую интерпретацию схемы при техническом ревью и синхрони</w:t>
-      </w:r>
-      <w:r>
-        <w:rPr>
-          <w:lang w:val="ru-RU"/>
-        </w:rPr>
-        <w:t xml:space="preserve">зации документации с кодовой базой. Ключевые контейнеры/подграфы включают: </w:t>
+        <w:t xml:space="preserve">Это описание задает ожидаемую интерпретацию схемы при техническом ревью и синхронизации документации с кодовой базой. Ключевые контейнеры/подграфы включают: </w:t>
       </w:r>
       <w:r>
         <w:t>Ingestion</w:t>
@@ -1677,10 +1487,7 @@
         <w:t xml:space="preserve">. Именно через эти блоки визуализированы границы слоев и маршруты передачи управления или данных. </w:t>
       </w:r>
       <w:r>
-        <w:t>Примеры узлов, отражающих доменную модель и инфрастру</w:t>
-      </w:r>
-      <w:r>
-        <w:t xml:space="preserve">ктуру: Ingestion, Provider APIs, Bronze Layer\nRaw JSON, Processing, </w:t>
+        <w:t xml:space="preserve">Примеры узлов, отражающих доменную модель и инфраструктуру: Ingestion, Provider APIs, Bronze Layer\nRaw JSON, Processing, </w:t>
       </w:r>
       <w:proofErr w:type="gramStart"/>
       <w:r>
@@ -1694,13 +1501,7 @@
         <w:rPr>
           <w:lang w:val="ru-RU"/>
         </w:rPr>
-        <w:t>По этим сущностям можно проверить согласованность терминов, портов и адаптеров между диаграммой и реализацией. В метаданных указана оценк</w:t>
-      </w:r>
-      <w:r>
-        <w:rPr>
-          <w:lang w:val="ru-RU"/>
-        </w:rPr>
-        <w:t>а плотности (@</w:t>
+        <w:t>По этим сущностям можно проверить согласованность терминов, портов и адаптеров между диаграммой и реализацией. В метаданных указана оценка плотности (@</w:t>
       </w:r>
       <w:r>
         <w:t>nodes</w:t>
@@ -1732,10 +1533,7 @@
     </w:p>
     <w:p>
       <w:r>
-        <w:t>Source: docs/02-architecture/mmd-diagrams/architecture/03a-medallion-layers-overview.mmd | Description: docs/02-architecture/diag</w:t>
-      </w:r>
-      <w:r>
-        <w:t>ram-descriptions/mmd-diagrams/architecture/03a-medallion-layers-overview.md</w:t>
+        <w:t>Source: docs/02-architecture/mmd-diagrams/architecture/03a-medallion-layers-overview.mmd | Description: docs/02-architecture/diagram-descriptions/mmd-diagrams/architecture/03a-medallion-layers-overview.md</w:t>
       </w:r>
     </w:p>
     <w:p>
@@ -1803,10 +1601,7 @@
         </w:rPr>
       </w:pPr>
       <w:r>
-        <w:t>Описание: Диаграмма Pipeline Execution Li</w:t>
-      </w:r>
-      <w:r>
-        <w:t xml:space="preserve">fecycle показывает архитектурный срез BioETL на уровне System / Component и использует нотацию sequenceDiagram. </w:t>
+        <w:t xml:space="preserve">Описание: Диаграмма Pipeline Execution Lifecycle показывает архитектурный срез BioETL на уровне System / Component и использует нотацию sequenceDiagram. </w:t>
       </w:r>
       <w:r>
         <w:rPr>
@@ -1824,10 +1619,7 @@
         <w:t>-</w:t>
       </w:r>
       <w:r>
-        <w:t>execut</w:t>
-      </w:r>
-      <w:r>
-        <w:t>ion</w:t>
+        <w:t>execution</w:t>
       </w:r>
       <w:r>
         <w:rPr>
@@ -1922,13 +1714,7 @@
         <w:rPr>
           <w:lang w:val="ru-RU"/>
         </w:rPr>
-        <w:t>=12), что полезно дл</w:t>
-      </w:r>
-      <w:r>
-        <w:rPr>
-          <w:lang w:val="ru-RU"/>
-        </w:rPr>
-        <w:t xml:space="preserve">я контроля читаемости, декомпозиции </w:t>
+        <w:t xml:space="preserve">=12), что полезно для контроля читаемости, декомпозиции </w:t>
       </w:r>
       <w:r>
         <w:t>view</w:t>
@@ -1951,10 +1737,7 @@
     </w:p>
     <w:p>
       <w:r>
-        <w:t>Source: docs/02-architecture/mmd-diagrams/architecture/04-pipeline-execution-flow.mmd | Description: docs/02-architecture/diagram-descriptions/mmd-diagrams/architecture</w:t>
-      </w:r>
-      <w:r>
-        <w:t>/04-pipeline-execution-flow.md</w:t>
+        <w:t>Source: docs/02-architecture/mmd-diagrams/architecture/04-pipeline-execution-flow.mmd | Description: docs/02-architecture/diagram-descriptions/mmd-diagrams/architecture/04-pipeline-execution-flow.md</w:t>
       </w:r>
     </w:p>
     <w:p>
@@ -2028,13 +1811,7 @@
         <w:rPr>
           <w:lang w:val="ru-RU"/>
         </w:rPr>
-        <w:t>Материал помогает понять границы ответственности модулей, точки интеграции и зависимости между компонентами в р</w:t>
-      </w:r>
-      <w:r>
-        <w:rPr>
-          <w:lang w:val="ru-RU"/>
-        </w:rPr>
-        <w:t>амках сценария 05-</w:t>
+        <w:t>Материал помогает понять границы ответственности модулей, точки интеграции и зависимости между компонентами в рамках сценария 05-</w:t>
       </w:r>
       <w:r>
         <w:t>provider</w:t>
@@ -2078,13 +1855,7 @@
         <w:rPr>
           <w:lang w:val="ru-RU"/>
         </w:rPr>
-        <w:t>Это описание задает ожидаемую интерпретацию схемы при техническом ревью и</w:t>
-      </w:r>
-      <w:r>
-        <w:rPr>
-          <w:lang w:val="ru-RU"/>
-        </w:rPr>
-        <w:t xml:space="preserve"> синхронизации документации с кодовой базой. Ключевые контейнеры/подграфы включают: </w:t>
+        <w:t xml:space="preserve">Это описание задает ожидаемую интерпретацию схемы при техническом ревью и синхронизации документации с кодовой базой. Ключевые контейнеры/подграфы включают: </w:t>
       </w:r>
       <w:r>
         <w:t>Domain</w:t>
@@ -2147,13 +1918,7 @@
         <w:rPr>
           <w:lang w:val="ru-RU"/>
         </w:rPr>
-        <w:t>. Именно через эти блоки визуализированы границы слоев и маршруты передачи управления или данных. Примеры узлов, отражающ</w:t>
-      </w:r>
-      <w:r>
-        <w:rPr>
-          <w:lang w:val="ru-RU"/>
-        </w:rPr>
-        <w:t xml:space="preserve">их доменную модель и инфраструктуру: </w:t>
+        <w:t xml:space="preserve">. Именно через эти блоки визуализированы границы слоев и маршруты передачи управления или данных. Примеры узлов, отражающих доменную модель и инфраструктуру: </w:t>
       </w:r>
       <w:r>
         <w:t>Domain</w:t>
@@ -2234,13 +1999,7 @@
         <w:rPr>
           <w:lang w:val="ru-RU"/>
         </w:rPr>
-        <w:t xml:space="preserve">. По этим сущностям можно проверить согласованность терминов, портов и адаптеров между диаграммой и </w:t>
-      </w:r>
-      <w:r>
-        <w:rPr>
-          <w:lang w:val="ru-RU"/>
-        </w:rPr>
-        <w:t>реализацией. В метаданных указана оценка плотности (@</w:t>
+        <w:t>. По этим сущностям можно проверить согласованность терминов, портов и адаптеров между диаграммой и реализацией. В метаданных указана оценка плотности (@</w:t>
       </w:r>
       <w:r>
         <w:t>nodes</w:t>
@@ -2272,10 +2031,7 @@
     </w:p>
     <w:p>
       <w:r>
-        <w:t>Source: docs/02-architecture/mmd-diagrams/architecture/05-provider-adapter-hierarchy.mmd |</w:t>
-      </w:r>
-      <w:r>
-        <w:t xml:space="preserve"> Description: docs/02-architecture/diagram-descriptions/mmd-diagrams/architecture/05-provider-adapter-hierarchy.md</w:t>
+        <w:t>Source: docs/02-architecture/mmd-diagrams/architecture/05-provider-adapter-hierarchy.mmd | Description: docs/02-architecture/diagram-descriptions/mmd-diagrams/architecture/05-provider-adapter-hierarchy.md</w:t>
       </w:r>
     </w:p>
     <w:p>
@@ -2343,22 +2099,13 @@
         </w:rPr>
       </w:pPr>
       <w:r>
-        <w:t>Описани</w:t>
-      </w:r>
-      <w:r>
-        <w:t xml:space="preserve">е: Диаграмма Adapter Hierarchy: Base Types показывает архитектурный срез BioETL на уровне System / Component и использует нотацию flowchart. </w:t>
-      </w:r>
-      <w:r>
-        <w:rPr>
-          <w:lang w:val="ru-RU"/>
-        </w:rPr>
-        <w:t>Материал помогает понять границы ответственности модулей, точки интеграции и зависимости между компонентами в рамка</w:t>
-      </w:r>
-      <w:r>
-        <w:rPr>
-          <w:lang w:val="ru-RU"/>
-        </w:rPr>
-        <w:t>х сценария 05</w:t>
+        <w:t xml:space="preserve">Описание: Диаграмма Adapter Hierarchy: Base Types показывает архитектурный срез BioETL на уровне System / Component и использует нотацию flowchart. </w:t>
+      </w:r>
+      <w:r>
+        <w:rPr>
+          <w:lang w:val="ru-RU"/>
+        </w:rPr>
+        <w:t>Материал помогает понять границы ответственности модулей, точки интеграции и зависимости между компонентами в рамках сценария 05</w:t>
       </w:r>
       <w:r>
         <w:t>a</w:t>
@@ -2411,13 +2158,7 @@
         <w:rPr>
           <w:lang w:val="ru-RU"/>
         </w:rPr>
-        <w:t>Это описание задает ожидаемую интерпретацию схемы при техническом ревью и синхронизации докумен</w:t>
-      </w:r>
-      <w:r>
-        <w:rPr>
-          <w:lang w:val="ru-RU"/>
-        </w:rPr>
-        <w:t xml:space="preserve">тации с кодовой базой. Ключевые контейнеры/подграфы включают: </w:t>
+        <w:t xml:space="preserve">Это описание задает ожидаемую интерпретацию схемы при техническом ревью и синхронизации документации с кодовой базой. Ключевые контейнеры/подграфы включают: </w:t>
       </w:r>
       <w:r>
         <w:t>Domain</w:t>
@@ -2456,10 +2197,7 @@
         <w:t xml:space="preserve">. Именно через эти блоки визуализированы границы слоев и маршруты передачи управления или данных. Примеры узлов, отражающих доменную модель и инфраструктуру: </w:t>
       </w:r>
       <w:r>
-        <w:t>Do</w:t>
-      </w:r>
-      <w:r>
-        <w:t>main</w:t>
+        <w:t>Domain</w:t>
       </w:r>
       <w:r>
         <w:rPr>
@@ -2528,13 +2266,7 @@
         <w:rPr>
           <w:lang w:val="ru-RU"/>
         </w:rPr>
-        <w:t>. По этим сущностям можно проверить согласованность терминов, портов и адаптеров между диаграммой и реализацией. В метаданных указана о</w:t>
-      </w:r>
-      <w:r>
-        <w:rPr>
-          <w:lang w:val="ru-RU"/>
-        </w:rPr>
-        <w:t>ценка плотности (@</w:t>
+        <w:t>. По этим сущностям можно проверить согласованность терминов, портов и адаптеров между диаграммой и реализацией. В метаданных указана оценка плотности (@</w:t>
       </w:r>
       <w:r>
         <w:t>nodes</w:t>
@@ -2566,10 +2298,7 @@
     </w:p>
     <w:p>
       <w:r>
-        <w:t>Source: docs/02-architecture/mmd-diagrams/architecture/05a-adapter-hierarchy-base.mmd | Description: docs/02-architecture/dia</w:t>
-      </w:r>
-      <w:r>
-        <w:t>gram-descriptions/mmd-diagrams/architecture/05a-adapter-hierarchy-base.md</w:t>
+        <w:t>Source: docs/02-architecture/mmd-diagrams/architecture/05a-adapter-hierarchy-base.mmd | Description: docs/02-architecture/diagram-descriptions/mmd-diagrams/architecture/05a-adapter-hierarchy-base.md</w:t>
       </w:r>
     </w:p>
     <w:p>
@@ -2637,22 +2366,13 @@
         </w:rPr>
       </w:pPr>
       <w:r>
-        <w:t>Описание: Диаграмма Adapter H</w:t>
-      </w:r>
-      <w:r>
-        <w:t xml:space="preserve">ierarchy: Provider Implementations показывает архитектурный срез BioETL на уровне System / Component и использует нотацию flowchart. </w:t>
-      </w:r>
-      <w:r>
-        <w:rPr>
-          <w:lang w:val="ru-RU"/>
-        </w:rPr>
-        <w:t>Материал помогает понять границы ответственности модулей, точки интеграции и зависимости между компонентами в рамках сценар</w:t>
-      </w:r>
-      <w:r>
-        <w:rPr>
-          <w:lang w:val="ru-RU"/>
-        </w:rPr>
-        <w:t>ия 05</w:t>
+        <w:t xml:space="preserve">Описание: Диаграмма Adapter Hierarchy: Provider Implementations показывает архитектурный срез BioETL на уровне System / Component и использует нотацию flowchart. </w:t>
+      </w:r>
+      <w:r>
+        <w:rPr>
+          <w:lang w:val="ru-RU"/>
+        </w:rPr>
+        <w:t>Материал помогает понять границы ответственности модулей, точки интеграции и зависимости между компонентами в рамках сценария 05</w:t>
       </w:r>
       <w:r>
         <w:t>b</w:t>
@@ -2705,13 +2425,7 @@
         <w:rPr>
           <w:lang w:val="ru-RU"/>
         </w:rPr>
-        <w:t>Это описание задает ожидаемую интерпретацию схемы при техническом ревью и синхронизации документации с кодово</w:t>
-      </w:r>
-      <w:r>
-        <w:rPr>
-          <w:lang w:val="ru-RU"/>
-        </w:rPr>
-        <w:t xml:space="preserve">й базой. Ключевые контейнеры/подграфы включают: </w:t>
+        <w:t xml:space="preserve">Это описание задает ожидаемую интерпретацию схемы при техническом ревью и синхронизации документации с кодовой базой. Ключевые контейнеры/подграфы включают: </w:t>
       </w:r>
       <w:r>
         <w:t>Infrastructure</w:t>
@@ -2750,10 +2464,7 @@
         <w:t xml:space="preserve">, </w:t>
       </w:r>
       <w:r>
-        <w:t>BaseHttp</w:t>
-      </w:r>
-      <w:r>
-        <w:t>Adapter</w:t>
+        <w:t>BaseHttpAdapter</w:t>
       </w:r>
       <w:r>
         <w:rPr>
@@ -2804,13 +2515,7 @@
         <w:rPr>
           <w:lang w:val="ru-RU"/>
         </w:rPr>
-        <w:t>=15), что полезно для контро</w:t>
-      </w:r>
-      <w:r>
-        <w:rPr>
-          <w:lang w:val="ru-RU"/>
-        </w:rPr>
-        <w:t xml:space="preserve">ля читаемости, декомпозиции </w:t>
+        <w:t xml:space="preserve">=15), что полезно для контроля читаемости, декомпозиции </w:t>
       </w:r>
       <w:r>
         <w:t>view</w:t>
@@ -2833,10 +2538,7 @@
     </w:p>
     <w:p>
       <w:r>
-        <w:t>Source: docs/02-architecture/mmd-diagrams/architecture/05b-adapter-hierarchy-providers.mmd | Description: docs/02-architecture/diagram-descriptions/mmd-diagrams/architecture/05</w:t>
-      </w:r>
-      <w:r>
-        <w:t>b-adapter-hierarchy-providers.md</w:t>
+        <w:t>Source: docs/02-architecture/mmd-diagrams/architecture/05b-adapter-hierarchy-providers.mmd | Description: docs/02-architecture/diagram-descriptions/mmd-diagrams/architecture/05b-adapter-hierarchy-providers.md</w:t>
       </w:r>
     </w:p>
     <w:p>
@@ -2915,10 +2617,7 @@
         </w:rPr>
       </w:pPr>
       <w:r>
-        <w:t>Описание: Диаграмма Storage Layer Components показывает архитектурный срез BioETL на уровне System / Com</w:t>
-      </w:r>
-      <w:r>
-        <w:t xml:space="preserve">ponent и использует нотацию flowchart. </w:t>
+        <w:t xml:space="preserve">Описание: Диаграмма Storage Layer Components показывает архитектурный срез BioETL на уровне System / Component и использует нотацию flowchart. </w:t>
       </w:r>
       <w:r>
         <w:rPr>
@@ -2981,10 +2680,7 @@
         <w:t xml:space="preserve"> </w:t>
       </w:r>
       <w:r>
-        <w:t>wr</w:t>
-      </w:r>
-      <w:r>
-        <w:t>iters</w:t>
+        <w:t>writers</w:t>
       </w:r>
       <w:r>
         <w:rPr>
@@ -3046,10 +2742,7 @@
         <w:t xml:space="preserve"> Это описание задает ожидаемую интерпретацию схемы при техническом ревью и синхронизации документации с кодовой базой. </w:t>
       </w:r>
       <w:r>
-        <w:t xml:space="preserve">Ключевые контейнеры/подграфы включают: Domain Port, Storage Writers, Bronze Storage, Silver </w:t>
-      </w:r>
-      <w:r>
-        <w:t xml:space="preserve">Storage, Gold Storage. </w:t>
+        <w:t xml:space="preserve">Ключевые контейнеры/подграфы включают: Domain Port, Storage Writers, Bronze Storage, Silver Storage, Gold Storage. </w:t>
       </w:r>
       <w:r>
         <w:rPr>
@@ -3130,10 +2823,7 @@
         <w:t xml:space="preserve">, </w:t>
       </w:r>
       <w:r>
-        <w:t>BronzeW</w:t>
-      </w:r>
-      <w:r>
-        <w:t>riter</w:t>
+        <w:t>BronzeWriter</w:t>
       </w:r>
       <w:r>
         <w:rPr>
@@ -3354,13 +3044,7 @@
         <w:rPr>
           <w:lang w:val="ru-RU"/>
         </w:rPr>
-        <w:t xml:space="preserve">. По этим сущностям </w:t>
-      </w:r>
-      <w:r>
-        <w:rPr>
-          <w:lang w:val="ru-RU"/>
-        </w:rPr>
-        <w:t>можно проверить согласованность терминов, портов и адаптеров между диаграммой и реализацией. В метаданных указана оценка плотности (@</w:t>
+        <w:t>. По этим сущностям можно проверить согласованность терминов, портов и адаптеров между диаграммой и реализацией. В метаданных указана оценка плотности (@</w:t>
       </w:r>
       <w:r>
         <w:t>nodes</w:t>
@@ -3392,10 +3076,7 @@
     </w:p>
     <w:p>
       <w:r>
-        <w:t>Source: do</w:t>
-      </w:r>
-      <w:r>
-        <w:t>cs/02-architecture/mmd-diagrams/architecture/06-storage-layer.mmd | Description: docs/02-architecture/diagram-descriptions/mmd-diagrams/architecture/06-storage-layer.md</w:t>
+        <w:t>Source: docs/02-architecture/mmd-diagrams/architecture/06-storage-layer.mmd | Description: docs/02-architecture/diagram-descriptions/mmd-diagrams/architecture/06-storage-layer.md</w:t>
       </w:r>
     </w:p>
     <w:p>
@@ -3453,10 +3134,7 @@
     </w:p>
     <w:p>
       <w:r>
-        <w:t>ID: 06a-storage-writers | Type: flowchart | Level: System / Com</w:t>
-      </w:r>
-      <w:r>
-        <w:t>ponent | Date: 2026-02-27</w:t>
+        <w:t>ID: 06a-storage-writers | Type: flowchart | Level: System / Component | Date: 2026-02-27</w:t>
       </w:r>
     </w:p>
     <w:p>
@@ -3472,13 +3150,7 @@
         <w:rPr>
           <w:lang w:val="ru-RU"/>
         </w:rPr>
-        <w:t>Материал помогает понять границы ответственности модулей, точки интеграции и зависимости между к</w:t>
-      </w:r>
-      <w:r>
-        <w:rPr>
-          <w:lang w:val="ru-RU"/>
-        </w:rPr>
-        <w:t>омпонентами в рамках сценария 06</w:t>
+        <w:t>Материал помогает понять границы ответственности модулей, точки интеграции и зависимости между компонентами в рамках сценария 06</w:t>
       </w:r>
       <w:r>
         <w:t>a</w:t>
@@ -3522,13 +3194,7 @@
         <w:rPr>
           <w:lang w:val="ru-RU"/>
         </w:rPr>
-        <w:t>Это описание задает ожидаемую интерпретацию схемы при техническо</w:t>
-      </w:r>
-      <w:r>
-        <w:rPr>
-          <w:lang w:val="ru-RU"/>
-        </w:rPr>
-        <w:t xml:space="preserve">м ревью и синхронизации документации с кодовой базой. </w:t>
+        <w:t xml:space="preserve">Это описание задает ожидаемую интерпретацию схемы при техническом ревью и синхронизации документации с кодовой базой. </w:t>
       </w:r>
       <w:r>
         <w:t xml:space="preserve">Ключевые контейнеры/подграфы включают: Domain Port, Bronze Storage, Silver Storage, Gold Storage, Delta Reader. </w:t>
@@ -3537,13 +3203,7 @@
         <w:rPr>
           <w:lang w:val="ru-RU"/>
         </w:rPr>
-        <w:t>Именно через эти блоки визуализированы границы слоев и маршруты передачи управления или да</w:t>
-      </w:r>
-      <w:r>
-        <w:rPr>
-          <w:lang w:val="ru-RU"/>
-        </w:rPr>
-        <w:t xml:space="preserve">нных. </w:t>
+        <w:t xml:space="preserve">Именно через эти блоки визуализированы границы слоев и маршруты передачи управления или данных. </w:t>
       </w:r>
       <w:r>
         <w:t>Примеры узлов, отражающих доменную модель и инфраструктуру: Domain Port, StoragePort (Protocol), Bronze Storage, BronzeWriter write_</w:t>
@@ -3560,13 +3220,7 @@
         <w:rPr>
           <w:lang w:val="ru-RU"/>
         </w:rPr>
-        <w:t>По этим сущностям можно проверить согл</w:t>
-      </w:r>
-      <w:r>
-        <w:rPr>
-          <w:lang w:val="ru-RU"/>
-        </w:rPr>
-        <w:t>асованность терминов, портов и адаптеров между диаграммой и реализацией. В метаданных указана оценка плотности (@</w:t>
+        <w:t>По этим сущностям можно проверить согласованность терминов, портов и адаптеров между диаграммой и реализацией. В метаданных указана оценка плотности (@</w:t>
       </w:r>
       <w:r>
         <w:t>nodes</w:t>
@@ -3598,10 +3252,7 @@
     </w:p>
     <w:p>
       <w:r>
-        <w:t>Source: docs/02-architecture/m</w:t>
-      </w:r>
-      <w:r>
-        <w:t>md-diagrams/architecture/06a-storage-writers.mmd | Description: docs/02-architecture/diagram-descriptions/mmd-diagrams/architecture/06a-storage-writers.md</w:t>
+        <w:t>Source: docs/02-architecture/mmd-diagrams/architecture/06a-storage-writers.mmd | Description: docs/02-architecture/diagram-descriptions/mmd-diagrams/architecture/06a-storage-writers.md</w:t>
       </w:r>
     </w:p>
     <w:p>
@@ -3644,10 +3295,7 @@
         </w:drawing>
       </w:r>
     </w:p>
-    <w:p>
-      <w:bookmarkStart w:id="0" w:name="_GoBack"/>
-      <w:bookmarkEnd w:id="0"/>
-    </w:p>
+    <w:p/>
     <w:p>
       <w:pPr>
         <w:pStyle w:val="Heading1"/>
@@ -3674,13 +3322,7 @@
         <w:rPr>
           <w:lang w:val="ru-RU"/>
         </w:rPr>
-        <w:t>Материал помогает поня</w:t>
-      </w:r>
-      <w:r>
-        <w:rPr>
-          <w:lang w:val="ru-RU"/>
-        </w:rPr>
-        <w:t>ть границы ответственности модулей, точки интеграции и зависимости между компонентами в рамках сценария 06</w:t>
+        <w:t>Материал помогает понять границы ответственности модулей, точки интеграции и зависимости между компонентами в рамках сценария 06</w:t>
       </w:r>
       <w:r>
         <w:t>b</w:t>
@@ -3724,13 +3366,7 @@
         <w:rPr>
           <w:lang w:val="ru-RU"/>
         </w:rPr>
-        <w:t>Это опис</w:t>
-      </w:r>
-      <w:r>
-        <w:rPr>
-          <w:lang w:val="ru-RU"/>
-        </w:rPr>
-        <w:t xml:space="preserve">ание задает ожидаемую интерпретацию схемы при техническом ревью и синхронизации документации с кодовой базой. Ключевые контейнеры/подграфы включают: </w:t>
+        <w:t xml:space="preserve">Это описание задает ожидаемую интерпретацию схемы при техническом ревью и синхронизации документации с кодовой базой. Ключевые контейнеры/подграфы включают: </w:t>
       </w:r>
       <w:r>
         <w:t>Support</w:t>
@@ -3775,13 +3411,7 @@
         <w:rPr>
           <w:lang w:val="ru-RU"/>
         </w:rPr>
-        <w:t>. Именно через эти блоки визуализированы границы слоев и м</w:t>
-      </w:r>
-      <w:r>
-        <w:rPr>
-          <w:lang w:val="ru-RU"/>
-        </w:rPr>
-        <w:t xml:space="preserve">аршруты передачи управления или данных. Примеры узлов, отражающих доменную модель и инфраструктуру: </w:t>
+        <w:t xml:space="preserve">. Именно через эти блоки визуализированы границы слоев и маршруты передачи управления или данных. Примеры узлов, отражающих доменную модель и инфраструктуру: </w:t>
       </w:r>
       <w:r>
         <w:t>Support</w:t>
@@ -3972,13 +3602,7 @@
         <w:rPr>
           <w:lang w:val="ru-RU"/>
         </w:rPr>
-        <w:t>-слоев</w:t>
-      </w:r>
-      <w:r>
-        <w:rPr>
-          <w:lang w:val="ru-RU"/>
-        </w:rPr>
-        <w:t xml:space="preserve"> и стабильного рендеринга в </w:t>
+        <w:t xml:space="preserve">-слоев и стабильного рендеринга в </w:t>
       </w:r>
       <w:r>
         <w:t>CI</w:t>
@@ -4045,10 +3669,7 @@
         <w:pStyle w:val="Heading1"/>
       </w:pPr>
       <w:r>
-        <w:t>16. Data Quality (DQ) Sys</w:t>
-      </w:r>
-      <w:r>
-        <w:t>tem</w:t>
+        <w:t>16. Data Quality (DQ) System</w:t>
       </w:r>
     </w:p>
     <w:p>
@@ -4069,13 +3690,7 @@
         <w:rPr>
           <w:lang w:val="ru-RU"/>
         </w:rPr>
-        <w:t>Материал помогает понять границы ответственности модулей, точки интеграции и зависимости между компонентами в рам</w:t>
-      </w:r>
-      <w:r>
-        <w:rPr>
-          <w:lang w:val="ru-RU"/>
-        </w:rPr>
-        <w:t>ках сценария 07-</w:t>
+        <w:t>Материал помогает понять границы ответственности модулей, точки интеграции и зависимости между компонентами в рамках сценария 07-</w:t>
       </w:r>
       <w:r>
         <w:t>dq</w:t>
@@ -4110,13 +3725,7 @@
         <w:rPr>
           <w:lang w:val="ru-RU"/>
         </w:rPr>
-        <w:t>Это описание задает ожидаемую интерпретацию схемы при техническом ревью и синхронизации документации с кодов</w:t>
-      </w:r>
-      <w:r>
-        <w:rPr>
-          <w:lang w:val="ru-RU"/>
-        </w:rPr>
-        <w:t xml:space="preserve">ой базой. </w:t>
+        <w:t xml:space="preserve">Это описание задает ожидаемую интерпретацию схемы при техническом ревью и синхронизации документации с кодовой базой. </w:t>
       </w:r>
       <w:r>
         <w:t xml:space="preserve">Ключевые контейнеры/подграфы включают: Domain Ports, Application Services, Application DQ Analysis, Pipeline Integration, Domain Value Objects. </w:t>
@@ -4125,13 +3734,7 @@
         <w:rPr>
           <w:lang w:val="ru-RU"/>
         </w:rPr>
-        <w:t>Именно через эти блоки визуализированы границы слоев и маршруты передачи управления или данных. Пример</w:t>
-      </w:r>
-      <w:r>
-        <w:rPr>
-          <w:lang w:val="ru-RU"/>
-        </w:rPr>
-        <w:t xml:space="preserve">ы узлов, отражающих доменную модель и инфраструктуру: </w:t>
+        <w:t xml:space="preserve">Именно через эти блоки визуализированы границы слоев и маршруты передачи управления или данных. Примеры узлов, отражающих доменную модель и инфраструктуру: </w:t>
       </w:r>
       <w:r>
         <w:t>Domain</w:t>
@@ -4194,13 +3797,7 @@
         <w:rPr>
           <w:lang w:val="ru-RU"/>
         </w:rPr>
-        <w:t>. По этим сущностям можно проверить согласованность терминов, портов и адаптеров между диаг</w:t>
-      </w:r>
-      <w:r>
-        <w:rPr>
-          <w:lang w:val="ru-RU"/>
-        </w:rPr>
-        <w:t>раммой и реализацией. В метаданных указана оценка плотности (@</w:t>
+        <w:t>. По этим сущностям можно проверить согласованность терминов, портов и адаптеров между диаграммой и реализацией. В метаданных указана оценка плотности (@</w:t>
       </w:r>
       <w:r>
         <w:t>nodes</w:t>
@@ -4232,10 +3829,7 @@
     </w:p>
     <w:p>
       <w:r>
-        <w:t>Source: docs/02-architecture/mmd-diagrams/architecture/07-dq-system.mmd | Descrip</w:t>
-      </w:r>
-      <w:r>
-        <w:t>tion: docs/02-architecture/diagram-descriptions/mmd-diagrams/architecture/07-dq-system.md</w:t>
+        <w:t>Source: docs/02-architecture/mmd-diagrams/architecture/07-dq-system.mmd | Description: docs/02-architecture/diagram-descriptions/mmd-diagrams/architecture/07-dq-system.md</w:t>
       </w:r>
     </w:p>
     <w:p>
@@ -4303,10 +3897,7 @@
         </w:rPr>
       </w:pPr>
       <w:r>
-        <w:t xml:space="preserve">Описание: Диаграмма DQ Analysis Services показывает </w:t>
-      </w:r>
-      <w:r>
-        <w:t xml:space="preserve">архитектурный срез BioETL на уровне System / Component и использует нотацию flowchart. </w:t>
+        <w:t xml:space="preserve">Описание: Диаграмма DQ Analysis Services показывает архитектурный срез BioETL на уровне System / Component и использует нотацию flowchart. </w:t>
       </w:r>
       <w:r>
         <w:rPr>
@@ -4342,10 +3933,7 @@
         <w:t xml:space="preserve">. </w:t>
       </w:r>
       <w:r>
-        <w:t>В исходном файле прямо заф</w:t>
-      </w:r>
-      <w:r>
-        <w:t xml:space="preserve">иксирован контекст: Domain ports, application services, analyzers, and anomaly detection for Data </w:t>
+        <w:t xml:space="preserve">В исходном файле прямо зафиксирован контекст: Domain ports, application services, analyzers, and anomaly detection for Data </w:t>
       </w:r>
       <w:proofErr w:type="gramStart"/>
       <w:r>
@@ -4362,10 +3950,7 @@
         <w:t xml:space="preserve">Это описание задает ожидаемую интерпретацию схемы при техническом ревью и синхронизации документации с кодовой базой. </w:t>
       </w:r>
       <w:r>
-        <w:t>Ключевые контейнеры/подграфы в</w:t>
-      </w:r>
-      <w:r>
-        <w:t xml:space="preserve">ключают: Domain Ports, Application Services, DQ Analyzers, Anomaly Detection. </w:t>
+        <w:t xml:space="preserve">Ключевые контейнеры/подграфы включают: Domain Ports, Application Services, DQ Analyzers, Anomaly Detection. </w:t>
       </w:r>
       <w:r>
         <w:rPr>
@@ -4392,10 +3977,7 @@
         <w:t xml:space="preserve">, </w:t>
       </w:r>
       <w:r>
-        <w:t>DQMonito</w:t>
-      </w:r>
-      <w:r>
-        <w:t>rPort</w:t>
+        <w:t>DQMonitorPort</w:t>
       </w:r>
       <w:r>
         <w:rPr>
@@ -4446,13 +4028,7 @@
         <w:rPr>
           <w:lang w:val="ru-RU"/>
         </w:rPr>
-        <w:t>=12), что</w:t>
-      </w:r>
-      <w:r>
-        <w:rPr>
-          <w:lang w:val="ru-RU"/>
-        </w:rPr>
-        <w:t xml:space="preserve"> полезно для контроля читаемости, декомпозиции </w:t>
+        <w:t xml:space="preserve">=12), что полезно для контроля читаемости, декомпозиции </w:t>
       </w:r>
       <w:r>
         <w:t>view</w:t>
@@ -4475,10 +4051,7 @@
     </w:p>
     <w:p>
       <w:r>
-        <w:t>Source: docs/02-architecture/mmd-diagrams/architecture/07a-dq-analysis.mmd | Description: docs/02-architecture/diagram-descriptions/mmd-diagrams/architecture</w:t>
-      </w:r>
-      <w:r>
-        <w:t>/07a-dq-analysis.md</w:t>
+        <w:t>Source: docs/02-architecture/mmd-diagrams/architecture/07a-dq-analysis.mmd | Description: docs/02-architecture/diagram-descriptions/mmd-diagrams/architecture/07a-dq-analysis.md</w:t>
       </w:r>
     </w:p>
     <w:p>
@@ -4546,10 +4119,7 @@
         </w:rPr>
       </w:pPr>
       <w:r>
-        <w:t>Описание: Диаграмма DQ Pipeline Integration показывает архитектурный срез BioETL на уровне System / Component и использ</w:t>
-      </w:r>
-      <w:r>
-        <w:t xml:space="preserve">ует нотацию flowchart. </w:t>
+        <w:t xml:space="preserve">Описание: Диаграмма DQ Pipeline Integration показывает архитектурный срез BioETL на уровне System / Component и использует нотацию flowchart. </w:t>
       </w:r>
       <w:r>
         <w:rPr>
@@ -4585,10 +4155,7 @@
         <w:t xml:space="preserve">. </w:t>
       </w:r>
       <w:r>
-        <w:t>В исходном файле прямо зафиксирован контекст: Pipeline DQ checks, domain value objects, an</w:t>
-      </w:r>
-      <w:r>
-        <w:t xml:space="preserve">d infrastructure config/report </w:t>
+        <w:t xml:space="preserve">В исходном файле прямо зафиксирован контекст: Pipeline DQ checks, domain value objects, and infrastructure config/report </w:t>
       </w:r>
       <w:proofErr w:type="gramStart"/>
       <w:r>
@@ -4605,10 +4172,7 @@
         <w:t xml:space="preserve">Это описание задает ожидаемую интерпретацию схемы при техническом ревью и синхронизации документации с кодовой базой. </w:t>
       </w:r>
       <w:r>
-        <w:t>Ключевые контейнеры/подграфы включают: Pipeline Integration, Domain Value Objects, Infrastructure</w:t>
-      </w:r>
-      <w:r>
-        <w:t xml:space="preserve"> Implementations. </w:t>
+        <w:t xml:space="preserve">Ключевые контейнеры/подграфы включают: Pipeline Integration, Domain Value Objects, Infrastructure Implementations. </w:t>
       </w:r>
       <w:r>
         <w:rPr>
@@ -4625,22 +4189,13 @@
       </w:r>
       <w:proofErr w:type="gramEnd"/>
       <w:r>
-        <w:t>), QuarantineManager q</w:t>
-      </w:r>
-      <w:r>
-        <w:t xml:space="preserve">uarantines failed records, ErrorClassifier recoverable vs fatal, Domain Value Objects, DQMetrics null_rate / duplicate_rate. </w:t>
-      </w:r>
-      <w:r>
-        <w:rPr>
-          <w:lang w:val="ru-RU"/>
-        </w:rPr>
-        <w:t>По этим сущностям можно проверить согласованность терминов, портов и адаптеров между диаграммой и реализацией. В метаданных указана</w:t>
-      </w:r>
-      <w:r>
-        <w:rPr>
-          <w:lang w:val="ru-RU"/>
-        </w:rPr>
-        <w:t xml:space="preserve"> оценка плотности (@</w:t>
+        <w:t xml:space="preserve">), QuarantineManager quarantines failed records, ErrorClassifier recoverable vs fatal, Domain Value Objects, DQMetrics null_rate / duplicate_rate. </w:t>
+      </w:r>
+      <w:r>
+        <w:rPr>
+          <w:lang w:val="ru-RU"/>
+        </w:rPr>
+        <w:t>По этим сущностям можно проверить согласованность терминов, портов и адаптеров между диаграммой и реализацией. В метаданных указана оценка плотности (@</w:t>
       </w:r>
       <w:r>
         <w:t>nodes</w:t>
@@ -4672,10 +4227,7 @@
     </w:p>
     <w:p>
       <w:r>
-        <w:t>Source: docs/02-architecture/mmd-diagrams/architecture/07b-dq-pipeline.mmd | Description: docs/02-architecture/diagram-desc</w:t>
-      </w:r>
-      <w:r>
-        <w:t>riptions/mmd-diagrams/architecture/07b-dq-pipeline.md</w:t>
+        <w:t>Source: docs/02-architecture/mmd-diagrams/architecture/07b-dq-pipeline.mmd | Description: docs/02-architecture/diagram-descriptions/mmd-diagrams/architecture/07b-dq-pipeline.md</w:t>
       </w:r>
     </w:p>
     <w:p>
@@ -4743,10 +4295,7 @@
         </w:rPr>
       </w:pPr>
       <w:r>
-        <w:t>Описание: Диаграмма Composite Pipeline Architecture показывает архитект</w:t>
-      </w:r>
-      <w:r>
-        <w:t xml:space="preserve">урный срез BioETL на уровне System / Component и использует нотацию flowchart. </w:t>
+        <w:t xml:space="preserve">Описание: Диаграмма Composite Pipeline Architecture показывает архитектурный срез BioETL на уровне System / Component и использует нотацию flowchart. </w:t>
       </w:r>
       <w:r>
         <w:rPr>
@@ -4770,13 +4319,7 @@
         <w:rPr>
           <w:lang w:val="ru-RU"/>
         </w:rPr>
-        <w:t>. В исходном файле прямо зафик</w:t>
-      </w:r>
-      <w:r>
-        <w:rPr>
-          <w:lang w:val="ru-RU"/>
-        </w:rPr>
-        <w:t xml:space="preserve">сирован контекст: </w:t>
+        <w:t xml:space="preserve">. В исходном файле прямо зафиксирован контекст: </w:t>
       </w:r>
       <w:r>
         <w:t>Shows</w:t>
@@ -4850,10 +4393,7 @@
         <w:t xml:space="preserve"> Это описание задает ожидаемую интерпретацию схемы при техническом ревью и синхронизации документации с кодовой базой. </w:t>
       </w:r>
       <w:r>
-        <w:t>Ключевые контейнеры/подграфы включают: Composite Configu</w:t>
-      </w:r>
-      <w:r>
-        <w:t xml:space="preserve">ration, CompositePipelineRunner, State Machine, Execution Components, Dependencies (Sequential). </w:t>
+        <w:t xml:space="preserve">Ключевые контейнеры/подграфы включают: Composite Configuration, CompositePipelineRunner, State Machine, Execution Components, Dependencies (Sequential). </w:t>
       </w:r>
       <w:r>
         <w:rPr>
@@ -4862,10 +4402,7 @@
         <w:t xml:space="preserve">Именно через эти блоки визуализированы границы слоев и маршруты передачи управления или данных. Примеры узлов, отражающих доменную модель и инфраструктуру: </w:t>
       </w:r>
       <w:r>
-        <w:t>Com</w:t>
-      </w:r>
-      <w:r>
-        <w:t>posite</w:t>
+        <w:t>Composite</w:t>
       </w:r>
       <w:r>
         <w:rPr>
@@ -4934,13 +4471,7 @@
         <w:rPr>
           <w:lang w:val="ru-RU"/>
         </w:rPr>
-        <w:t>=3</w:t>
-      </w:r>
-      <w:r>
-        <w:rPr>
-          <w:lang w:val="ru-RU"/>
-        </w:rPr>
-        <w:t xml:space="preserve">3), что полезно для контроля читаемости, декомпозиции </w:t>
+        <w:t xml:space="preserve">=33), что полезно для контроля читаемости, декомпозиции </w:t>
       </w:r>
       <w:r>
         <w:t>view</w:t>
@@ -4963,10 +4494,7 @@
     </w:p>
     <w:p>
       <w:r>
-        <w:t>Source: docs/02-architecture/mmd-diagrams/architecture/08-composite-pipeline.mmd | Description: docs/02-architecture/diagram-descriptions/mmd-diagrams</w:t>
-      </w:r>
-      <w:r>
-        <w:t>/architecture/08-composite-pipeline.md</w:t>
+        <w:t>Source: docs/02-architecture/mmd-diagrams/architecture/08-composite-pipeline.mmd | Description: docs/02-architecture/diagram-descriptions/mmd-diagrams/architecture/08-composite-pipeline.md</w:t>
       </w:r>
     </w:p>
     <w:p>
@@ -5040,13 +4568,7 @@
         <w:rPr>
           <w:lang w:val="ru-RU"/>
         </w:rPr>
-        <w:t>Материал помогает понять границы ответственности модулей, точки интеграции и зависимости между комп</w:t>
-      </w:r>
-      <w:r>
-        <w:rPr>
-          <w:lang w:val="ru-RU"/>
-        </w:rPr>
-        <w:t>онентами в рамках сценария 08</w:t>
+        <w:t>Материал помогает понять границы ответственности модулей, точки интеграции и зависимости между компонентами в рамках сценария 08</w:t>
       </w:r>
       <w:r>
         <w:t>a</w:t>
@@ -5090,13 +4612,7 @@
         <w:rPr>
           <w:lang w:val="ru-RU"/>
         </w:rPr>
-        <w:t>Это описание задает ожидаемую интерпретацию схемы при техническом ревью и синхрони</w:t>
-      </w:r>
-      <w:r>
-        <w:rPr>
-          <w:lang w:val="ru-RU"/>
-        </w:rPr>
-        <w:t xml:space="preserve">зации документации с кодовой базой. Ключевые контейнеры/подграфы включают: </w:t>
+        <w:t xml:space="preserve">Это описание задает ожидаемую интерпретацию схемы при техническом ревью и синхронизации документации с кодовой базой. Ключевые контейнеры/подграфы включают: </w:t>
       </w:r>
       <w:r>
         <w:t>Composite</w:t>
@@ -5135,22 +4651,13 @@
         <w:t xml:space="preserve">. Именно через эти блоки визуализированы границы слоев и маршруты передачи управления или данных. </w:t>
       </w:r>
       <w:r>
-        <w:t>Примеры узлов, отражающих доменную модель и и</w:t>
-      </w:r>
-      <w:r>
-        <w:t xml:space="preserve">нфраструктуру: Composite Configuration, CompositeConfig name / seed / deps / enrichers / merge, SeedConfig, DependencyConfig, EnricherConfig, MergeConfig. </w:t>
-      </w:r>
-      <w:r>
-        <w:rPr>
-          <w:lang w:val="ru-RU"/>
-        </w:rPr>
-        <w:t>По этим сущностям можно проверить согласованность терминов, портов и адаптеров между диаграммой и реа</w:t>
-      </w:r>
-      <w:r>
-        <w:rPr>
-          <w:lang w:val="ru-RU"/>
-        </w:rPr>
-        <w:t>лизацией. В метаданных указана оценка плотности (@</w:t>
+        <w:t xml:space="preserve">Примеры узлов, отражающих доменную модель и инфраструктуру: Composite Configuration, CompositeConfig name / seed / deps / enrichers / merge, SeedConfig, DependencyConfig, EnricherConfig, MergeConfig. </w:t>
+      </w:r>
+      <w:r>
+        <w:rPr>
+          <w:lang w:val="ru-RU"/>
+        </w:rPr>
+        <w:t>По этим сущностям можно проверить согласованность терминов, портов и адаптеров между диаграммой и реализацией. В метаданных указана оценка плотности (@</w:t>
       </w:r>
       <w:r>
         <w:t>nodes</w:t>
@@ -5182,10 +4689,7 @@
     </w:p>
     <w:p>
       <w:r>
-        <w:t>Source: docs/02-architecture/mmd-diagrams/architecture/08a-composite-config.mmd | Description</w:t>
-      </w:r>
-      <w:r>
-        <w:t>: docs/02-architecture/diagram-descriptions/mmd-diagrams/architecture/08a-composite-config.md</w:t>
+        <w:t>Source: docs/02-architecture/mmd-diagrams/architecture/08a-composite-config.mmd | Description: docs/02-architecture/diagram-descriptions/mmd-diagrams/architecture/08a-composite-config.md</w:t>
       </w:r>
     </w:p>
     <w:p>
@@ -5253,10 +4757,7 @@
         </w:rPr>
       </w:pPr>
       <w:r>
-        <w:t>Описание: Диаграмма Composite Pi</w:t>
-      </w:r>
-      <w:r>
-        <w:t xml:space="preserve">peline Execution показывает архитектурный срез BioETL на уровне System / Component и использует нотацию flowchart. </w:t>
+        <w:t xml:space="preserve">Описание: Диаграмма Composite Pipeline Execution показывает архитектурный срез BioETL на уровне System / Component и использует нотацию flowchart. </w:t>
       </w:r>
       <w:r>
         <w:rPr>
@@ -5283,10 +4784,7 @@
         <w:t>-</w:t>
       </w:r>
       <w:r>
-        <w:t>e</w:t>
-      </w:r>
-      <w:r>
-        <w:t>xecution</w:t>
+        <w:t>execution</w:t>
       </w:r>
       <w:r>
         <w:rPr>
@@ -5309,13 +4807,7 @@
         <w:rPr>
           <w:lang w:val="ru-RU"/>
         </w:rPr>
-        <w:t>Это описание задает ожидаемую интерпретацию схемы при техническом ревью и синхронизации доку</w:t>
-      </w:r>
-      <w:r>
-        <w:rPr>
-          <w:lang w:val="ru-RU"/>
-        </w:rPr>
-        <w:t xml:space="preserve">ментации с кодовой базой. </w:t>
+        <w:t xml:space="preserve">Это описание задает ожидаемую интерпретацию схемы при техническом ревью и синхронизации документации с кодовой базой. </w:t>
       </w:r>
       <w:r>
         <w:t xml:space="preserve">Ключевые контейнеры/подграфы включают: CompositePipelineRunner, Preflight, Execution Components, Dependencies (Sequential), Enrichers (Parallel Fan-Out). </w:t>
@@ -5324,13 +4816,7 @@
         <w:rPr>
           <w:lang w:val="ru-RU"/>
         </w:rPr>
-        <w:t>Именно через эти блоки визуализированы границы слоев и маршруты передачи упр</w:t>
-      </w:r>
-      <w:r>
-        <w:rPr>
-          <w:lang w:val="ru-RU"/>
-        </w:rPr>
-        <w:t xml:space="preserve">авления или данных. </w:t>
+        <w:t xml:space="preserve">Именно через эти блоки визуализированы границы слоев и маршруты передачи управления или данных. </w:t>
       </w:r>
       <w:r>
         <w:t xml:space="preserve">Примеры узлов, отражающих доменную модель и инфраструктуру: CompositePipelineRunner, CompositePipelineRunner orchestrates full execution, Preflight, PreflightValidator, Execution Components, Seed Pipeline. </w:t>
@@ -5339,13 +4825,7 @@
         <w:rPr>
           <w:lang w:val="ru-RU"/>
         </w:rPr>
-        <w:t>По этим сущностям можно провер</w:t>
-      </w:r>
-      <w:r>
-        <w:rPr>
-          <w:lang w:val="ru-RU"/>
-        </w:rPr>
-        <w:t>ить согласованность терминов, портов и адаптеров между диаграммой и реализацией. В метаданных указана оценка плотности (@</w:t>
+        <w:t>По этим сущностям можно проверить согласованность терминов, портов и адаптеров между диаграммой и реализацией. В метаданных указана оценка плотности (@</w:t>
       </w:r>
       <w:r>
         <w:t>nodes</w:t>
@@ -5377,10 +4857,7 @@
     </w:p>
     <w:p>
       <w:r>
-        <w:t>Source: docs/02-archit</w:t>
-      </w:r>
-      <w:r>
-        <w:t>ecture/mmd-diagrams/architecture/08b-composite-execution.mmd | Description: docs/02-architecture/diagram-descriptions/mmd-diagrams/architecture/08b-composite-execution.md</w:t>
+        <w:t>Source: docs/02-architecture/mmd-diagrams/architecture/08b-composite-execution.mmd | Description: docs/02-architecture/diagram-descriptions/mmd-diagrams/architecture/08b-composite-execution.md</w:t>
       </w:r>
     </w:p>
     <w:p>
@@ -5438,10 +4915,7 @@
     </w:p>
     <w:p>
       <w:r>
-        <w:t>ID: 09-observability-stack | Type: flowchart | Level: Sys</w:t>
-      </w:r>
-      <w:r>
-        <w:t>tem / Component | Date: 2026-02-24</w:t>
+        <w:t>ID: 09-observability-stack | Type: flowchart | Level: System / Component | Date: 2026-02-24</w:t>
       </w:r>
     </w:p>
     <w:p>
@@ -5457,13 +4931,7 @@
         <w:rPr>
           <w:lang w:val="ru-RU"/>
         </w:rPr>
-        <w:t>Материал помогает понять границы ответственности модулей, точки интеграции и зависи</w:t>
-      </w:r>
-      <w:r>
-        <w:rPr>
-          <w:lang w:val="ru-RU"/>
-        </w:rPr>
-        <w:t>мости между компонентами в рамках сценария 09-</w:t>
+        <w:t>Материал помогает понять границы ответственности модулей, точки интеграции и зависимости между компонентами в рамках сценария 09-</w:t>
       </w:r>
       <w:r>
         <w:t>observability</w:t>
@@ -5525,13 +4993,7 @@
         <w:rPr>
           <w:lang w:val="ru-RU"/>
         </w:rPr>
-        <w:t xml:space="preserve"> Это описание задает ожидаемую интерпретацию схемы при техническом ревью и синхронизации документации с</w:t>
-      </w:r>
-      <w:r>
-        <w:rPr>
-          <w:lang w:val="ru-RU"/>
-        </w:rPr>
-        <w:t xml:space="preserve"> кодовой базой. </w:t>
+        <w:t xml:space="preserve"> Это описание задает ожидаемую интерпретацию схемы при техническом ревью и синхронизации документации с кодовой базой. </w:t>
       </w:r>
       <w:r>
         <w:t xml:space="preserve">Ключевые контейнеры/подграфы включают: Domain Ports, Application Observability, Infrastructure: Logging, Infrastructure: Metrics, Infrastructure: Tracing. </w:t>
@@ -5540,34 +5002,16 @@
         <w:rPr>
           <w:lang w:val="ru-RU"/>
         </w:rPr>
-        <w:t>Именно через эти блоки визуализированы границы слоев и маршруты передачи управления и</w:t>
-      </w:r>
-      <w:r>
-        <w:rPr>
-          <w:lang w:val="ru-RU"/>
-        </w:rPr>
-        <w:t xml:space="preserve">ли данных. </w:t>
-      </w:r>
-      <w:r>
-        <w:t>Примеры узлов, отражающих доменную модель и инфраструктуру: Domain Ports, LoggerPort (Protocol) ━━━━━━━━━━━━━━━━━ + bind(**kwargs) + info(msg, **fields) + warning(msg, **fields) + error(msg, **fields) + debug(msg, **fields) + exception(msg, **fi</w:t>
-      </w:r>
-      <w:r>
-        <w:t>elds), MetricsPort (Protocol) ━━━━━━━━━━━━━━━━━ + observe_histogram(name, value, labels) + increment_counter(name, labels) + set_gauge(name, value, labels) + close(), TracingPort (Protocol) ━━━━━━━━━━━━━━━━━ + get_tracer(name) → Tracer + close(), DQMonitor</w:t>
-      </w:r>
-      <w:r>
-        <w:t xml:space="preserve">Port (Protocol) ━━━━━━━━━━━━━━━━━ + add_metric(name, value) + check_quality() + update_baseline_from_metrics(), Application Observability. </w:t>
-      </w:r>
-      <w:r>
-        <w:rPr>
-          <w:lang w:val="ru-RU"/>
-        </w:rPr>
-        <w:t>По этим сущностям можно проверить согласованность терминов, портов и адаптеров между диаграммой и реализацией. В мета</w:t>
-      </w:r>
-      <w:r>
-        <w:rPr>
-          <w:lang w:val="ru-RU"/>
-        </w:rPr>
-        <w:t>данных указана оценка плотности (@</w:t>
+        <w:t xml:space="preserve">Именно через эти блоки визуализированы границы слоев и маршруты передачи управления или данных. </w:t>
+      </w:r>
+      <w:r>
+        <w:t xml:space="preserve">Примеры узлов, отражающих доменную модель и инфраструктуру: Domain Ports, LoggerPort (Protocol) ━━━━━━━━━━━━━━━━━ + bind(**kwargs) + info(msg, **fields) + warning(msg, **fields) + error(msg, **fields) + debug(msg, **fields) + exception(msg, **fields), MetricsPort (Protocol) ━━━━━━━━━━━━━━━━━ + observe_histogram(name, value, labels) + increment_counter(name, labels) + set_gauge(name, value, labels) + close(), TracingPort (Protocol) ━━━━━━━━━━━━━━━━━ + get_tracer(name) → Tracer + close(), DQMonitorPort (Protocol) ━━━━━━━━━━━━━━━━━ + add_metric(name, value) + check_quality() + update_baseline_from_metrics(), Application Observability. </w:t>
+      </w:r>
+      <w:r>
+        <w:rPr>
+          <w:lang w:val="ru-RU"/>
+        </w:rPr>
+        <w:t>По этим сущностям можно проверить согласованность терминов, портов и адаптеров между диаграммой и реализацией. В метаданных указана оценка плотности (@</w:t>
       </w:r>
       <w:r>
         <w:t>nodes</w:t>
@@ -5599,10 +5043,7 @@
     </w:p>
     <w:p>
       <w:r>
-        <w:t>Source: docs/02-architecture/mmd-diagrams/architecture/09-observability-stack.mmd | Description: docs/02-arch</w:t>
-      </w:r>
-      <w:r>
-        <w:t>itecture/diagram-descriptions/mmd-diagrams/architecture/09-observability-stack.md</w:t>
+        <w:t>Source: docs/02-architecture/mmd-diagrams/architecture/09-observability-stack.mmd | Description: docs/02-architecture/diagram-descriptions/mmd-diagrams/architecture/09-observability-stack.md</w:t>
       </w:r>
     </w:p>
     <w:p>
@@ -5670,10 +5111,7 @@
         </w:rPr>
       </w:pPr>
       <w:r>
-        <w:t>Описание: Диаграмма Observability: Applica</w:t>
-      </w:r>
-      <w:r>
-        <w:t xml:space="preserve">tion Layer показывает архитектурный срез BioETL на уровне System / Component и использует нотацию flowchart. </w:t>
+        <w:t xml:space="preserve">Описание: Диаграмма Observability: Application Layer показывает архитектурный срез BioETL на уровне System / Component и использует нотацию flowchart. </w:t>
       </w:r>
       <w:r>
         <w:rPr>
@@ -5723,13 +5161,7 @@
         <w:rPr>
           <w:lang w:val="ru-RU"/>
         </w:rPr>
-        <w:t>Это описание задает ожидаемую интерпретацию схемы при техническом ревью и синхронизации документации с кодовой базой</w:t>
-      </w:r>
-      <w:r>
-        <w:rPr>
-          <w:lang w:val="ru-RU"/>
-        </w:rPr>
-        <w:t xml:space="preserve">. </w:t>
+        <w:t xml:space="preserve">Это описание задает ожидаемую интерпретацию схемы при техническом ревью и синхронизации документации с кодовой базой. </w:t>
       </w:r>
       <w:r>
         <w:t xml:space="preserve">Ключевые контейнеры/подграфы включают: Domain Ports, Application Observability, Adapter-Level Metrics. </w:t>
@@ -5738,13 +5170,7 @@
         <w:rPr>
           <w:lang w:val="ru-RU"/>
         </w:rPr>
-        <w:t>Именно через эти блоки визуализированы границы слоев и маршруты передачи управления или данных. Примеры узлов, отражающих доменную модель и инфраструкт</w:t>
-      </w:r>
-      <w:r>
-        <w:rPr>
-          <w:lang w:val="ru-RU"/>
-        </w:rPr>
-        <w:t xml:space="preserve">уру: </w:t>
+        <w:t xml:space="preserve">Именно через эти блоки визуализированы границы слоев и маршруты передачи управления или данных. Примеры узлов, отражающих доменную модель и инфраструктуру: </w:t>
       </w:r>
       <w:r>
         <w:t>Domain</w:t>
@@ -5852,13 +5278,7 @@
         <w:rPr>
           <w:lang w:val="ru-RU"/>
         </w:rPr>
-        <w:t xml:space="preserve">. По этим сущностям можно проверить согласованность терминов, портов и адаптеров между диаграммой и реализацией. В </w:t>
-      </w:r>
-      <w:r>
-        <w:rPr>
-          <w:lang w:val="ru-RU"/>
-        </w:rPr>
-        <w:t>метаданных указана оценка плотности (@</w:t>
+        <w:t>. По этим сущностям можно проверить согласованность терминов, портов и адаптеров между диаграммой и реализацией. В метаданных указана оценка плотности (@</w:t>
       </w:r>
       <w:r>
         <w:t>nodes</w:t>
@@ -5890,10 +5310,7 @@
     </w:p>
     <w:p>
       <w:r>
-        <w:t>Source: docs/02-architecture/mmd-diagrams/architecture/09a-observability-app.mmd | Description: docs/02-ar</w:t>
-      </w:r>
-      <w:r>
-        <w:t>chitecture/diagram-descriptions/mmd-diagrams/architecture/09a-observability-app.md</w:t>
+        <w:t>Source: docs/02-architecture/mmd-diagrams/architecture/09a-observability-app.mmd | Description: docs/02-architecture/diagram-descriptions/mmd-diagrams/architecture/09a-observability-app.md</w:t>
       </w:r>
     </w:p>
     <w:p>
@@ -5967,13 +5384,7 @@
         <w:rPr>
           <w:lang w:val="ru-RU"/>
         </w:rPr>
-        <w:t>Материал помогает понять границы ответственности модулей, точки интеграции и зависимости между компоне</w:t>
-      </w:r>
-      <w:r>
-        <w:rPr>
-          <w:lang w:val="ru-RU"/>
-        </w:rPr>
-        <w:t>нтами в рамках сценария 09</w:t>
+        <w:t>Материал помогает понять границы ответственности модулей, точки интеграции и зависимости между компонентами в рамках сценария 09</w:t>
       </w:r>
       <w:r>
         <w:t>b</w:t>
@@ -6017,13 +5428,7 @@
         <w:rPr>
           <w:lang w:val="ru-RU"/>
         </w:rPr>
-        <w:t>Это описание задает ожидаемую интерпретацию схемы при техническо</w:t>
-      </w:r>
-      <w:r>
-        <w:rPr>
-          <w:lang w:val="ru-RU"/>
-        </w:rPr>
-        <w:t xml:space="preserve">м ревью и синхронизации документации с кодовой базой. </w:t>
+        <w:t xml:space="preserve">Это описание задает ожидаемую интерпретацию схемы при техническом ревью и синхронизации документации с кодовой базой. </w:t>
       </w:r>
       <w:r>
         <w:t xml:space="preserve">Ключевые контейнеры/подграфы включают: Infrastructure: Logging, Infrastructure: Metrics, Infrastructure: Tracing, Infrastructure: Anomaly Detection, External Systems. </w:t>
@@ -6032,13 +5437,7 @@
         <w:rPr>
           <w:lang w:val="ru-RU"/>
         </w:rPr>
-        <w:t>Именно через эти блоки визуализиров</w:t>
-      </w:r>
-      <w:r>
-        <w:rPr>
-          <w:lang w:val="ru-RU"/>
-        </w:rPr>
-        <w:t xml:space="preserve">аны границы слоев и маршруты передачи управления или данных. Примеры узлов, отражающих доменную модель и инфраструктуру: </w:t>
+        <w:t xml:space="preserve">Именно через эти блоки визуализированы границы слоев и маршруты передачи управления или данных. Примеры узлов, отражающих доменную модель и инфраструктуру: </w:t>
       </w:r>
       <w:r>
         <w:t>Infrastructure</w:t>
@@ -6131,10 +5530,7 @@
         <w:t xml:space="preserve">), </w:t>
       </w:r>
       <w:r>
-        <w:t>PrometheusMetri</w:t>
-      </w:r>
-      <w:r>
-        <w:t>cs</w:t>
+        <w:t>PrometheusMetrics</w:t>
       </w:r>
       <w:r>
         <w:rPr>
@@ -6176,13 +5572,7 @@
         <w:rPr>
           <w:lang w:val="ru-RU"/>
         </w:rPr>
-        <w:t>=13), что полезно для контроля читаемости, декомпозиции</w:t>
-      </w:r>
-      <w:r>
-        <w:rPr>
-          <w:lang w:val="ru-RU"/>
-        </w:rPr>
-        <w:t xml:space="preserve"> </w:t>
+        <w:t xml:space="preserve">=13), что полезно для контроля читаемости, декомпозиции </w:t>
       </w:r>
       <w:r>
         <w:t>view</w:t>
@@ -6279,13 +5669,7 @@
         <w:rPr>
           <w:lang w:val="ru-RU"/>
         </w:rPr>
-        <w:t>Ма</w:t>
-      </w:r>
-      <w:r>
-        <w:rPr>
-          <w:lang w:val="ru-RU"/>
-        </w:rPr>
-        <w:t>териал помогает понять границы ответственности модулей, точки интеграции и зависимости между компонентами в рамках сценария 10-</w:t>
+        <w:t>Материал помогает понять границы ответственности модулей, точки интеграции и зависимости между компонентами в рамках сценария 10-</w:t>
       </w:r>
       <w:r>
         <w:t>resilience</w:t>
@@ -6323,10 +5707,7 @@
         <w:t xml:space="preserve">Это описание задает ожидаемую интерпретацию схемы при техническом ревью и синхронизации документации с кодовой базой. </w:t>
       </w:r>
       <w:r>
-        <w:t>Ключевые контейнеры/подграфы включают: Domain Ports, Circuit Breaker Pattern, State Machine, Rate Limiter (Token Bucket), Provider Rate Li</w:t>
-      </w:r>
-      <w:r>
-        <w:t xml:space="preserve">mits. </w:t>
+        <w:t xml:space="preserve">Ключевые контейнеры/подграфы включают: Domain Ports, Circuit Breaker Pattern, State Machine, Rate Limiter (Token Bucket), Provider Rate Limits. </w:t>
       </w:r>
       <w:r>
         <w:rPr>
@@ -6343,22 +5724,13 @@
       </w:r>
       <w:proofErr w:type="gramEnd"/>
       <w:r>
-        <w:t>) + call(fn), RateLimiterPort</w:t>
-      </w:r>
-      <w:r>
-        <w:t xml:space="preserve"> (Protocol) -------- + acquire(tokens) + try_acquire(), HealthCheckPort (Protocol) -------- + check_health(), Circuit Breaker Pattern, CircuitBreaker -------- provider failure_threshold recovery_timeout. </w:t>
-      </w:r>
-      <w:r>
-        <w:rPr>
-          <w:lang w:val="ru-RU"/>
-        </w:rPr>
-        <w:t>По этим сущностям можно проверить согласованность те</w:t>
-      </w:r>
-      <w:r>
-        <w:rPr>
-          <w:lang w:val="ru-RU"/>
-        </w:rPr>
-        <w:t>рминов, портов и адаптеров между диаграммой и реализацией. В метаданных указана оценка плотности (@</w:t>
+        <w:t xml:space="preserve">) + call(fn), RateLimiterPort (Protocol) -------- + acquire(tokens) + try_acquire(), HealthCheckPort (Protocol) -------- + check_health(), Circuit Breaker Pattern, CircuitBreaker -------- provider failure_threshold recovery_timeout. </w:t>
+      </w:r>
+      <w:r>
+        <w:rPr>
+          <w:lang w:val="ru-RU"/>
+        </w:rPr>
+        <w:t>По этим сущностям можно проверить согласованность терминов, портов и адаптеров между диаграммой и реализацией. В метаданных указана оценка плотности (@</w:t>
       </w:r>
       <w:r>
         <w:t>nodes</w:t>
@@ -6390,10 +5762,7 @@
     </w:p>
     <w:p>
       <w:r>
-        <w:t>Source: docs/02-architecture/mmd-diagrams/ar</w:t>
-      </w:r>
-      <w:r>
-        <w:t>chitecture/10-resilience-patterns.mmd | Description: docs/02-architecture/diagram-descriptions/mmd-diagrams/architecture/10-resilience-patterns.md</w:t>
+        <w:t>Source: docs/02-architecture/mmd-diagrams/architecture/10-resilience-patterns.mmd | Description: docs/02-architecture/diagram-descriptions/mmd-diagrams/architecture/10-resilience-patterns.md</w:t>
       </w:r>
     </w:p>
     <w:p>
@@ -6451,10 +5820,7 @@
     </w:p>
     <w:p>
       <w:r>
-        <w:t>ID: 11-configuration-system | Type: flowchart | Level: System / Component | Date</w:t>
-      </w:r>
-      <w:r>
-        <w:t>: 2026-02-27</w:t>
+        <w:t>ID: 11-configuration-system | Type: flowchart | Level: System / Component | Date: 2026-02-27</w:t>
       </w:r>
     </w:p>
     <w:p>
@@ -6470,13 +5836,7 @@
         <w:rPr>
           <w:lang w:val="ru-RU"/>
         </w:rPr>
-        <w:t>Материал помогает понять границы ответственности модулей, точки интеграции и зависимости между компонент</w:t>
-      </w:r>
-      <w:r>
-        <w:rPr>
-          <w:lang w:val="ru-RU"/>
-        </w:rPr>
-        <w:t>ами в рамках сценария 11-</w:t>
+        <w:t>Материал помогает понять границы ответственности модулей, точки интеграции и зависимости между компонентами в рамках сценария 11-</w:t>
       </w:r>
       <w:r>
         <w:t>configuration</w:t>
@@ -6511,13 +5871,7 @@
         <w:rPr>
           <w:lang w:val="ru-RU"/>
         </w:rPr>
-        <w:t xml:space="preserve">Это описание задает ожидаемую интерпретацию схемы при техническом ревью и синхронизации </w:t>
-      </w:r>
-      <w:r>
-        <w:rPr>
-          <w:lang w:val="ru-RU"/>
-        </w:rPr>
-        <w:t xml:space="preserve">документации с кодовой базой. </w:t>
+        <w:t xml:space="preserve">Это описание задает ожидаемую интерпретацию схемы при техническом ревью и синхронизации документации с кодовой базой. </w:t>
       </w:r>
       <w:r>
         <w:t xml:space="preserve">Ключевые контейнеры/подграфы включают: YAML Config Files, Infrastructure Config Loaders, Infrastructure Schemas (Pydantic), Domain Configuration, Composite Domain Config. </w:t>
@@ -6526,13 +5880,7 @@
         <w:rPr>
           <w:lang w:val="ru-RU"/>
         </w:rPr>
-        <w:t xml:space="preserve">Именно через эти блоки визуализированы границы слоев и </w:t>
-      </w:r>
-      <w:r>
-        <w:rPr>
-          <w:lang w:val="ru-RU"/>
-        </w:rPr>
-        <w:t xml:space="preserve">маршруты передачи управления или данных. Примеры узлов, отражающих доменную модель и инфраструктуру: </w:t>
+        <w:t xml:space="preserve">Именно через эти блоки визуализированы границы слоев и маршруты передачи управления или данных. Примеры узлов, отражающих доменную модель и инфраструктуру: </w:t>
       </w:r>
       <w:r>
         <w:t>YAML</w:t>
@@ -6720,13 +6068,7 @@
         <w:rPr>
           <w:lang w:val="ru-RU"/>
         </w:rPr>
-        <w:t>/*</w:t>
-      </w:r>
-      <w:r>
-        <w:rPr>
-          <w:lang w:val="ru-RU"/>
-        </w:rPr>
-        <w:t>.</w:t>
+        <w:t>/*.</w:t>
       </w:r>
       <w:r>
         <w:t>yaml</w:t>
@@ -6816,13 +6158,7 @@
         <w:rPr>
           <w:lang w:val="ru-RU"/>
         </w:rPr>
-        <w:t>=29), что полезно для контроля чи</w:t>
-      </w:r>
-      <w:r>
-        <w:rPr>
-          <w:lang w:val="ru-RU"/>
-        </w:rPr>
-        <w:t xml:space="preserve">таемости, декомпозиции </w:t>
+        <w:t xml:space="preserve">=29), что полезно для контроля читаемости, декомпозиции </w:t>
       </w:r>
       <w:r>
         <w:t>view</w:t>
@@ -6845,10 +6181,7 @@
     </w:p>
     <w:p>
       <w:r>
-        <w:t>Source: docs/02-architecture/mmd-diagrams/architecture/11-configuration-system.mmd | Description: docs/02-architecture/diagram-descriptions/mmd-diagrams/architecture/11-configuratio</w:t>
-      </w:r>
-      <w:r>
-        <w:t>n-system.md</w:t>
+        <w:t>Source: docs/02-architecture/mmd-diagrams/architecture/11-configuration-system.mmd | Description: docs/02-architecture/diagram-descriptions/mmd-diagrams/architecture/11-configuration-system.md</w:t>
       </w:r>
     </w:p>
     <w:p>
@@ -6916,10 +6249,7 @@
         </w:rPr>
       </w:pPr>
       <w:r>
-        <w:t>Описание: Диаграмма Configuration: Loading Pipeline показывает архитектурный срез BioETL на уровне System / Componen</w:t>
-      </w:r>
-      <w:r>
-        <w:t xml:space="preserve">t и использует нотацию flowchart. </w:t>
+        <w:t xml:space="preserve">Описание: Диаграмма Configuration: Loading Pipeline показывает архитектурный срез BioETL на уровне System / Component и использует нотацию flowchart. </w:t>
       </w:r>
       <w:r>
         <w:rPr>
@@ -6955,10 +6285,7 @@
         <w:t xml:space="preserve">. </w:t>
       </w:r>
       <w:r>
-        <w:t>В исходном файле прямо зафиксирован контекст: YAML files, config loaders, an</w:t>
-      </w:r>
-      <w:r>
-        <w:t>d infrastructure schemas (Pydantic validation</w:t>
+        <w:t>В исходном файле прямо зафиксирован контекст: YAML files, config loaders, and infrastructure schemas (Pydantic validation</w:t>
       </w:r>
       <w:proofErr w:type="gramStart"/>
       <w:r>
@@ -6975,10 +6302,7 @@
         <w:t xml:space="preserve">Это описание задает ожидаемую интерпретацию схемы при техническом ревью и синхронизации документации с кодовой базой. </w:t>
       </w:r>
       <w:r>
-        <w:t xml:space="preserve">Ключевые контейнеры/подграфы включают: YAML Config Files, Infrastructure Config Loaders, </w:t>
-      </w:r>
-      <w:r>
-        <w:t xml:space="preserve">Infrastructure Schemas (Pydantic). </w:t>
+        <w:t xml:space="preserve">Ключевые контейнеры/подграфы включают: YAML Config Files, Infrastructure Config Loaders, Infrastructure Schemas (Pydantic). </w:t>
       </w:r>
       <w:r>
         <w:rPr>
@@ -7067,10 +6391,7 @@
         <w:t>/*.</w:t>
       </w:r>
       <w:r>
-        <w:t>y</w:t>
-      </w:r>
-      <w:r>
-        <w:t>aml</w:t>
+        <w:t>yaml</w:t>
       </w:r>
       <w:r>
         <w:rPr>
@@ -7175,13 +6496,7 @@
         <w:rPr>
           <w:lang w:val="ru-RU"/>
         </w:rPr>
-        <w:t>=13), что полез</w:t>
-      </w:r>
-      <w:r>
-        <w:rPr>
-          <w:lang w:val="ru-RU"/>
-        </w:rPr>
-        <w:t xml:space="preserve">но для контроля читаемости, декомпозиции </w:t>
+        <w:t xml:space="preserve">=13), что полезно для контроля читаемости, декомпозиции </w:t>
       </w:r>
       <w:r>
         <w:t>view</w:t>
@@ -7204,10 +6519,7 @@
     </w:p>
     <w:p>
       <w:r>
-        <w:t>Source: docs/02-architecture/mmd-diagrams/architecture/11a-config-loading.mmd | Description: docs/02-architecture/diagram-descriptions/mmd-diagrams/architecture/11</w:t>
-      </w:r>
-      <w:r>
-        <w:t>a-config-loading.md</w:t>
+        <w:t>Source: docs/02-architecture/mmd-diagrams/architecture/11a-config-loading.mmd | Description: docs/02-architecture/diagram-descriptions/mmd-diagrams/architecture/11a-config-loading.md</w:t>
       </w:r>
     </w:p>
     <w:p>
@@ -7275,10 +6587,7 @@
         </w:rPr>
       </w:pPr>
       <w:r>
-        <w:t>Описание: Диаграмма Configuration: Domain &amp; Application Config показывает архитектурный срез BioET</w:t>
-      </w:r>
-      <w:r>
-        <w:t xml:space="preserve">L на уровне System / Component и использует нотацию flowchart. </w:t>
+        <w:t xml:space="preserve">Описание: Диаграмма Configuration: Domain &amp; Application Config показывает архитектурный срез BioETL на уровне System / Component и использует нотацию flowchart. </w:t>
       </w:r>
       <w:r>
         <w:rPr>
@@ -7314,10 +6623,7 @@
         <w:t xml:space="preserve">. </w:t>
       </w:r>
       <w:r>
-        <w:t>В исходном файле прямо зафиксирован контекст: Do</w:t>
-      </w:r>
-      <w:r>
-        <w:t xml:space="preserve">main config objects, composite config, application config, and infrastructure </w:t>
+        <w:t xml:space="preserve">В исходном файле прямо зафиксирован контекст: Domain config objects, composite config, application config, and infrastructure </w:t>
       </w:r>
       <w:proofErr w:type="gramStart"/>
       <w:r>
@@ -7334,22 +6640,13 @@
         <w:t xml:space="preserve">Это описание задает ожидаемую интерпретацию схемы при техническом ревью и синхронизации документации с кодовой базой. </w:t>
       </w:r>
       <w:r>
-        <w:t>Ключевые контейнеры/подграфы включают: Infrastruc</w:t>
-      </w:r>
-      <w:r>
-        <w:t xml:space="preserve">ture Schemas, Domain Configuration, Composite Domain Config, Application Config, Infrastructure Settings. </w:t>
-      </w:r>
-      <w:r>
-        <w:rPr>
-          <w:lang w:val="ru-RU"/>
-        </w:rPr>
-        <w:t>Именно через эти блоки визуализированы границы слоев и маршруты передачи управления или данных. Примеры узлов, отражающих доменную модель и инфраструк</w:t>
-      </w:r>
-      <w:r>
-        <w:rPr>
-          <w:lang w:val="ru-RU"/>
-        </w:rPr>
-        <w:t xml:space="preserve">туру: </w:t>
+        <w:t xml:space="preserve">Ключевые контейнеры/подграфы включают: Infrastructure Schemas, Domain Configuration, Composite Domain Config, Application Config, Infrastructure Settings. </w:t>
+      </w:r>
+      <w:r>
+        <w:rPr>
+          <w:lang w:val="ru-RU"/>
+        </w:rPr>
+        <w:t xml:space="preserve">Именно через эти блоки визуализированы границы слоев и маршруты передачи управления или данных. Примеры узлов, отражающих доменную модель и инфраструктуру: </w:t>
       </w:r>
       <w:r>
         <w:t>Infrastructure</w:t>
@@ -7421,13 +6718,7 @@
         <w:rPr>
           <w:lang w:val="ru-RU"/>
         </w:rPr>
-        <w:t>. По этим сущностям можно проверить согласованность терминов, портов и адаптеров между диаграммой и реализацией. В метаданных указана о</w:t>
-      </w:r>
-      <w:r>
-        <w:rPr>
-          <w:lang w:val="ru-RU"/>
-        </w:rPr>
-        <w:t>ценка плотности (@</w:t>
+        <w:t>. По этим сущностям можно проверить согласованность терминов, портов и адаптеров между диаграммой и реализацией. В метаданных указана оценка плотности (@</w:t>
       </w:r>
       <w:r>
         <w:t>nodes</w:t>
@@ -7459,10 +6750,7 @@
     </w:p>
     <w:p>
       <w:r>
-        <w:t>Source: docs/02-architecture/mmd-diagrams/architecture/11b-config-domain.mmd | Description: docs/02-architecture/diagram-desc</w:t>
-      </w:r>
-      <w:r>
-        <w:t>riptions/mmd-diagrams/architecture/11b-config-domain.md</w:t>
+        <w:t>Source: docs/02-architecture/mmd-diagrams/architecture/11b-config-domain.mmd | Description: docs/02-architecture/diagram-descriptions/mmd-diagrams/architecture/11b-config-domain.md</w:t>
       </w:r>
     </w:p>
     <w:p>
@@ -7536,13 +6824,7 @@
         <w:rPr>
           <w:lang w:val="ru-RU"/>
         </w:rPr>
-        <w:t>Материал помогает понять границы ответственности модулей, точки интеграции и зависимости между</w:t>
-      </w:r>
-      <w:r>
-        <w:rPr>
-          <w:lang w:val="ru-RU"/>
-        </w:rPr>
-        <w:t xml:space="preserve"> компонентами в рамках сценария 12-</w:t>
+        <w:t>Материал помогает понять границы ответственности модулей, точки интеграции и зависимости между компонентами в рамках сценария 12-</w:t>
       </w:r>
       <w:r>
         <w:t>bootstrap</w:t>
@@ -7586,13 +6868,7 @@
         <w:rPr>
           <w:lang w:val="ru-RU"/>
         </w:rPr>
-        <w:t>Это описание задает ожидаемую интерпретацию схемы при техническом ревью и синхронизации докум</w:t>
-      </w:r>
-      <w:r>
-        <w:rPr>
-          <w:lang w:val="ru-RU"/>
-        </w:rPr>
-        <w:t xml:space="preserve">ентации с кодовой базой. </w:t>
+        <w:t xml:space="preserve">Это описание задает ожидаемую интерпретацию схемы при техническом ревью и синхронизации документации с кодовой базой. </w:t>
       </w:r>
       <w:r>
         <w:t xml:space="preserve">Ключевые контейнеры/подграфы включают: Entry Points, composition layer, Bootstrap Assembly, Factories, Provider Registry. </w:t>
@@ -7601,13 +6877,7 @@
         <w:rPr>
           <w:lang w:val="ru-RU"/>
         </w:rPr>
-        <w:t>Именно через эти блоки визуализированы границы слоев и маршруты передачи управления или данных. Примеры узлов</w:t>
-      </w:r>
-      <w:r>
-        <w:rPr>
-          <w:lang w:val="ru-RU"/>
-        </w:rPr>
-        <w:t xml:space="preserve">, отражающих доменную модель и инфраструктуру: </w:t>
+        <w:t xml:space="preserve">Именно через эти блоки визуализированы границы слоев и маршруты передачи управления или данных. Примеры узлов, отражающих доменную модель и инфраструктуру: </w:t>
       </w:r>
       <w:r>
         <w:t>Entry</w:t>
@@ -7813,13 +7083,7 @@
         <w:rPr>
           <w:lang w:val="ru-RU"/>
         </w:rPr>
-        <w:t xml:space="preserve"> По </w:t>
-      </w:r>
-      <w:r>
-        <w:rPr>
-          <w:lang w:val="ru-RU"/>
-        </w:rPr>
-        <w:t>этим сущностям можно проверить согласованность терминов, портов и адаптеров между диаграммой и реализацией. В метаданных указана оценка плотности (@</w:t>
+        <w:t xml:space="preserve"> По этим сущностям можно проверить согласованность терминов, портов и адаптеров между диаграммой и реализацией. В метаданных указана оценка плотности (@</w:t>
       </w:r>
       <w:r>
         <w:t>nodes</w:t>
@@ -7846,13 +7110,7 @@
         <w:rPr>
           <w:lang w:val="ru-RU"/>
         </w:rPr>
-        <w:t>-пайпла</w:t>
-      </w:r>
-      <w:r>
-        <w:rPr>
-          <w:lang w:val="ru-RU"/>
-        </w:rPr>
-        <w:t>йне.</w:t>
+        <w:t>-пайплайне.</w:t>
       </w:r>
     </w:p>
     <w:p>
@@ -7915,10 +7173,7 @@
     </w:p>
     <w:p>
       <w:r>
-        <w:t>ID: 12a-bo</w:t>
-      </w:r>
-      <w:r>
-        <w:t>otstrap-factories | Type: flowchart | Level: System / Component | Date: 2026-02-25</w:t>
+        <w:t>ID: 12a-bootstrap-factories | Type: flowchart | Level: System / Component | Date: 2026-02-25</w:t>
       </w:r>
     </w:p>
     <w:p>
@@ -7934,13 +7189,7 @@
         <w:rPr>
           <w:lang w:val="ru-RU"/>
         </w:rPr>
-        <w:t>Материал помогает п</w:t>
-      </w:r>
-      <w:r>
-        <w:rPr>
-          <w:lang w:val="ru-RU"/>
-        </w:rPr>
-        <w:t>онять границы ответственности модулей, точки интеграции и зависимости между компонентами в рамках сценария 12</w:t>
+        <w:t>Материал помогает понять границы ответственности модулей, точки интеграции и зависимости между компонентами в рамках сценария 12</w:t>
       </w:r>
       <w:r>
         <w:t>a</w:t>
@@ -7984,13 +7233,7 @@
         <w:rPr>
           <w:lang w:val="ru-RU"/>
         </w:rPr>
-        <w:t>Э</w:t>
-      </w:r>
-      <w:r>
-        <w:rPr>
-          <w:lang w:val="ru-RU"/>
-        </w:rPr>
-        <w:t xml:space="preserve">то описание задает ожидаемую интерпретацию схемы при техническом ревью и синхронизации документации с кодовой базой. Ключевые контейнеры/подграфы включают: </w:t>
+        <w:t xml:space="preserve">Это описание задает ожидаемую интерпретацию схемы при техническом ревью и синхронизации документации с кодовой базой. Ключевые контейнеры/подграфы включают: </w:t>
       </w:r>
       <w:r>
         <w:t>Interfaces</w:t>
@@ -8026,13 +7269,7 @@
         <w:rPr>
           <w:lang w:val="ru-RU"/>
         </w:rPr>
-        <w:t>. Именно через эти блоки визуализированы границы слоев и маршруты</w:t>
-      </w:r>
-      <w:r>
-        <w:rPr>
-          <w:lang w:val="ru-RU"/>
-        </w:rPr>
-        <w:t xml:space="preserve"> передачи управления или данных. </w:t>
+        <w:t xml:space="preserve">. Именно через эти блоки визуализированы границы слоев и маршруты передачи управления или данных. </w:t>
       </w:r>
       <w:r>
         <w:t xml:space="preserve">Примеры узлов, отражающих доменную модель и инфраструктуру: Interfaces Layer, CLI Commands (Click), HTTP Interface, Composition Layer, bootstrap_pipeline_runner, DataSourceRegistry. </w:t>
@@ -8041,13 +7278,7 @@
         <w:rPr>
           <w:lang w:val="ru-RU"/>
         </w:rPr>
-        <w:t>По этим сущностям можно проверить согласо</w:t>
-      </w:r>
-      <w:r>
-        <w:rPr>
-          <w:lang w:val="ru-RU"/>
-        </w:rPr>
-        <w:t>ванность терминов, портов и адаптеров между диаграммой и реализацией. В метаданных указана оценка плотности (@</w:t>
+        <w:t>По этим сущностям можно проверить согласованность терминов, портов и адаптеров между диаграммой и реализацией. В метаданных указана оценка плотности (@</w:t>
       </w:r>
       <w:r>
         <w:t>nodes</w:t>
@@ -8079,10 +7310,7 @@
     </w:p>
     <w:p>
       <w:r>
-        <w:t>Source: docs/02-architecture/mmd-</w:t>
-      </w:r>
-      <w:r>
-        <w:t>diagrams/architecture/12a-bootstrap-factories.mmd | Description: docs/02-architecture/diagram-descriptions/mmd-diagrams/architecture/12a-bootstrap-factories.md</w:t>
+        <w:t>Source: docs/02-architecture/mmd-diagrams/architecture/12a-bootstrap-factories.mmd | Description: docs/02-architecture/diagram-descriptions/mmd-diagrams/architecture/12a-bootstrap-factories.md</w:t>
       </w:r>
     </w:p>
     <w:p>
@@ -8140,10 +7368,7 @@
     </w:p>
     <w:p>
       <w:r>
-        <w:t>ID: 12b-bootstrap-wiring | Type: flowchart | Level: System / Com</w:t>
-      </w:r>
-      <w:r>
-        <w:t>ponent | Date: 2026-02-25</w:t>
+        <w:t>ID: 12b-bootstrap-wiring | Type: flowchart | Level: System / Component | Date: 2026-02-25</w:t>
       </w:r>
     </w:p>
     <w:p>
@@ -8159,13 +7384,7 @@
         <w:rPr>
           <w:lang w:val="ru-RU"/>
         </w:rPr>
-        <w:t>Материал помогает понять границы ответственности модулей, точки интеграции и зависимости</w:t>
-      </w:r>
-      <w:r>
-        <w:rPr>
-          <w:lang w:val="ru-RU"/>
-        </w:rPr>
-        <w:t xml:space="preserve"> между компонентами в рамках сценария 12</w:t>
+        <w:t>Материал помогает понять границы ответственности модулей, точки интеграции и зависимости между компонентами в рамках сценария 12</w:t>
       </w:r>
       <w:r>
         <w:t>b</w:t>
@@ -8209,13 +7428,7 @@
         <w:rPr>
           <w:lang w:val="ru-RU"/>
         </w:rPr>
-        <w:t>Это описание задает ожидаемую интерпретацию схемы при техническом ревью и синхр</w:t>
-      </w:r>
-      <w:r>
-        <w:rPr>
-          <w:lang w:val="ru-RU"/>
-        </w:rPr>
-        <w:t xml:space="preserve">онизации документации с кодовой базой. </w:t>
+        <w:t xml:space="preserve">Это описание задает ожидаемую интерпретацию схемы при техническом ревью и синхронизации документации с кодовой базой. </w:t>
       </w:r>
       <w:r>
         <w:t xml:space="preserve">Ключевые контейнеры/подграфы включают: Composition Layer, Infrastructure Layer, Application Layer. </w:t>
@@ -8224,13 +7437,7 @@
         <w:rPr>
           <w:lang w:val="ru-RU"/>
         </w:rPr>
-        <w:t>Именно через эти блоки визуализированы границы слоев и маршруты передачи управления или данных. Примеры узлов, отражаю</w:t>
-      </w:r>
-      <w:r>
-        <w:rPr>
-          <w:lang w:val="ru-RU"/>
-        </w:rPr>
-        <w:t xml:space="preserve">щих доменную модель и инфраструктуру: </w:t>
+        <w:t xml:space="preserve">Именно через эти блоки визуализированы границы слоев и маршруты передачи управления или данных. Примеры узлов, отражающих доменную модель и инфраструктуру: </w:t>
       </w:r>
       <w:r>
         <w:t>Composition</w:t>
@@ -8311,13 +7518,7 @@
         <w:rPr>
           <w:lang w:val="ru-RU"/>
         </w:rPr>
-        <w:t>. По этим сущностям можно проверить согласованность терминов, портов и адаптеров между диаграммой и реа</w:t>
-      </w:r>
-      <w:r>
-        <w:rPr>
-          <w:lang w:val="ru-RU"/>
-        </w:rPr>
-        <w:t>лизацией. В метаданных указана оценка плотности (@</w:t>
+        <w:t>. По этим сущностям можно проверить согласованность терминов, портов и адаптеров между диаграммой и реализацией. В метаданных указана оценка плотности (@</w:t>
       </w:r>
       <w:r>
         <w:t>nodes</w:t>
@@ -8349,10 +7550,7 @@
     </w:p>
     <w:p>
       <w:r>
-        <w:t>Source: docs/02-architecture/mmd-diagrams/architecture/12b-bootstrap-wiring.mmd | Description</w:t>
-      </w:r>
-      <w:r>
-        <w:t>: docs/02-architecture/diagram-descriptions/mmd-diagrams/architecture/12b-bootstrap-wiring.md</w:t>
+        <w:t>Source: docs/02-architecture/mmd-diagrams/architecture/12b-bootstrap-wiring.mmd | Description: docs/02-architecture/diagram-descriptions/mmd-diagrams/architecture/12b-bootstrap-wiring.md</w:t>
       </w:r>
     </w:p>
     <w:p>
@@ -8426,13 +7624,7 @@
         <w:rPr>
           <w:lang w:val="ru-RU"/>
         </w:rPr>
-        <w:t>Материал помогает понять границы ответственности модулей, точки интеграции и зависимости между компонен</w:t>
-      </w:r>
-      <w:r>
-        <w:rPr>
-          <w:lang w:val="ru-RU"/>
-        </w:rPr>
-        <w:t>тами в рамках сценария 13-</w:t>
+        <w:t>Материал помогает понять границы ответственности модулей, точки интеграции и зависимости между компонентами в рамках сценария 13-</w:t>
       </w:r>
       <w:r>
         <w:t>port</w:t>
@@ -8476,13 +7668,7 @@
         <w:rPr>
           <w:lang w:val="ru-RU"/>
         </w:rPr>
-        <w:t>Это описание задает ожидаемую интерпретацию схемы при техническом ревью и синхронизации документаци</w:t>
-      </w:r>
-      <w:r>
-        <w:rPr>
-          <w:lang w:val="ru-RU"/>
-        </w:rPr>
-        <w:t xml:space="preserve">и с кодовой базой. </w:t>
+        <w:t xml:space="preserve">Это описание задает ожидаемую интерпретацию схемы при техническом ревью и синхронизации документации с кодовой базой. </w:t>
       </w:r>
       <w:r>
         <w:t xml:space="preserve">Ключевые контейнеры/подграфы включают: Domain Ports (Protocols), Infrastructure Implementations, Application Implementations. </w:t>
@@ -8491,13 +7677,7 @@
         <w:rPr>
           <w:lang w:val="ru-RU"/>
         </w:rPr>
-        <w:t xml:space="preserve">Именно через эти блоки визуализированы границы слоев и маршруты передачи управления или данных. Примеры узлов, </w:t>
-      </w:r>
-      <w:r>
-        <w:rPr>
-          <w:lang w:val="ru-RU"/>
-        </w:rPr>
-        <w:t xml:space="preserve">отражающих доменную модель и инфраструктуру: </w:t>
+        <w:t xml:space="preserve">Именно через эти блоки визуализированы границы слоев и маршруты передачи управления или данных. Примеры узлов, отражающих доменную модель и инфраструктуру: </w:t>
       </w:r>
       <w:r>
         <w:t>Domain</w:t>
@@ -8569,13 +7749,7 @@
         <w:rPr>
           <w:lang w:val="ru-RU"/>
         </w:rPr>
-        <w:t>. По этим сущностям можно проверить согласованность терминов, портов и адаптеров между диаграммой и реализ</w:t>
-      </w:r>
-      <w:r>
-        <w:rPr>
-          <w:lang w:val="ru-RU"/>
-        </w:rPr>
-        <w:t>ацией. В метаданных указана оценка плотности (@</w:t>
+        <w:t>. По этим сущностям можно проверить согласованность терминов, портов и адаптеров между диаграммой и реализацией. В метаданных указана оценка плотности (@</w:t>
       </w:r>
       <w:r>
         <w:t>nodes</w:t>
@@ -8607,10 +7781,7 @@
     </w:p>
     <w:p>
       <w:r>
-        <w:t>Source: docs/02-architecture/mmd-diagrams/architecture/13-port-protocol-contracts.mmd | Descript</w:t>
-      </w:r>
-      <w:r>
-        <w:t>ion: docs/02-architecture/diagram-descriptions/mmd-diagrams/architecture/13-port-protocol-contracts.md</w:t>
+        <w:t>Source: docs/02-architecture/mmd-diagrams/architecture/13-port-protocol-contracts.mmd | Description: docs/02-architecture/diagram-descriptions/mmd-diagrams/architecture/13-port-protocol-contracts.md</w:t>
       </w:r>
     </w:p>
     <w:p>
@@ -8678,10 +7849,7 @@
         </w:rPr>
       </w:pPr>
       <w:r>
-        <w:t>Описание: Диаграмма Data</w:t>
-      </w:r>
-      <w:r>
-        <w:t xml:space="preserve">Source and Storage Ports показывает архитектурный срез BioETL на уровне System / Component и использует нотацию flowchart. </w:t>
+        <w:t xml:space="preserve">Описание: Диаграмма DataSource and Storage Ports показывает архитектурный срез BioETL на уровне System / Component и использует нотацию flowchart. </w:t>
       </w:r>
       <w:r>
         <w:rPr>
@@ -8699,10 +7867,7 @@
         <w:t>-</w:t>
       </w:r>
       <w:r>
-        <w:t>dat</w:t>
-      </w:r>
-      <w:r>
-        <w:t>a</w:t>
+        <w:t>data</w:t>
       </w:r>
       <w:r>
         <w:rPr>
@@ -8788,13 +7953,7 @@
         <w:rPr>
           <w:lang w:val="ru-RU"/>
         </w:rPr>
-        <w:t xml:space="preserve"> Это описание задает ожидаемую интерпретацию схемы при техническом ревью и синхронизации документации с кодовой базой. Ключевые контейнеры/подграфы включ</w:t>
-      </w:r>
-      <w:r>
-        <w:rPr>
-          <w:lang w:val="ru-RU"/>
-        </w:rPr>
-        <w:t xml:space="preserve">ают: </w:t>
+        <w:t xml:space="preserve"> Это описание задает ожидаемую интерпретацию схемы при техническом ревью и синхронизации документации с кодовой базой. Ключевые контейнеры/подграфы включают: </w:t>
       </w:r>
       <w:r>
         <w:t>Domain</w:t>
@@ -8907,10 +8066,7 @@
         <w:t xml:space="preserve"> </w:t>
       </w:r>
       <w:r>
-        <w:t>Filterable</w:t>
-      </w:r>
-      <w:r>
-        <w:t>DataSourcePort</w:t>
+        <w:t>FilterableDataSourcePort</w:t>
       </w:r>
       <w:r>
         <w:rPr>
@@ -9042,13 +8198,7 @@
         <w:rPr>
           <w:lang w:val="ru-RU"/>
         </w:rPr>
-        <w:t>. По этим сущностям можно проверить согласованность терминов, портов и адаптеров между диаграммой и реализацией. В метаданных указана оценка плотн</w:t>
-      </w:r>
-      <w:r>
-        <w:rPr>
-          <w:lang w:val="ru-RU"/>
-        </w:rPr>
-        <w:t>ости (@</w:t>
+        <w:t>. По этим сущностям можно проверить согласованность терминов, портов и адаптеров между диаграммой и реализацией. В метаданных указана оценка плотности (@</w:t>
       </w:r>
       <w:r>
         <w:t>nodes</w:t>
@@ -9080,10 +8230,7 @@
     </w:p>
     <w:p>
       <w:r>
-        <w:t>Source: docs/02-architecture/mmd-diagrams/architecture/13a-data-storage-ports.mmd | Description: docs/02-architecture/diagram-descriptio</w:t>
-      </w:r>
-      <w:r>
-        <w:t>ns/mmd-diagrams/architecture/13a-data-storage-ports.md</w:t>
+        <w:t>Source: docs/02-architecture/mmd-diagrams/architecture/13a-data-storage-ports.mmd | Description: docs/02-architecture/diagram-descriptions/mmd-diagrams/architecture/13a-data-storage-ports.md</w:t>
       </w:r>
     </w:p>
     <w:p>
@@ -9157,13 +8304,7 @@
         <w:rPr>
           <w:lang w:val="ru-RU"/>
         </w:rPr>
-        <w:t>Материал помогает понять границы ответственности модулей, точки интеграции и зависимости между компонентами в</w:t>
-      </w:r>
-      <w:r>
-        <w:rPr>
-          <w:lang w:val="ru-RU"/>
-        </w:rPr>
-        <w:t xml:space="preserve"> рамках сценария 13</w:t>
+        <w:t>Материал помогает понять границы ответственности модулей, точки интеграции и зависимости между компонентами в рамках сценария 13</w:t>
       </w:r>
       <w:r>
         <w:t>a</w:t>
@@ -9225,13 +8366,7 @@
         <w:rPr>
           <w:lang w:val="ru-RU"/>
         </w:rPr>
-        <w:t>Это описание задает ожидаемую интерпретацию схемы при техническом ревью и синх</w:t>
-      </w:r>
-      <w:r>
-        <w:rPr>
-          <w:lang w:val="ru-RU"/>
-        </w:rPr>
-        <w:t xml:space="preserve">ронизации документации с кодовой базой. Ключевые контейнеры/подграфы включают: </w:t>
+        <w:t xml:space="preserve">Это описание задает ожидаемую интерпретацию схемы при техническом ревью и синхронизации документации с кодовой базой. Ключевые контейнеры/подграфы включают: </w:t>
       </w:r>
       <w:r>
         <w:t>Domain</w:t>
@@ -9270,22 +8405,13 @@
         <w:t xml:space="preserve">. Именно через эти блоки визуализированы границы слоев и маршруты передачи управления или данных. </w:t>
       </w:r>
       <w:r>
-        <w:t>Примеры узлов, отражающих доменную модель и и</w:t>
-      </w:r>
-      <w:r>
-        <w:t xml:space="preserve">нфраструктуру: Domain Layer, DataSourcePort, FilterableDataSourcePort, Infrastructure Layer, ChemblAdapter. </w:t>
-      </w:r>
-      <w:r>
-        <w:rPr>
-          <w:lang w:val="ru-RU"/>
-        </w:rPr>
-        <w:t>По этим сущностям можно проверить согласованность терминов, портов и адаптеров между диаграммой и реализацией. В метаданных указана оценка плотности</w:t>
-      </w:r>
-      <w:r>
-        <w:rPr>
-          <w:lang w:val="ru-RU"/>
-        </w:rPr>
-        <w:t xml:space="preserve"> (@</w:t>
+        <w:t xml:space="preserve">Примеры узлов, отражающих доменную модель и инфраструктуру: Domain Layer, DataSourcePort, FilterableDataSourcePort, Infrastructure Layer, ChemblAdapter. </w:t>
+      </w:r>
+      <w:r>
+        <w:rPr>
+          <w:lang w:val="ru-RU"/>
+        </w:rPr>
+        <w:t>По этим сущностям можно проверить согласованность терминов, портов и адаптеров между диаграммой и реализацией. В метаданных указана оценка плотности (@</w:t>
       </w:r>
       <w:r>
         <w:t>nodes</w:t>
@@ -9317,10 +8443,7 @@
     </w:p>
     <w:p>
       <w:r>
-        <w:t>Source: docs/02-architecture/mmd-diagrams/architecture/13a-port-contracts-data-sources.mmd | Description: docs/02-architecture/diagram-descri</w:t>
-      </w:r>
-      <w:r>
-        <w:t>ptions/mmd-diagrams/architecture/13a-port-contracts-data-sources.md</w:t>
+        <w:t>Source: docs/02-architecture/mmd-diagrams/architecture/13a-port-contracts-data-sources.mmd | Description: docs/02-architecture/diagram-descriptions/mmd-diagrams/architecture/13a-port-contracts-data-sources.md</w:t>
       </w:r>
     </w:p>
     <w:p>
@@ -9388,10 +8511,7 @@
         </w:rPr>
       </w:pPr>
       <w:r>
-        <w:t>Описание: Диаграмма Operational and Observability Por</w:t>
-      </w:r>
-      <w:r>
-        <w:t xml:space="preserve">ts показывает архитектурный срез BioETL на уровне System / Component и использует нотацию flowchart. </w:t>
+        <w:t xml:space="preserve">Описание: Диаграмма Operational and Observability Ports показывает архитектурный срез BioETL на уровне System / Component и использует нотацию flowchart. </w:t>
       </w:r>
       <w:r>
         <w:rPr>
@@ -9427,10 +8547,7 @@
         <w:t xml:space="preserve">. </w:t>
       </w:r>
       <w:r>
-        <w:t>В исхо</w:t>
-      </w:r>
-      <w:r>
-        <w:t xml:space="preserve">дном файле прямо зафиксирован контекст: Monitoring, logging, and operational control </w:t>
+        <w:t xml:space="preserve">В исходном файле прямо зафиксирован контекст: Monitoring, logging, and operational control </w:t>
       </w:r>
       <w:proofErr w:type="gramStart"/>
       <w:r>
@@ -9593,10 +8710,7 @@
         <w:t xml:space="preserve"> </w:t>
       </w:r>
       <w:r>
-        <w:t>Lo</w:t>
-      </w:r>
-      <w:r>
-        <w:t>ggerPort</w:t>
+        <w:t>LoggerPort</w:t>
       </w:r>
       <w:r>
         <w:rPr>
@@ -9701,13 +8815,7 @@
         <w:rPr>
           <w:lang w:val="ru-RU"/>
         </w:rPr>
-        <w:t>=25), что полезно для контрол</w:t>
-      </w:r>
-      <w:r>
-        <w:rPr>
-          <w:lang w:val="ru-RU"/>
-        </w:rPr>
-        <w:t xml:space="preserve">я читаемости, декомпозиции </w:t>
+        <w:t xml:space="preserve">=25), что полезно для контроля читаемости, декомпозиции </w:t>
       </w:r>
       <w:r>
         <w:t>view</w:t>
@@ -9730,10 +8838,7 @@
     </w:p>
     <w:p>
       <w:r>
-        <w:t>Source: docs/02-architecture/mmd-diagrams/architecture/13b-operational-ports.mmd | Description: docs/02-architecture/diagram-descriptions/mmd-diagrams/architecture/13b-operation</w:t>
-      </w:r>
-      <w:r>
-        <w:t>al-ports.md</w:t>
+        <w:t>Source: docs/02-architecture/mmd-diagrams/architecture/13b-operational-ports.mmd | Description: docs/02-architecture/diagram-descriptions/mmd-diagrams/architecture/13b-operational-ports.md</w:t>
       </w:r>
     </w:p>
     <w:p>
@@ -9801,10 +8906,7 @@
         </w:rPr>
       </w:pPr>
       <w:r>
-        <w:t>Описание: Диаграмма Port Contracts: Storage показывает архитектурный срез BioETL на уровне System / Component и испо</w:t>
-      </w:r>
-      <w:r>
-        <w:t xml:space="preserve">льзует нотацию flowchart. </w:t>
+        <w:t xml:space="preserve">Описание: Диаграмма Port Contracts: Storage показывает архитектурный срез BioETL на уровне System / Component и использует нотацию flowchart. </w:t>
       </w:r>
       <w:r>
         <w:rPr>
@@ -9849,10 +8951,7 @@
         <w:t xml:space="preserve">. </w:t>
       </w:r>
       <w:r>
-        <w:t>В исходном файле прямо зафиксирован контекст: Covers StoragePort, DeltaReade</w:t>
-      </w:r>
-      <w:r>
-        <w:t xml:space="preserve">rPort, and MetadataWriterPort </w:t>
+        <w:t xml:space="preserve">В исходном файле прямо зафиксирован контекст: Covers StoragePort, DeltaReaderPort, and MetadataWriterPort </w:t>
       </w:r>
       <w:proofErr w:type="gramStart"/>
       <w:r>
@@ -9902,13 +9001,7 @@
         <w:rPr>
           <w:lang w:val="ru-RU"/>
         </w:rPr>
-        <w:t>. Именно через эт</w:t>
-      </w:r>
-      <w:r>
-        <w:rPr>
-          <w:lang w:val="ru-RU"/>
-        </w:rPr>
-        <w:t xml:space="preserve">и блоки визуализированы границы слоев и маршруты передачи управления или данных. Примеры узлов, отражающих доменную модель и инфраструктуру: </w:t>
+        <w:t xml:space="preserve">. Именно через эти блоки визуализированы границы слоев и маршруты передачи управления или данных. Примеры узлов, отражающих доменную модель и инфраструктуру: </w:t>
       </w:r>
       <w:r>
         <w:t>Domain</w:t>
@@ -9980,13 +9073,7 @@
         <w:rPr>
           <w:lang w:val="ru-RU"/>
         </w:rPr>
-        <w:t>. По этим сущност</w:t>
-      </w:r>
-      <w:r>
-        <w:rPr>
-          <w:lang w:val="ru-RU"/>
-        </w:rPr>
-        <w:t>ям можно проверить согласованность терминов, портов и адаптеров между диаграммой и реализацией. В метаданных указана оценка плотности (@</w:t>
+        <w:t>. По этим сущностям можно проверить согласованность терминов, портов и адаптеров между диаграммой и реализацией. В метаданных указана оценка плотности (@</w:t>
       </w:r>
       <w:r>
         <w:t>nodes</w:t>
@@ -10018,10 +9105,7 @@
     </w:p>
     <w:p>
       <w:r>
-        <w:t xml:space="preserve">Source: </w:t>
-      </w:r>
-      <w:r>
-        <w:t>docs/02-architecture/mmd-diagrams/architecture/13b-port-contracts-storage.mmd | Description: docs/02-architecture/diagram-descriptions/mmd-diagrams/architecture/13b-port-contracts-storage.md</w:t>
+        <w:t>Source: docs/02-architecture/mmd-diagrams/architecture/13b-port-contracts-storage.mmd | Description: docs/02-architecture/diagram-descriptions/mmd-diagrams/architecture/13b-port-contracts-storage.md</w:t>
       </w:r>
     </w:p>
     <w:p>
@@ -10079,10 +9163,7 @@
     </w:p>
     <w:p>
       <w:r>
-        <w:t>ID: 13c-port</w:t>
-      </w:r>
-      <w:r>
-        <w:t>-contracts-observability | Type: flowchart | Level: System / Component | Date: 2026-02-25</w:t>
+        <w:t>ID: 13c-port-contracts-observability | Type: flowchart | Level: System / Component | Date: 2026-02-25</w:t>
       </w:r>
     </w:p>
     <w:p>
@@ -10098,13 +9179,7 @@
         <w:rPr>
           <w:lang w:val="ru-RU"/>
         </w:rPr>
-        <w:t>Мат</w:t>
-      </w:r>
-      <w:r>
-        <w:rPr>
-          <w:lang w:val="ru-RU"/>
-        </w:rPr>
-        <w:t>ериал помогает понять границы ответственности модулей, точки интеграции и зависимости между компонентами в рамках сценария 13</w:t>
+        <w:t>Материал помогает понять границы ответственности модулей, точки интеграции и зависимости между компонентами в рамках сценария 13</w:t>
       </w:r>
       <w:r>
         <w:t>c</w:t>
@@ -10143,10 +9218,7 @@
         <w:t xml:space="preserve">. </w:t>
       </w:r>
       <w:r>
-        <w:t>В исходном файле прямо зафиксирован контекст: Covers Logger/Metrics/Tracing ports plus resilience c</w:t>
-      </w:r>
-      <w:r>
-        <w:t xml:space="preserve">ontrol </w:t>
+        <w:t xml:space="preserve">В исходном файле прямо зафиксирован контекст: Covers Logger/Metrics/Tracing ports plus resilience control </w:t>
       </w:r>
       <w:proofErr w:type="gramStart"/>
       <w:r>
@@ -10196,13 +9268,7 @@
         <w:rPr>
           <w:lang w:val="ru-RU"/>
         </w:rPr>
-        <w:t>. Именно через эти блоки визуализированы границы с</w:t>
-      </w:r>
-      <w:r>
-        <w:rPr>
-          <w:lang w:val="ru-RU"/>
-        </w:rPr>
-        <w:t xml:space="preserve">лоев и маршруты передачи управления или данных. Примеры узлов, отражающих доменную модель и инфраструктуру: </w:t>
+        <w:t xml:space="preserve">. Именно через эти блоки визуализированы границы слоев и маршруты передачи управления или данных. Примеры узлов, отражающих доменную модель и инфраструктуру: </w:t>
       </w:r>
       <w:r>
         <w:t>Domain</w:t>
@@ -10265,13 +9331,7 @@
         <w:rPr>
           <w:lang w:val="ru-RU"/>
         </w:rPr>
-        <w:t>. По этим сущностям можно проверить согласованность терминов,</w:t>
-      </w:r>
-      <w:r>
-        <w:rPr>
-          <w:lang w:val="ru-RU"/>
-        </w:rPr>
-        <w:t xml:space="preserve"> портов и адаптеров между диаграммой и реализацией. В метаданных указана оценка плотности (@</w:t>
+        <w:t>. По этим сущностям можно проверить согласованность терминов, портов и адаптеров между диаграммой и реализацией. В метаданных указана оценка плотности (@</w:t>
       </w:r>
       <w:r>
         <w:t>nodes</w:t>
@@ -10303,10 +9363,7 @@
     </w:p>
     <w:p>
       <w:r>
-        <w:t>Source: docs/02-architecture/mmd-diagrams/architect</w:t>
-      </w:r>
-      <w:r>
-        <w:t>ure/13c-port-contracts-observability.mmd | Description: docs/02-architecture/diagram-descriptions/mmd-diagrams/architecture/13c-port-contracts-observability.md</w:t>
+        <w:t>Source: docs/02-architecture/mmd-diagrams/architecture/13c-port-contracts-observability.mmd | Description: docs/02-architecture/diagram-descriptions/mmd-diagrams/architecture/13c-port-contracts-observability.md</w:t>
       </w:r>
     </w:p>
     <w:p>
@@ -10364,10 +9421,7 @@
     </w:p>
     <w:p>
       <w:r>
-        <w:t>ID: 13c-validation-dq-ports | Type: flowchart | Level:</w:t>
-      </w:r>
-      <w:r>
-        <w:t xml:space="preserve"> System / Component | Date: 2026-02-27</w:t>
+        <w:t>ID: 13c-validation-dq-ports | Type: flowchart | Level: System / Component | Date: 2026-02-27</w:t>
       </w:r>
     </w:p>
     <w:p>
@@ -10383,13 +9437,7 @@
         <w:rPr>
           <w:lang w:val="ru-RU"/>
         </w:rPr>
-        <w:t>Материал помогает понять границы ответственности модулей, точки и</w:t>
-      </w:r>
-      <w:r>
-        <w:rPr>
-          <w:lang w:val="ru-RU"/>
-        </w:rPr>
-        <w:t>нтеграции и зависимости между компонентами в рамках сценария 13</w:t>
+        <w:t>Материал помогает понять границы ответственности модулей, точки интеграции и зависимости между компонентами в рамках сценария 13</w:t>
       </w:r>
       <w:r>
         <w:t>c</w:t>
@@ -10442,13 +9490,7 @@
         <w:rPr>
           <w:lang w:val="ru-RU"/>
         </w:rPr>
-        <w:t>Это описание задает ожидаемую интерпретацию схемы при техническо</w:t>
-      </w:r>
-      <w:r>
-        <w:rPr>
-          <w:lang w:val="ru-RU"/>
-        </w:rPr>
-        <w:t xml:space="preserve">м ревью и синхронизации документации с кодовой базой. Ключевые контейнеры/подграфы включают: </w:t>
+        <w:t xml:space="preserve">Это описание задает ожидаемую интерпретацию схемы при техническом ревью и синхронизации документации с кодовой базой. Ключевые контейнеры/подграфы включают: </w:t>
       </w:r>
       <w:r>
         <w:t>Domain</w:t>
@@ -10484,13 +9526,7 @@
         <w:rPr>
           <w:lang w:val="ru-RU"/>
         </w:rPr>
-        <w:t>. Именно через эти блоки визуализированы границы слоев и маршруты передачи управления или данных. Примеры узлов, отражающи</w:t>
-      </w:r>
-      <w:r>
-        <w:rPr>
-          <w:lang w:val="ru-RU"/>
-        </w:rPr>
-        <w:t xml:space="preserve">х доменную модель и инфраструктуру: </w:t>
+        <w:t xml:space="preserve">. Именно через эти блоки визуализированы границы слоев и маршруты передачи управления или данных. Примеры узлов, отражающих доменную модель и инфраструктуру: </w:t>
       </w:r>
       <w:r>
         <w:t>Domain</w:t>
@@ -10747,10 +9783,7 @@
         <w:t xml:space="preserve"> </w:t>
       </w:r>
       <w:r>
-        <w:t>Gold</w:t>
-      </w:r>
-      <w:r>
-        <w:t>DQAnalyzerPort</w:t>
+        <w:t>GoldDQAnalyzerPort</w:t>
       </w:r>
       <w:r>
         <w:rPr>
@@ -10774,13 +9807,7 @@
         <w:rPr>
           <w:lang w:val="ru-RU"/>
         </w:rPr>
-        <w:t>-слоев и стабильного рен</w:t>
-      </w:r>
-      <w:r>
-        <w:rPr>
-          <w:lang w:val="ru-RU"/>
-        </w:rPr>
-        <w:t xml:space="preserve">деринга в </w:t>
+        <w:t xml:space="preserve">-слоев и стабильного рендеринга в </w:t>
       </w:r>
       <w:r>
         <w:t>CI</w:t>
@@ -10862,10 +9889,7 @@
         </w:rPr>
       </w:pPr>
       <w:r>
-        <w:t>Описание: Диаграмма Port Contracts: Services and Controls показывает архитектурный срез BioETL на уровне System / Com</w:t>
-      </w:r>
-      <w:r>
-        <w:t xml:space="preserve">ponent и использует нотацию flowchart. </w:t>
+        <w:t xml:space="preserve">Описание: Диаграмма Port Contracts: Services and Controls показывает архитектурный срез BioETL на уровне System / Component и использует нотацию flowchart. </w:t>
       </w:r>
       <w:r>
         <w:rPr>
@@ -10910,10 +9934,7 @@
         <w:t xml:space="preserve">. </w:t>
       </w:r>
       <w:r>
-        <w:t>В исходном файле прямо зафиксирован контекст: Covers control p</w:t>
-      </w:r>
-      <w:r>
-        <w:t xml:space="preserve">orts, data quality service ports, and related </w:t>
+        <w:t xml:space="preserve">В исходном файле прямо зафиксирован контекст: Covers control ports, data quality service ports, and related </w:t>
       </w:r>
       <w:proofErr w:type="gramStart"/>
       <w:r>
@@ -10930,10 +9951,7 @@
         <w:t xml:space="preserve">Это описание задает ожидаемую интерпретацию схемы при техническом ревью и синхронизации документации с кодовой базой. </w:t>
       </w:r>
       <w:r>
-        <w:t>Ключевые контейнеры/подграфы включают: Domain Layer, Infrastructure Layer,</w:t>
-      </w:r>
-      <w:r>
-        <w:t xml:space="preserve"> Application Layer, NoOp Implementations (fallback defaults). </w:t>
+        <w:t xml:space="preserve">Ключевые контейнеры/подграфы включают: Domain Layer, Infrastructure Layer, Application Layer, NoOp Implementations (fallback defaults). </w:t>
       </w:r>
       <w:r>
         <w:rPr>
@@ -11102,10 +10120,7 @@
         </w:rPr>
       </w:pPr>
       <w:r>
-        <w:t>Описание: Диаграмма Domain Operational Ports показывает архитектурный срез BioETL на уровне System / Component и использует нота</w:t>
-      </w:r>
-      <w:r>
-        <w:t xml:space="preserve">цию flowchart. </w:t>
+        <w:t xml:space="preserve">Описание: Диаграмма Domain Operational Ports показывает архитектурный срез BioETL на уровне System / Component и использует нотацию flowchart. </w:t>
       </w:r>
       <w:r>
         <w:rPr>
@@ -11150,10 +10165,7 @@
         <w:t xml:space="preserve">. </w:t>
       </w:r>
       <w:r>
-        <w:t>В исходном файле прямо зафиксирован контекст: Independent protocol definitions for op</w:t>
-      </w:r>
-      <w:r>
-        <w:t>erational concerns (lock, checkpoint, observability, shutdown</w:t>
+        <w:t>В исходном файле прямо зафиксирован контекст: Independent protocol definitions for operational concerns (lock, checkpoint, observability, shutdown</w:t>
       </w:r>
       <w:proofErr w:type="gramStart"/>
       <w:r>
@@ -11194,13 +10206,7 @@
         <w:rPr>
           <w:lang w:val="ru-RU"/>
         </w:rPr>
-        <w:t>. Именно ч</w:t>
-      </w:r>
-      <w:r>
-        <w:rPr>
-          <w:lang w:val="ru-RU"/>
-        </w:rPr>
-        <w:t xml:space="preserve">ерез эти блоки визуализированы границы слоев и маршруты передачи управления или данных. Примеры узлов, отражающих доменную модель и инфраструктуру: </w:t>
+        <w:t xml:space="preserve">. Именно через эти блоки визуализированы границы слоев и маршруты передачи управления или данных. Примеры узлов, отражающих доменную модель и инфраструктуру: </w:t>
       </w:r>
       <w:r>
         <w:t>Domain</w:t>
@@ -11436,13 +10442,7 @@
         <w:rPr>
           <w:lang w:val="ru-RU"/>
         </w:rPr>
-        <w:t>=8), что полезно для контроля читаемости, декомпоз</w:t>
-      </w:r>
-      <w:r>
-        <w:rPr>
-          <w:lang w:val="ru-RU"/>
-        </w:rPr>
-        <w:t xml:space="preserve">иции </w:t>
+        <w:t xml:space="preserve">=8), что полезно для контроля читаемости, декомпозиции </w:t>
       </w:r>
       <w:r>
         <w:t>view</w:t>
@@ -11465,10 +10465,7 @@
     </w:p>
     <w:p>
       <w:r>
-        <w:t>Source: docs/02-architecture/mmd-diagrams/architecture/13e-operational-ports-domain.mmd | Description: docs/02-architecture/diagram-descriptions/mmd-diagrams/architecture/13e-operational-ports-domain</w:t>
-      </w:r>
-      <w:r>
-        <w:t>.md</w:t>
+        <w:t>Source: docs/02-architecture/mmd-diagrams/architecture/13e-operational-ports-domain.mmd | Description: docs/02-architecture/diagram-descriptions/mmd-diagrams/architecture/13e-operational-ports-domain.md</w:t>
       </w:r>
     </w:p>
     <w:p>
@@ -11536,10 +10533,7 @@
         </w:rPr>
       </w:pPr>
       <w:r>
-        <w:t>Описание: Диаграмма Infrastructure Operational Implementations показывает архитектурный срез BioETL на у</w:t>
-      </w:r>
-      <w:r>
-        <w:t xml:space="preserve">ровне System / Component и использует нотацию flowchart. </w:t>
+        <w:t xml:space="preserve">Описание: Диаграмма Infrastructure Operational Implementations показывает архитектурный срез BioETL на уровне System / Component и использует нотацию flowchart. </w:t>
       </w:r>
       <w:r>
         <w:rPr>
@@ -11584,10 +10578,7 @@
         <w:t xml:space="preserve">. </w:t>
       </w:r>
       <w:r>
-        <w:t>В исходном файле прямо зафиксирован контекст</w:t>
-      </w:r>
-      <w:r>
-        <w:t xml:space="preserve">: Independent adapter implementations of operational </w:t>
+        <w:t xml:space="preserve">В исходном файле прямо зафиксирован контекст: Independent adapter implementations of operational </w:t>
       </w:r>
       <w:proofErr w:type="gramStart"/>
       <w:r>
@@ -11619,19 +10610,10 @@
         <w:rPr>
           <w:lang w:val="ru-RU"/>
         </w:rPr>
-        <w:t>. Именно</w:t>
-      </w:r>
-      <w:r>
-        <w:rPr>
-          <w:lang w:val="ru-RU"/>
-        </w:rPr>
-        <w:t xml:space="preserve"> через эти блоки визуализированы границы слоев и маршруты передачи управления или данных. </w:t>
-      </w:r>
-      <w:r>
-        <w:t>Примеры узлов, отражающих доменную модель и инфраструктуру: Infrastructure Implementations, MemoryLock, LocalCheckpoint, UnifiedLogger, MetricsCollector, OpenTelemetr</w:t>
-      </w:r>
-      <w:r>
-        <w:t xml:space="preserve">yTracer. </w:t>
+        <w:t xml:space="preserve">. Именно через эти блоки визуализированы границы слоев и маршруты передачи управления или данных. </w:t>
+      </w:r>
+      <w:r>
+        <w:t xml:space="preserve">Примеры узлов, отражающих доменную модель и инфраструктуру: Infrastructure Implementations, MemoryLock, LocalCheckpoint, UnifiedLogger, MetricsCollector, OpenTelemetryTracer. </w:t>
       </w:r>
       <w:r>
         <w:rPr>
@@ -11655,13 +10637,7 @@
         <w:rPr>
           <w:lang w:val="ru-RU"/>
         </w:rPr>
-        <w:t xml:space="preserve">-слоев и стабильного рендеринга </w:t>
-      </w:r>
-      <w:r>
-        <w:rPr>
-          <w:lang w:val="ru-RU"/>
-        </w:rPr>
-        <w:t xml:space="preserve">в </w:t>
+        <w:t xml:space="preserve">-слоев и стабильного рендеринга в </w:t>
       </w:r>
       <w:r>
         <w:t>CI</w:t>
@@ -11733,10 +10709,7 @@
     </w:p>
     <w:p>
       <w:r>
-        <w:t>ID: 14-cl</w:t>
-      </w:r>
-      <w:r>
-        <w:t>i-interface-layer | Type: flowchart | Level: System / Component | Date: 2026-02-24</w:t>
+        <w:t>ID: 14-cli-interface-layer | Type: flowchart | Level: System / Component | Date: 2026-02-24</w:t>
       </w:r>
     </w:p>
     <w:p>
@@ -11752,13 +10725,7 @@
         <w:rPr>
           <w:lang w:val="ru-RU"/>
         </w:rPr>
-        <w:t xml:space="preserve">Материал помогает понять границы </w:t>
-      </w:r>
-      <w:r>
-        <w:rPr>
-          <w:lang w:val="ru-RU"/>
-        </w:rPr>
-        <w:t>ответственности модулей, точки интеграции и зависимости между компонентами в рамках сценария 14-</w:t>
+        <w:t>Материал помогает понять границы ответственности модулей, точки интеграции и зависимости между компонентами в рамках сценария 14-</w:t>
       </w:r>
       <w:r>
         <w:t>cli</w:t>
@@ -11802,13 +10769,7 @@
         <w:rPr>
           <w:lang w:val="ru-RU"/>
         </w:rPr>
-        <w:t>Это описание задает ожи</w:t>
-      </w:r>
-      <w:r>
-        <w:rPr>
-          <w:lang w:val="ru-RU"/>
-        </w:rPr>
-        <w:t xml:space="preserve">даемую интерпретацию схемы при техническом ревью и синхронизации документации с кодовой базой. </w:t>
+        <w:t xml:space="preserve">Это описание задает ожидаемую интерпретацию схемы при техническом ревью и синхронизации документации с кодовой базой. </w:t>
       </w:r>
       <w:r>
         <w:t xml:space="preserve">Ключевые контейнеры/подграфы включают: User, CLI Interface (Click), Run Commands, Health Commands, Data Commands. </w:t>
@@ -11817,13 +10778,7 @@
         <w:rPr>
           <w:lang w:val="ru-RU"/>
         </w:rPr>
-        <w:t xml:space="preserve">Именно через эти блоки визуализированы границы </w:t>
-      </w:r>
-      <w:r>
-        <w:rPr>
-          <w:lang w:val="ru-RU"/>
-        </w:rPr>
-        <w:t xml:space="preserve">слоев и маршруты передачи управления или данных. Примеры узлов, отражающих доменную модель и инфраструктуру: </w:t>
+        <w:t xml:space="preserve">Именно через эти блоки визуализированы границы слоев и маршруты передачи управления или данных. Примеры узлов, отражающих доменную модель и инфраструктуру: </w:t>
       </w:r>
       <w:r>
         <w:t>User</w:t>
@@ -11979,10 +10934,7 @@
         <w:t xml:space="preserve"> --</w:t>
       </w:r>
       <w:r>
-        <w:t>res</w:t>
-      </w:r>
-      <w:r>
-        <w:t>ume</w:t>
+        <w:t>resume</w:t>
       </w:r>
       <w:r>
         <w:rPr>
@@ -12024,13 +10976,7 @@
         <w:rPr>
           <w:lang w:val="ru-RU"/>
         </w:rPr>
-        <w:t>-слоев и стабильного ренд</w:t>
-      </w:r>
-      <w:r>
-        <w:rPr>
-          <w:lang w:val="ru-RU"/>
-        </w:rPr>
-        <w:t xml:space="preserve">еринга в </w:t>
+        <w:t xml:space="preserve">-слоев и стабильного рендеринга в </w:t>
       </w:r>
       <w:r>
         <w:t>CI</w:t>
@@ -12102,10 +11048,7 @@
     </w:p>
     <w:p>
       <w:r>
-        <w:t>ID: 14a-cli</w:t>
-      </w:r>
-      <w:r>
-        <w:t>-commands | Type: flowchart | Level: System / Component | Date: 2026-02-27</w:t>
+        <w:t>ID: 14a-cli-commands | Type: flowchart | Level: System / Component | Date: 2026-02-27</w:t>
       </w:r>
     </w:p>
     <w:p>
@@ -12121,13 +11064,7 @@
         <w:rPr>
           <w:lang w:val="ru-RU"/>
         </w:rPr>
-        <w:t>Материал помогает понять границы ответст</w:t>
-      </w:r>
-      <w:r>
-        <w:rPr>
-          <w:lang w:val="ru-RU"/>
-        </w:rPr>
-        <w:t>венности модулей, точки интеграции и зависимости между компонентами в рамках сценария 14</w:t>
+        <w:t>Материал помогает понять границы ответственности модулей, точки интеграции и зависимости между компонентами в рамках сценария 14</w:t>
       </w:r>
       <w:r>
         <w:t>a</w:t>
@@ -12171,13 +11108,7 @@
         <w:rPr>
           <w:lang w:val="ru-RU"/>
         </w:rPr>
-        <w:t>Это описание задает ожидаему</w:t>
-      </w:r>
-      <w:r>
-        <w:rPr>
-          <w:lang w:val="ru-RU"/>
-        </w:rPr>
-        <w:t xml:space="preserve">ю интерпретацию схемы при техническом ревью и синхронизации документации с кодовой базой. </w:t>
+        <w:t xml:space="preserve">Это описание задает ожидаемую интерпретацию схемы при техническом ревью и синхронизации документации с кодовой базой. </w:t>
       </w:r>
       <w:r>
         <w:t xml:space="preserve">Ключевые контейнеры/подграфы включают: User, CLI Interface (Click), Run Commands, Health Commands, Data Commands. </w:t>
@@ -12186,13 +11117,7 @@
         <w:rPr>
           <w:lang w:val="ru-RU"/>
         </w:rPr>
-        <w:t>Именно через эти блоки визуализированы границы слоев</w:t>
-      </w:r>
-      <w:r>
-        <w:rPr>
-          <w:lang w:val="ru-RU"/>
-        </w:rPr>
-        <w:t xml:space="preserve"> и маршруты передачи управления или данных. Примеры узлов, отражающих доменную модель и инфраструктуру: </w:t>
+        <w:t xml:space="preserve">Именно через эти блоки визуализированы границы слоев и маршруты передачи управления или данных. Примеры узлов, отражающих доменную модель и инфраструктуру: </w:t>
       </w:r>
       <w:r>
         <w:t>User</w:t>
@@ -12291,13 +11216,7 @@
         <w:rPr>
           <w:lang w:val="ru-RU"/>
         </w:rPr>
-        <w:t>. По этим сущностям можно проверить согласованность терминов, портов и адап</w:t>
-      </w:r>
-      <w:r>
-        <w:rPr>
-          <w:lang w:val="ru-RU"/>
-        </w:rPr>
-        <w:t>теров между диаграммой и реализацией. В метаданных указана оценка плотности (@</w:t>
+        <w:t>. По этим сущностям можно проверить согласованность терминов, портов и адаптеров между диаграммой и реализацией. В метаданных указана оценка плотности (@</w:t>
       </w:r>
       <w:r>
         <w:t>nodes</w:t>
@@ -12329,10 +11248,7 @@
     </w:p>
     <w:p>
       <w:r>
-        <w:t>Source: docs/02-architecture/mmd-diagrams/architecture/14a-cli-co</w:t>
-      </w:r>
-      <w:r>
-        <w:t>mmands.mmd | Description: docs/02-architecture/diagram-descriptions/mmd-diagrams/architecture/14a-cli-commands.md</w:t>
+        <w:t>Source: docs/02-architecture/mmd-diagrams/architecture/14a-cli-commands.mmd | Description: docs/02-architecture/diagram-descriptions/mmd-diagrams/architecture/14a-cli-commands.md</w:t>
       </w:r>
     </w:p>
     <w:p>
@@ -12406,13 +11322,7 @@
         <w:rPr>
           <w:lang w:val="ru-RU"/>
         </w:rPr>
-        <w:t>Материал помогает понять границы ответственности модулей, точки интеграции и зависимости между к</w:t>
-      </w:r>
-      <w:r>
-        <w:rPr>
-          <w:lang w:val="ru-RU"/>
-        </w:rPr>
-        <w:t>омпонентами в рамках сценария 14</w:t>
+        <w:t>Материал помогает понять границы ответственности модулей, точки интеграции и зависимости между компонентами в рамках сценария 14</w:t>
       </w:r>
       <w:r>
         <w:t>b</w:t>
@@ -12456,13 +11366,7 @@
         <w:rPr>
           <w:lang w:val="ru-RU"/>
         </w:rPr>
-        <w:t>Это описание задает ожидаемую интерпретацию схемы при техническом ревью и синхрониза</w:t>
-      </w:r>
-      <w:r>
-        <w:rPr>
-          <w:lang w:val="ru-RU"/>
-        </w:rPr>
-        <w:t xml:space="preserve">ции документации с кодовой базой. Ключевые контейнеры/подграфы включают: </w:t>
+        <w:t xml:space="preserve">Это описание задает ожидаемую интерпретацию схемы при техническом ревью и синхронизации документации с кодовой базой. Ключевые контейнеры/подграфы включают: </w:t>
       </w:r>
       <w:r>
         <w:t>Composition</w:t>
@@ -12498,13 +11402,7 @@
         <w:rPr>
           <w:lang w:val="ru-RU"/>
         </w:rPr>
-        <w:t>. Именно через эти блоки визуализированы границы слоев и маршруты передачи управления или данных. Примеры узлов, отражающих доменную модель и инфра</w:t>
-      </w:r>
-      <w:r>
-        <w:rPr>
-          <w:lang w:val="ru-RU"/>
-        </w:rPr>
-        <w:t xml:space="preserve">структуру: </w:t>
+        <w:t xml:space="preserve">. Именно через эти блоки визуализированы границы слоев и маршруты передачи управления или данных. Примеры узлов, отражающих доменную модель и инфраструктуру: </w:t>
       </w:r>
       <w:r>
         <w:t>bioetl</w:t>
@@ -12621,13 +11519,7 @@
         <w:rPr>
           <w:lang w:val="ru-RU"/>
         </w:rPr>
-        <w:t>. По этим сущностям можно проверить согласованность терминов, портов и адаптеров между диаграммой и реализацией. В метаданных указана оценка плот</w:t>
-      </w:r>
-      <w:r>
-        <w:rPr>
-          <w:lang w:val="ru-RU"/>
-        </w:rPr>
-        <w:t>ности (@</w:t>
+        <w:t>. По этим сущностям можно проверить согласованность терминов, портов и адаптеров между диаграммой и реализацией. В метаданных указана оценка плотности (@</w:t>
       </w:r>
       <w:r>
         <w:t>nodes</w:t>
@@ -12659,10 +11551,7 @@
     </w:p>
     <w:p>
       <w:r>
-        <w:t>Source: docs/02-architecture/mmd-diagrams/architecture/14b-cli-routing.mmd | Description: docs/02-architecture/diagram-descriptions/mmd</w:t>
-      </w:r>
-      <w:r>
-        <w:t>-diagrams/architecture/14b-cli-routing.md</w:t>
+        <w:t>Source: docs/02-architecture/mmd-diagrams/architecture/14b-cli-routing.mmd | Description: docs/02-architecture/diagram-descriptions/mmd-diagrams/architecture/14b-cli-routing.md</w:t>
       </w:r>
     </w:p>
     <w:p>
@@ -12730,10 +11619,7 @@
         </w:rPr>
       </w:pPr>
       <w:r>
-        <w:t>Описание: Диаграмма BatchExecutor Internal Architecture показывает архите</w:t>
-      </w:r>
-      <w:r>
-        <w:t xml:space="preserve">ктурный срез BioETL на уровне System / Component и использует нотацию flowchart. </w:t>
+        <w:t xml:space="preserve">Описание: Диаграмма BatchExecutor Internal Architecture показывает архитектурный срез BioETL на уровне System / Component и использует нотацию flowchart. </w:t>
       </w:r>
       <w:r>
         <w:rPr>
@@ -12769,10 +11655,7 @@
         <w:t xml:space="preserve">. </w:t>
       </w:r>
       <w:r>
-        <w:t>В исходном файле пря</w:t>
-      </w:r>
-      <w:r>
-        <w:t xml:space="preserve">мо зафиксирован контекст: Shows the composition of BatchExecutor and its helper </w:t>
+        <w:t xml:space="preserve">В исходном файле прямо зафиксирован контекст: Shows the composition of BatchExecutor and its helper </w:t>
       </w:r>
       <w:proofErr w:type="gramStart"/>
       <w:r>
@@ -12789,10 +11672,7 @@
         <w:t xml:space="preserve">Это описание задает ожидаемую интерпретацию схемы при техническом ревью и синхронизации документации с кодовой базой. </w:t>
       </w:r>
       <w:r>
-        <w:t>Ключевые контейнеры/подграфы включают: BatchE</w:t>
-      </w:r>
-      <w:r>
-        <w:t xml:space="preserve">xecutor, Composed Helper Components, Data Flow Through Batch, TransformResult, Error Classification. </w:t>
+        <w:t xml:space="preserve">Ключевые контейнеры/подграфы включают: BatchExecutor, Composed Helper Components, Data Flow Through Batch, TransformResult, Error Classification. </w:t>
       </w:r>
       <w:r>
         <w:rPr>
@@ -12801,10 +11681,7 @@
         <w:t xml:space="preserve">Именно через эти блоки визуализированы границы слоев и маршруты передачи управления или данных. </w:t>
       </w:r>
       <w:r>
-        <w:t>Примеры узлов, отражающих доменную модель и инфраструктуру:</w:t>
-      </w:r>
-      <w:r>
-        <w:t xml:space="preserve"> BatchExecutor, BatchExecutor -------- services, context, config batch_size, checkpoint_interval + </w:t>
+        <w:t xml:space="preserve">Примеры узлов, отражающих доменную модель и инфраструктуру: BatchExecutor, BatchExecutor -------- services, context, config batch_size, checkpoint_interval + </w:t>
       </w:r>
       <w:proofErr w:type="gramStart"/>
       <w:r>
@@ -12812,22 +11689,13 @@
       </w:r>
       <w:proofErr w:type="gramEnd"/>
       <w:r>
-        <w:t>) + process(), Composed Helper Components, BatchMemoryManager -------- adaptive batch sizing + check_pressure() + maybe_recover(), BatchMetricsRecord</w:t>
-      </w:r>
-      <w:r>
-        <w:t xml:space="preserve">er -------- batch and error metrics + track_batch_size() + track_error(), BatchTracingManager -------- execution spans + start_batch_span() + end_span(). </w:t>
-      </w:r>
-      <w:r>
-        <w:rPr>
-          <w:lang w:val="ru-RU"/>
-        </w:rPr>
-        <w:t>По этим сущностям можно проверить согласованность терминов, портов и адаптеров между диаграммой и реал</w:t>
-      </w:r>
-      <w:r>
-        <w:rPr>
-          <w:lang w:val="ru-RU"/>
-        </w:rPr>
-        <w:t>изацией. В метаданных указана оценка плотности (@</w:t>
+        <w:t xml:space="preserve">) + process(), Composed Helper Components, BatchMemoryManager -------- adaptive batch sizing + check_pressure() + maybe_recover(), BatchMetricsRecorder -------- batch and error metrics + track_batch_size() + track_error(), BatchTracingManager -------- execution spans + start_batch_span() + end_span(). </w:t>
+      </w:r>
+      <w:r>
+        <w:rPr>
+          <w:lang w:val="ru-RU"/>
+        </w:rPr>
+        <w:t>По этим сущностям можно проверить согласованность терминов, портов и адаптеров между диаграммой и реализацией. В метаданных указана оценка плотности (@</w:t>
       </w:r>
       <w:r>
         <w:t>nodes</w:t>
@@ -12859,10 +11727,7 @@
     </w:p>
     <w:p>
       <w:r>
-        <w:t>Source: docs/02-architecture/mmd-diagrams/architecture/15-batch-executor-internals.mmd | Descr</w:t>
-      </w:r>
-      <w:r>
-        <w:t>iption: docs/02-architecture/diagram-descriptions/mmd-diagrams/architecture/15-batch-executor-internals.md</w:t>
+        <w:t>Source: docs/02-architecture/mmd-diagrams/architecture/15-batch-executor-internals.mmd | Description: docs/02-architecture/diagram-descriptions/mmd-diagrams/architecture/15-batch-executor-internals.md</w:t>
       </w:r>
     </w:p>
     <w:p>
@@ -12930,10 +11795,7 @@
         </w:rPr>
       </w:pPr>
       <w:r>
-        <w:t>Описание: Диаграмма Trans</w:t>
-      </w:r>
-      <w:r>
-        <w:t xml:space="preserve">former Hierarchy показывает архитектурный срез BioETL на уровне System / Component и использует нотацию flowchart. </w:t>
+        <w:t xml:space="preserve">Описание: Диаграмма Transformer Hierarchy показывает архитектурный срез BioETL на уровне System / Component и использует нотацию flowchart. </w:t>
       </w:r>
       <w:r>
         <w:rPr>
@@ -12977,10 +11839,7 @@
         <w:t xml:space="preserve">Это описание задает ожидаемую интерпретацию схемы при техническом ревью и синхронизации документации с кодовой базой. </w:t>
       </w:r>
       <w:r>
-        <w:t>Ключев</w:t>
-      </w:r>
-      <w:r>
-        <w:t xml:space="preserve">ые контейнеры/подграфы включают: Template Method Pattern, ChEMBL Transformers, Publication Transformers, UniProt Transformers, Other Transformers. </w:t>
+        <w:t xml:space="preserve">Ключевые контейнеры/подграфы включают: Template Method Pattern, ChEMBL Transformers, Publication Transformers, UniProt Transformers, Other Transformers. </w:t>
       </w:r>
       <w:r>
         <w:rPr>
@@ -12989,19 +11848,7 @@
         <w:t xml:space="preserve">Именно через эти блоки визуализированы границы слоев и маршруты передачи управления или данных. </w:t>
       </w:r>
       <w:r>
-        <w:t>Примеры узлов</w:t>
-      </w:r>
-      <w:r>
-        <w:t>, отражающих доменную модель и инфраструктуру: Template Method Pattern, BaseTransformer (ABC) ━━━━━━━━━━━━━━━━━ provider: str entity_type: str _tracer: TracingPort _metrics: MetricsPort _identity: IdentityService _pii_hasher: PiiHasherPort _data_normalizer</w:t>
-      </w:r>
-      <w:r>
-        <w:t>: DataNormalizationPort ━━━━━━━━━━━━━━━━━ + transform(ctx, record, idx) → SilverRecord ├ _transform_impl() ← ABSTRACT HOOK ├ compute_entity_id() ├ compute_content_hash() └ should_write_silver/gold() + transform_for_gold(ctx, silver) → dict + entity_to_silv</w:t>
-      </w:r>
-      <w:r>
-        <w:t>er_record(entity) → dict + hash_pii_value() / hash_pii_list() + validate_value_object(), ChEMBL Transformers, BaseChemblTransformer ━━━━━━━━━━━━━━━━━ entity_class: type primary_id_field: str ━━━━━━━━━━━━━━━━━ + _extract_business_data(), ActivityTransformer</w:t>
-      </w:r>
-      <w:r>
-        <w:t xml:space="preserve">, Publication Transformers. </w:t>
+        <w:t xml:space="preserve">Примеры узлов, отражающих доменную модель и инфраструктуру: Template Method Pattern, BaseTransformer (ABC) ━━━━━━━━━━━━━━━━━ provider: str entity_type: str _tracer: TracingPort _metrics: MetricsPort _identity: IdentityService _pii_hasher: PiiHasherPort _data_normalizer: DataNormalizationPort ━━━━━━━━━━━━━━━━━ + transform(ctx, record, idx) → SilverRecord ├ _transform_impl() ← ABSTRACT HOOK ├ compute_entity_id() ├ compute_content_hash() └ should_write_silver/gold() + transform_for_gold(ctx, silver) → dict + entity_to_silver_record(entity) → dict + hash_pii_value() / hash_pii_list() + validate_value_object(), ChEMBL Transformers, BaseChemblTransformer ━━━━━━━━━━━━━━━━━ entity_class: type primary_id_field: str ━━━━━━━━━━━━━━━━━ + _extract_business_data(), ActivityTransformer, Publication Transformers. </w:t>
       </w:r>
       <w:r>
         <w:rPr>
@@ -13025,13 +11872,7 @@
         <w:rPr>
           <w:lang w:val="ru-RU"/>
         </w:rPr>
-        <w:t>-слоев и ста</w:t>
-      </w:r>
-      <w:r>
-        <w:rPr>
-          <w:lang w:val="ru-RU"/>
-        </w:rPr>
-        <w:t xml:space="preserve">бильного рендеринга в </w:t>
+        <w:t xml:space="preserve">-слоев и стабильного рендеринга в </w:t>
       </w:r>
       <w:r>
         <w:t>CI</w:t>
@@ -13098,10 +11939,7 @@
         <w:pStyle w:val="Heading1"/>
       </w:pPr>
       <w:r>
-        <w:t xml:space="preserve">47. Base Transformer </w:t>
-      </w:r>
-      <w:r>
-        <w:t>and ChEMBL Transformers</w:t>
+        <w:t>47. Base Transformer and ChEMBL Transformers</w:t>
       </w:r>
     </w:p>
     <w:p>
@@ -13116,10 +11954,7 @@
         </w:rPr>
       </w:pPr>
       <w:r>
-        <w:t>Описание: Диаграмма Base Transformer and ChEMBL Transformers показывает архитектурный срез BioETL на уровне System / Component и использует но</w:t>
-      </w:r>
-      <w:r>
-        <w:t xml:space="preserve">тацию flowchart. </w:t>
+        <w:t xml:space="preserve">Описание: Диаграмма Base Transformer and ChEMBL Transformers показывает архитектурный срез BioETL на уровне System / Component и использует нотацию flowchart. </w:t>
       </w:r>
       <w:r>
         <w:rPr>
@@ -13155,10 +11990,7 @@
         <w:t xml:space="preserve">. </w:t>
       </w:r>
       <w:r>
-        <w:t>В исходном файле прямо зафиксирован контекст: Template Method base class, ChEMBL provider t</w:t>
-      </w:r>
-      <w:r>
-        <w:t xml:space="preserve">ransformers, and extractor </w:t>
+        <w:t xml:space="preserve">В исходном файле прямо зафиксирован контекст: Template Method base class, ChEMBL provider transformers, and extractor </w:t>
       </w:r>
       <w:proofErr w:type="gramStart"/>
       <w:r>
@@ -13181,19 +12013,10 @@
         <w:rPr>
           <w:lang w:val="ru-RU"/>
         </w:rPr>
-        <w:t>Име</w:t>
-      </w:r>
-      <w:r>
-        <w:rPr>
-          <w:lang w:val="ru-RU"/>
-        </w:rPr>
-        <w:t xml:space="preserve">нно через эти блоки визуализированы границы слоев и маршруты передачи управления или данных. </w:t>
-      </w:r>
-      <w:r>
-        <w:t>Примеры узлов, отражающих доменную модель и инфраструктуру: Template Method Pattern, BaseTransformer ABC, ChEMBL Transformers, BaseChemblTransformer, ActivityTrans</w:t>
-      </w:r>
-      <w:r>
-        <w:t xml:space="preserve">former, AssayTransformer. </w:t>
+        <w:t xml:space="preserve">Именно через эти блоки визуализированы границы слоев и маршруты передачи управления или данных. </w:t>
+      </w:r>
+      <w:r>
+        <w:t xml:space="preserve">Примеры узлов, отражающих доменную модель и инфраструктуру: Template Method Pattern, BaseTransformer ABC, ChEMBL Transformers, BaseChemblTransformer, ActivityTransformer, AssayTransformer. </w:t>
       </w:r>
       <w:r>
         <w:rPr>
@@ -13217,13 +12040,7 @@
         <w:rPr>
           <w:lang w:val="ru-RU"/>
         </w:rPr>
-        <w:t>-слоев и стаби</w:t>
-      </w:r>
-      <w:r>
-        <w:rPr>
-          <w:lang w:val="ru-RU"/>
-        </w:rPr>
-        <w:t xml:space="preserve">льного рендеринга в </w:t>
+        <w:t xml:space="preserve">-слоев и стабильного рендеринга в </w:t>
       </w:r>
       <w:r>
         <w:t>CI</w:t>
@@ -13305,10 +12122,7 @@
         </w:rPr>
       </w:pPr>
       <w:r>
-        <w:t xml:space="preserve">Описание: Диаграмма Publication, UniProt, Other Transformers and Extractors показывает архитектурный </w:t>
-      </w:r>
-      <w:r>
-        <w:t xml:space="preserve">срез BioETL на уровне System / Component и использует нотацию flowchart. </w:t>
+        <w:t xml:space="preserve">Описание: Диаграмма Publication, UniProt, Other Transformers and Extractors показывает архитектурный срез BioETL на уровне System / Component и использует нотацию flowchart. </w:t>
       </w:r>
       <w:r>
         <w:rPr>
@@ -13353,10 +12167,7 @@
         <w:t xml:space="preserve">. </w:t>
       </w:r>
       <w:r>
-        <w:t>В исходном файле прямо зафикси</w:t>
-      </w:r>
-      <w:r>
-        <w:t xml:space="preserve">рован контекст: Provider-specific transformers and field extractor </w:t>
+        <w:t xml:space="preserve">В исходном файле прямо зафиксирован контекст: Provider-specific transformers and field extractor </w:t>
       </w:r>
       <w:proofErr w:type="gramStart"/>
       <w:r>
@@ -13373,10 +12184,7 @@
         <w:t xml:space="preserve">Это описание задает ожидаемую интерпретацию схемы при техническом ревью и синхронизации документации с кодовой базой. </w:t>
       </w:r>
       <w:r>
-        <w:t>Ключевые контейнеры/подграфы включают: Publication Transfor</w:t>
-      </w:r>
-      <w:r>
-        <w:t xml:space="preserve">mers, UniProt Transformers, Other Transformers, Field Extractors. </w:t>
+        <w:t xml:space="preserve">Ключевые контейнеры/подграфы включают: Publication Transformers, UniProt Transformers, Other Transformers, Field Extractors. </w:t>
       </w:r>
       <w:r>
         <w:rPr>
@@ -13385,22 +12193,13 @@
         <w:t xml:space="preserve">Именно через эти блоки визуализированы границы слоев и маршруты передачи управления или данных. </w:t>
       </w:r>
       <w:r>
-        <w:t>Примеры узлов, отражающих доменную модель и инфраструктуру: Publication Transformers, BasePubl</w:t>
-      </w:r>
-      <w:r>
-        <w:t xml:space="preserve">icationTransformer, PubMedPublicationTransformer, CrossRefTransformer, OpenAlexTransformer, SemanticScholarTransformer. </w:t>
-      </w:r>
-      <w:r>
-        <w:rPr>
-          <w:lang w:val="ru-RU"/>
-        </w:rPr>
-        <w:t>По этим сущностям можно проверить согласованность терминов, портов и адаптеров между диаграммой и реализацией. В метаданных указана оцен</w:t>
-      </w:r>
-      <w:r>
-        <w:rPr>
-          <w:lang w:val="ru-RU"/>
-        </w:rPr>
-        <w:t>ка плотности (@</w:t>
+        <w:t xml:space="preserve">Примеры узлов, отражающих доменную модель и инфраструктуру: Publication Transformers, BasePublicationTransformer, PubMedPublicationTransformer, CrossRefTransformer, OpenAlexTransformer, SemanticScholarTransformer. </w:t>
+      </w:r>
+      <w:r>
+        <w:rPr>
+          <w:lang w:val="ru-RU"/>
+        </w:rPr>
+        <w:t>По этим сущностям можно проверить согласованность терминов, портов и адаптеров между диаграммой и реализацией. В метаданных указана оценка плотности (@</w:t>
       </w:r>
       <w:r>
         <w:t>nodes</w:t>
@@ -13432,10 +12231,7 @@
     </w:p>
     <w:p>
       <w:r>
-        <w:t>Source: docs/02-architecture/mmd-diagrams/architecture/16b-transformer-pub-other.mmd | Description: docs/02-architecture/diagram</w:t>
-      </w:r>
-      <w:r>
-        <w:t>-descriptions/mmd-diagrams/architecture/16b-transformer-pub-other.md</w:t>
+        <w:t>Source: docs/02-architecture/mmd-diagrams/architecture/16b-transformer-pub-other.mmd | Description: docs/02-architecture/diagram-descriptions/mmd-diagrams/architecture/16b-transformer-pub-other.md</w:t>
       </w:r>
     </w:p>
     <w:p>
@@ -13509,13 +12305,7 @@
         <w:rPr>
           <w:lang w:val="ru-RU"/>
         </w:rPr>
-        <w:t>Материал помогает понять границы ответственности модулей, точки интеграции и зависимости между комп</w:t>
-      </w:r>
-      <w:r>
-        <w:rPr>
-          <w:lang w:val="ru-RU"/>
-        </w:rPr>
-        <w:t>онентами в рамках сценария 17-</w:t>
+        <w:t>Материал помогает понять границы ответственности модулей, точки интеграции и зависимости между компонентами в рамках сценария 17-</w:t>
       </w:r>
       <w:r>
         <w:t>security</w:t>
@@ -13559,13 +12349,7 @@
         <w:rPr>
           <w:lang w:val="ru-RU"/>
         </w:rPr>
-        <w:t xml:space="preserve">Это описание задает ожидаемую интерпретацию схемы при техническом ревью и синхронизации документации с </w:t>
-      </w:r>
-      <w:r>
-        <w:rPr>
-          <w:lang w:val="ru-RU"/>
-        </w:rPr>
-        <w:t xml:space="preserve">кодовой базой. </w:t>
+        <w:t xml:space="preserve">Это описание задает ожидаемую интерпретацию схемы при техническом ревью и синхронизации документации с кодовой базой. </w:t>
       </w:r>
       <w:r>
         <w:t xml:space="preserve">Ключевые контейнеры/подграфы включают: Domain Ports, Domain Types, PII Hashing Flow, Infrastructure: PII Hasher, Infrastructure: Audit. </w:t>
@@ -13577,10 +12361,7 @@
         <w:t xml:space="preserve">Именно через эти блоки визуализированы границы слоев и маршруты передачи управления или данных. </w:t>
       </w:r>
       <w:r>
-        <w:t>Примеры у</w:t>
-      </w:r>
-      <w:r>
-        <w:t xml:space="preserve">злов, отражающих доменную модель и инфраструктуру: Domain Ports, PiiHasherPort (Protocol) -------- + </w:t>
+        <w:t xml:space="preserve">Примеры узлов, отражающих доменную модель и инфраструктуру: Domain Ports, PiiHasherPort (Protocol) -------- + </w:t>
       </w:r>
       <w:proofErr w:type="gramStart"/>
       <w:r>
@@ -13588,22 +12369,13 @@
       </w:r>
       <w:proofErr w:type="gramEnd"/>
       <w:r>
-        <w:t>value: str) -&gt; str, AuditPort (Protocol) -------- + log_write(entry) + get_entries(filters), Domain Types, AuditEntry (frozen dataclass) -------- run_</w:t>
-      </w:r>
-      <w:r>
-        <w:t xml:space="preserve">id, timestamp, layer table_name, operation records_count, metadata, AuditLayer -------- BRONZE / SILVER / GOLD. </w:t>
-      </w:r>
-      <w:r>
-        <w:rPr>
-          <w:lang w:val="ru-RU"/>
-        </w:rPr>
-        <w:t>По этим сущностям можно проверить согласованность терминов, портов и адаптеров между диаграммой и реализацией. В метаданных указана оценка плотн</w:t>
-      </w:r>
-      <w:r>
-        <w:rPr>
-          <w:lang w:val="ru-RU"/>
-        </w:rPr>
-        <w:t>ости (@</w:t>
+        <w:t xml:space="preserve">value: str) -&gt; str, AuditPort (Protocol) -------- + log_write(entry) + get_entries(filters), Domain Types, AuditEntry (frozen dataclass) -------- run_id, timestamp, layer table_name, operation records_count, metadata, AuditLayer -------- BRONZE / SILVER / GOLD. </w:t>
+      </w:r>
+      <w:r>
+        <w:rPr>
+          <w:lang w:val="ru-RU"/>
+        </w:rPr>
+        <w:t>По этим сущностям можно проверить согласованность терминов, портов и адаптеров между диаграммой и реализацией. В метаданных указана оценка плотности (@</w:t>
       </w:r>
       <w:r>
         <w:t>nodes</w:t>
@@ -13635,10 +12407,7 @@
     </w:p>
     <w:p>
       <w:r>
-        <w:t>Source: docs/02-architecture/mmd-diagrams/architecture/17-security-pii-audit.mmd | Description: docs/02-architecture/diagram-description</w:t>
-      </w:r>
-      <w:r>
-        <w:t>s/mmd-diagrams/architecture/17-security-pii-audit.md</w:t>
+        <w:t>Source: docs/02-architecture/mmd-diagrams/architecture/17-security-pii-audit.mmd | Description: docs/02-architecture/diagram-descriptions/mmd-diagrams/architecture/17-security-pii-audit.md</w:t>
       </w:r>
     </w:p>
     <w:p>
@@ -13706,10 +12475,7 @@
         </w:rPr>
       </w:pPr>
       <w:r>
-        <w:t>Описание: Диаграмма Locking, Checkpoint, and Graceful S</w:t>
-      </w:r>
-      <w:r>
-        <w:t xml:space="preserve">hutdown показывает архитектурный срез BioETL на уровне System / Component и использует нотацию flowchart. </w:t>
+        <w:t xml:space="preserve">Описание: Диаграмма Locking, Checkpoint, and Graceful Shutdown показывает архитектурный срез BioETL на уровне System / Component и использует нотацию flowchart. </w:t>
       </w:r>
       <w:r>
         <w:rPr>
@@ -13736,10 +12502,7 @@
         <w:t>-</w:t>
       </w:r>
       <w:r>
-        <w:t>shutd</w:t>
-      </w:r>
-      <w:r>
-        <w:t>own</w:t>
+        <w:t>shutdown</w:t>
       </w:r>
       <w:r>
         <w:rPr>
@@ -13792,10 +12555,7 @@
         <w:t xml:space="preserve"> Это описание задает ожидаемую интерпретацию схемы при техническом ревью и синхронизации документации с кодовой базой. </w:t>
       </w:r>
       <w:r>
-        <w:t>Ключевые контейнеры/подграфы включают: Domain Por</w:t>
-      </w:r>
-      <w:r>
-        <w:t xml:space="preserve">ts, Domain Lock Types, Application: LockManager, Application: CheckpointManager, Application: Shutdown. </w:t>
+        <w:t xml:space="preserve">Ключевые контейнеры/подграфы включают: Domain Ports, Domain Lock Types, Application: LockManager, Application: CheckpointManager, Application: Shutdown. </w:t>
       </w:r>
       <w:r>
         <w:rPr>
@@ -13804,25 +12564,13 @@
         <w:t xml:space="preserve">Именно через эти блоки визуализированы границы слоев и маршруты передачи управления или данных. </w:t>
       </w:r>
       <w:r>
-        <w:t>Примеры узлов, отражающих доменную модель и инфраструкту</w:t>
-      </w:r>
-      <w:r>
-        <w:t>ру: Domain Ports, LockPort (Protocol) ━━━━━━━━━━━━━━━━━ + acquire(key, owner, ttl) + release(key, owner) + heartbeat(key, owner) + validate_owner(key, owner) + validate_fencing_token(token), CheckpointPort (Protocol) ━━━━━━━━━━━━━━━━━ + save(key, data) + l</w:t>
-      </w:r>
-      <w:r>
-        <w:t xml:space="preserve">oad(key) → dict | None + list_all() → list + delete(key), ShutdownPort (Protocol), Domain Lock Types, FencingToken (frozen dataclass) ━━━━━━━━━━━━━━━━━ sequence: int key: str owner_id: RunID issued_at: float. </w:t>
-      </w:r>
-      <w:r>
-        <w:rPr>
-          <w:lang w:val="ru-RU"/>
-        </w:rPr>
-        <w:t>По этим сущностям можно проверить согласованнос</w:t>
-      </w:r>
-      <w:r>
-        <w:rPr>
-          <w:lang w:val="ru-RU"/>
-        </w:rPr>
-        <w:t>ть терминов, портов и адаптеров между диаграммой и реализацией. В метаданных указана оценка плотности (@</w:t>
+        <w:t xml:space="preserve">Примеры узлов, отражающих доменную модель и инфраструктуру: Domain Ports, LockPort (Protocol) ━━━━━━━━━━━━━━━━━ + acquire(key, owner, ttl) + release(key, owner) + heartbeat(key, owner) + validate_owner(key, owner) + validate_fencing_token(token), CheckpointPort (Protocol) ━━━━━━━━━━━━━━━━━ + save(key, data) + load(key) → dict | None + list_all() → list + delete(key), ShutdownPort (Protocol), Domain Lock Types, FencingToken (frozen dataclass) ━━━━━━━━━━━━━━━━━ sequence: int key: str owner_id: RunID issued_at: float. </w:t>
+      </w:r>
+      <w:r>
+        <w:rPr>
+          <w:lang w:val="ru-RU"/>
+        </w:rPr>
+        <w:t>По этим сущностям можно проверить согласованность терминов, портов и адаптеров между диаграммой и реализацией. В метаданных указана оценка плотности (@</w:t>
       </w:r>
       <w:r>
         <w:t>nodes</w:t>
@@ -13854,10 +12602,7 @@
     </w:p>
     <w:p>
       <w:r>
-        <w:t>Source: docs/02-architecture/mmd-diagra</w:t>
-      </w:r>
-      <w:r>
-        <w:t>ms/architecture/18-lock-checkpoint-shutdown.mmd | Description: docs/02-architecture/diagram-descriptions/mmd-diagrams/architecture/18-lock-checkpoint-shutdown.md</w:t>
+        <w:t>Source: docs/02-architecture/mmd-diagrams/architecture/18-lock-checkpoint-shutdown.mmd | Description: docs/02-architecture/diagram-descriptions/mmd-diagrams/architecture/18-lock-checkpoint-shutdown.md</w:t>
       </w:r>
     </w:p>
     <w:p>
@@ -13915,10 +12660,7 @@
     </w:p>
     <w:p>
       <w:r>
-        <w:t xml:space="preserve">ID: 18a-lock-system | Type: flowchart | Level: System / Component | Date: </w:t>
-      </w:r>
-      <w:r>
-        <w:t>2026-02-27</w:t>
+        <w:t>ID: 18a-lock-system | Type: flowchart | Level: System / Component | Date: 2026-02-27</w:t>
       </w:r>
     </w:p>
     <w:p>
@@ -13985,13 +12727,7 @@
         <w:rPr>
           <w:lang w:val="ru-RU"/>
         </w:rPr>
-        <w:t>. Материал помогает понять границы ответственности модулей, точки интеграции и зависимости между компонентами в рамка</w:t>
-      </w:r>
-      <w:r>
-        <w:rPr>
-          <w:lang w:val="ru-RU"/>
-        </w:rPr>
-        <w:t>х сценария 18</w:t>
+        <w:t>. Материал помогает понять границы ответственности модулей, точки интеграции и зависимости между компонентами в рамках сценария 18</w:t>
       </w:r>
       <w:r>
         <w:t>a</w:t>
@@ -14035,13 +12771,7 @@
         <w:rPr>
           <w:lang w:val="ru-RU"/>
         </w:rPr>
-        <w:t>Это описание задает ожидаемую интерпретацию схемы при техническом ревью и синхронизац</w:t>
-      </w:r>
-      <w:r>
-        <w:rPr>
-          <w:lang w:val="ru-RU"/>
-        </w:rPr>
-        <w:t xml:space="preserve">ии документации с кодовой базой. </w:t>
+        <w:t xml:space="preserve">Это описание задает ожидаемую интерпретацию схемы при техническом ревью и синхронизации документации с кодовой базой. </w:t>
       </w:r>
       <w:r>
         <w:t xml:space="preserve">Ключевые контейнеры/подграфы включают: Domain Port, Domain Lock Types, Application: LockManager, Infrastructure: MemoryLock, Safety Guard. </w:t>
@@ -14050,13 +12780,7 @@
         <w:rPr>
           <w:lang w:val="ru-RU"/>
         </w:rPr>
-        <w:t xml:space="preserve">Именно через эти блоки визуализированы границы слоев и маршруты передачи управления </w:t>
-      </w:r>
-      <w:r>
-        <w:rPr>
-          <w:lang w:val="ru-RU"/>
-        </w:rPr>
-        <w:t xml:space="preserve">или данных. </w:t>
+        <w:t xml:space="preserve">Именно через эти блоки визуализированы границы слоев и маршруты передачи управления или данных. </w:t>
       </w:r>
       <w:r>
         <w:t xml:space="preserve">Примеры узлов, отражающих доменную модель и инфраструктуру: Domain Port, </w:t>
@@ -14073,13 +12797,7 @@
         <w:rPr>
           <w:lang w:val="ru-RU"/>
         </w:rPr>
-        <w:t>По этим сущностям можно проверить согласованность терминов, портов и адап</w:t>
-      </w:r>
-      <w:r>
-        <w:rPr>
-          <w:lang w:val="ru-RU"/>
-        </w:rPr>
-        <w:t>теров между диаграммой и реализацией. В метаданных указана оценка плотности (@</w:t>
+        <w:t>По этим сущностям можно проверить согласованность терминов, портов и адаптеров между диаграммой и реализацией. В метаданных указана оценка плотности (@</w:t>
       </w:r>
       <w:r>
         <w:t>nodes</w:t>
@@ -14111,10 +12829,7 @@
     </w:p>
     <w:p>
       <w:r>
-        <w:t>Source: docs/02-architecture/mmd-diagrams/architecture/18a-lock-sy</w:t>
-      </w:r>
-      <w:r>
-        <w:t>stem.mmd | Description: docs/02-architecture/diagram-descriptions/mmd-diagrams/architecture/18a-lock-system.md</w:t>
+        <w:t>Source: docs/02-architecture/mmd-diagrams/architecture/18a-lock-system.mmd | Description: docs/02-architecture/diagram-descriptions/mmd-diagrams/architecture/18a-lock-system.md</w:t>
       </w:r>
     </w:p>
     <w:p>
@@ -14182,22 +12897,13 @@
         </w:rPr>
       </w:pPr>
       <w:r>
-        <w:t>Описание: Диа</w:t>
-      </w:r>
-      <w:r>
-        <w:t xml:space="preserve">грамма Checkpoint and Shutdown System показывает архитектурный срез BioETL на уровне System / Component и использует нотацию flowchart. </w:t>
-      </w:r>
-      <w:r>
-        <w:rPr>
-          <w:lang w:val="ru-RU"/>
-        </w:rPr>
-        <w:t>Материал помогает понять границы ответственности модулей, точки интеграции и зависимости между компонентами в рамках сце</w:t>
-      </w:r>
-      <w:r>
-        <w:rPr>
-          <w:lang w:val="ru-RU"/>
-        </w:rPr>
-        <w:t>нария 18</w:t>
+        <w:t xml:space="preserve">Описание: Диаграмма Checkpoint and Shutdown System показывает архитектурный срез BioETL на уровне System / Component и использует нотацию flowchart. </w:t>
+      </w:r>
+      <w:r>
+        <w:rPr>
+          <w:lang w:val="ru-RU"/>
+        </w:rPr>
+        <w:t>Материал помогает понять границы ответственности модулей, точки интеграции и зависимости между компонентами в рамках сценария 18</w:t>
       </w:r>
       <w:r>
         <w:t>b</w:t>
@@ -14241,13 +12947,7 @@
         <w:rPr>
           <w:lang w:val="ru-RU"/>
         </w:rPr>
-        <w:t xml:space="preserve">Это описание задает ожидаемую интерпретацию схемы при техническом ревью и синхронизации документации </w:t>
-      </w:r>
-      <w:r>
-        <w:rPr>
-          <w:lang w:val="ru-RU"/>
-        </w:rPr>
-        <w:t xml:space="preserve">с кодовой базой. </w:t>
+        <w:t xml:space="preserve">Это описание задает ожидаемую интерпретацию схемы при техническом ревью и синхронизации документации с кодовой базой. </w:t>
       </w:r>
       <w:r>
         <w:t xml:space="preserve">Ключевые контейнеры/подграфы включают: Domain Ports, Application: CheckpointManager, Application: Shutdown, Infrastructure: LocalCheckpoint, Pipeline Lifecycle. </w:t>
@@ -14256,13 +12956,7 @@
         <w:rPr>
           <w:lang w:val="ru-RU"/>
         </w:rPr>
-        <w:t>Именно через эти блоки визуализированы границы слоев и маршруты передачи управ</w:t>
-      </w:r>
-      <w:r>
-        <w:rPr>
-          <w:lang w:val="ru-RU"/>
-        </w:rPr>
-        <w:t xml:space="preserve">ления или данных. Примеры узлов, отражающих доменную модель и инфраструктуру: </w:t>
+        <w:t xml:space="preserve">Именно через эти блоки визуализированы границы слоев и маршруты передачи управления или данных. Примеры узлов, отражающих доменную модель и инфраструктуру: </w:t>
       </w:r>
       <w:r>
         <w:t>Domain</w:t>
@@ -14408,13 +13102,7 @@
         <w:rPr>
           <w:lang w:val="ru-RU"/>
         </w:rPr>
-        <w:t>. По этим сущностям можно проверить</w:t>
-      </w:r>
-      <w:r>
-        <w:rPr>
-          <w:lang w:val="ru-RU"/>
-        </w:rPr>
-        <w:t xml:space="preserve"> согласованность терминов, портов и адаптеров между диаграммой и реализацией. В метаданных указана оценка плотности (@</w:t>
+        <w:t>. По этим сущностям можно проверить согласованность терминов, портов и адаптеров между диаграммой и реализацией. В метаданных указана оценка плотности (@</w:t>
       </w:r>
       <w:r>
         <w:t>nodes</w:t>
@@ -14446,10 +13134,7 @@
     </w:p>
     <w:p>
       <w:r>
-        <w:t>Source: docs/02-architect</w:t>
-      </w:r>
-      <w:r>
-        <w:t>ure/mmd-diagrams/architecture/18b-checkpoint-shutdown.mmd | Description: docs/02-architecture/diagram-descriptions/mmd-diagrams/architecture/18b-checkpoint-shutdown.md</w:t>
+        <w:t>Source: docs/02-architecture/mmd-diagrams/architecture/18b-checkpoint-shutdown.mmd | Description: docs/02-architecture/diagram-descriptions/mmd-diagrams/architecture/18b-checkpoint-shutdown.md</w:t>
       </w:r>
     </w:p>
     <w:p>

</xml_diff>

<commit_message>
refactor(cli): extract quarantine support logic into reusable module
- Moved shared quarantine logic to `quarantine_support` for better modularity and reuse.
- Simplified `quarantine.py` by delegating functionality to the extracted helpers (`_inspect_quarantine`, `_show_quarantine_stats`, `_replay_quarantine`, `_resolve_quarantine_record`, `_purge_quarantine`).
- Updated CLI commands to utilize the new modular structure.
- Updated architecture unit tests and CLI composition entry points to reflect changes.

This refactor improves code organization and enables easier testing and maintenance.

Signed-off-by: SatoryKono <821311@gmail.com>
</commit_message>
<xml_diff>
--- a/docs/02-architecture/mmd-diagrams/architecture-diagrams-with-descriptions.docx
+++ b/docs/02-architecture/mmd-diagrams/architecture-diagrams-with-descriptions.docx
@@ -2,7 +2,7 @@
 <file path=word/document.xml><?xml version="1.0" encoding="utf-8"?>
 <w:document xmlns:w="http://schemas.openxmlformats.org/wordprocessingml/2006/main" xmlns:m="http://schemas.openxmlformats.org/officeDocument/2006/math" xmlns:r="http://schemas.openxmlformats.org/officeDocument/2006/relationships" xmlns:o="urn:schemas-microsoft-com:office:office" xmlns:v="urn:schemas-microsoft-com:vml" xmlns:w10="urn:schemas-microsoft-com:office:word" xmlns:a="http://schemas.openxmlformats.org/drawingml/2006/main" xmlns:pic="http://schemas.openxmlformats.org/drawingml/2006/picture" xmlns:wp="http://schemas.openxmlformats.org/drawingml/2006/wordprocessingDrawing">
   <w:body>
-    <w:bookmarkStart w:id="166" w:name="Xd21dcf1c73de6206c52699118930c539b938de4"/>
+    <w:bookmarkStart w:id="322" w:name="Xd21dcf1c73de6206c52699118930c539b938de4"/>
     <w:p>
       <w:pPr>
         <w:pStyle w:val="Heading1"/>
@@ -936,7 +936,7 @@
       </w:r>
     </w:p>
     <w:bookmarkEnd w:id="9"/>
-    <w:bookmarkStart w:id="10" w:name="Xfd6e7f35668d2396e068105ed0e4ca3b159348a"/>
+    <w:bookmarkStart w:id="13" w:name="Xfd6e7f35668d2396e068105ed0e4ca3b159348a"/>
     <w:p>
       <w:pPr>
         <w:pStyle w:val="Heading2"/>
@@ -950,7 +950,46 @@
         <w:pStyle w:val="FirstParagraph"/>
       </w:pPr>
       <w:r>
-        <w:t xml:space="preserve">01-high-level-hexagonal</w:t>
+        <w:drawing>
+          <wp:inline>
+            <wp:extent cx="5334000" cy="1810799"/>
+            <wp:effectExtent b="0" l="0" r="0" t="0"/>
+            <wp:docPr descr="01-high-level-hexagonal" title="" id="11" name="Picture"/>
+            <a:graphic>
+              <a:graphicData uri="http://schemas.openxmlformats.org/drawingml/2006/picture">
+                <pic:pic>
+                  <pic:nvPicPr>
+                    <pic:cNvPr descr="architecture/png/01-high-level-hexagonal.png" id="12" name="Picture"/>
+                    <pic:cNvPicPr>
+                      <a:picLocks noChangeArrowheads="1" noChangeAspect="1"/>
+                    </pic:cNvPicPr>
+                  </pic:nvPicPr>
+                  <pic:blipFill>
+                    <a:blip r:embed="rId10"/>
+                    <a:stretch>
+                      <a:fillRect/>
+                    </a:stretch>
+                  </pic:blipFill>
+                  <pic:spPr bwMode="auto">
+                    <a:xfrm>
+                      <a:off x="0" y="0"/>
+                      <a:ext cx="5334000" cy="1810799"/>
+                    </a:xfrm>
+                    <a:prstGeom prst="rect">
+                      <a:avLst/>
+                    </a:prstGeom>
+                    <a:noFill/>
+                    <a:ln w="9525">
+                      <a:noFill/>
+                      <a:headEnd/>
+                      <a:tailEnd/>
+                    </a:ln>
+                  </pic:spPr>
+                </pic:pic>
+              </a:graphicData>
+            </a:graphic>
+          </wp:inline>
+        </w:drawing>
       </w:r>
     </w:p>
     <w:p>
@@ -974,8 +1013,8 @@
         <w:t xml:space="preserve">mmd-diagrams/architecture/01-high-level-hexagonal.mmd</w:t>
       </w:r>
     </w:p>
-    <w:bookmarkEnd w:id="10"/>
-    <w:bookmarkStart w:id="11" w:name="описание"/>
+    <w:bookmarkEnd w:id="13"/>
+    <w:bookmarkStart w:id="14" w:name="описание"/>
     <w:p>
       <w:pPr>
         <w:pStyle w:val="Heading2"/>
@@ -992,8 +1031,8 @@
         <w:t xml:space="preserve">Архитектурная диаграмма «High-Level Hexagonal Architecture» из набора architecture представлена в формате flowchart. Уровень детализации: System / Component. Показывает: the Ports &amp; Adapters (Hexagonal) pattern across all layers.. Количество узлов: 46. Примечание: Decomposed into 01a, 01b, 01c sub-diagrams.</w:t>
       </w:r>
     </w:p>
-    <w:bookmarkEnd w:id="11"/>
-    <w:bookmarkStart w:id="12" w:name="метаданные"/>
+    <w:bookmarkEnd w:id="14"/>
+    <w:bookmarkStart w:id="15" w:name="метаданные"/>
     <w:p>
       <w:pPr>
         <w:pStyle w:val="Heading2"/>
@@ -1086,8 +1125,8 @@
         <w:t xml:space="preserve">46</w:t>
       </w:r>
     </w:p>
-    <w:bookmarkEnd w:id="12"/>
-    <w:bookmarkStart w:id="13" w:name="X3285dd563211097e3da6b0147cd2074c43b554f"/>
+    <w:bookmarkEnd w:id="15"/>
+    <w:bookmarkStart w:id="19" w:name="X3285dd563211097e3da6b0147cd2074c43b554f"/>
     <w:p>
       <w:pPr>
         <w:pStyle w:val="Heading2"/>
@@ -1101,7 +1140,46 @@
         <w:pStyle w:val="FirstParagraph"/>
       </w:pPr>
       <w:r>
-        <w:t xml:space="preserve">01a-hexagonal-overview</w:t>
+        <w:drawing>
+          <wp:inline>
+            <wp:extent cx="5334000" cy="2934464"/>
+            <wp:effectExtent b="0" l="0" r="0" t="0"/>
+            <wp:docPr descr="01a-hexagonal-overview" title="" id="17" name="Picture"/>
+            <a:graphic>
+              <a:graphicData uri="http://schemas.openxmlformats.org/drawingml/2006/picture">
+                <pic:pic>
+                  <pic:nvPicPr>
+                    <pic:cNvPr descr="architecture/png/01a-hexagonal-overview.png" id="18" name="Picture"/>
+                    <pic:cNvPicPr>
+                      <a:picLocks noChangeArrowheads="1" noChangeAspect="1"/>
+                    </pic:cNvPicPr>
+                  </pic:nvPicPr>
+                  <pic:blipFill>
+                    <a:blip r:embed="rId16"/>
+                    <a:stretch>
+                      <a:fillRect/>
+                    </a:stretch>
+                  </pic:blipFill>
+                  <pic:spPr bwMode="auto">
+                    <a:xfrm>
+                      <a:off x="0" y="0"/>
+                      <a:ext cx="5334000" cy="2934464"/>
+                    </a:xfrm>
+                    <a:prstGeom prst="rect">
+                      <a:avLst/>
+                    </a:prstGeom>
+                    <a:noFill/>
+                    <a:ln w="9525">
+                      <a:noFill/>
+                      <a:headEnd/>
+                      <a:tailEnd/>
+                    </a:ln>
+                  </pic:spPr>
+                </pic:pic>
+              </a:graphicData>
+            </a:graphic>
+          </wp:inline>
+        </w:drawing>
       </w:r>
     </w:p>
     <w:p>
@@ -1125,8 +1203,8 @@
         <w:t xml:space="preserve">mmd-diagrams/architecture/01a-hexagonal-overview.mmd</w:t>
       </w:r>
     </w:p>
-    <w:bookmarkEnd w:id="13"/>
-    <w:bookmarkStart w:id="14" w:name="описание-1"/>
+    <w:bookmarkEnd w:id="19"/>
+    <w:bookmarkStart w:id="20" w:name="описание-1"/>
     <w:p>
       <w:pPr>
         <w:pStyle w:val="Heading2"/>
@@ -1143,8 +1221,8 @@
         <w:t xml:space="preserve">Архитектурная диаграмма «Hexagonal Overview» из набора architecture представлена в формате flowchart. Уровень детализации: System / Component. Количество узлов: 11.</w:t>
       </w:r>
     </w:p>
-    <w:bookmarkEnd w:id="14"/>
-    <w:bookmarkStart w:id="15" w:name="метаданные-1"/>
+    <w:bookmarkEnd w:id="20"/>
+    <w:bookmarkStart w:id="21" w:name="метаданные-1"/>
     <w:p>
       <w:pPr>
         <w:pStyle w:val="Heading2"/>
@@ -1237,8 +1315,8 @@
         <w:t xml:space="preserve">11</w:t>
       </w:r>
     </w:p>
-    <w:bookmarkEnd w:id="15"/>
-    <w:bookmarkStart w:id="16" w:name="X1bcb3ff18eeb3883164949aeb9e38b14a830021"/>
+    <w:bookmarkEnd w:id="21"/>
+    <w:bookmarkStart w:id="25" w:name="X1bcb3ff18eeb3883164949aeb9e38b14a830021"/>
     <w:p>
       <w:pPr>
         <w:pStyle w:val="Heading2"/>
@@ -1252,7 +1330,46 @@
         <w:pStyle w:val="FirstParagraph"/>
       </w:pPr>
       <w:r>
-        <w:t xml:space="preserve">01b-hexagonal-domain-app</w:t>
+        <w:drawing>
+          <wp:inline>
+            <wp:extent cx="5334000" cy="973247"/>
+            <wp:effectExtent b="0" l="0" r="0" t="0"/>
+            <wp:docPr descr="01b-hexagonal-domain-app" title="" id="23" name="Picture"/>
+            <a:graphic>
+              <a:graphicData uri="http://schemas.openxmlformats.org/drawingml/2006/picture">
+                <pic:pic>
+                  <pic:nvPicPr>
+                    <pic:cNvPr descr="architecture/png/01b-hexagonal-domain-app.png" id="24" name="Picture"/>
+                    <pic:cNvPicPr>
+                      <a:picLocks noChangeArrowheads="1" noChangeAspect="1"/>
+                    </pic:cNvPicPr>
+                  </pic:nvPicPr>
+                  <pic:blipFill>
+                    <a:blip r:embed="rId22"/>
+                    <a:stretch>
+                      <a:fillRect/>
+                    </a:stretch>
+                  </pic:blipFill>
+                  <pic:spPr bwMode="auto">
+                    <a:xfrm>
+                      <a:off x="0" y="0"/>
+                      <a:ext cx="5334000" cy="973247"/>
+                    </a:xfrm>
+                    <a:prstGeom prst="rect">
+                      <a:avLst/>
+                    </a:prstGeom>
+                    <a:noFill/>
+                    <a:ln w="9525">
+                      <a:noFill/>
+                      <a:headEnd/>
+                      <a:tailEnd/>
+                    </a:ln>
+                  </pic:spPr>
+                </pic:pic>
+              </a:graphicData>
+            </a:graphic>
+          </wp:inline>
+        </w:drawing>
       </w:r>
     </w:p>
     <w:p>
@@ -1276,8 +1393,8 @@
         <w:t xml:space="preserve">mmd-diagrams/architecture/01b-hexagonal-domain-app.mmd</w:t>
       </w:r>
     </w:p>
-    <w:bookmarkEnd w:id="16"/>
-    <w:bookmarkStart w:id="17" w:name="описание-2"/>
+    <w:bookmarkEnd w:id="25"/>
+    <w:bookmarkStart w:id="26" w:name="описание-2"/>
     <w:p>
       <w:pPr>
         <w:pStyle w:val="Heading2"/>
@@ -1294,8 +1411,8 @@
         <w:t xml:space="preserve">Архитектурная диаграмма «Hexagonal Domain and Application» из набора architecture представлена в формате flowchart. Уровень детализации: System / Component. Количество узлов: 13.</w:t>
       </w:r>
     </w:p>
-    <w:bookmarkEnd w:id="17"/>
-    <w:bookmarkStart w:id="18" w:name="метаданные-2"/>
+    <w:bookmarkEnd w:id="26"/>
+    <w:bookmarkStart w:id="27" w:name="метаданные-2"/>
     <w:p>
       <w:pPr>
         <w:pStyle w:val="Heading2"/>
@@ -1388,8 +1505,8 @@
         <w:t xml:space="preserve">13</w:t>
       </w:r>
     </w:p>
-    <w:bookmarkEnd w:id="18"/>
-    <w:bookmarkStart w:id="19" w:name="Xca4d9abd820b95e2c659fc4b2da2b78fc5695b5"/>
+    <w:bookmarkEnd w:id="27"/>
+    <w:bookmarkStart w:id="31" w:name="Xca4d9abd820b95e2c659fc4b2da2b78fc5695b5"/>
     <w:p>
       <w:pPr>
         <w:pStyle w:val="Heading2"/>
@@ -1403,7 +1520,46 @@
         <w:pStyle w:val="FirstParagraph"/>
       </w:pPr>
       <w:r>
-        <w:t xml:space="preserve">01c-hexagonal-infra-comp</w:t>
+        <w:drawing>
+          <wp:inline>
+            <wp:extent cx="5334000" cy="1449739"/>
+            <wp:effectExtent b="0" l="0" r="0" t="0"/>
+            <wp:docPr descr="01c-hexagonal-infra-comp" title="" id="29" name="Picture"/>
+            <a:graphic>
+              <a:graphicData uri="http://schemas.openxmlformats.org/drawingml/2006/picture">
+                <pic:pic>
+                  <pic:nvPicPr>
+                    <pic:cNvPr descr="architecture/png/01c-hexagonal-infra-comp.png" id="30" name="Picture"/>
+                    <pic:cNvPicPr>
+                      <a:picLocks noChangeArrowheads="1" noChangeAspect="1"/>
+                    </pic:cNvPicPr>
+                  </pic:nvPicPr>
+                  <pic:blipFill>
+                    <a:blip r:embed="rId28"/>
+                    <a:stretch>
+                      <a:fillRect/>
+                    </a:stretch>
+                  </pic:blipFill>
+                  <pic:spPr bwMode="auto">
+                    <a:xfrm>
+                      <a:off x="0" y="0"/>
+                      <a:ext cx="5334000" cy="1449739"/>
+                    </a:xfrm>
+                    <a:prstGeom prst="rect">
+                      <a:avLst/>
+                    </a:prstGeom>
+                    <a:noFill/>
+                    <a:ln w="9525">
+                      <a:noFill/>
+                      <a:headEnd/>
+                      <a:tailEnd/>
+                    </a:ln>
+                  </pic:spPr>
+                </pic:pic>
+              </a:graphicData>
+            </a:graphic>
+          </wp:inline>
+        </w:drawing>
       </w:r>
     </w:p>
     <w:p>
@@ -1427,8 +1583,8 @@
         <w:t xml:space="preserve">mmd-diagrams/architecture/01c-hexagonal-infra-comp.mmd</w:t>
       </w:r>
     </w:p>
-    <w:bookmarkEnd w:id="19"/>
-    <w:bookmarkStart w:id="20" w:name="описание-3"/>
+    <w:bookmarkEnd w:id="31"/>
+    <w:bookmarkStart w:id="32" w:name="описание-3"/>
     <w:p>
       <w:pPr>
         <w:pStyle w:val="Heading2"/>
@@ -1445,8 +1601,8 @@
         <w:t xml:space="preserve">Архитектурная диаграмма «Hexagonal Infrastructure and Composition» из набора architecture представлена в формате flowchart. Уровень детализации: System / Component. Количество узлов: 14.</w:t>
       </w:r>
     </w:p>
-    <w:bookmarkEnd w:id="20"/>
-    <w:bookmarkStart w:id="21" w:name="метаданные-3"/>
+    <w:bookmarkEnd w:id="32"/>
+    <w:bookmarkStart w:id="33" w:name="метаданные-3"/>
     <w:p>
       <w:pPr>
         <w:pStyle w:val="Heading2"/>
@@ -1539,8 +1695,8 @@
         <w:t xml:space="preserve">14</w:t>
       </w:r>
     </w:p>
-    <w:bookmarkEnd w:id="21"/>
-    <w:bookmarkStart w:id="22" w:name="Xf33de9551686f4a0df3f2aaa4eccf2a6b652cd3"/>
+    <w:bookmarkEnd w:id="33"/>
+    <w:bookmarkStart w:id="37" w:name="Xf33de9551686f4a0df3f2aaa4eccf2a6b652cd3"/>
     <w:p>
       <w:pPr>
         <w:pStyle w:val="Heading2"/>
@@ -1554,7 +1710,46 @@
         <w:pStyle w:val="FirstParagraph"/>
       </w:pPr>
       <w:r>
-        <w:t xml:space="preserve">01d-hexagonal-overview-rounded</w:t>
+        <w:drawing>
+          <wp:inline>
+            <wp:extent cx="5334000" cy="2934464"/>
+            <wp:effectExtent b="0" l="0" r="0" t="0"/>
+            <wp:docPr descr="01d-hexagonal-overview-rounded" title="" id="35" name="Picture"/>
+            <a:graphic>
+              <a:graphicData uri="http://schemas.openxmlformats.org/drawingml/2006/picture">
+                <pic:pic>
+                  <pic:nvPicPr>
+                    <pic:cNvPr descr="architecture/png/01d-hexagonal-overview-rounded.png" id="36" name="Picture"/>
+                    <pic:cNvPicPr>
+                      <a:picLocks noChangeArrowheads="1" noChangeAspect="1"/>
+                    </pic:cNvPicPr>
+                  </pic:nvPicPr>
+                  <pic:blipFill>
+                    <a:blip r:embed="rId34"/>
+                    <a:stretch>
+                      <a:fillRect/>
+                    </a:stretch>
+                  </pic:blipFill>
+                  <pic:spPr bwMode="auto">
+                    <a:xfrm>
+                      <a:off x="0" y="0"/>
+                      <a:ext cx="5334000" cy="2934464"/>
+                    </a:xfrm>
+                    <a:prstGeom prst="rect">
+                      <a:avLst/>
+                    </a:prstGeom>
+                    <a:noFill/>
+                    <a:ln w="9525">
+                      <a:noFill/>
+                      <a:headEnd/>
+                      <a:tailEnd/>
+                    </a:ln>
+                  </pic:spPr>
+                </pic:pic>
+              </a:graphicData>
+            </a:graphic>
+          </wp:inline>
+        </w:drawing>
       </w:r>
     </w:p>
     <w:p>
@@ -1578,8 +1773,8 @@
         <w:t xml:space="preserve">mmd-diagrams/architecture/01d-hexagonal-overview-rounded.mmd</w:t>
       </w:r>
     </w:p>
-    <w:bookmarkEnd w:id="22"/>
-    <w:bookmarkStart w:id="23" w:name="описание-4"/>
+    <w:bookmarkEnd w:id="37"/>
+    <w:bookmarkStart w:id="38" w:name="описание-4"/>
     <w:p>
       <w:pPr>
         <w:pStyle w:val="Heading2"/>
@@ -1596,8 +1791,8 @@
         <w:t xml:space="preserve">Архитектурная диаграмма «Hexagonal Overview (Rounded Nodes)» из набора architecture представлена в формате flowchart. Уровень детализации: System / Component. Количество узлов: 11.</w:t>
       </w:r>
     </w:p>
-    <w:bookmarkEnd w:id="23"/>
-    <w:bookmarkStart w:id="24" w:name="метаданные-4"/>
+    <w:bookmarkEnd w:id="38"/>
+    <w:bookmarkStart w:id="39" w:name="метаданные-4"/>
     <w:p>
       <w:pPr>
         <w:pStyle w:val="Heading2"/>
@@ -1690,8 +1885,8 @@
         <w:t xml:space="preserve">11</w:t>
       </w:r>
     </w:p>
-    <w:bookmarkEnd w:id="24"/>
-    <w:bookmarkStart w:id="25" w:name="X70ef10417ad890169def489df4df608c3542e37"/>
+    <w:bookmarkEnd w:id="39"/>
+    <w:bookmarkStart w:id="43" w:name="X70ef10417ad890169def489df4df608c3542e37"/>
     <w:p>
       <w:pPr>
         <w:pStyle w:val="Heading2"/>
@@ -1705,7 +1900,46 @@
         <w:pStyle w:val="FirstParagraph"/>
       </w:pPr>
       <w:r>
-        <w:t xml:space="preserve">02-layer-dependency-matrix</w:t>
+        <w:drawing>
+          <wp:inline>
+            <wp:extent cx="5334000" cy="7871218"/>
+            <wp:effectExtent b="0" l="0" r="0" t="0"/>
+            <wp:docPr descr="02-layer-dependency-matrix" title="" id="41" name="Picture"/>
+            <a:graphic>
+              <a:graphicData uri="http://schemas.openxmlformats.org/drawingml/2006/picture">
+                <pic:pic>
+                  <pic:nvPicPr>
+                    <pic:cNvPr descr="architecture/png/02-layer-dependency-matrix.png" id="42" name="Picture"/>
+                    <pic:cNvPicPr>
+                      <a:picLocks noChangeArrowheads="1" noChangeAspect="1"/>
+                    </pic:cNvPicPr>
+                  </pic:nvPicPr>
+                  <pic:blipFill>
+                    <a:blip r:embed="rId40"/>
+                    <a:stretch>
+                      <a:fillRect/>
+                    </a:stretch>
+                  </pic:blipFill>
+                  <pic:spPr bwMode="auto">
+                    <a:xfrm>
+                      <a:off x="0" y="0"/>
+                      <a:ext cx="5334000" cy="7871218"/>
+                    </a:xfrm>
+                    <a:prstGeom prst="rect">
+                      <a:avLst/>
+                    </a:prstGeom>
+                    <a:noFill/>
+                    <a:ln w="9525">
+                      <a:noFill/>
+                      <a:headEnd/>
+                      <a:tailEnd/>
+                    </a:ln>
+                  </pic:spPr>
+                </pic:pic>
+              </a:graphicData>
+            </a:graphic>
+          </wp:inline>
+        </w:drawing>
       </w:r>
     </w:p>
     <w:p>
@@ -1729,8 +1963,8 @@
         <w:t xml:space="preserve">mmd-diagrams/architecture/02-layer-dependency-matrix.mmd</w:t>
       </w:r>
     </w:p>
-    <w:bookmarkEnd w:id="25"/>
-    <w:bookmarkStart w:id="26" w:name="описание-5"/>
+    <w:bookmarkEnd w:id="43"/>
+    <w:bookmarkStart w:id="44" w:name="описание-5"/>
     <w:p>
       <w:pPr>
         <w:pStyle w:val="Heading2"/>
@@ -1747,8 +1981,8 @@
         <w:t xml:space="preserve">Архитектурная диаграмма «Layer Dependency Matrix (ARCH-001)» из набора architecture представлена в формате flowchart. Уровень детализации: System / Component. Количество узлов: 5.</w:t>
       </w:r>
     </w:p>
-    <w:bookmarkEnd w:id="26"/>
-    <w:bookmarkStart w:id="27" w:name="метаданные-5"/>
+    <w:bookmarkEnd w:id="44"/>
+    <w:bookmarkStart w:id="45" w:name="метаданные-5"/>
     <w:p>
       <w:pPr>
         <w:pStyle w:val="Heading2"/>
@@ -1841,8 +2075,8 @@
         <w:t xml:space="preserve">5</w:t>
       </w:r>
     </w:p>
-    <w:bookmarkEnd w:id="27"/>
-    <w:bookmarkStart w:id="28" w:name="X7a2c07a958c76c043e40036a93c93e4496dd414"/>
+    <w:bookmarkEnd w:id="45"/>
+    <w:bookmarkStart w:id="49" w:name="X7a2c07a958c76c043e40036a93c93e4496dd414"/>
     <w:p>
       <w:pPr>
         <w:pStyle w:val="Heading2"/>
@@ -1856,7 +2090,46 @@
         <w:pStyle w:val="FirstParagraph"/>
       </w:pPr>
       <w:r>
-        <w:t xml:space="preserve">03-medallion-data-flow</w:t>
+        <w:drawing>
+          <wp:inline>
+            <wp:extent cx="5334000" cy="856051"/>
+            <wp:effectExtent b="0" l="0" r="0" t="0"/>
+            <wp:docPr descr="03-medallion-data-flow" title="" id="47" name="Picture"/>
+            <a:graphic>
+              <a:graphicData uri="http://schemas.openxmlformats.org/drawingml/2006/picture">
+                <pic:pic>
+                  <pic:nvPicPr>
+                    <pic:cNvPr descr="architecture/png/03-medallion-data-flow.png" id="48" name="Picture"/>
+                    <pic:cNvPicPr>
+                      <a:picLocks noChangeArrowheads="1" noChangeAspect="1"/>
+                    </pic:cNvPicPr>
+                  </pic:nvPicPr>
+                  <pic:blipFill>
+                    <a:blip r:embed="rId46"/>
+                    <a:stretch>
+                      <a:fillRect/>
+                    </a:stretch>
+                  </pic:blipFill>
+                  <pic:spPr bwMode="auto">
+                    <a:xfrm>
+                      <a:off x="0" y="0"/>
+                      <a:ext cx="5334000" cy="856051"/>
+                    </a:xfrm>
+                    <a:prstGeom prst="rect">
+                      <a:avLst/>
+                    </a:prstGeom>
+                    <a:noFill/>
+                    <a:ln w="9525">
+                      <a:noFill/>
+                      <a:headEnd/>
+                      <a:tailEnd/>
+                    </a:ln>
+                  </pic:spPr>
+                </pic:pic>
+              </a:graphicData>
+            </a:graphic>
+          </wp:inline>
+        </w:drawing>
       </w:r>
     </w:p>
     <w:p>
@@ -1880,8 +2153,8 @@
         <w:t xml:space="preserve">mmd-diagrams/architecture/03-medallion-data-flow.mmd</w:t>
       </w:r>
     </w:p>
-    <w:bookmarkEnd w:id="28"/>
-    <w:bookmarkStart w:id="29" w:name="описание-6"/>
+    <w:bookmarkEnd w:id="49"/>
+    <w:bookmarkStart w:id="50" w:name="описание-6"/>
     <w:p>
       <w:pPr>
         <w:pStyle w:val="Heading2"/>
@@ -1898,8 +2171,8 @@
         <w:t xml:space="preserve">Архитектурная диаграмма «Medallion Architecture Data Flow (Bronze → Silver → Gold)» из набора architecture представлена в формате flowchart. Уровень детализации: System / Component. Показывает: how data flows through the three medallion layers.. Количество узлов: 36. Примечание: Canonical medallion flow — at threshold boundary.</w:t>
       </w:r>
     </w:p>
-    <w:bookmarkEnd w:id="29"/>
-    <w:bookmarkStart w:id="30" w:name="метаданные-6"/>
+    <w:bookmarkEnd w:id="50"/>
+    <w:bookmarkStart w:id="51" w:name="метаданные-6"/>
     <w:p>
       <w:pPr>
         <w:pStyle w:val="Heading2"/>
@@ -1992,8 +2265,8 @@
         <w:t xml:space="preserve">36</w:t>
       </w:r>
     </w:p>
-    <w:bookmarkEnd w:id="30"/>
-    <w:bookmarkStart w:id="31" w:name="Xf7941136224cdd640244b7aead7895c5bc2b374"/>
+    <w:bookmarkEnd w:id="51"/>
+    <w:bookmarkStart w:id="55" w:name="Xf7941136224cdd640244b7aead7895c5bc2b374"/>
     <w:p>
       <w:pPr>
         <w:pStyle w:val="Heading2"/>
@@ -2007,7 +2280,46 @@
         <w:pStyle w:val="FirstParagraph"/>
       </w:pPr>
       <w:r>
-        <w:t xml:space="preserve">03a-medallion-layers-overview</w:t>
+        <w:drawing>
+          <wp:inline>
+            <wp:extent cx="5334000" cy="454741"/>
+            <wp:effectExtent b="0" l="0" r="0" t="0"/>
+            <wp:docPr descr="03a-medallion-layers-overview" title="" id="53" name="Picture"/>
+            <a:graphic>
+              <a:graphicData uri="http://schemas.openxmlformats.org/drawingml/2006/picture">
+                <pic:pic>
+                  <pic:nvPicPr>
+                    <pic:cNvPr descr="architecture/png/03a-medallion-layers-overview.png" id="54" name="Picture"/>
+                    <pic:cNvPicPr>
+                      <a:picLocks noChangeArrowheads="1" noChangeAspect="1"/>
+                    </pic:cNvPicPr>
+                  </pic:nvPicPr>
+                  <pic:blipFill>
+                    <a:blip r:embed="rId52"/>
+                    <a:stretch>
+                      <a:fillRect/>
+                    </a:stretch>
+                  </pic:blipFill>
+                  <pic:spPr bwMode="auto">
+                    <a:xfrm>
+                      <a:off x="0" y="0"/>
+                      <a:ext cx="5334000" cy="454741"/>
+                    </a:xfrm>
+                    <a:prstGeom prst="rect">
+                      <a:avLst/>
+                    </a:prstGeom>
+                    <a:noFill/>
+                    <a:ln w="9525">
+                      <a:noFill/>
+                      <a:headEnd/>
+                      <a:tailEnd/>
+                    </a:ln>
+                  </pic:spPr>
+                </pic:pic>
+              </a:graphicData>
+            </a:graphic>
+          </wp:inline>
+        </w:drawing>
       </w:r>
     </w:p>
     <w:p>
@@ -2031,8 +2343,8 @@
         <w:t xml:space="preserve">mmd-diagrams/architecture/03a-medallion-layers-overview.mmd</w:t>
       </w:r>
     </w:p>
-    <w:bookmarkEnd w:id="31"/>
-    <w:bookmarkStart w:id="32" w:name="описание-7"/>
+    <w:bookmarkEnd w:id="55"/>
+    <w:bookmarkStart w:id="56" w:name="описание-7"/>
     <w:p>
       <w:pPr>
         <w:pStyle w:val="Heading2"/>
@@ -2049,8 +2361,8 @@
         <w:t xml:space="preserve">Архитектурная диаграмма «Medallion Layers Overview» из набора architecture представлена в формате flowchart. Уровень детализации: System / Component. Количество узлов: 12.</w:t>
       </w:r>
     </w:p>
-    <w:bookmarkEnd w:id="32"/>
-    <w:bookmarkStart w:id="33" w:name="метаданные-7"/>
+    <w:bookmarkEnd w:id="56"/>
+    <w:bookmarkStart w:id="57" w:name="метаданные-7"/>
     <w:p>
       <w:pPr>
         <w:pStyle w:val="Heading2"/>
@@ -2143,8 +2455,8 @@
         <w:t xml:space="preserve">12</w:t>
       </w:r>
     </w:p>
-    <w:bookmarkEnd w:id="33"/>
-    <w:bookmarkStart w:id="34" w:name="Xd9dca22ebfadc530679e433a5e6f63abc6500ec"/>
+    <w:bookmarkEnd w:id="57"/>
+    <w:bookmarkStart w:id="61" w:name="Xd9dca22ebfadc530679e433a5e6f63abc6500ec"/>
     <w:p>
       <w:pPr>
         <w:pStyle w:val="Heading2"/>
@@ -2158,7 +2470,46 @@
         <w:pStyle w:val="FirstParagraph"/>
       </w:pPr>
       <w:r>
-        <w:t xml:space="preserve">04-pipeline-execution-flow</w:t>
+        <w:drawing>
+          <wp:inline>
+            <wp:extent cx="5334000" cy="4756202"/>
+            <wp:effectExtent b="0" l="0" r="0" t="0"/>
+            <wp:docPr descr="04-pipeline-execution-flow" title="" id="59" name="Picture"/>
+            <a:graphic>
+              <a:graphicData uri="http://schemas.openxmlformats.org/drawingml/2006/picture">
+                <pic:pic>
+                  <pic:nvPicPr>
+                    <pic:cNvPr descr="architecture/png/04-pipeline-execution-flow.png" id="60" name="Picture"/>
+                    <pic:cNvPicPr>
+                      <a:picLocks noChangeArrowheads="1" noChangeAspect="1"/>
+                    </pic:cNvPicPr>
+                  </pic:nvPicPr>
+                  <pic:blipFill>
+                    <a:blip r:embed="rId58"/>
+                    <a:stretch>
+                      <a:fillRect/>
+                    </a:stretch>
+                  </pic:blipFill>
+                  <pic:spPr bwMode="auto">
+                    <a:xfrm>
+                      <a:off x="0" y="0"/>
+                      <a:ext cx="5334000" cy="4756202"/>
+                    </a:xfrm>
+                    <a:prstGeom prst="rect">
+                      <a:avLst/>
+                    </a:prstGeom>
+                    <a:noFill/>
+                    <a:ln w="9525">
+                      <a:noFill/>
+                      <a:headEnd/>
+                      <a:tailEnd/>
+                    </a:ln>
+                  </pic:spPr>
+                </pic:pic>
+              </a:graphicData>
+            </a:graphic>
+          </wp:inline>
+        </w:drawing>
       </w:r>
     </w:p>
     <w:p>
@@ -2182,8 +2533,8 @@
         <w:t xml:space="preserve">mmd-diagrams/architecture/04-pipeline-execution-flow.mmd</w:t>
       </w:r>
     </w:p>
-    <w:bookmarkEnd w:id="34"/>
-    <w:bookmarkStart w:id="35" w:name="описание-8"/>
+    <w:bookmarkEnd w:id="61"/>
+    <w:bookmarkStart w:id="62" w:name="описание-8"/>
     <w:p>
       <w:pPr>
         <w:pStyle w:val="Heading2"/>
@@ -2200,8 +2551,8 @@
         <w:t xml:space="preserve">Архитектурная диаграмма «Pipeline Execution Lifecycle» из набора architecture представлена в формате sequenceDiagram. Уровень детализации: System / Component. Количество узлов: 12.</w:t>
       </w:r>
     </w:p>
-    <w:bookmarkEnd w:id="35"/>
-    <w:bookmarkStart w:id="36" w:name="метаданные-8"/>
+    <w:bookmarkEnd w:id="62"/>
+    <w:bookmarkStart w:id="63" w:name="метаданные-8"/>
     <w:p>
       <w:pPr>
         <w:pStyle w:val="Heading2"/>
@@ -2294,8 +2645,8 @@
         <w:t xml:space="preserve">12</w:t>
       </w:r>
     </w:p>
-    <w:bookmarkEnd w:id="36"/>
-    <w:bookmarkStart w:id="37" w:name="X399af10f916b19bdfb9710b51b4f2bce7c87c99"/>
+    <w:bookmarkEnd w:id="63"/>
+    <w:bookmarkStart w:id="67" w:name="X399af10f916b19bdfb9710b51b4f2bce7c87c99"/>
     <w:p>
       <w:pPr>
         <w:pStyle w:val="Heading2"/>
@@ -2309,7 +2660,46 @@
         <w:pStyle w:val="FirstParagraph"/>
       </w:pPr>
       <w:r>
-        <w:t xml:space="preserve">05-provider-adapter-hierarchy</w:t>
+        <w:drawing>
+          <wp:inline>
+            <wp:extent cx="5334000" cy="1241956"/>
+            <wp:effectExtent b="0" l="0" r="0" t="0"/>
+            <wp:docPr descr="05-provider-adapter-hierarchy" title="" id="65" name="Picture"/>
+            <a:graphic>
+              <a:graphicData uri="http://schemas.openxmlformats.org/drawingml/2006/picture">
+                <pic:pic>
+                  <pic:nvPicPr>
+                    <pic:cNvPr descr="architecture/png/05-provider-adapter-hierarchy.png" id="66" name="Picture"/>
+                    <pic:cNvPicPr>
+                      <a:picLocks noChangeArrowheads="1" noChangeAspect="1"/>
+                    </pic:cNvPicPr>
+                  </pic:nvPicPr>
+                  <pic:blipFill>
+                    <a:blip r:embed="rId64"/>
+                    <a:stretch>
+                      <a:fillRect/>
+                    </a:stretch>
+                  </pic:blipFill>
+                  <pic:spPr bwMode="auto">
+                    <a:xfrm>
+                      <a:off x="0" y="0"/>
+                      <a:ext cx="5334000" cy="1241956"/>
+                    </a:xfrm>
+                    <a:prstGeom prst="rect">
+                      <a:avLst/>
+                    </a:prstGeom>
+                    <a:noFill/>
+                    <a:ln w="9525">
+                      <a:noFill/>
+                      <a:headEnd/>
+                      <a:tailEnd/>
+                    </a:ln>
+                  </pic:spPr>
+                </pic:pic>
+              </a:graphicData>
+            </a:graphic>
+          </wp:inline>
+        </w:drawing>
       </w:r>
     </w:p>
     <w:p>
@@ -2333,8 +2723,8 @@
         <w:t xml:space="preserve">mmd-diagrams/architecture/05-provider-adapter-hierarchy.mmd</w:t>
       </w:r>
     </w:p>
-    <w:bookmarkEnd w:id="37"/>
-    <w:bookmarkStart w:id="38" w:name="описание-9"/>
+    <w:bookmarkEnd w:id="67"/>
+    <w:bookmarkStart w:id="68" w:name="описание-9"/>
     <w:p>
       <w:pPr>
         <w:pStyle w:val="Heading2"/>
@@ -2351,8 +2741,8 @@
         <w:t xml:space="preserve">Архитектурная диаграмма «Provider Adapter Hierarchy» из набора architecture представлена в формате flowchart. Уровень детализации: System / Component. Показывает: how each provider adapter inherits from base classes and implements DataSourcePort.. Количество узлов: 27. Примечание: Decomposed into 05a, 05b sub-diagrams.</w:t>
       </w:r>
     </w:p>
-    <w:bookmarkEnd w:id="38"/>
-    <w:bookmarkStart w:id="39" w:name="метаданные-9"/>
+    <w:bookmarkEnd w:id="68"/>
+    <w:bookmarkStart w:id="69" w:name="метаданные-9"/>
     <w:p>
       <w:pPr>
         <w:pStyle w:val="Heading2"/>
@@ -2445,8 +2835,8 @@
         <w:t xml:space="preserve">27</w:t>
       </w:r>
     </w:p>
-    <w:bookmarkEnd w:id="39"/>
-    <w:bookmarkStart w:id="40" w:name="X0b83679be86735ec9ce2164053c7f28d9f9d75c"/>
+    <w:bookmarkEnd w:id="69"/>
+    <w:bookmarkStart w:id="73" w:name="X0b83679be86735ec9ce2164053c7f28d9f9d75c"/>
     <w:p>
       <w:pPr>
         <w:pStyle w:val="Heading2"/>
@@ -2460,7 +2850,46 @@
         <w:pStyle w:val="FirstParagraph"/>
       </w:pPr>
       <w:r>
-        <w:t xml:space="preserve">05a-adapter-hierarchy-base</w:t>
+        <w:drawing>
+          <wp:inline>
+            <wp:extent cx="5334000" cy="1369200"/>
+            <wp:effectExtent b="0" l="0" r="0" t="0"/>
+            <wp:docPr descr="05a-adapter-hierarchy-base" title="" id="71" name="Picture"/>
+            <a:graphic>
+              <a:graphicData uri="http://schemas.openxmlformats.org/drawingml/2006/picture">
+                <pic:pic>
+                  <pic:nvPicPr>
+                    <pic:cNvPr descr="architecture/png/05a-adapter-hierarchy-base.png" id="72" name="Picture"/>
+                    <pic:cNvPicPr>
+                      <a:picLocks noChangeArrowheads="1" noChangeAspect="1"/>
+                    </pic:cNvPicPr>
+                  </pic:nvPicPr>
+                  <pic:blipFill>
+                    <a:blip r:embed="rId70"/>
+                    <a:stretch>
+                      <a:fillRect/>
+                    </a:stretch>
+                  </pic:blipFill>
+                  <pic:spPr bwMode="auto">
+                    <a:xfrm>
+                      <a:off x="0" y="0"/>
+                      <a:ext cx="5334000" cy="1369200"/>
+                    </a:xfrm>
+                    <a:prstGeom prst="rect">
+                      <a:avLst/>
+                    </a:prstGeom>
+                    <a:noFill/>
+                    <a:ln w="9525">
+                      <a:noFill/>
+                      <a:headEnd/>
+                      <a:tailEnd/>
+                    </a:ln>
+                  </pic:spPr>
+                </pic:pic>
+              </a:graphicData>
+            </a:graphic>
+          </wp:inline>
+        </w:drawing>
       </w:r>
     </w:p>
     <w:p>
@@ -2484,8 +2913,8 @@
         <w:t xml:space="preserve">mmd-diagrams/architecture/05a-adapter-hierarchy-base.mmd</w:t>
       </w:r>
     </w:p>
-    <w:bookmarkEnd w:id="40"/>
-    <w:bookmarkStart w:id="41" w:name="описание-10"/>
+    <w:bookmarkEnd w:id="73"/>
+    <w:bookmarkStart w:id="74" w:name="описание-10"/>
     <w:p>
       <w:pPr>
         <w:pStyle w:val="Heading2"/>
@@ -2502,8 +2931,8 @@
         <w:t xml:space="preserve">Архитектурная диаграмма «Adapter Hierarchy: Base Types» из набора architecture представлена в формате flowchart. Уровень детализации: System / Component. Количество узлов: 12.</w:t>
       </w:r>
     </w:p>
-    <w:bookmarkEnd w:id="41"/>
-    <w:bookmarkStart w:id="42" w:name="метаданные-10"/>
+    <w:bookmarkEnd w:id="74"/>
+    <w:bookmarkStart w:id="75" w:name="метаданные-10"/>
     <w:p>
       <w:pPr>
         <w:pStyle w:val="Heading2"/>
@@ -2596,8 +3025,8 @@
         <w:t xml:space="preserve">12</w:t>
       </w:r>
     </w:p>
-    <w:bookmarkEnd w:id="42"/>
-    <w:bookmarkStart w:id="43" w:name="Xf4d5090fa419cf6f27db9bb4251590b328a391f"/>
+    <w:bookmarkEnd w:id="75"/>
+    <w:bookmarkStart w:id="79" w:name="Xf4d5090fa419cf6f27db9bb4251590b328a391f"/>
     <w:p>
       <w:pPr>
         <w:pStyle w:val="Heading2"/>
@@ -2611,7 +3040,46 @@
         <w:pStyle w:val="FirstParagraph"/>
       </w:pPr>
       <w:r>
-        <w:t xml:space="preserve">05b-adapter-hierarchy-providers</w:t>
+        <w:drawing>
+          <wp:inline>
+            <wp:extent cx="5334000" cy="600845"/>
+            <wp:effectExtent b="0" l="0" r="0" t="0"/>
+            <wp:docPr descr="05b-adapter-hierarchy-providers" title="" id="77" name="Picture"/>
+            <a:graphic>
+              <a:graphicData uri="http://schemas.openxmlformats.org/drawingml/2006/picture">
+                <pic:pic>
+                  <pic:nvPicPr>
+                    <pic:cNvPr descr="architecture/png/05b-adapter-hierarchy-providers.png" id="78" name="Picture"/>
+                    <pic:cNvPicPr>
+                      <a:picLocks noChangeArrowheads="1" noChangeAspect="1"/>
+                    </pic:cNvPicPr>
+                  </pic:nvPicPr>
+                  <pic:blipFill>
+                    <a:blip r:embed="rId76"/>
+                    <a:stretch>
+                      <a:fillRect/>
+                    </a:stretch>
+                  </pic:blipFill>
+                  <pic:spPr bwMode="auto">
+                    <a:xfrm>
+                      <a:off x="0" y="0"/>
+                      <a:ext cx="5334000" cy="600845"/>
+                    </a:xfrm>
+                    <a:prstGeom prst="rect">
+                      <a:avLst/>
+                    </a:prstGeom>
+                    <a:noFill/>
+                    <a:ln w="9525">
+                      <a:noFill/>
+                      <a:headEnd/>
+                      <a:tailEnd/>
+                    </a:ln>
+                  </pic:spPr>
+                </pic:pic>
+              </a:graphicData>
+            </a:graphic>
+          </wp:inline>
+        </w:drawing>
       </w:r>
     </w:p>
     <w:p>
@@ -2635,8 +3103,8 @@
         <w:t xml:space="preserve">mmd-diagrams/architecture/05b-adapter-hierarchy-providers.mmd</w:t>
       </w:r>
     </w:p>
-    <w:bookmarkEnd w:id="43"/>
-    <w:bookmarkStart w:id="44" w:name="описание-11"/>
+    <w:bookmarkEnd w:id="79"/>
+    <w:bookmarkStart w:id="80" w:name="описание-11"/>
     <w:p>
       <w:pPr>
         <w:pStyle w:val="Heading2"/>
@@ -2653,8 +3121,8 @@
         <w:t xml:space="preserve">Архитектурная диаграмма «Adapter Hierarchy: Provider Implementations» из набора architecture представлена в формате flowchart. Уровень детализации: System / Component. Количество узлов: 15.</w:t>
       </w:r>
     </w:p>
-    <w:bookmarkEnd w:id="44"/>
-    <w:bookmarkStart w:id="45" w:name="метаданные-11"/>
+    <w:bookmarkEnd w:id="80"/>
+    <w:bookmarkStart w:id="81" w:name="метаданные-11"/>
     <w:p>
       <w:pPr>
         <w:pStyle w:val="Heading2"/>
@@ -2747,8 +3215,8 @@
         <w:t xml:space="preserve">15</w:t>
       </w:r>
     </w:p>
-    <w:bookmarkEnd w:id="45"/>
-    <w:bookmarkStart w:id="46" w:name="Xe23479e8c7538552d8870ff864ac1dab31ecf53"/>
+    <w:bookmarkEnd w:id="81"/>
+    <w:bookmarkStart w:id="85" w:name="Xe23479e8c7538552d8870ff864ac1dab31ecf53"/>
     <w:p>
       <w:pPr>
         <w:pStyle w:val="Heading2"/>
@@ -2762,7 +3230,46 @@
         <w:pStyle w:val="FirstParagraph"/>
       </w:pPr>
       <w:r>
-        <w:t xml:space="preserve">06-storage-layer</w:t>
+        <w:drawing>
+          <wp:inline>
+            <wp:extent cx="5334000" cy="5295724"/>
+            <wp:effectExtent b="0" l="0" r="0" t="0"/>
+            <wp:docPr descr="06-storage-layer" title="" id="83" name="Picture"/>
+            <a:graphic>
+              <a:graphicData uri="http://schemas.openxmlformats.org/drawingml/2006/picture">
+                <pic:pic>
+                  <pic:nvPicPr>
+                    <pic:cNvPr descr="architecture/png/06-storage-layer.png" id="84" name="Picture"/>
+                    <pic:cNvPicPr>
+                      <a:picLocks noChangeArrowheads="1" noChangeAspect="1"/>
+                    </pic:cNvPicPr>
+                  </pic:nvPicPr>
+                  <pic:blipFill>
+                    <a:blip r:embed="rId82"/>
+                    <a:stretch>
+                      <a:fillRect/>
+                    </a:stretch>
+                  </pic:blipFill>
+                  <pic:spPr bwMode="auto">
+                    <a:xfrm>
+                      <a:off x="0" y="0"/>
+                      <a:ext cx="5334000" cy="5295724"/>
+                    </a:xfrm>
+                    <a:prstGeom prst="rect">
+                      <a:avLst/>
+                    </a:prstGeom>
+                    <a:noFill/>
+                    <a:ln w="9525">
+                      <a:noFill/>
+                      <a:headEnd/>
+                      <a:tailEnd/>
+                    </a:ln>
+                  </pic:spPr>
+                </pic:pic>
+              </a:graphicData>
+            </a:graphic>
+          </wp:inline>
+        </w:drawing>
       </w:r>
     </w:p>
     <w:p>
@@ -2786,8 +3293,8 @@
         <w:t xml:space="preserve">mmd-diagrams/architecture/06-storage-layer.mmd</w:t>
       </w:r>
     </w:p>
-    <w:bookmarkEnd w:id="46"/>
-    <w:bookmarkStart w:id="47" w:name="описание-12"/>
+    <w:bookmarkEnd w:id="85"/>
+    <w:bookmarkStart w:id="86" w:name="описание-12"/>
     <w:p>
       <w:pPr>
         <w:pStyle w:val="Heading2"/>
@@ -2804,8 +3311,8 @@
         <w:t xml:space="preserve">Архитектурная диаграмма «Storage Layer Components» из набора architecture представлена в формате flowchart. Уровень детализации: System / Component. Показывает: Bronze/Silver/Gold writers, Delta Lake, metadata, and validation.. Количество узлов: 21. Примечание: Decomposed into 06a-storage-writers, 06b-storage-support.</w:t>
       </w:r>
     </w:p>
-    <w:bookmarkEnd w:id="47"/>
-    <w:bookmarkStart w:id="48" w:name="метаданные-12"/>
+    <w:bookmarkEnd w:id="86"/>
+    <w:bookmarkStart w:id="87" w:name="метаданные-12"/>
     <w:p>
       <w:pPr>
         <w:pStyle w:val="Heading2"/>
@@ -2898,8 +3405,8 @@
         <w:t xml:space="preserve">21</w:t>
       </w:r>
     </w:p>
-    <w:bookmarkEnd w:id="48"/>
-    <w:bookmarkStart w:id="49" w:name="X3e157a2ca8965b93998f3442f541c7435e7860d"/>
+    <w:bookmarkEnd w:id="87"/>
+    <w:bookmarkStart w:id="91" w:name="X3e157a2ca8965b93998f3442f541c7435e7860d"/>
     <w:p>
       <w:pPr>
         <w:pStyle w:val="Heading2"/>
@@ -2913,7 +3420,46 @@
         <w:pStyle w:val="FirstParagraph"/>
       </w:pPr>
       <w:r>
-        <w:t xml:space="preserve">06a-storage-writers</w:t>
+        <w:drawing>
+          <wp:inline>
+            <wp:extent cx="5334000" cy="5572306"/>
+            <wp:effectExtent b="0" l="0" r="0" t="0"/>
+            <wp:docPr descr="06a-storage-writers" title="" id="89" name="Picture"/>
+            <a:graphic>
+              <a:graphicData uri="http://schemas.openxmlformats.org/drawingml/2006/picture">
+                <pic:pic>
+                  <pic:nvPicPr>
+                    <pic:cNvPr descr="architecture/png/06a-storage-writers.png" id="90" name="Picture"/>
+                    <pic:cNvPicPr>
+                      <a:picLocks noChangeArrowheads="1" noChangeAspect="1"/>
+                    </pic:cNvPicPr>
+                  </pic:nvPicPr>
+                  <pic:blipFill>
+                    <a:blip r:embed="rId88"/>
+                    <a:stretch>
+                      <a:fillRect/>
+                    </a:stretch>
+                  </pic:blipFill>
+                  <pic:spPr bwMode="auto">
+                    <a:xfrm>
+                      <a:off x="0" y="0"/>
+                      <a:ext cx="5334000" cy="5572306"/>
+                    </a:xfrm>
+                    <a:prstGeom prst="rect">
+                      <a:avLst/>
+                    </a:prstGeom>
+                    <a:noFill/>
+                    <a:ln w="9525">
+                      <a:noFill/>
+                      <a:headEnd/>
+                      <a:tailEnd/>
+                    </a:ln>
+                  </pic:spPr>
+                </pic:pic>
+              </a:graphicData>
+            </a:graphic>
+          </wp:inline>
+        </w:drawing>
       </w:r>
     </w:p>
     <w:p>
@@ -2937,8 +3483,8 @@
         <w:t xml:space="preserve">mmd-diagrams/architecture/06a-storage-writers.mmd</w:t>
       </w:r>
     </w:p>
-    <w:bookmarkEnd w:id="49"/>
-    <w:bookmarkStart w:id="50" w:name="описание-13"/>
+    <w:bookmarkEnd w:id="91"/>
+    <w:bookmarkStart w:id="92" w:name="описание-13"/>
     <w:p>
       <w:pPr>
         <w:pStyle w:val="Heading2"/>
@@ -2955,8 +3501,8 @@
         <w:t xml:space="preserve">Архитектурная диаграмма «Storage Writers» из набора architecture представлена в формате flowchart. Уровень детализации: System / Component. Количество узлов: 10.</w:t>
       </w:r>
     </w:p>
-    <w:bookmarkEnd w:id="50"/>
-    <w:bookmarkStart w:id="51" w:name="метаданные-13"/>
+    <w:bookmarkEnd w:id="92"/>
+    <w:bookmarkStart w:id="93" w:name="метаданные-13"/>
     <w:p>
       <w:pPr>
         <w:pStyle w:val="Heading2"/>
@@ -3049,8 +3595,8 @@
         <w:t xml:space="preserve">10</w:t>
       </w:r>
     </w:p>
-    <w:bookmarkEnd w:id="51"/>
-    <w:bookmarkStart w:id="52" w:name="X35a3a99fa30367943602d728a82677c5c72be80"/>
+    <w:bookmarkEnd w:id="93"/>
+    <w:bookmarkStart w:id="97" w:name="X35a3a99fa30367943602d728a82677c5c72be80"/>
     <w:p>
       <w:pPr>
         <w:pStyle w:val="Heading2"/>
@@ -3064,7 +3610,46 @@
         <w:pStyle w:val="FirstParagraph"/>
       </w:pPr>
       <w:r>
-        <w:t xml:space="preserve">06b-storage-support</w:t>
+        <w:drawing>
+          <wp:inline>
+            <wp:extent cx="5334000" cy="616979"/>
+            <wp:effectExtent b="0" l="0" r="0" t="0"/>
+            <wp:docPr descr="06b-storage-support" title="" id="95" name="Picture"/>
+            <a:graphic>
+              <a:graphicData uri="http://schemas.openxmlformats.org/drawingml/2006/picture">
+                <pic:pic>
+                  <pic:nvPicPr>
+                    <pic:cNvPr descr="architecture/png/06b-storage-support.png" id="96" name="Picture"/>
+                    <pic:cNvPicPr>
+                      <a:picLocks noChangeArrowheads="1" noChangeAspect="1"/>
+                    </pic:cNvPicPr>
+                  </pic:nvPicPr>
+                  <pic:blipFill>
+                    <a:blip r:embed="rId94"/>
+                    <a:stretch>
+                      <a:fillRect/>
+                    </a:stretch>
+                  </pic:blipFill>
+                  <pic:spPr bwMode="auto">
+                    <a:xfrm>
+                      <a:off x="0" y="0"/>
+                      <a:ext cx="5334000" cy="616979"/>
+                    </a:xfrm>
+                    <a:prstGeom prst="rect">
+                      <a:avLst/>
+                    </a:prstGeom>
+                    <a:noFill/>
+                    <a:ln w="9525">
+                      <a:noFill/>
+                      <a:headEnd/>
+                      <a:tailEnd/>
+                    </a:ln>
+                  </pic:spPr>
+                </pic:pic>
+              </a:graphicData>
+            </a:graphic>
+          </wp:inline>
+        </w:drawing>
       </w:r>
     </w:p>
     <w:p>
@@ -3088,8 +3673,8 @@
         <w:t xml:space="preserve">mmd-diagrams/architecture/06b-storage-support.mmd</w:t>
       </w:r>
     </w:p>
-    <w:bookmarkEnd w:id="52"/>
-    <w:bookmarkStart w:id="53" w:name="описание-14"/>
+    <w:bookmarkEnd w:id="97"/>
+    <w:bookmarkStart w:id="98" w:name="описание-14"/>
     <w:p>
       <w:pPr>
         <w:pStyle w:val="Heading2"/>
@@ -3106,8 +3691,8 @@
         <w:t xml:space="preserve">Архитектурная диаграмма «Storage Support Components» из набора architecture представлена в формате flowchart. Уровень детализации: System / Component. Количество узлов: 11.</w:t>
       </w:r>
     </w:p>
-    <w:bookmarkEnd w:id="53"/>
-    <w:bookmarkStart w:id="54" w:name="метаданные-14"/>
+    <w:bookmarkEnd w:id="98"/>
+    <w:bookmarkStart w:id="99" w:name="метаданные-14"/>
     <w:p>
       <w:pPr>
         <w:pStyle w:val="Heading2"/>
@@ -3200,8 +3785,8 @@
         <w:t xml:space="preserve">11</w:t>
       </w:r>
     </w:p>
-    <w:bookmarkEnd w:id="54"/>
-    <w:bookmarkStart w:id="55" w:name="X3180247ec7e20c1b62ea496824dd14a0a4204fa"/>
+    <w:bookmarkEnd w:id="99"/>
+    <w:bookmarkStart w:id="103" w:name="X3180247ec7e20c1b62ea496824dd14a0a4204fa"/>
     <w:p>
       <w:pPr>
         <w:pStyle w:val="Heading2"/>
@@ -3215,7 +3800,46 @@
         <w:pStyle w:val="FirstParagraph"/>
       </w:pPr>
       <w:r>
-        <w:t xml:space="preserve">07-dq-system</w:t>
+        <w:drawing>
+          <wp:inline>
+            <wp:extent cx="5334000" cy="2588471"/>
+            <wp:effectExtent b="0" l="0" r="0" t="0"/>
+            <wp:docPr descr="07-dq-system" title="" id="101" name="Picture"/>
+            <a:graphic>
+              <a:graphicData uri="http://schemas.openxmlformats.org/drawingml/2006/picture">
+                <pic:pic>
+                  <pic:nvPicPr>
+                    <pic:cNvPr descr="architecture/png/07-dq-system.png" id="102" name="Picture"/>
+                    <pic:cNvPicPr>
+                      <a:picLocks noChangeArrowheads="1" noChangeAspect="1"/>
+                    </pic:cNvPicPr>
+                  </pic:nvPicPr>
+                  <pic:blipFill>
+                    <a:blip r:embed="rId100"/>
+                    <a:stretch>
+                      <a:fillRect/>
+                    </a:stretch>
+                  </pic:blipFill>
+                  <pic:spPr bwMode="auto">
+                    <a:xfrm>
+                      <a:off x="0" y="0"/>
+                      <a:ext cx="5334000" cy="2588471"/>
+                    </a:xfrm>
+                    <a:prstGeom prst="rect">
+                      <a:avLst/>
+                    </a:prstGeom>
+                    <a:noFill/>
+                    <a:ln w="9525">
+                      <a:noFill/>
+                      <a:headEnd/>
+                      <a:tailEnd/>
+                    </a:ln>
+                  </pic:spPr>
+                </pic:pic>
+              </a:graphicData>
+            </a:graphic>
+          </wp:inline>
+        </w:drawing>
       </w:r>
     </w:p>
     <w:p>
@@ -3239,8 +3863,8 @@
         <w:t xml:space="preserve">mmd-diagrams/architecture/07-dq-system.mmd</w:t>
       </w:r>
     </w:p>
-    <w:bookmarkEnd w:id="55"/>
-    <w:bookmarkStart w:id="56" w:name="описание-15"/>
+    <w:bookmarkEnd w:id="103"/>
+    <w:bookmarkStart w:id="104" w:name="описание-15"/>
     <w:p>
       <w:pPr>
         <w:pStyle w:val="Heading2"/>
@@ -3257,8 +3881,8 @@
         <w:t xml:space="preserve">Архитектурная диаграмма «Data Quality (DQ) System» из набора architecture представлена в формате flowchart. Уровень детализации: System / Component. Показывает: DQ monitoring, analysis, and reporting across all medallion layers.. Количество узлов: 22. Примечание: Decomposed into 07a-dq-analysis, 07b-dq-pipeline.</w:t>
       </w:r>
     </w:p>
-    <w:bookmarkEnd w:id="56"/>
-    <w:bookmarkStart w:id="57" w:name="метаданные-15"/>
+    <w:bookmarkEnd w:id="104"/>
+    <w:bookmarkStart w:id="105" w:name="метаданные-15"/>
     <w:p>
       <w:pPr>
         <w:pStyle w:val="Heading2"/>
@@ -3351,8 +3975,8 @@
         <w:t xml:space="preserve">22</w:t>
       </w:r>
     </w:p>
-    <w:bookmarkEnd w:id="57"/>
-    <w:bookmarkStart w:id="58" w:name="X5001c7f5ca08c8b1cd985a7231769fb8df0e622"/>
+    <w:bookmarkEnd w:id="105"/>
+    <w:bookmarkStart w:id="109" w:name="X5001c7f5ca08c8b1cd985a7231769fb8df0e622"/>
     <w:p>
       <w:pPr>
         <w:pStyle w:val="Heading2"/>
@@ -3366,7 +3990,46 @@
         <w:pStyle w:val="FirstParagraph"/>
       </w:pPr>
       <w:r>
-        <w:t xml:space="preserve">07a-dq-analysis</w:t>
+        <w:drawing>
+          <wp:inline>
+            <wp:extent cx="5334000" cy="2953026"/>
+            <wp:effectExtent b="0" l="0" r="0" t="0"/>
+            <wp:docPr descr="07a-dq-analysis" title="" id="107" name="Picture"/>
+            <a:graphic>
+              <a:graphicData uri="http://schemas.openxmlformats.org/drawingml/2006/picture">
+                <pic:pic>
+                  <pic:nvPicPr>
+                    <pic:cNvPr descr="architecture/png/07a-dq-analysis.png" id="108" name="Picture"/>
+                    <pic:cNvPicPr>
+                      <a:picLocks noChangeArrowheads="1" noChangeAspect="1"/>
+                    </pic:cNvPicPr>
+                  </pic:nvPicPr>
+                  <pic:blipFill>
+                    <a:blip r:embed="rId106"/>
+                    <a:stretch>
+                      <a:fillRect/>
+                    </a:stretch>
+                  </pic:blipFill>
+                  <pic:spPr bwMode="auto">
+                    <a:xfrm>
+                      <a:off x="0" y="0"/>
+                      <a:ext cx="5334000" cy="2953026"/>
+                    </a:xfrm>
+                    <a:prstGeom prst="rect">
+                      <a:avLst/>
+                    </a:prstGeom>
+                    <a:noFill/>
+                    <a:ln w="9525">
+                      <a:noFill/>
+                      <a:headEnd/>
+                      <a:tailEnd/>
+                    </a:ln>
+                  </pic:spPr>
+                </pic:pic>
+              </a:graphicData>
+            </a:graphic>
+          </wp:inline>
+        </w:drawing>
       </w:r>
     </w:p>
     <w:p>
@@ -3390,8 +4053,8 @@
         <w:t xml:space="preserve">mmd-diagrams/architecture/07a-dq-analysis.mmd</w:t>
       </w:r>
     </w:p>
-    <w:bookmarkEnd w:id="58"/>
-    <w:bookmarkStart w:id="59" w:name="описание-16"/>
+    <w:bookmarkEnd w:id="109"/>
+    <w:bookmarkStart w:id="110" w:name="описание-16"/>
     <w:p>
       <w:pPr>
         <w:pStyle w:val="Heading2"/>
@@ -3408,8 +4071,8 @@
         <w:t xml:space="preserve">Архитектурная диаграмма «DQ Analysis Services» из набора architecture представлена в формате flowchart. Уровень детализации: System / Component. Количество узлов: 12.</w:t>
       </w:r>
     </w:p>
-    <w:bookmarkEnd w:id="59"/>
-    <w:bookmarkStart w:id="60" w:name="метаданные-16"/>
+    <w:bookmarkEnd w:id="110"/>
+    <w:bookmarkStart w:id="111" w:name="метаданные-16"/>
     <w:p>
       <w:pPr>
         <w:pStyle w:val="Heading2"/>
@@ -3502,8 +4165,8 @@
         <w:t xml:space="preserve">12</w:t>
       </w:r>
     </w:p>
-    <w:bookmarkEnd w:id="60"/>
-    <w:bookmarkStart w:id="61" w:name="X394c5e7b72458d21fe7eadc43b6ef7ecf0b0a5c"/>
+    <w:bookmarkEnd w:id="111"/>
+    <w:bookmarkStart w:id="115" w:name="X394c5e7b72458d21fe7eadc43b6ef7ecf0b0a5c"/>
     <w:p>
       <w:pPr>
         <w:pStyle w:val="Heading2"/>
@@ -3517,7 +4180,46 @@
         <w:pStyle w:val="FirstParagraph"/>
       </w:pPr>
       <w:r>
-        <w:t xml:space="preserve">07b-dq-pipeline</w:t>
+        <w:drawing>
+          <wp:inline>
+            <wp:extent cx="5334000" cy="1778000"/>
+            <wp:effectExtent b="0" l="0" r="0" t="0"/>
+            <wp:docPr descr="07b-dq-pipeline" title="" id="113" name="Picture"/>
+            <a:graphic>
+              <a:graphicData uri="http://schemas.openxmlformats.org/drawingml/2006/picture">
+                <pic:pic>
+                  <pic:nvPicPr>
+                    <pic:cNvPr descr="architecture/png/07b-dq-pipeline.png" id="114" name="Picture"/>
+                    <pic:cNvPicPr>
+                      <a:picLocks noChangeArrowheads="1" noChangeAspect="1"/>
+                    </pic:cNvPicPr>
+                  </pic:nvPicPr>
+                  <pic:blipFill>
+                    <a:blip r:embed="rId112"/>
+                    <a:stretch>
+                      <a:fillRect/>
+                    </a:stretch>
+                  </pic:blipFill>
+                  <pic:spPr bwMode="auto">
+                    <a:xfrm>
+                      <a:off x="0" y="0"/>
+                      <a:ext cx="5334000" cy="1778000"/>
+                    </a:xfrm>
+                    <a:prstGeom prst="rect">
+                      <a:avLst/>
+                    </a:prstGeom>
+                    <a:noFill/>
+                    <a:ln w="9525">
+                      <a:noFill/>
+                      <a:headEnd/>
+                      <a:tailEnd/>
+                    </a:ln>
+                  </pic:spPr>
+                </pic:pic>
+              </a:graphicData>
+            </a:graphic>
+          </wp:inline>
+        </w:drawing>
       </w:r>
     </w:p>
     <w:p>
@@ -3541,8 +4243,8 @@
         <w:t xml:space="preserve">mmd-diagrams/architecture/07b-dq-pipeline.mmd</w:t>
       </w:r>
     </w:p>
-    <w:bookmarkEnd w:id="61"/>
-    <w:bookmarkStart w:id="62" w:name="описание-17"/>
+    <w:bookmarkEnd w:id="115"/>
+    <w:bookmarkStart w:id="116" w:name="описание-17"/>
     <w:p>
       <w:pPr>
         <w:pStyle w:val="Heading2"/>
@@ -3559,8 +4261,8 @@
         <w:t xml:space="preserve">Архитектурная диаграмма «DQ Pipeline Integration» из набора architecture представлена в формате flowchart. Уровень детализации: System / Component. Количество узлов: 10.</w:t>
       </w:r>
     </w:p>
-    <w:bookmarkEnd w:id="62"/>
-    <w:bookmarkStart w:id="63" w:name="метаданные-17"/>
+    <w:bookmarkEnd w:id="116"/>
+    <w:bookmarkStart w:id="117" w:name="метаданные-17"/>
     <w:p>
       <w:pPr>
         <w:pStyle w:val="Heading2"/>
@@ -3653,8 +4355,8 @@
         <w:t xml:space="preserve">10</w:t>
       </w:r>
     </w:p>
-    <w:bookmarkEnd w:id="63"/>
-    <w:bookmarkStart w:id="64" w:name="X258b5a82c72f107811b51b19f20296b98327590"/>
+    <w:bookmarkEnd w:id="117"/>
+    <w:bookmarkStart w:id="121" w:name="X258b5a82c72f107811b51b19f20296b98327590"/>
     <w:p>
       <w:pPr>
         <w:pStyle w:val="Heading2"/>
@@ -3668,7 +4370,46 @@
         <w:pStyle w:val="FirstParagraph"/>
       </w:pPr>
       <w:r>
-        <w:t xml:space="preserve">08-composite-pipeline</w:t>
+        <w:drawing>
+          <wp:inline>
+            <wp:extent cx="5334000" cy="3802455"/>
+            <wp:effectExtent b="0" l="0" r="0" t="0"/>
+            <wp:docPr descr="08-composite-pipeline" title="" id="119" name="Picture"/>
+            <a:graphic>
+              <a:graphicData uri="http://schemas.openxmlformats.org/drawingml/2006/picture">
+                <pic:pic>
+                  <pic:nvPicPr>
+                    <pic:cNvPr descr="architecture/png/08-composite-pipeline.png" id="120" name="Picture"/>
+                    <pic:cNvPicPr>
+                      <a:picLocks noChangeArrowheads="1" noChangeAspect="1"/>
+                    </pic:cNvPicPr>
+                  </pic:nvPicPr>
+                  <pic:blipFill>
+                    <a:blip r:embed="rId118"/>
+                    <a:stretch>
+                      <a:fillRect/>
+                    </a:stretch>
+                  </pic:blipFill>
+                  <pic:spPr bwMode="auto">
+                    <a:xfrm>
+                      <a:off x="0" y="0"/>
+                      <a:ext cx="5334000" cy="3802455"/>
+                    </a:xfrm>
+                    <a:prstGeom prst="rect">
+                      <a:avLst/>
+                    </a:prstGeom>
+                    <a:noFill/>
+                    <a:ln w="9525">
+                      <a:noFill/>
+                      <a:headEnd/>
+                      <a:tailEnd/>
+                    </a:ln>
+                  </pic:spPr>
+                </pic:pic>
+              </a:graphicData>
+            </a:graphic>
+          </wp:inline>
+        </w:drawing>
       </w:r>
     </w:p>
     <w:p>
@@ -3692,8 +4433,8 @@
         <w:t xml:space="preserve">mmd-diagrams/architecture/08-composite-pipeline.mmd</w:t>
       </w:r>
     </w:p>
-    <w:bookmarkEnd w:id="64"/>
-    <w:bookmarkStart w:id="65" w:name="описание-18"/>
+    <w:bookmarkEnd w:id="121"/>
+    <w:bookmarkStart w:id="122" w:name="описание-18"/>
     <w:p>
       <w:pPr>
         <w:pStyle w:val="Heading2"/>
@@ -3710,8 +4451,8 @@
         <w:t xml:space="preserve">Архитектурная диаграмма «Composite Pipeline Architecture» из набора architecture представлена в формате flowchart. Уровень детализации: System / Component. Показывает: seed → dependencies → enrichers (parallel) → merge flow.. Количество узлов: 33. Примечание: Decomposed into 08a-composite-config, 08b-composite-execution.</w:t>
       </w:r>
     </w:p>
-    <w:bookmarkEnd w:id="65"/>
-    <w:bookmarkStart w:id="66" w:name="метаданные-18"/>
+    <w:bookmarkEnd w:id="122"/>
+    <w:bookmarkStart w:id="123" w:name="метаданные-18"/>
     <w:p>
       <w:pPr>
         <w:pStyle w:val="Heading2"/>
@@ -3804,8 +4545,8 @@
         <w:t xml:space="preserve">33</w:t>
       </w:r>
     </w:p>
-    <w:bookmarkEnd w:id="66"/>
-    <w:bookmarkStart w:id="67" w:name="Xb3b3f1e74fcc4764f88ddc251b381e201176bcc"/>
+    <w:bookmarkEnd w:id="123"/>
+    <w:bookmarkStart w:id="127" w:name="Xb3b3f1e74fcc4764f88ddc251b381e201176bcc"/>
     <w:p>
       <w:pPr>
         <w:pStyle w:val="Heading2"/>
@@ -3819,7 +4560,46 @@
         <w:pStyle w:val="FirstParagraph"/>
       </w:pPr>
       <w:r>
-        <w:t xml:space="preserve">08a-composite-config</w:t>
+        <w:drawing>
+          <wp:inline>
+            <wp:extent cx="5334000" cy="2028078"/>
+            <wp:effectExtent b="0" l="0" r="0" t="0"/>
+            <wp:docPr descr="08a-composite-config" title="" id="125" name="Picture"/>
+            <a:graphic>
+              <a:graphicData uri="http://schemas.openxmlformats.org/drawingml/2006/picture">
+                <pic:pic>
+                  <pic:nvPicPr>
+                    <pic:cNvPr descr="architecture/png/08a-composite-config.png" id="126" name="Picture"/>
+                    <pic:cNvPicPr>
+                      <a:picLocks noChangeArrowheads="1" noChangeAspect="1"/>
+                    </pic:cNvPicPr>
+                  </pic:nvPicPr>
+                  <pic:blipFill>
+                    <a:blip r:embed="rId124"/>
+                    <a:stretch>
+                      <a:fillRect/>
+                    </a:stretch>
+                  </pic:blipFill>
+                  <pic:spPr bwMode="auto">
+                    <a:xfrm>
+                      <a:off x="0" y="0"/>
+                      <a:ext cx="5334000" cy="2028078"/>
+                    </a:xfrm>
+                    <a:prstGeom prst="rect">
+                      <a:avLst/>
+                    </a:prstGeom>
+                    <a:noFill/>
+                    <a:ln w="9525">
+                      <a:noFill/>
+                      <a:headEnd/>
+                      <a:tailEnd/>
+                    </a:ln>
+                  </pic:spPr>
+                </pic:pic>
+              </a:graphicData>
+            </a:graphic>
+          </wp:inline>
+        </w:drawing>
       </w:r>
     </w:p>
     <w:p>
@@ -3843,8 +4623,8 @@
         <w:t xml:space="preserve">mmd-diagrams/architecture/08a-composite-config.mmd</w:t>
       </w:r>
     </w:p>
-    <w:bookmarkEnd w:id="67"/>
-    <w:bookmarkStart w:id="68" w:name="описание-19"/>
+    <w:bookmarkEnd w:id="127"/>
+    <w:bookmarkStart w:id="128" w:name="описание-19"/>
     <w:p>
       <w:pPr>
         <w:pStyle w:val="Heading2"/>
@@ -3861,8 +4641,8 @@
         <w:t xml:space="preserve">Архитектурная диаграмма «Composite Pipeline Configuration &amp; FSM» из набора architecture представлена в формате flowchart. Уровень детализации: System / Component. Количество узлов: 13.</w:t>
       </w:r>
     </w:p>
-    <w:bookmarkEnd w:id="68"/>
-    <w:bookmarkStart w:id="69" w:name="метаданные-19"/>
+    <w:bookmarkEnd w:id="128"/>
+    <w:bookmarkStart w:id="129" w:name="метаданные-19"/>
     <w:p>
       <w:pPr>
         <w:pStyle w:val="Heading2"/>
@@ -3955,8 +4735,8 @@
         <w:t xml:space="preserve">13</w:t>
       </w:r>
     </w:p>
-    <w:bookmarkEnd w:id="69"/>
-    <w:bookmarkStart w:id="70" w:name="X0f786549fd0e3a2a8c9e06454ad505fdf64f4d0"/>
+    <w:bookmarkEnd w:id="129"/>
+    <w:bookmarkStart w:id="133" w:name="X0f786549fd0e3a2a8c9e06454ad505fdf64f4d0"/>
     <w:p>
       <w:pPr>
         <w:pStyle w:val="Heading2"/>
@@ -3970,7 +4750,46 @@
         <w:pStyle w:val="FirstParagraph"/>
       </w:pPr>
       <w:r>
-        <w:t xml:space="preserve">08b-composite-execution</w:t>
+        <w:drawing>
+          <wp:inline>
+            <wp:extent cx="5334000" cy="4136571"/>
+            <wp:effectExtent b="0" l="0" r="0" t="0"/>
+            <wp:docPr descr="08b-composite-execution" title="" id="131" name="Picture"/>
+            <a:graphic>
+              <a:graphicData uri="http://schemas.openxmlformats.org/drawingml/2006/picture">
+                <pic:pic>
+                  <pic:nvPicPr>
+                    <pic:cNvPr descr="architecture/png/08b-composite-execution.png" id="132" name="Picture"/>
+                    <pic:cNvPicPr>
+                      <a:picLocks noChangeArrowheads="1" noChangeAspect="1"/>
+                    </pic:cNvPicPr>
+                  </pic:nvPicPr>
+                  <pic:blipFill>
+                    <a:blip r:embed="rId130"/>
+                    <a:stretch>
+                      <a:fillRect/>
+                    </a:stretch>
+                  </pic:blipFill>
+                  <pic:spPr bwMode="auto">
+                    <a:xfrm>
+                      <a:off x="0" y="0"/>
+                      <a:ext cx="5334000" cy="4136571"/>
+                    </a:xfrm>
+                    <a:prstGeom prst="rect">
+                      <a:avLst/>
+                    </a:prstGeom>
+                    <a:noFill/>
+                    <a:ln w="9525">
+                      <a:noFill/>
+                      <a:headEnd/>
+                      <a:tailEnd/>
+                    </a:ln>
+                  </pic:spPr>
+                </pic:pic>
+              </a:graphicData>
+            </a:graphic>
+          </wp:inline>
+        </w:drawing>
       </w:r>
     </w:p>
     <w:p>
@@ -3994,8 +4813,8 @@
         <w:t xml:space="preserve">mmd-diagrams/architecture/08b-composite-execution.mmd</w:t>
       </w:r>
     </w:p>
-    <w:bookmarkEnd w:id="70"/>
-    <w:bookmarkStart w:id="71" w:name="описание-20"/>
+    <w:bookmarkEnd w:id="133"/>
+    <w:bookmarkStart w:id="134" w:name="описание-20"/>
     <w:p>
       <w:pPr>
         <w:pStyle w:val="Heading2"/>
@@ -4012,8 +4831,8 @@
         <w:t xml:space="preserve">Архитектурная диаграмма «Composite Pipeline Execution» из набора architecture представлена в формате flowchart. Уровень детализации: System / Component. Количество узлов: 20.</w:t>
       </w:r>
     </w:p>
-    <w:bookmarkEnd w:id="71"/>
-    <w:bookmarkStart w:id="72" w:name="метаданные-20"/>
+    <w:bookmarkEnd w:id="134"/>
+    <w:bookmarkStart w:id="135" w:name="метаданные-20"/>
     <w:p>
       <w:pPr>
         <w:pStyle w:val="Heading2"/>
@@ -4106,8 +4925,8 @@
         <w:t xml:space="preserve">20</w:t>
       </w:r>
     </w:p>
-    <w:bookmarkEnd w:id="72"/>
-    <w:bookmarkStart w:id="73" w:name="X4035c774d1b15bf4376ea4fc294fc7666b7d26b"/>
+    <w:bookmarkEnd w:id="135"/>
+    <w:bookmarkStart w:id="139" w:name="X4035c774d1b15bf4376ea4fc294fc7666b7d26b"/>
     <w:p>
       <w:pPr>
         <w:pStyle w:val="Heading2"/>
@@ -4121,7 +4940,46 @@
         <w:pStyle w:val="FirstParagraph"/>
       </w:pPr>
       <w:r>
-        <w:t xml:space="preserve">09-observability-stack</w:t>
+        <w:drawing>
+          <wp:inline>
+            <wp:extent cx="5334000" cy="3594272"/>
+            <wp:effectExtent b="0" l="0" r="0" t="0"/>
+            <wp:docPr descr="09-observability-stack" title="" id="137" name="Picture"/>
+            <a:graphic>
+              <a:graphicData uri="http://schemas.openxmlformats.org/drawingml/2006/picture">
+                <pic:pic>
+                  <pic:nvPicPr>
+                    <pic:cNvPr descr="architecture/png/09-observability-stack.png" id="138" name="Picture"/>
+                    <pic:cNvPicPr>
+                      <a:picLocks noChangeArrowheads="1" noChangeAspect="1"/>
+                    </pic:cNvPicPr>
+                  </pic:nvPicPr>
+                  <pic:blipFill>
+                    <a:blip r:embed="rId136"/>
+                    <a:stretch>
+                      <a:fillRect/>
+                    </a:stretch>
+                  </pic:blipFill>
+                  <pic:spPr bwMode="auto">
+                    <a:xfrm>
+                      <a:off x="0" y="0"/>
+                      <a:ext cx="5334000" cy="3594272"/>
+                    </a:xfrm>
+                    <a:prstGeom prst="rect">
+                      <a:avLst/>
+                    </a:prstGeom>
+                    <a:noFill/>
+                    <a:ln w="9525">
+                      <a:noFill/>
+                      <a:headEnd/>
+                      <a:tailEnd/>
+                    </a:ln>
+                  </pic:spPr>
+                </pic:pic>
+              </a:graphicData>
+            </a:graphic>
+          </wp:inline>
+        </w:drawing>
       </w:r>
     </w:p>
     <w:p>
@@ -4145,8 +5003,8 @@
         <w:t xml:space="preserve">mmd-diagrams/architecture/09-observability-stack.mmd</w:t>
       </w:r>
     </w:p>
-    <w:bookmarkEnd w:id="73"/>
-    <w:bookmarkStart w:id="74" w:name="описание-21"/>
+    <w:bookmarkEnd w:id="139"/>
+    <w:bookmarkStart w:id="140" w:name="описание-21"/>
     <w:p>
       <w:pPr>
         <w:pStyle w:val="Heading2"/>
@@ -4163,8 +5021,8 @@
         <w:t xml:space="preserve">Архитектурная диаграмма «Observability Stack» из набора architecture представлена в формате flowchart. Уровень детализации: System / Component. Количество узлов: 24. Примечание: Decomposed into 09a-observability-app, 09b-observability-infra.</w:t>
       </w:r>
     </w:p>
-    <w:bookmarkEnd w:id="74"/>
-    <w:bookmarkStart w:id="75" w:name="метаданные-21"/>
+    <w:bookmarkEnd w:id="140"/>
+    <w:bookmarkStart w:id="141" w:name="метаданные-21"/>
     <w:p>
       <w:pPr>
         <w:pStyle w:val="Heading2"/>
@@ -4257,8 +5115,8 @@
         <w:t xml:space="preserve">24</w:t>
       </w:r>
     </w:p>
-    <w:bookmarkEnd w:id="75"/>
-    <w:bookmarkStart w:id="76" w:name="X66796e386e519f79daa04a0c326da962b537f52"/>
+    <w:bookmarkEnd w:id="141"/>
+    <w:bookmarkStart w:id="145" w:name="X66796e386e519f79daa04a0c326da962b537f52"/>
     <w:p>
       <w:pPr>
         <w:pStyle w:val="Heading2"/>
@@ -4272,7 +5130,46 @@
         <w:pStyle w:val="FirstParagraph"/>
       </w:pPr>
       <w:r>
-        <w:t xml:space="preserve">09a-observability-app</w:t>
+        <w:drawing>
+          <wp:inline>
+            <wp:extent cx="5334000" cy="1787663"/>
+            <wp:effectExtent b="0" l="0" r="0" t="0"/>
+            <wp:docPr descr="09a-observability-app" title="" id="143" name="Picture"/>
+            <a:graphic>
+              <a:graphicData uri="http://schemas.openxmlformats.org/drawingml/2006/picture">
+                <pic:pic>
+                  <pic:nvPicPr>
+                    <pic:cNvPr descr="architecture/png/09a-observability-app.png" id="144" name="Picture"/>
+                    <pic:cNvPicPr>
+                      <a:picLocks noChangeArrowheads="1" noChangeAspect="1"/>
+                    </pic:cNvPicPr>
+                  </pic:nvPicPr>
+                  <pic:blipFill>
+                    <a:blip r:embed="rId142"/>
+                    <a:stretch>
+                      <a:fillRect/>
+                    </a:stretch>
+                  </pic:blipFill>
+                  <pic:spPr bwMode="auto">
+                    <a:xfrm>
+                      <a:off x="0" y="0"/>
+                      <a:ext cx="5334000" cy="1787663"/>
+                    </a:xfrm>
+                    <a:prstGeom prst="rect">
+                      <a:avLst/>
+                    </a:prstGeom>
+                    <a:noFill/>
+                    <a:ln w="9525">
+                      <a:noFill/>
+                      <a:headEnd/>
+                      <a:tailEnd/>
+                    </a:ln>
+                  </pic:spPr>
+                </pic:pic>
+              </a:graphicData>
+            </a:graphic>
+          </wp:inline>
+        </w:drawing>
       </w:r>
     </w:p>
     <w:p>
@@ -4296,8 +5193,8 @@
         <w:t xml:space="preserve">mmd-diagrams/architecture/09a-observability-app.mmd</w:t>
       </w:r>
     </w:p>
-    <w:bookmarkEnd w:id="76"/>
-    <w:bookmarkStart w:id="77" w:name="описание-22"/>
+    <w:bookmarkEnd w:id="145"/>
+    <w:bookmarkStart w:id="146" w:name="описание-22"/>
     <w:p>
       <w:pPr>
         <w:pStyle w:val="Heading2"/>
@@ -4314,8 +5211,8 @@
         <w:t xml:space="preserve">Архитектурная диаграмма «Observability: Application Layer» из набора architecture представлена в формате flowchart. Уровень детализации: System / Component. Количество узлов: 8.</w:t>
       </w:r>
     </w:p>
-    <w:bookmarkEnd w:id="77"/>
-    <w:bookmarkStart w:id="78" w:name="метаданные-22"/>
+    <w:bookmarkEnd w:id="146"/>
+    <w:bookmarkStart w:id="147" w:name="метаданные-22"/>
     <w:p>
       <w:pPr>
         <w:pStyle w:val="Heading2"/>
@@ -4408,8 +5305,8 @@
         <w:t xml:space="preserve">8</w:t>
       </w:r>
     </w:p>
-    <w:bookmarkEnd w:id="78"/>
-    <w:bookmarkStart w:id="79" w:name="X0245f0a49b79cfe7361fd40bfbdd6d50f71529e"/>
+    <w:bookmarkEnd w:id="147"/>
+    <w:bookmarkStart w:id="151" w:name="X0245f0a49b79cfe7361fd40bfbdd6d50f71529e"/>
     <w:p>
       <w:pPr>
         <w:pStyle w:val="Heading2"/>
@@ -4423,7 +5320,46 @@
         <w:pStyle w:val="FirstParagraph"/>
       </w:pPr>
       <w:r>
-        <w:t xml:space="preserve">09b-observability-infra</w:t>
+        <w:drawing>
+          <wp:inline>
+            <wp:extent cx="5334000" cy="1990725"/>
+            <wp:effectExtent b="0" l="0" r="0" t="0"/>
+            <wp:docPr descr="09b-observability-infra" title="" id="149" name="Picture"/>
+            <a:graphic>
+              <a:graphicData uri="http://schemas.openxmlformats.org/drawingml/2006/picture">
+                <pic:pic>
+                  <pic:nvPicPr>
+                    <pic:cNvPr descr="architecture/png/09b-observability-infra.png" id="150" name="Picture"/>
+                    <pic:cNvPicPr>
+                      <a:picLocks noChangeArrowheads="1" noChangeAspect="1"/>
+                    </pic:cNvPicPr>
+                  </pic:nvPicPr>
+                  <pic:blipFill>
+                    <a:blip r:embed="rId148"/>
+                    <a:stretch>
+                      <a:fillRect/>
+                    </a:stretch>
+                  </pic:blipFill>
+                  <pic:spPr bwMode="auto">
+                    <a:xfrm>
+                      <a:off x="0" y="0"/>
+                      <a:ext cx="5334000" cy="1990725"/>
+                    </a:xfrm>
+                    <a:prstGeom prst="rect">
+                      <a:avLst/>
+                    </a:prstGeom>
+                    <a:noFill/>
+                    <a:ln w="9525">
+                      <a:noFill/>
+                      <a:headEnd/>
+                      <a:tailEnd/>
+                    </a:ln>
+                  </pic:spPr>
+                </pic:pic>
+              </a:graphicData>
+            </a:graphic>
+          </wp:inline>
+        </w:drawing>
       </w:r>
     </w:p>
     <w:p>
@@ -4447,8 +5383,8 @@
         <w:t xml:space="preserve">mmd-diagrams/architecture/09b-observability-infra.mmd</w:t>
       </w:r>
     </w:p>
-    <w:bookmarkEnd w:id="79"/>
-    <w:bookmarkStart w:id="80" w:name="описание-23"/>
+    <w:bookmarkEnd w:id="151"/>
+    <w:bookmarkStart w:id="152" w:name="описание-23"/>
     <w:p>
       <w:pPr>
         <w:pStyle w:val="Heading2"/>
@@ -4465,8 +5401,8 @@
         <w:t xml:space="preserve">Архитектурная диаграмма «Observability: Infrastructure Layer» из набора architecture представлена в формате flowchart. Уровень детализации: System / Component. Количество узлов: 13.</w:t>
       </w:r>
     </w:p>
-    <w:bookmarkEnd w:id="80"/>
-    <w:bookmarkStart w:id="81" w:name="метаданные-23"/>
+    <w:bookmarkEnd w:id="152"/>
+    <w:bookmarkStart w:id="153" w:name="метаданные-23"/>
     <w:p>
       <w:pPr>
         <w:pStyle w:val="Heading2"/>
@@ -4559,8 +5495,8 @@
         <w:t xml:space="preserve">13</w:t>
       </w:r>
     </w:p>
-    <w:bookmarkEnd w:id="81"/>
-    <w:bookmarkStart w:id="82" w:name="X25322fe0e0ca9b9c3119db27db2b33260679365"/>
+    <w:bookmarkEnd w:id="153"/>
+    <w:bookmarkStart w:id="157" w:name="X25322fe0e0ca9b9c3119db27db2b33260679365"/>
     <w:p>
       <w:pPr>
         <w:pStyle w:val="Heading2"/>
@@ -4574,7 +5510,46 @@
         <w:pStyle w:val="FirstParagraph"/>
       </w:pPr>
       <w:r>
-        <w:t xml:space="preserve">10-resilience-patterns</w:t>
+        <w:drawing>
+          <wp:inline>
+            <wp:extent cx="5334000" cy="2527340"/>
+            <wp:effectExtent b="0" l="0" r="0" t="0"/>
+            <wp:docPr descr="10-resilience-patterns" title="" id="155" name="Picture"/>
+            <a:graphic>
+              <a:graphicData uri="http://schemas.openxmlformats.org/drawingml/2006/picture">
+                <pic:pic>
+                  <pic:nvPicPr>
+                    <pic:cNvPr descr="architecture/png/10-resilience-patterns.png" id="156" name="Picture"/>
+                    <pic:cNvPicPr>
+                      <a:picLocks noChangeArrowheads="1" noChangeAspect="1"/>
+                    </pic:cNvPicPr>
+                  </pic:nvPicPr>
+                  <pic:blipFill>
+                    <a:blip r:embed="rId154"/>
+                    <a:stretch>
+                      <a:fillRect/>
+                    </a:stretch>
+                  </pic:blipFill>
+                  <pic:spPr bwMode="auto">
+                    <a:xfrm>
+                      <a:off x="0" y="0"/>
+                      <a:ext cx="5334000" cy="2527340"/>
+                    </a:xfrm>
+                    <a:prstGeom prst="rect">
+                      <a:avLst/>
+                    </a:prstGeom>
+                    <a:noFill/>
+                    <a:ln w="9525">
+                      <a:noFill/>
+                      <a:headEnd/>
+                      <a:tailEnd/>
+                    </a:ln>
+                  </pic:spPr>
+                </pic:pic>
+              </a:graphicData>
+            </a:graphic>
+          </wp:inline>
+        </w:drawing>
       </w:r>
     </w:p>
     <w:p>
@@ -4598,8 +5573,8 @@
         <w:t xml:space="preserve">mmd-diagrams/architecture/10-resilience-patterns.mmd</w:t>
       </w:r>
     </w:p>
-    <w:bookmarkEnd w:id="82"/>
-    <w:bookmarkStart w:id="83" w:name="описание-24"/>
+    <w:bookmarkEnd w:id="157"/>
+    <w:bookmarkStart w:id="158" w:name="описание-24"/>
     <w:p>
       <w:pPr>
         <w:pStyle w:val="Heading2"/>
@@ -4616,8 +5591,8 @@
         <w:t xml:space="preserve">Архитектурная диаграмма «Resilience Patterns» из набора architecture представлена в формате flowchart. Уровень детализации: System / Component. Количество узлов: 15.</w:t>
       </w:r>
     </w:p>
-    <w:bookmarkEnd w:id="83"/>
-    <w:bookmarkStart w:id="84" w:name="метаданные-24"/>
+    <w:bookmarkEnd w:id="158"/>
+    <w:bookmarkStart w:id="159" w:name="метаданные-24"/>
     <w:p>
       <w:pPr>
         <w:pStyle w:val="Heading2"/>
@@ -4710,8 +5685,8 @@
         <w:t xml:space="preserve">15</w:t>
       </w:r>
     </w:p>
-    <w:bookmarkEnd w:id="84"/>
-    <w:bookmarkStart w:id="85" w:name="Xed6092386b76448f613123e05938077b6c4e894"/>
+    <w:bookmarkEnd w:id="159"/>
+    <w:bookmarkStart w:id="163" w:name="Xed6092386b76448f613123e05938077b6c4e894"/>
     <w:p>
       <w:pPr>
         <w:pStyle w:val="Heading2"/>
@@ -4725,7 +5700,46 @@
         <w:pStyle w:val="FirstParagraph"/>
       </w:pPr>
       <w:r>
-        <w:t xml:space="preserve">11-configuration-system</w:t>
+        <w:drawing>
+          <wp:inline>
+            <wp:extent cx="5334000" cy="2368773"/>
+            <wp:effectExtent b="0" l="0" r="0" t="0"/>
+            <wp:docPr descr="11-configuration-system" title="" id="161" name="Picture"/>
+            <a:graphic>
+              <a:graphicData uri="http://schemas.openxmlformats.org/drawingml/2006/picture">
+                <pic:pic>
+                  <pic:nvPicPr>
+                    <pic:cNvPr descr="architecture/png/11-configuration-system.png" id="162" name="Picture"/>
+                    <pic:cNvPicPr>
+                      <a:picLocks noChangeArrowheads="1" noChangeAspect="1"/>
+                    </pic:cNvPicPr>
+                  </pic:nvPicPr>
+                  <pic:blipFill>
+                    <a:blip r:embed="rId160"/>
+                    <a:stretch>
+                      <a:fillRect/>
+                    </a:stretch>
+                  </pic:blipFill>
+                  <pic:spPr bwMode="auto">
+                    <a:xfrm>
+                      <a:off x="0" y="0"/>
+                      <a:ext cx="5334000" cy="2368773"/>
+                    </a:xfrm>
+                    <a:prstGeom prst="rect">
+                      <a:avLst/>
+                    </a:prstGeom>
+                    <a:noFill/>
+                    <a:ln w="9525">
+                      <a:noFill/>
+                      <a:headEnd/>
+                      <a:tailEnd/>
+                    </a:ln>
+                  </pic:spPr>
+                </pic:pic>
+              </a:graphicData>
+            </a:graphic>
+          </wp:inline>
+        </w:drawing>
       </w:r>
     </w:p>
     <w:p>
@@ -4749,8 +5763,8 @@
         <w:t xml:space="preserve">mmd-diagrams/architecture/11-configuration-system.mmd</w:t>
       </w:r>
     </w:p>
-    <w:bookmarkEnd w:id="85"/>
-    <w:bookmarkStart w:id="86" w:name="описание-25"/>
+    <w:bookmarkEnd w:id="163"/>
+    <w:bookmarkStart w:id="164" w:name="описание-25"/>
     <w:p>
       <w:pPr>
         <w:pStyle w:val="Heading2"/>
@@ -4767,8 +5781,8 @@
         <w:t xml:space="preserve">Архитектурная диаграмма «Configuration System» из набора architecture представлена в формате flowchart. Уровень детализации: System / Component. Показывает: how YAML configs are loaded, validated, and used across the system.. Количество узлов: 29. Примечание: Decomposed into 11a-config-loading, 11b-config-domain.</w:t>
       </w:r>
     </w:p>
-    <w:bookmarkEnd w:id="86"/>
-    <w:bookmarkStart w:id="87" w:name="метаданные-25"/>
+    <w:bookmarkEnd w:id="164"/>
+    <w:bookmarkStart w:id="165" w:name="метаданные-25"/>
     <w:p>
       <w:pPr>
         <w:pStyle w:val="Heading2"/>
@@ -4861,8 +5875,8 @@
         <w:t xml:space="preserve">29</w:t>
       </w:r>
     </w:p>
-    <w:bookmarkEnd w:id="87"/>
-    <w:bookmarkStart w:id="88" w:name="Xe5fb57bb50c9d777b392aaaa4d1dde604fe168f"/>
+    <w:bookmarkEnd w:id="165"/>
+    <w:bookmarkStart w:id="169" w:name="Xe5fb57bb50c9d777b392aaaa4d1dde604fe168f"/>
     <w:p>
       <w:pPr>
         <w:pStyle w:val="Heading2"/>
@@ -4876,7 +5890,46 @@
         <w:pStyle w:val="FirstParagraph"/>
       </w:pPr>
       <w:r>
-        <w:t xml:space="preserve">11a-config-loading</w:t>
+        <w:drawing>
+          <wp:inline>
+            <wp:extent cx="5334000" cy="2254536"/>
+            <wp:effectExtent b="0" l="0" r="0" t="0"/>
+            <wp:docPr descr="11a-config-loading" title="" id="167" name="Picture"/>
+            <a:graphic>
+              <a:graphicData uri="http://schemas.openxmlformats.org/drawingml/2006/picture">
+                <pic:pic>
+                  <pic:nvPicPr>
+                    <pic:cNvPr descr="architecture/png/11a-config-loading.png" id="168" name="Picture"/>
+                    <pic:cNvPicPr>
+                      <a:picLocks noChangeArrowheads="1" noChangeAspect="1"/>
+                    </pic:cNvPicPr>
+                  </pic:nvPicPr>
+                  <pic:blipFill>
+                    <a:blip r:embed="rId166"/>
+                    <a:stretch>
+                      <a:fillRect/>
+                    </a:stretch>
+                  </pic:blipFill>
+                  <pic:spPr bwMode="auto">
+                    <a:xfrm>
+                      <a:off x="0" y="0"/>
+                      <a:ext cx="5334000" cy="2254536"/>
+                    </a:xfrm>
+                    <a:prstGeom prst="rect">
+                      <a:avLst/>
+                    </a:prstGeom>
+                    <a:noFill/>
+                    <a:ln w="9525">
+                      <a:noFill/>
+                      <a:headEnd/>
+                      <a:tailEnd/>
+                    </a:ln>
+                  </pic:spPr>
+                </pic:pic>
+              </a:graphicData>
+            </a:graphic>
+          </wp:inline>
+        </w:drawing>
       </w:r>
     </w:p>
     <w:p>
@@ -4900,8 +5953,8 @@
         <w:t xml:space="preserve">mmd-diagrams/architecture/11a-config-loading.mmd</w:t>
       </w:r>
     </w:p>
-    <w:bookmarkEnd w:id="88"/>
-    <w:bookmarkStart w:id="89" w:name="описание-26"/>
+    <w:bookmarkEnd w:id="169"/>
+    <w:bookmarkStart w:id="170" w:name="описание-26"/>
     <w:p>
       <w:pPr>
         <w:pStyle w:val="Heading2"/>
@@ -4918,8 +5971,8 @@
         <w:t xml:space="preserve">Архитектурная диаграмма «Configuration: Loading Pipeline» из набора architecture представлена в формате flowchart. Уровень детализации: System / Component. Количество узлов: 13.</w:t>
       </w:r>
     </w:p>
-    <w:bookmarkEnd w:id="89"/>
-    <w:bookmarkStart w:id="90" w:name="метаданные-26"/>
+    <w:bookmarkEnd w:id="170"/>
+    <w:bookmarkStart w:id="171" w:name="метаданные-26"/>
     <w:p>
       <w:pPr>
         <w:pStyle w:val="Heading2"/>
@@ -5012,8 +6065,8 @@
         <w:t xml:space="preserve">13</w:t>
       </w:r>
     </w:p>
-    <w:bookmarkEnd w:id="90"/>
-    <w:bookmarkStart w:id="91" w:name="X10d0def250d51d059753395d3f069dee6c84298"/>
+    <w:bookmarkEnd w:id="171"/>
+    <w:bookmarkStart w:id="175" w:name="X10d0def250d51d059753395d3f069dee6c84298"/>
     <w:p>
       <w:pPr>
         <w:pStyle w:val="Heading2"/>
@@ -5027,7 +6080,46 @@
         <w:pStyle w:val="FirstParagraph"/>
       </w:pPr>
       <w:r>
-        <w:t xml:space="preserve">11b-config-domain</w:t>
+        <w:drawing>
+          <wp:inline>
+            <wp:extent cx="5334000" cy="461170"/>
+            <wp:effectExtent b="0" l="0" r="0" t="0"/>
+            <wp:docPr descr="11b-config-domain" title="" id="173" name="Picture"/>
+            <a:graphic>
+              <a:graphicData uri="http://schemas.openxmlformats.org/drawingml/2006/picture">
+                <pic:pic>
+                  <pic:nvPicPr>
+                    <pic:cNvPr descr="architecture/png/11b-config-domain.png" id="174" name="Picture"/>
+                    <pic:cNvPicPr>
+                      <a:picLocks noChangeArrowheads="1" noChangeAspect="1"/>
+                    </pic:cNvPicPr>
+                  </pic:nvPicPr>
+                  <pic:blipFill>
+                    <a:blip r:embed="rId172"/>
+                    <a:stretch>
+                      <a:fillRect/>
+                    </a:stretch>
+                  </pic:blipFill>
+                  <pic:spPr bwMode="auto">
+                    <a:xfrm>
+                      <a:off x="0" y="0"/>
+                      <a:ext cx="5334000" cy="461170"/>
+                    </a:xfrm>
+                    <a:prstGeom prst="rect">
+                      <a:avLst/>
+                    </a:prstGeom>
+                    <a:noFill/>
+                    <a:ln w="9525">
+                      <a:noFill/>
+                      <a:headEnd/>
+                      <a:tailEnd/>
+                    </a:ln>
+                  </pic:spPr>
+                </pic:pic>
+              </a:graphicData>
+            </a:graphic>
+          </wp:inline>
+        </w:drawing>
       </w:r>
     </w:p>
     <w:p>
@@ -5051,8 +6143,8 @@
         <w:t xml:space="preserve">mmd-diagrams/architecture/11b-config-domain.mmd</w:t>
       </w:r>
     </w:p>
-    <w:bookmarkEnd w:id="91"/>
-    <w:bookmarkStart w:id="92" w:name="описание-27"/>
+    <w:bookmarkEnd w:id="175"/>
+    <w:bookmarkStart w:id="176" w:name="описание-27"/>
     <w:p>
       <w:pPr>
         <w:pStyle w:val="Heading2"/>
@@ -5069,8 +6161,8 @@
         <w:t xml:space="preserve">Архитектурная диаграмма «Configuration: Domain &amp; Application Config» из набора architecture представлена в формате flowchart. Уровень детализации: System / Component. Количество узлов: 16.</w:t>
       </w:r>
     </w:p>
-    <w:bookmarkEnd w:id="92"/>
-    <w:bookmarkStart w:id="93" w:name="метаданные-27"/>
+    <w:bookmarkEnd w:id="176"/>
+    <w:bookmarkStart w:id="177" w:name="метаданные-27"/>
     <w:p>
       <w:pPr>
         <w:pStyle w:val="Heading2"/>
@@ -5163,8 +6255,8 @@
         <w:t xml:space="preserve">16</w:t>
       </w:r>
     </w:p>
-    <w:bookmarkEnd w:id="93"/>
-    <w:bookmarkStart w:id="94" w:name="X46398f454cbb57fd1cc55e470d73a3eef5258ad"/>
+    <w:bookmarkEnd w:id="177"/>
+    <w:bookmarkStart w:id="181" w:name="X46398f454cbb57fd1cc55e470d73a3eef5258ad"/>
     <w:p>
       <w:pPr>
         <w:pStyle w:val="Heading2"/>
@@ -5178,7 +6270,46 @@
         <w:pStyle w:val="FirstParagraph"/>
       </w:pPr>
       <w:r>
-        <w:t xml:space="preserve">12-bootstrap-di-container</w:t>
+        <w:drawing>
+          <wp:inline>
+            <wp:extent cx="5334000" cy="4125745"/>
+            <wp:effectExtent b="0" l="0" r="0" t="0"/>
+            <wp:docPr descr="12-bootstrap-di-container" title="" id="179" name="Picture"/>
+            <a:graphic>
+              <a:graphicData uri="http://schemas.openxmlformats.org/drawingml/2006/picture">
+                <pic:pic>
+                  <pic:nvPicPr>
+                    <pic:cNvPr descr="architecture/png/12-bootstrap-di-container.png" id="180" name="Picture"/>
+                    <pic:cNvPicPr>
+                      <a:picLocks noChangeArrowheads="1" noChangeAspect="1"/>
+                    </pic:cNvPicPr>
+                  </pic:nvPicPr>
+                  <pic:blipFill>
+                    <a:blip r:embed="rId178"/>
+                    <a:stretch>
+                      <a:fillRect/>
+                    </a:stretch>
+                  </pic:blipFill>
+                  <pic:spPr bwMode="auto">
+                    <a:xfrm>
+                      <a:off x="0" y="0"/>
+                      <a:ext cx="5334000" cy="4125745"/>
+                    </a:xfrm>
+                    <a:prstGeom prst="rect">
+                      <a:avLst/>
+                    </a:prstGeom>
+                    <a:noFill/>
+                    <a:ln w="9525">
+                      <a:noFill/>
+                      <a:headEnd/>
+                      <a:tailEnd/>
+                    </a:ln>
+                  </pic:spPr>
+                </pic:pic>
+              </a:graphicData>
+            </a:graphic>
+          </wp:inline>
+        </w:drawing>
       </w:r>
     </w:p>
     <w:p>
@@ -5202,8 +6333,8 @@
         <w:t xml:space="preserve">mmd-diagrams/architecture/12-bootstrap-di-container.mmd</w:t>
       </w:r>
     </w:p>
-    <w:bookmarkEnd w:id="94"/>
-    <w:bookmarkStart w:id="95" w:name="описание-28"/>
+    <w:bookmarkEnd w:id="181"/>
+    <w:bookmarkStart w:id="182" w:name="описание-28"/>
     <w:p>
       <w:pPr>
         <w:pStyle w:val="Heading2"/>
@@ -5220,8 +6351,8 @@
         <w:t xml:space="preserve">Архитектурная диаграмма «Bootstrap / DI Container (Composition Root)» из набора architecture представлена в формате flowchart. Уровень детализации: System / Component. Показывает: how dependencies are assembled and wired together.. Количество узлов: 29. Примечание: Decomposed into 12a, 12b sub-diagrams.</w:t>
       </w:r>
     </w:p>
-    <w:bookmarkEnd w:id="95"/>
-    <w:bookmarkStart w:id="96" w:name="метаданные-28"/>
+    <w:bookmarkEnd w:id="182"/>
+    <w:bookmarkStart w:id="183" w:name="метаданные-28"/>
     <w:p>
       <w:pPr>
         <w:pStyle w:val="Heading2"/>
@@ -5314,8 +6445,8 @@
         <w:t xml:space="preserve">29</w:t>
       </w:r>
     </w:p>
-    <w:bookmarkEnd w:id="96"/>
-    <w:bookmarkStart w:id="97" w:name="X556f390b7d9690948cacbd95f1aa787f4b26832"/>
+    <w:bookmarkEnd w:id="183"/>
+    <w:bookmarkStart w:id="187" w:name="X556f390b7d9690948cacbd95f1aa787f4b26832"/>
     <w:p>
       <w:pPr>
         <w:pStyle w:val="Heading2"/>
@@ -5329,7 +6460,46 @@
         <w:pStyle w:val="FirstParagraph"/>
       </w:pPr>
       <w:r>
-        <w:t xml:space="preserve">12a-bootstrap-factories</w:t>
+        <w:drawing>
+          <wp:inline>
+            <wp:extent cx="5334000" cy="3331909"/>
+            <wp:effectExtent b="0" l="0" r="0" t="0"/>
+            <wp:docPr descr="12a-bootstrap-factories" title="" id="185" name="Picture"/>
+            <a:graphic>
+              <a:graphicData uri="http://schemas.openxmlformats.org/drawingml/2006/picture">
+                <pic:pic>
+                  <pic:nvPicPr>
+                    <pic:cNvPr descr="architecture/png/12a-bootstrap-factories.png" id="186" name="Picture"/>
+                    <pic:cNvPicPr>
+                      <a:picLocks noChangeArrowheads="1" noChangeAspect="1"/>
+                    </pic:cNvPicPr>
+                  </pic:nvPicPr>
+                  <pic:blipFill>
+                    <a:blip r:embed="rId184"/>
+                    <a:stretch>
+                      <a:fillRect/>
+                    </a:stretch>
+                  </pic:blipFill>
+                  <pic:spPr bwMode="auto">
+                    <a:xfrm>
+                      <a:off x="0" y="0"/>
+                      <a:ext cx="5334000" cy="3331909"/>
+                    </a:xfrm>
+                    <a:prstGeom prst="rect">
+                      <a:avLst/>
+                    </a:prstGeom>
+                    <a:noFill/>
+                    <a:ln w="9525">
+                      <a:noFill/>
+                      <a:headEnd/>
+                      <a:tailEnd/>
+                    </a:ln>
+                  </pic:spPr>
+                </pic:pic>
+              </a:graphicData>
+            </a:graphic>
+          </wp:inline>
+        </w:drawing>
       </w:r>
     </w:p>
     <w:p>
@@ -5353,8 +6523,8 @@
         <w:t xml:space="preserve">mmd-diagrams/architecture/12a-bootstrap-factories.mmd</w:t>
       </w:r>
     </w:p>
-    <w:bookmarkEnd w:id="97"/>
-    <w:bookmarkStart w:id="98" w:name="описание-29"/>
+    <w:bookmarkEnd w:id="187"/>
+    <w:bookmarkStart w:id="188" w:name="описание-29"/>
     <w:p>
       <w:pPr>
         <w:pStyle w:val="Heading2"/>
@@ -5371,8 +6541,8 @@
         <w:t xml:space="preserve">Архитектурная диаграмма «Bootstrap: Factories and Registries» из набора architecture представлена в формате flowchart. Уровень детализации: System / Component. Количество узлов: 10.</w:t>
       </w:r>
     </w:p>
-    <w:bookmarkEnd w:id="98"/>
-    <w:bookmarkStart w:id="99" w:name="метаданные-29"/>
+    <w:bookmarkEnd w:id="188"/>
+    <w:bookmarkStart w:id="189" w:name="метаданные-29"/>
     <w:p>
       <w:pPr>
         <w:pStyle w:val="Heading2"/>
@@ -5465,8 +6635,8 @@
         <w:t xml:space="preserve">10</w:t>
       </w:r>
     </w:p>
-    <w:bookmarkEnd w:id="99"/>
-    <w:bookmarkStart w:id="100" w:name="X2c66d02ddfb36bcac8350104972b5b0c59a6d1d"/>
+    <w:bookmarkEnd w:id="189"/>
+    <w:bookmarkStart w:id="193" w:name="X2c66d02ddfb36bcac8350104972b5b0c59a6d1d"/>
     <w:p>
       <w:pPr>
         <w:pStyle w:val="Heading2"/>
@@ -5480,7 +6650,46 @@
         <w:pStyle w:val="FirstParagraph"/>
       </w:pPr>
       <w:r>
-        <w:t xml:space="preserve">12b-bootstrap-wiring</w:t>
+        <w:drawing>
+          <wp:inline>
+            <wp:extent cx="5334000" cy="1776751"/>
+            <wp:effectExtent b="0" l="0" r="0" t="0"/>
+            <wp:docPr descr="12b-bootstrap-wiring" title="" id="191" name="Picture"/>
+            <a:graphic>
+              <a:graphicData uri="http://schemas.openxmlformats.org/drawingml/2006/picture">
+                <pic:pic>
+                  <pic:nvPicPr>
+                    <pic:cNvPr descr="architecture/png/12b-bootstrap-wiring.png" id="192" name="Picture"/>
+                    <pic:cNvPicPr>
+                      <a:picLocks noChangeArrowheads="1" noChangeAspect="1"/>
+                    </pic:cNvPicPr>
+                  </pic:nvPicPr>
+                  <pic:blipFill>
+                    <a:blip r:embed="rId190"/>
+                    <a:stretch>
+                      <a:fillRect/>
+                    </a:stretch>
+                  </pic:blipFill>
+                  <pic:spPr bwMode="auto">
+                    <a:xfrm>
+                      <a:off x="0" y="0"/>
+                      <a:ext cx="5334000" cy="1776751"/>
+                    </a:xfrm>
+                    <a:prstGeom prst="rect">
+                      <a:avLst/>
+                    </a:prstGeom>
+                    <a:noFill/>
+                    <a:ln w="9525">
+                      <a:noFill/>
+                      <a:headEnd/>
+                      <a:tailEnd/>
+                    </a:ln>
+                  </pic:spPr>
+                </pic:pic>
+              </a:graphicData>
+            </a:graphic>
+          </wp:inline>
+        </w:drawing>
       </w:r>
     </w:p>
     <w:p>
@@ -5504,8 +6713,8 @@
         <w:t xml:space="preserve">mmd-diagrams/architecture/12b-bootstrap-wiring.mmd</w:t>
       </w:r>
     </w:p>
-    <w:bookmarkEnd w:id="100"/>
-    <w:bookmarkStart w:id="101" w:name="описание-30"/>
+    <w:bookmarkEnd w:id="193"/>
+    <w:bookmarkStart w:id="194" w:name="описание-30"/>
     <w:p>
       <w:pPr>
         <w:pStyle w:val="Heading2"/>
@@ -5522,8 +6731,8 @@
         <w:t xml:space="preserve">Архитектурная диаграмма «Bootstrap: Wiring Graph» из набора architecture представлена в формате flowchart. Уровень детализации: System / Component. Количество узлов: 15.</w:t>
       </w:r>
     </w:p>
-    <w:bookmarkEnd w:id="101"/>
-    <w:bookmarkStart w:id="102" w:name="метаданные-30"/>
+    <w:bookmarkEnd w:id="194"/>
+    <w:bookmarkStart w:id="195" w:name="метаданные-30"/>
     <w:p>
       <w:pPr>
         <w:pStyle w:val="Heading2"/>
@@ -5616,8 +6825,8 @@
         <w:t xml:space="preserve">15</w:t>
       </w:r>
     </w:p>
-    <w:bookmarkEnd w:id="102"/>
-    <w:bookmarkStart w:id="103" w:name="X9ee1dbdb80fe736aee50a5280391e249125adee"/>
+    <w:bookmarkEnd w:id="195"/>
+    <w:bookmarkStart w:id="199" w:name="X9ee1dbdb80fe736aee50a5280391e249125adee"/>
     <w:p>
       <w:pPr>
         <w:pStyle w:val="Heading2"/>
@@ -5631,7 +6840,46 @@
         <w:pStyle w:val="FirstParagraph"/>
       </w:pPr>
       <w:r>
-        <w:t xml:space="preserve">13-port-protocol-contracts</w:t>
+        <w:drawing>
+          <wp:inline>
+            <wp:extent cx="5334000" cy="23247900"/>
+            <wp:effectExtent b="0" l="0" r="0" t="0"/>
+            <wp:docPr descr="13-port-protocol-contracts" title="" id="197" name="Picture"/>
+            <a:graphic>
+              <a:graphicData uri="http://schemas.openxmlformats.org/drawingml/2006/picture">
+                <pic:pic>
+                  <pic:nvPicPr>
+                    <pic:cNvPr descr="architecture/png/13-port-protocol-contracts.png" id="198" name="Picture"/>
+                    <pic:cNvPicPr>
+                      <a:picLocks noChangeArrowheads="1" noChangeAspect="1"/>
+                    </pic:cNvPicPr>
+                  </pic:nvPicPr>
+                  <pic:blipFill>
+                    <a:blip r:embed="rId196"/>
+                    <a:stretch>
+                      <a:fillRect/>
+                    </a:stretch>
+                  </pic:blipFill>
+                  <pic:spPr bwMode="auto">
+                    <a:xfrm>
+                      <a:off x="0" y="0"/>
+                      <a:ext cx="5334000" cy="23247900"/>
+                    </a:xfrm>
+                    <a:prstGeom prst="rect">
+                      <a:avLst/>
+                    </a:prstGeom>
+                    <a:noFill/>
+                    <a:ln w="9525">
+                      <a:noFill/>
+                      <a:headEnd/>
+                      <a:tailEnd/>
+                    </a:ln>
+                  </pic:spPr>
+                </pic:pic>
+              </a:graphicData>
+            </a:graphic>
+          </wp:inline>
+        </w:drawing>
       </w:r>
     </w:p>
     <w:p>
@@ -5655,8 +6903,8 @@
         <w:t xml:space="preserve">mmd-diagrams/architecture/13-port-protocol-contracts.mmd</w:t>
       </w:r>
     </w:p>
-    <w:bookmarkEnd w:id="103"/>
-    <w:bookmarkStart w:id="104" w:name="описание-31"/>
+    <w:bookmarkEnd w:id="199"/>
+    <w:bookmarkStart w:id="200" w:name="описание-31"/>
     <w:p>
       <w:pPr>
         <w:pStyle w:val="Heading2"/>
@@ -5673,8 +6921,8 @@
         <w:t xml:space="preserve">Архитектурная диаграмма «Port/Protocol Contracts (Full Map)» из набора architecture представлена в формате flowchart. Уровень детализации: System / Component. Количество узлов: 68. Примечание: Decomposed into 13a, 13b, 13c, 13d sub-diagrams.</w:t>
       </w:r>
     </w:p>
-    <w:bookmarkEnd w:id="104"/>
-    <w:bookmarkStart w:id="105" w:name="метаданные-31"/>
+    <w:bookmarkEnd w:id="200"/>
+    <w:bookmarkStart w:id="201" w:name="метаданные-31"/>
     <w:p>
       <w:pPr>
         <w:pStyle w:val="Heading2"/>
@@ -5767,8 +7015,8 @@
         <w:t xml:space="preserve">68</w:t>
       </w:r>
     </w:p>
-    <w:bookmarkEnd w:id="105"/>
-    <w:bookmarkStart w:id="106" w:name="X1105599c9490d51ca1f2da6d27d5b1a710cbc3a"/>
+    <w:bookmarkEnd w:id="201"/>
+    <w:bookmarkStart w:id="205" w:name="X1105599c9490d51ca1f2da6d27d5b1a710cbc3a"/>
     <w:p>
       <w:pPr>
         <w:pStyle w:val="Heading2"/>
@@ -5782,7 +7030,46 @@
         <w:pStyle w:val="FirstParagraph"/>
       </w:pPr>
       <w:r>
-        <w:t xml:space="preserve">13a-data-storage-ports</w:t>
+        <w:drawing>
+          <wp:inline>
+            <wp:extent cx="5334000" cy="6991321"/>
+            <wp:effectExtent b="0" l="0" r="0" t="0"/>
+            <wp:docPr descr="13a-data-storage-ports" title="" id="203" name="Picture"/>
+            <a:graphic>
+              <a:graphicData uri="http://schemas.openxmlformats.org/drawingml/2006/picture">
+                <pic:pic>
+                  <pic:nvPicPr>
+                    <pic:cNvPr descr="architecture/png/13a-data-storage-ports.png" id="204" name="Picture"/>
+                    <pic:cNvPicPr>
+                      <a:picLocks noChangeArrowheads="1" noChangeAspect="1"/>
+                    </pic:cNvPicPr>
+                  </pic:nvPicPr>
+                  <pic:blipFill>
+                    <a:blip r:embed="rId202"/>
+                    <a:stretch>
+                      <a:fillRect/>
+                    </a:stretch>
+                  </pic:blipFill>
+                  <pic:spPr bwMode="auto">
+                    <a:xfrm>
+                      <a:off x="0" y="0"/>
+                      <a:ext cx="5334000" cy="6991321"/>
+                    </a:xfrm>
+                    <a:prstGeom prst="rect">
+                      <a:avLst/>
+                    </a:prstGeom>
+                    <a:noFill/>
+                    <a:ln w="9525">
+                      <a:noFill/>
+                      <a:headEnd/>
+                      <a:tailEnd/>
+                    </a:ln>
+                  </pic:spPr>
+                </pic:pic>
+              </a:graphicData>
+            </a:graphic>
+          </wp:inline>
+        </w:drawing>
       </w:r>
     </w:p>
     <w:p>
@@ -5806,8 +7093,8 @@
         <w:t xml:space="preserve">mmd-diagrams/architecture/13a-data-storage-ports.mmd</w:t>
       </w:r>
     </w:p>
-    <w:bookmarkEnd w:id="106"/>
-    <w:bookmarkStart w:id="107" w:name="описание-32"/>
+    <w:bookmarkEnd w:id="205"/>
+    <w:bookmarkStart w:id="206" w:name="описание-32"/>
     <w:p>
       <w:pPr>
         <w:pStyle w:val="Heading2"/>
@@ -5824,8 +7111,8 @@
         <w:t xml:space="preserve">Архитектурная диаграмма «DataSource and Storage Ports» из набора architecture представлена в формате flowchart. Уровень детализации: System / Component. Количество узлов: 20.</w:t>
       </w:r>
     </w:p>
-    <w:bookmarkEnd w:id="107"/>
-    <w:bookmarkStart w:id="108" w:name="метаданные-32"/>
+    <w:bookmarkEnd w:id="206"/>
+    <w:bookmarkStart w:id="207" w:name="метаданные-32"/>
     <w:p>
       <w:pPr>
         <w:pStyle w:val="Heading2"/>
@@ -5918,8 +7205,8 @@
         <w:t xml:space="preserve">20</w:t>
       </w:r>
     </w:p>
-    <w:bookmarkEnd w:id="108"/>
-    <w:bookmarkStart w:id="109" w:name="X9b6f148ce6492111afe7cc0b134199b8560bdbb"/>
+    <w:bookmarkEnd w:id="207"/>
+    <w:bookmarkStart w:id="211" w:name="X9b6f148ce6492111afe7cc0b134199b8560bdbb"/>
     <w:p>
       <w:pPr>
         <w:pStyle w:val="Heading2"/>
@@ -5933,7 +7220,46 @@
         <w:pStyle w:val="FirstParagraph"/>
       </w:pPr>
       <w:r>
-        <w:t xml:space="preserve">13a-port-contracts-data-sources</w:t>
+        <w:drawing>
+          <wp:inline>
+            <wp:extent cx="5334000" cy="6935070"/>
+            <wp:effectExtent b="0" l="0" r="0" t="0"/>
+            <wp:docPr descr="13a-port-contracts-data-sources" title="" id="209" name="Picture"/>
+            <a:graphic>
+              <a:graphicData uri="http://schemas.openxmlformats.org/drawingml/2006/picture">
+                <pic:pic>
+                  <pic:nvPicPr>
+                    <pic:cNvPr descr="architecture/png/13a-port-contracts-data-sources.png" id="210" name="Picture"/>
+                    <pic:cNvPicPr>
+                      <a:picLocks noChangeArrowheads="1" noChangeAspect="1"/>
+                    </pic:cNvPicPr>
+                  </pic:nvPicPr>
+                  <pic:blipFill>
+                    <a:blip r:embed="rId208"/>
+                    <a:stretch>
+                      <a:fillRect/>
+                    </a:stretch>
+                  </pic:blipFill>
+                  <pic:spPr bwMode="auto">
+                    <a:xfrm>
+                      <a:off x="0" y="0"/>
+                      <a:ext cx="5334000" cy="6935070"/>
+                    </a:xfrm>
+                    <a:prstGeom prst="rect">
+                      <a:avLst/>
+                    </a:prstGeom>
+                    <a:noFill/>
+                    <a:ln w="9525">
+                      <a:noFill/>
+                      <a:headEnd/>
+                      <a:tailEnd/>
+                    </a:ln>
+                  </pic:spPr>
+                </pic:pic>
+              </a:graphicData>
+            </a:graphic>
+          </wp:inline>
+        </w:drawing>
       </w:r>
     </w:p>
     <w:p>
@@ -5957,8 +7283,8 @@
         <w:t xml:space="preserve">mmd-diagrams/architecture/13a-port-contracts-data-sources.mmd</w:t>
       </w:r>
     </w:p>
-    <w:bookmarkEnd w:id="109"/>
-    <w:bookmarkStart w:id="110" w:name="описание-33"/>
+    <w:bookmarkEnd w:id="211"/>
+    <w:bookmarkStart w:id="212" w:name="описание-33"/>
     <w:p>
       <w:pPr>
         <w:pStyle w:val="Heading2"/>
@@ -5975,8 +7301,8 @@
         <w:t xml:space="preserve">Архитектурная диаграмма «Port Contracts: Data Sources» из набора architecture представлена в формате flowchart. Уровень детализации: System / Component. Количество узлов: 9.</w:t>
       </w:r>
     </w:p>
-    <w:bookmarkEnd w:id="110"/>
-    <w:bookmarkStart w:id="111" w:name="метаданные-33"/>
+    <w:bookmarkEnd w:id="212"/>
+    <w:bookmarkStart w:id="213" w:name="метаданные-33"/>
     <w:p>
       <w:pPr>
         <w:pStyle w:val="Heading2"/>
@@ -6069,8 +7395,8 @@
         <w:t xml:space="preserve">9</w:t>
       </w:r>
     </w:p>
-    <w:bookmarkEnd w:id="111"/>
-    <w:bookmarkStart w:id="112" w:name="X28d66455700b2fec9d150c9e01693516b9bd7eb"/>
+    <w:bookmarkEnd w:id="213"/>
+    <w:bookmarkStart w:id="217" w:name="X28d66455700b2fec9d150c9e01693516b9bd7eb"/>
     <w:p>
       <w:pPr>
         <w:pStyle w:val="Heading2"/>
@@ -6084,7 +7410,46 @@
         <w:pStyle w:val="FirstParagraph"/>
       </w:pPr>
       <w:r>
-        <w:t xml:space="preserve">13b-operational-ports</w:t>
+        <w:drawing>
+          <wp:inline>
+            <wp:extent cx="5334000" cy="7276681"/>
+            <wp:effectExtent b="0" l="0" r="0" t="0"/>
+            <wp:docPr descr="13b-operational-ports" title="" id="215" name="Picture"/>
+            <a:graphic>
+              <a:graphicData uri="http://schemas.openxmlformats.org/drawingml/2006/picture">
+                <pic:pic>
+                  <pic:nvPicPr>
+                    <pic:cNvPr descr="architecture/png/13b-operational-ports.png" id="216" name="Picture"/>
+                    <pic:cNvPicPr>
+                      <a:picLocks noChangeArrowheads="1" noChangeAspect="1"/>
+                    </pic:cNvPicPr>
+                  </pic:nvPicPr>
+                  <pic:blipFill>
+                    <a:blip r:embed="rId214"/>
+                    <a:stretch>
+                      <a:fillRect/>
+                    </a:stretch>
+                  </pic:blipFill>
+                  <pic:spPr bwMode="auto">
+                    <a:xfrm>
+                      <a:off x="0" y="0"/>
+                      <a:ext cx="5334000" cy="7276681"/>
+                    </a:xfrm>
+                    <a:prstGeom prst="rect">
+                      <a:avLst/>
+                    </a:prstGeom>
+                    <a:noFill/>
+                    <a:ln w="9525">
+                      <a:noFill/>
+                      <a:headEnd/>
+                      <a:tailEnd/>
+                    </a:ln>
+                  </pic:spPr>
+                </pic:pic>
+              </a:graphicData>
+            </a:graphic>
+          </wp:inline>
+        </w:drawing>
       </w:r>
     </w:p>
     <w:p>
@@ -6108,8 +7473,8 @@
         <w:t xml:space="preserve">mmd-diagrams/architecture/13b-operational-ports.mmd</w:t>
       </w:r>
     </w:p>
-    <w:bookmarkEnd w:id="112"/>
-    <w:bookmarkStart w:id="113" w:name="описание-34"/>
+    <w:bookmarkEnd w:id="217"/>
+    <w:bookmarkStart w:id="218" w:name="описание-34"/>
     <w:p>
       <w:pPr>
         <w:pStyle w:val="Heading2"/>
@@ -6126,8 +7491,8 @@
         <w:t xml:space="preserve">Архитектурная диаграмма «Operational and Observability Ports» из набора architecture представлена в формате flowchart. Уровень детализации: System / Component. Количество узлов: 25. Примечание: Decomposed into 13e-operational-ports-domain, 13f-operational-ports-infra.</w:t>
       </w:r>
     </w:p>
-    <w:bookmarkEnd w:id="113"/>
-    <w:bookmarkStart w:id="114" w:name="метаданные-34"/>
+    <w:bookmarkEnd w:id="218"/>
+    <w:bookmarkStart w:id="219" w:name="метаданные-34"/>
     <w:p>
       <w:pPr>
         <w:pStyle w:val="Heading2"/>
@@ -6220,8 +7585,8 @@
         <w:t xml:space="preserve">25</w:t>
       </w:r>
     </w:p>
-    <w:bookmarkEnd w:id="114"/>
-    <w:bookmarkStart w:id="115" w:name="X587580b4861dda4348bfb43adbb8ff64ff7014f"/>
+    <w:bookmarkEnd w:id="219"/>
+    <w:bookmarkStart w:id="223" w:name="X587580b4861dda4348bfb43adbb8ff64ff7014f"/>
     <w:p>
       <w:pPr>
         <w:pStyle w:val="Heading2"/>
@@ -6235,7 +7600,46 @@
         <w:pStyle w:val="FirstParagraph"/>
       </w:pPr>
       <w:r>
-        <w:t xml:space="preserve">13b-port-contracts-storage</w:t>
+        <w:drawing>
+          <wp:inline>
+            <wp:extent cx="5334000" cy="6179080"/>
+            <wp:effectExtent b="0" l="0" r="0" t="0"/>
+            <wp:docPr descr="13b-port-contracts-storage" title="" id="221" name="Picture"/>
+            <a:graphic>
+              <a:graphicData uri="http://schemas.openxmlformats.org/drawingml/2006/picture">
+                <pic:pic>
+                  <pic:nvPicPr>
+                    <pic:cNvPr descr="architecture/png/13b-port-contracts-storage.png" id="222" name="Picture"/>
+                    <pic:cNvPicPr>
+                      <a:picLocks noChangeArrowheads="1" noChangeAspect="1"/>
+                    </pic:cNvPicPr>
+                  </pic:nvPicPr>
+                  <pic:blipFill>
+                    <a:blip r:embed="rId220"/>
+                    <a:stretch>
+                      <a:fillRect/>
+                    </a:stretch>
+                  </pic:blipFill>
+                  <pic:spPr bwMode="auto">
+                    <a:xfrm>
+                      <a:off x="0" y="0"/>
+                      <a:ext cx="5334000" cy="6179080"/>
+                    </a:xfrm>
+                    <a:prstGeom prst="rect">
+                      <a:avLst/>
+                    </a:prstGeom>
+                    <a:noFill/>
+                    <a:ln w="9525">
+                      <a:noFill/>
+                      <a:headEnd/>
+                      <a:tailEnd/>
+                    </a:ln>
+                  </pic:spPr>
+                </pic:pic>
+              </a:graphicData>
+            </a:graphic>
+          </wp:inline>
+        </w:drawing>
       </w:r>
     </w:p>
     <w:p>
@@ -6259,8 +7663,8 @@
         <w:t xml:space="preserve">mmd-diagrams/architecture/13b-port-contracts-storage.mmd</w:t>
       </w:r>
     </w:p>
-    <w:bookmarkEnd w:id="115"/>
-    <w:bookmarkStart w:id="116" w:name="описание-35"/>
+    <w:bookmarkEnd w:id="223"/>
+    <w:bookmarkStart w:id="224" w:name="описание-35"/>
     <w:p>
       <w:pPr>
         <w:pStyle w:val="Heading2"/>
@@ -6277,8 +7681,8 @@
         <w:t xml:space="preserve">Архитектурная диаграмма «Port Contracts: Storage» из набора architecture представлена в формате flowchart. Уровень детализации: System / Component. Количество узлов: 9.</w:t>
       </w:r>
     </w:p>
-    <w:bookmarkEnd w:id="116"/>
-    <w:bookmarkStart w:id="117" w:name="метаданные-35"/>
+    <w:bookmarkEnd w:id="224"/>
+    <w:bookmarkStart w:id="225" w:name="метаданные-35"/>
     <w:p>
       <w:pPr>
         <w:pStyle w:val="Heading2"/>
@@ -6371,8 +7775,8 @@
         <w:t xml:space="preserve">9</w:t>
       </w:r>
     </w:p>
-    <w:bookmarkEnd w:id="117"/>
-    <w:bookmarkStart w:id="118" w:name="X1b4a7e27bc3560f630c6bacb2b9e99ec37d67f4"/>
+    <w:bookmarkEnd w:id="225"/>
+    <w:bookmarkStart w:id="229" w:name="X1b4a7e27bc3560f630c6bacb2b9e99ec37d67f4"/>
     <w:p>
       <w:pPr>
         <w:pStyle w:val="Heading2"/>
@@ -6386,7 +7790,46 @@
         <w:pStyle w:val="FirstParagraph"/>
       </w:pPr>
       <w:r>
-        <w:t xml:space="preserve">13c-port-contracts-observability</w:t>
+        <w:drawing>
+          <wp:inline>
+            <wp:extent cx="5334000" cy="9122635"/>
+            <wp:effectExtent b="0" l="0" r="0" t="0"/>
+            <wp:docPr descr="13c-port-contracts-observability" title="" id="227" name="Picture"/>
+            <a:graphic>
+              <a:graphicData uri="http://schemas.openxmlformats.org/drawingml/2006/picture">
+                <pic:pic>
+                  <pic:nvPicPr>
+                    <pic:cNvPr descr="architecture/png/13c-port-contracts-observability.png" id="228" name="Picture"/>
+                    <pic:cNvPicPr>
+                      <a:picLocks noChangeArrowheads="1" noChangeAspect="1"/>
+                    </pic:cNvPicPr>
+                  </pic:nvPicPr>
+                  <pic:blipFill>
+                    <a:blip r:embed="rId226"/>
+                    <a:stretch>
+                      <a:fillRect/>
+                    </a:stretch>
+                  </pic:blipFill>
+                  <pic:spPr bwMode="auto">
+                    <a:xfrm>
+                      <a:off x="0" y="0"/>
+                      <a:ext cx="5334000" cy="9122635"/>
+                    </a:xfrm>
+                    <a:prstGeom prst="rect">
+                      <a:avLst/>
+                    </a:prstGeom>
+                    <a:noFill/>
+                    <a:ln w="9525">
+                      <a:noFill/>
+                      <a:headEnd/>
+                      <a:tailEnd/>
+                    </a:ln>
+                  </pic:spPr>
+                </pic:pic>
+              </a:graphicData>
+            </a:graphic>
+          </wp:inline>
+        </w:drawing>
       </w:r>
     </w:p>
     <w:p>
@@ -6410,8 +7853,8 @@
         <w:t xml:space="preserve">mmd-diagrams/architecture/13c-port-contracts-observability.mmd</w:t>
       </w:r>
     </w:p>
-    <w:bookmarkEnd w:id="118"/>
-    <w:bookmarkStart w:id="119" w:name="описание-36"/>
+    <w:bookmarkEnd w:id="229"/>
+    <w:bookmarkStart w:id="230" w:name="описание-36"/>
     <w:p>
       <w:pPr>
         <w:pStyle w:val="Heading2"/>
@@ -6428,8 +7871,8 @@
         <w:t xml:space="preserve">Архитектурная диаграмма «Port Contracts: Observability and Resilience» из набора architecture представлена в формате flowchart. Уровень детализации: System / Component. Количество узлов: 15.</w:t>
       </w:r>
     </w:p>
-    <w:bookmarkEnd w:id="119"/>
-    <w:bookmarkStart w:id="120" w:name="метаданные-36"/>
+    <w:bookmarkEnd w:id="230"/>
+    <w:bookmarkStart w:id="231" w:name="метаданные-36"/>
     <w:p>
       <w:pPr>
         <w:pStyle w:val="Heading2"/>
@@ -6522,8 +7965,8 @@
         <w:t xml:space="preserve">15</w:t>
       </w:r>
     </w:p>
-    <w:bookmarkEnd w:id="120"/>
-    <w:bookmarkStart w:id="121" w:name="Xa5d5ba349a569367c81be66d3149bd744e5eda5"/>
+    <w:bookmarkEnd w:id="231"/>
+    <w:bookmarkStart w:id="235" w:name="Xa5d5ba349a569367c81be66d3149bd744e5eda5"/>
     <w:p>
       <w:pPr>
         <w:pStyle w:val="Heading2"/>
@@ -6537,7 +7980,46 @@
         <w:pStyle w:val="FirstParagraph"/>
       </w:pPr>
       <w:r>
-        <w:t xml:space="preserve">13c-validation-dq-ports</w:t>
+        <w:drawing>
+          <wp:inline>
+            <wp:extent cx="5334000" cy="7126156"/>
+            <wp:effectExtent b="0" l="0" r="0" t="0"/>
+            <wp:docPr descr="13c-validation-dq-ports" title="" id="233" name="Picture"/>
+            <a:graphic>
+              <a:graphicData uri="http://schemas.openxmlformats.org/drawingml/2006/picture">
+                <pic:pic>
+                  <pic:nvPicPr>
+                    <pic:cNvPr descr="architecture/png/13c-validation-dq-ports.png" id="234" name="Picture"/>
+                    <pic:cNvPicPr>
+                      <a:picLocks noChangeArrowheads="1" noChangeAspect="1"/>
+                    </pic:cNvPicPr>
+                  </pic:nvPicPr>
+                  <pic:blipFill>
+                    <a:blip r:embed="rId232"/>
+                    <a:stretch>
+                      <a:fillRect/>
+                    </a:stretch>
+                  </pic:blipFill>
+                  <pic:spPr bwMode="auto">
+                    <a:xfrm>
+                      <a:off x="0" y="0"/>
+                      <a:ext cx="5334000" cy="7126156"/>
+                    </a:xfrm>
+                    <a:prstGeom prst="rect">
+                      <a:avLst/>
+                    </a:prstGeom>
+                    <a:noFill/>
+                    <a:ln w="9525">
+                      <a:noFill/>
+                      <a:headEnd/>
+                      <a:tailEnd/>
+                    </a:ln>
+                  </pic:spPr>
+                </pic:pic>
+              </a:graphicData>
+            </a:graphic>
+          </wp:inline>
+        </w:drawing>
       </w:r>
     </w:p>
     <w:p>
@@ -6561,8 +8043,8 @@
         <w:t xml:space="preserve">mmd-diagrams/architecture/13c-validation-dq-ports.mmd</w:t>
       </w:r>
     </w:p>
-    <w:bookmarkEnd w:id="121"/>
-    <w:bookmarkStart w:id="122" w:name="описание-37"/>
+    <w:bookmarkEnd w:id="235"/>
+    <w:bookmarkStart w:id="236" w:name="описание-37"/>
     <w:p>
       <w:pPr>
         <w:pStyle w:val="Heading2"/>
@@ -6579,8 +8061,8 @@
         <w:t xml:space="preserve">Архитектурная диаграмма «Validation and Data Quality Ports» из набора architecture представлена в формате flowchart. Уровень детализации: System / Component. Количество узлов: 20.</w:t>
       </w:r>
     </w:p>
-    <w:bookmarkEnd w:id="122"/>
-    <w:bookmarkStart w:id="123" w:name="метаданные-37"/>
+    <w:bookmarkEnd w:id="236"/>
+    <w:bookmarkStart w:id="237" w:name="метаданные-37"/>
     <w:p>
       <w:pPr>
         <w:pStyle w:val="Heading2"/>
@@ -6673,8 +8155,8 @@
         <w:t xml:space="preserve">20</w:t>
       </w:r>
     </w:p>
-    <w:bookmarkEnd w:id="123"/>
-    <w:bookmarkStart w:id="124" w:name="X6d23d8bf98c7d1c9c2ebc64ae3b37073e6502e6"/>
+    <w:bookmarkEnd w:id="237"/>
+    <w:bookmarkStart w:id="241" w:name="X6d23d8bf98c7d1c9c2ebc64ae3b37073e6502e6"/>
     <w:p>
       <w:pPr>
         <w:pStyle w:val="Heading2"/>
@@ -6688,7 +8170,46 @@
         <w:pStyle w:val="FirstParagraph"/>
       </w:pPr>
       <w:r>
-        <w:t xml:space="preserve">13d-port-contracts-services</w:t>
+        <w:drawing>
+          <wp:inline>
+            <wp:extent cx="5334000" cy="6537782"/>
+            <wp:effectExtent b="0" l="0" r="0" t="0"/>
+            <wp:docPr descr="13d-port-contracts-services" title="" id="239" name="Picture"/>
+            <a:graphic>
+              <a:graphicData uri="http://schemas.openxmlformats.org/drawingml/2006/picture">
+                <pic:pic>
+                  <pic:nvPicPr>
+                    <pic:cNvPr descr="architecture/png/13d-port-contracts-services.png" id="240" name="Picture"/>
+                    <pic:cNvPicPr>
+                      <a:picLocks noChangeArrowheads="1" noChangeAspect="1"/>
+                    </pic:cNvPicPr>
+                  </pic:nvPicPr>
+                  <pic:blipFill>
+                    <a:blip r:embed="rId238"/>
+                    <a:stretch>
+                      <a:fillRect/>
+                    </a:stretch>
+                  </pic:blipFill>
+                  <pic:spPr bwMode="auto">
+                    <a:xfrm>
+                      <a:off x="0" y="0"/>
+                      <a:ext cx="5334000" cy="6537782"/>
+                    </a:xfrm>
+                    <a:prstGeom prst="rect">
+                      <a:avLst/>
+                    </a:prstGeom>
+                    <a:noFill/>
+                    <a:ln w="9525">
+                      <a:noFill/>
+                      <a:headEnd/>
+                      <a:tailEnd/>
+                    </a:ln>
+                  </pic:spPr>
+                </pic:pic>
+              </a:graphicData>
+            </a:graphic>
+          </wp:inline>
+        </w:drawing>
       </w:r>
     </w:p>
     <w:p>
@@ -6712,8 +8233,8 @@
         <w:t xml:space="preserve">mmd-diagrams/architecture/13d-port-contracts-services.mmd</w:t>
       </w:r>
     </w:p>
-    <w:bookmarkEnd w:id="124"/>
-    <w:bookmarkStart w:id="125" w:name="описание-38"/>
+    <w:bookmarkEnd w:id="241"/>
+    <w:bookmarkStart w:id="242" w:name="описание-38"/>
     <w:p>
       <w:pPr>
         <w:pStyle w:val="Heading2"/>
@@ -6730,8 +8251,8 @@
         <w:t xml:space="preserve">Архитектурная диаграмма «Port Contracts: Services and Controls» из набора architecture представлена в формате flowchart. Уровень детализации: System / Component. Количество узлов: 20.</w:t>
       </w:r>
     </w:p>
-    <w:bookmarkEnd w:id="125"/>
-    <w:bookmarkStart w:id="126" w:name="метаданные-38"/>
+    <w:bookmarkEnd w:id="242"/>
+    <w:bookmarkStart w:id="243" w:name="метаданные-38"/>
     <w:p>
       <w:pPr>
         <w:pStyle w:val="Heading2"/>
@@ -6824,8 +8345,8 @@
         <w:t xml:space="preserve">20</w:t>
       </w:r>
     </w:p>
-    <w:bookmarkEnd w:id="126"/>
-    <w:bookmarkStart w:id="127" w:name="Xb487158a9fed53660b6c54edb02d1c5ea9000de"/>
+    <w:bookmarkEnd w:id="243"/>
+    <w:bookmarkStart w:id="247" w:name="Xb487158a9fed53660b6c54edb02d1c5ea9000de"/>
     <w:p>
       <w:pPr>
         <w:pStyle w:val="Heading2"/>
@@ -6839,7 +8360,46 @@
         <w:pStyle w:val="FirstParagraph"/>
       </w:pPr>
       <w:r>
-        <w:t xml:space="preserve">13e-operational-ports-domain</w:t>
+        <w:drawing>
+          <wp:inline>
+            <wp:extent cx="5334000" cy="417139"/>
+            <wp:effectExtent b="0" l="0" r="0" t="0"/>
+            <wp:docPr descr="13e-operational-ports-domain" title="" id="245" name="Picture"/>
+            <a:graphic>
+              <a:graphicData uri="http://schemas.openxmlformats.org/drawingml/2006/picture">
+                <pic:pic>
+                  <pic:nvPicPr>
+                    <pic:cNvPr descr="architecture/png/13e-operational-ports-domain.png" id="246" name="Picture"/>
+                    <pic:cNvPicPr>
+                      <a:picLocks noChangeArrowheads="1" noChangeAspect="1"/>
+                    </pic:cNvPicPr>
+                  </pic:nvPicPr>
+                  <pic:blipFill>
+                    <a:blip r:embed="rId244"/>
+                    <a:stretch>
+                      <a:fillRect/>
+                    </a:stretch>
+                  </pic:blipFill>
+                  <pic:spPr bwMode="auto">
+                    <a:xfrm>
+                      <a:off x="0" y="0"/>
+                      <a:ext cx="5334000" cy="417139"/>
+                    </a:xfrm>
+                    <a:prstGeom prst="rect">
+                      <a:avLst/>
+                    </a:prstGeom>
+                    <a:noFill/>
+                    <a:ln w="9525">
+                      <a:noFill/>
+                      <a:headEnd/>
+                      <a:tailEnd/>
+                    </a:ln>
+                  </pic:spPr>
+                </pic:pic>
+              </a:graphicData>
+            </a:graphic>
+          </wp:inline>
+        </w:drawing>
       </w:r>
     </w:p>
     <w:p>
@@ -6863,8 +8423,8 @@
         <w:t xml:space="preserve">mmd-diagrams/architecture/13e-operational-ports-domain.mmd</w:t>
       </w:r>
     </w:p>
-    <w:bookmarkEnd w:id="127"/>
-    <w:bookmarkStart w:id="128" w:name="описание-39"/>
+    <w:bookmarkEnd w:id="247"/>
+    <w:bookmarkStart w:id="248" w:name="описание-39"/>
     <w:p>
       <w:pPr>
         <w:pStyle w:val="Heading2"/>
@@ -6881,8 +8441,8 @@
         <w:t xml:space="preserve">Архитектурная диаграмма «Domain Operational Ports» из набора architecture представлена в формате flowchart. Уровень детализации: System / Component. Количество узлов: 8.</w:t>
       </w:r>
     </w:p>
-    <w:bookmarkEnd w:id="128"/>
-    <w:bookmarkStart w:id="129" w:name="метаданные-39"/>
+    <w:bookmarkEnd w:id="248"/>
+    <w:bookmarkStart w:id="249" w:name="метаданные-39"/>
     <w:p>
       <w:pPr>
         <w:pStyle w:val="Heading2"/>
@@ -6975,8 +8535,8 @@
         <w:t xml:space="preserve">8</w:t>
       </w:r>
     </w:p>
-    <w:bookmarkEnd w:id="129"/>
-    <w:bookmarkStart w:id="130" w:name="X922dcdb214e9c479abdfa05383c1bf6865e5f6a"/>
+    <w:bookmarkEnd w:id="249"/>
+    <w:bookmarkStart w:id="253" w:name="X922dcdb214e9c479abdfa05383c1bf6865e5f6a"/>
     <w:p>
       <w:pPr>
         <w:pStyle w:val="Heading2"/>
@@ -6990,7 +8550,46 @@
         <w:pStyle w:val="FirstParagraph"/>
       </w:pPr>
       <w:r>
-        <w:t xml:space="preserve">13f-operational-ports-infra</w:t>
+        <w:drawing>
+          <wp:inline>
+            <wp:extent cx="5334000" cy="486621"/>
+            <wp:effectExtent b="0" l="0" r="0" t="0"/>
+            <wp:docPr descr="13f-operational-ports-infra" title="" id="251" name="Picture"/>
+            <a:graphic>
+              <a:graphicData uri="http://schemas.openxmlformats.org/drawingml/2006/picture">
+                <pic:pic>
+                  <pic:nvPicPr>
+                    <pic:cNvPr descr="architecture/png/13f-operational-ports-infra.png" id="252" name="Picture"/>
+                    <pic:cNvPicPr>
+                      <a:picLocks noChangeArrowheads="1" noChangeAspect="1"/>
+                    </pic:cNvPicPr>
+                  </pic:nvPicPr>
+                  <pic:blipFill>
+                    <a:blip r:embed="rId250"/>
+                    <a:stretch>
+                      <a:fillRect/>
+                    </a:stretch>
+                  </pic:blipFill>
+                  <pic:spPr bwMode="auto">
+                    <a:xfrm>
+                      <a:off x="0" y="0"/>
+                      <a:ext cx="5334000" cy="486621"/>
+                    </a:xfrm>
+                    <a:prstGeom prst="rect">
+                      <a:avLst/>
+                    </a:prstGeom>
+                    <a:noFill/>
+                    <a:ln w="9525">
+                      <a:noFill/>
+                      <a:headEnd/>
+                      <a:tailEnd/>
+                    </a:ln>
+                  </pic:spPr>
+                </pic:pic>
+              </a:graphicData>
+            </a:graphic>
+          </wp:inline>
+        </w:drawing>
       </w:r>
     </w:p>
     <w:p>
@@ -7014,8 +8613,8 @@
         <w:t xml:space="preserve">mmd-diagrams/architecture/13f-operational-ports-infra.mmd</w:t>
       </w:r>
     </w:p>
-    <w:bookmarkEnd w:id="130"/>
-    <w:bookmarkStart w:id="131" w:name="описание-40"/>
+    <w:bookmarkEnd w:id="253"/>
+    <w:bookmarkStart w:id="254" w:name="описание-40"/>
     <w:p>
       <w:pPr>
         <w:pStyle w:val="Heading2"/>
@@ -7032,8 +8631,8 @@
         <w:t xml:space="preserve">Архитектурная диаграмма «Infrastructure Operational Implementations» из набора architecture представлена в формате flowchart. Уровень детализации: System / Component. Количество узлов: 7.</w:t>
       </w:r>
     </w:p>
-    <w:bookmarkEnd w:id="131"/>
-    <w:bookmarkStart w:id="132" w:name="метаданные-40"/>
+    <w:bookmarkEnd w:id="254"/>
+    <w:bookmarkStart w:id="255" w:name="метаданные-40"/>
     <w:p>
       <w:pPr>
         <w:pStyle w:val="Heading2"/>
@@ -7126,8 +8725,8 @@
         <w:t xml:space="preserve">7</w:t>
       </w:r>
     </w:p>
-    <w:bookmarkEnd w:id="132"/>
-    <w:bookmarkStart w:id="133" w:name="X4da636e118cfc51f5f9dc53eeed33eaace3696c"/>
+    <w:bookmarkEnd w:id="255"/>
+    <w:bookmarkStart w:id="259" w:name="X4da636e118cfc51f5f9dc53eeed33eaace3696c"/>
     <w:p>
       <w:pPr>
         <w:pStyle w:val="Heading2"/>
@@ -7141,7 +8740,46 @@
         <w:pStyle w:val="FirstParagraph"/>
       </w:pPr>
       <w:r>
-        <w:t xml:space="preserve">14-cli-interface-layer</w:t>
+        <w:drawing>
+          <wp:inline>
+            <wp:extent cx="5334000" cy="5446390"/>
+            <wp:effectExtent b="0" l="0" r="0" t="0"/>
+            <wp:docPr descr="14-cli-interface-layer" title="" id="257" name="Picture"/>
+            <a:graphic>
+              <a:graphicData uri="http://schemas.openxmlformats.org/drawingml/2006/picture">
+                <pic:pic>
+                  <pic:nvPicPr>
+                    <pic:cNvPr descr="architecture/png/14-cli-interface-layer.png" id="258" name="Picture"/>
+                    <pic:cNvPicPr>
+                      <a:picLocks noChangeArrowheads="1" noChangeAspect="1"/>
+                    </pic:cNvPicPr>
+                  </pic:nvPicPr>
+                  <pic:blipFill>
+                    <a:blip r:embed="rId256"/>
+                    <a:stretch>
+                      <a:fillRect/>
+                    </a:stretch>
+                  </pic:blipFill>
+                  <pic:spPr bwMode="auto">
+                    <a:xfrm>
+                      <a:off x="0" y="0"/>
+                      <a:ext cx="5334000" cy="5446390"/>
+                    </a:xfrm>
+                    <a:prstGeom prst="rect">
+                      <a:avLst/>
+                    </a:prstGeom>
+                    <a:noFill/>
+                    <a:ln w="9525">
+                      <a:noFill/>
+                      <a:headEnd/>
+                      <a:tailEnd/>
+                    </a:ln>
+                  </pic:spPr>
+                </pic:pic>
+              </a:graphicData>
+            </a:graphic>
+          </wp:inline>
+        </w:drawing>
       </w:r>
     </w:p>
     <w:p>
@@ -7165,8 +8803,8 @@
         <w:t xml:space="preserve">mmd-diagrams/architecture/14-cli-interface-layer.mmd</w:t>
       </w:r>
     </w:p>
-    <w:bookmarkEnd w:id="133"/>
-    <w:bookmarkStart w:id="134" w:name="описание-41"/>
+    <w:bookmarkEnd w:id="259"/>
+    <w:bookmarkStart w:id="260" w:name="описание-41"/>
     <w:p>
       <w:pPr>
         <w:pStyle w:val="Heading2"/>
@@ -7183,8 +8821,8 @@
         <w:t xml:space="preserve">Архитектурная диаграмма «CLI / Interface Layer» из набора architecture представлена в формате flowchart. Уровень детализации: System / Component. Показывает: CLI commands, their routing, and interaction with composition.. Количество узлов: 24. Примечание: Decomposed into 14a-cli-commands, 14b-cli-routing.</w:t>
       </w:r>
     </w:p>
-    <w:bookmarkEnd w:id="134"/>
-    <w:bookmarkStart w:id="135" w:name="метаданные-41"/>
+    <w:bookmarkEnd w:id="260"/>
+    <w:bookmarkStart w:id="261" w:name="метаданные-41"/>
     <w:p>
       <w:pPr>
         <w:pStyle w:val="Heading2"/>
@@ -7277,8 +8915,8 @@
         <w:t xml:space="preserve">24</w:t>
       </w:r>
     </w:p>
-    <w:bookmarkEnd w:id="135"/>
-    <w:bookmarkStart w:id="136" w:name="X71c5bd2fb365807f9012e622745c21d9682c4a8"/>
+    <w:bookmarkEnd w:id="261"/>
+    <w:bookmarkStart w:id="265" w:name="X71c5bd2fb365807f9012e622745c21d9682c4a8"/>
     <w:p>
       <w:pPr>
         <w:pStyle w:val="Heading2"/>
@@ -7292,7 +8930,46 @@
         <w:pStyle w:val="FirstParagraph"/>
       </w:pPr>
       <w:r>
-        <w:t xml:space="preserve">14a-cli-commands</w:t>
+        <w:drawing>
+          <wp:inline>
+            <wp:extent cx="5334000" cy="5007511"/>
+            <wp:effectExtent b="0" l="0" r="0" t="0"/>
+            <wp:docPr descr="14a-cli-commands" title="" id="263" name="Picture"/>
+            <a:graphic>
+              <a:graphicData uri="http://schemas.openxmlformats.org/drawingml/2006/picture">
+                <pic:pic>
+                  <pic:nvPicPr>
+                    <pic:cNvPr descr="architecture/png/14a-cli-commands.png" id="264" name="Picture"/>
+                    <pic:cNvPicPr>
+                      <a:picLocks noChangeArrowheads="1" noChangeAspect="1"/>
+                    </pic:cNvPicPr>
+                  </pic:nvPicPr>
+                  <pic:blipFill>
+                    <a:blip r:embed="rId262"/>
+                    <a:stretch>
+                      <a:fillRect/>
+                    </a:stretch>
+                  </pic:blipFill>
+                  <pic:spPr bwMode="auto">
+                    <a:xfrm>
+                      <a:off x="0" y="0"/>
+                      <a:ext cx="5334000" cy="5007511"/>
+                    </a:xfrm>
+                    <a:prstGeom prst="rect">
+                      <a:avLst/>
+                    </a:prstGeom>
+                    <a:noFill/>
+                    <a:ln w="9525">
+                      <a:noFill/>
+                      <a:headEnd/>
+                      <a:tailEnd/>
+                    </a:ln>
+                  </pic:spPr>
+                </pic:pic>
+              </a:graphicData>
+            </a:graphic>
+          </wp:inline>
+        </w:drawing>
       </w:r>
     </w:p>
     <w:p>
@@ -7316,8 +8993,8 @@
         <w:t xml:space="preserve">mmd-diagrams/architecture/14a-cli-commands.mmd</w:t>
       </w:r>
     </w:p>
-    <w:bookmarkEnd w:id="136"/>
-    <w:bookmarkStart w:id="137" w:name="описание-42"/>
+    <w:bookmarkEnd w:id="265"/>
+    <w:bookmarkStart w:id="266" w:name="описание-42"/>
     <w:p>
       <w:pPr>
         <w:pStyle w:val="Heading2"/>
@@ -7334,8 +9011,8 @@
         <w:t xml:space="preserve">Архитектурная диаграмма «CLI: Command Structure» из набора architecture представлена в формате flowchart. Уровень детализации: System / Component. Количество узлов: 12.</w:t>
       </w:r>
     </w:p>
-    <w:bookmarkEnd w:id="137"/>
-    <w:bookmarkStart w:id="138" w:name="метаданные-42"/>
+    <w:bookmarkEnd w:id="266"/>
+    <w:bookmarkStart w:id="267" w:name="метаданные-42"/>
     <w:p>
       <w:pPr>
         <w:pStyle w:val="Heading2"/>
@@ -7428,8 +9105,8 @@
         <w:t xml:space="preserve">12</w:t>
       </w:r>
     </w:p>
-    <w:bookmarkEnd w:id="138"/>
-    <w:bookmarkStart w:id="139" w:name="X21e34f443b76494704d8997a4f2bd8dbb8fe836"/>
+    <w:bookmarkEnd w:id="267"/>
+    <w:bookmarkStart w:id="271" w:name="X21e34f443b76494704d8997a4f2bd8dbb8fe836"/>
     <w:p>
       <w:pPr>
         <w:pStyle w:val="Heading2"/>
@@ -7443,7 +9120,46 @@
         <w:pStyle w:val="FirstParagraph"/>
       </w:pPr>
       <w:r>
-        <w:t xml:space="preserve">14b-cli-routing</w:t>
+        <w:drawing>
+          <wp:inline>
+            <wp:extent cx="5334000" cy="910209"/>
+            <wp:effectExtent b="0" l="0" r="0" t="0"/>
+            <wp:docPr descr="14b-cli-routing" title="" id="269" name="Picture"/>
+            <a:graphic>
+              <a:graphicData uri="http://schemas.openxmlformats.org/drawingml/2006/picture">
+                <pic:pic>
+                  <pic:nvPicPr>
+                    <pic:cNvPr descr="architecture/png/14b-cli-routing.png" id="270" name="Picture"/>
+                    <pic:cNvPicPr>
+                      <a:picLocks noChangeArrowheads="1" noChangeAspect="1"/>
+                    </pic:cNvPicPr>
+                  </pic:nvPicPr>
+                  <pic:blipFill>
+                    <a:blip r:embed="rId268"/>
+                    <a:stretch>
+                      <a:fillRect/>
+                    </a:stretch>
+                  </pic:blipFill>
+                  <pic:spPr bwMode="auto">
+                    <a:xfrm>
+                      <a:off x="0" y="0"/>
+                      <a:ext cx="5334000" cy="910209"/>
+                    </a:xfrm>
+                    <a:prstGeom prst="rect">
+                      <a:avLst/>
+                    </a:prstGeom>
+                    <a:noFill/>
+                    <a:ln w="9525">
+                      <a:noFill/>
+                      <a:headEnd/>
+                      <a:tailEnd/>
+                    </a:ln>
+                  </pic:spPr>
+                </pic:pic>
+              </a:graphicData>
+            </a:graphic>
+          </wp:inline>
+        </w:drawing>
       </w:r>
     </w:p>
     <w:p>
@@ -7467,8 +9183,8 @@
         <w:t xml:space="preserve">mmd-diagrams/architecture/14b-cli-routing.mmd</w:t>
       </w:r>
     </w:p>
-    <w:bookmarkEnd w:id="139"/>
-    <w:bookmarkStart w:id="140" w:name="описание-43"/>
+    <w:bookmarkEnd w:id="271"/>
+    <w:bookmarkStart w:id="272" w:name="описание-43"/>
     <w:p>
       <w:pPr>
         <w:pStyle w:val="Heading2"/>
@@ -7485,8 +9201,8 @@
         <w:t xml:space="preserve">Архитектурная диаграмма «CLI: Routing to Composition &amp; Application» из набора architecture представлена в формате flowchart. Уровень детализации: System / Component. Количество узлов: 12.</w:t>
       </w:r>
     </w:p>
-    <w:bookmarkEnd w:id="140"/>
-    <w:bookmarkStart w:id="141" w:name="метаданные-43"/>
+    <w:bookmarkEnd w:id="272"/>
+    <w:bookmarkStart w:id="273" w:name="метаданные-43"/>
     <w:p>
       <w:pPr>
         <w:pStyle w:val="Heading2"/>
@@ -7579,8 +9295,8 @@
         <w:t xml:space="preserve">12</w:t>
       </w:r>
     </w:p>
-    <w:bookmarkEnd w:id="141"/>
-    <w:bookmarkStart w:id="142" w:name="X6b6c0058fadad35b1f24807a83969b36ca6f7ef"/>
+    <w:bookmarkEnd w:id="273"/>
+    <w:bookmarkStart w:id="277" w:name="X6b6c0058fadad35b1f24807a83969b36ca6f7ef"/>
     <w:p>
       <w:pPr>
         <w:pStyle w:val="Heading2"/>
@@ -7594,7 +9310,46 @@
         <w:pStyle w:val="FirstParagraph"/>
       </w:pPr>
       <w:r>
-        <w:t xml:space="preserve">15-batch-executor-internals</w:t>
+        <w:drawing>
+          <wp:inline>
+            <wp:extent cx="5334000" cy="3195726"/>
+            <wp:effectExtent b="0" l="0" r="0" t="0"/>
+            <wp:docPr descr="15-batch-executor-internals" title="" id="275" name="Picture"/>
+            <a:graphic>
+              <a:graphicData uri="http://schemas.openxmlformats.org/drawingml/2006/picture">
+                <pic:pic>
+                  <pic:nvPicPr>
+                    <pic:cNvPr descr="architecture/png/15-batch-executor-internals.png" id="276" name="Picture"/>
+                    <pic:cNvPicPr>
+                      <a:picLocks noChangeArrowheads="1" noChangeAspect="1"/>
+                    </pic:cNvPicPr>
+                  </pic:nvPicPr>
+                  <pic:blipFill>
+                    <a:blip r:embed="rId274"/>
+                    <a:stretch>
+                      <a:fillRect/>
+                    </a:stretch>
+                  </pic:blipFill>
+                  <pic:spPr bwMode="auto">
+                    <a:xfrm>
+                      <a:off x="0" y="0"/>
+                      <a:ext cx="5334000" cy="3195726"/>
+                    </a:xfrm>
+                    <a:prstGeom prst="rect">
+                      <a:avLst/>
+                    </a:prstGeom>
+                    <a:noFill/>
+                    <a:ln w="9525">
+                      <a:noFill/>
+                      <a:headEnd/>
+                      <a:tailEnd/>
+                    </a:ln>
+                  </pic:spPr>
+                </pic:pic>
+              </a:graphicData>
+            </a:graphic>
+          </wp:inline>
+        </w:drawing>
       </w:r>
     </w:p>
     <w:p>
@@ -7618,8 +9373,8 @@
         <w:t xml:space="preserve">mmd-diagrams/architecture/15-batch-executor-internals.mmd</w:t>
       </w:r>
     </w:p>
-    <w:bookmarkEnd w:id="142"/>
-    <w:bookmarkStart w:id="143" w:name="описание-44"/>
+    <w:bookmarkEnd w:id="277"/>
+    <w:bookmarkStart w:id="278" w:name="описание-44"/>
     <w:p>
       <w:pPr>
         <w:pStyle w:val="Heading2"/>
@@ -7636,8 +9391,8 @@
         <w:t xml:space="preserve">Архитектурная диаграмма «BatchExecutor Internal Architecture» из набора architecture представлена в формате flowchart. Уровень детализации: System / Component. Показывает: the composition of BatchExecutor and its helper components.. Количество узлов: 15.</w:t>
       </w:r>
     </w:p>
-    <w:bookmarkEnd w:id="143"/>
-    <w:bookmarkStart w:id="144" w:name="метаданные-44"/>
+    <w:bookmarkEnd w:id="278"/>
+    <w:bookmarkStart w:id="279" w:name="метаданные-44"/>
     <w:p>
       <w:pPr>
         <w:pStyle w:val="Heading2"/>
@@ -7730,8 +9485,8 @@
         <w:t xml:space="preserve">15</w:t>
       </w:r>
     </w:p>
-    <w:bookmarkEnd w:id="144"/>
-    <w:bookmarkStart w:id="145" w:name="X33ca675d349453cc680a37ef07998c9836bc14d"/>
+    <w:bookmarkEnd w:id="279"/>
+    <w:bookmarkStart w:id="283" w:name="X33ca675d349453cc680a37ef07998c9836bc14d"/>
     <w:p>
       <w:pPr>
         <w:pStyle w:val="Heading2"/>
@@ -7745,7 +9500,46 @@
         <w:pStyle w:val="FirstParagraph"/>
       </w:pPr>
       <w:r>
-        <w:t xml:space="preserve">16-transformer-hierarchy</w:t>
+        <w:drawing>
+          <wp:inline>
+            <wp:extent cx="5334000" cy="1678081"/>
+            <wp:effectExtent b="0" l="0" r="0" t="0"/>
+            <wp:docPr descr="16-transformer-hierarchy" title="" id="281" name="Picture"/>
+            <a:graphic>
+              <a:graphicData uri="http://schemas.openxmlformats.org/drawingml/2006/picture">
+                <pic:pic>
+                  <pic:nvPicPr>
+                    <pic:cNvPr descr="architecture/png/16-transformer-hierarchy.png" id="282" name="Picture"/>
+                    <pic:cNvPicPr>
+                      <a:picLocks noChangeArrowheads="1" noChangeAspect="1"/>
+                    </pic:cNvPicPr>
+                  </pic:nvPicPr>
+                  <pic:blipFill>
+                    <a:blip r:embed="rId280"/>
+                    <a:stretch>
+                      <a:fillRect/>
+                    </a:stretch>
+                  </pic:blipFill>
+                  <pic:spPr bwMode="auto">
+                    <a:xfrm>
+                      <a:off x="0" y="0"/>
+                      <a:ext cx="5334000" cy="1678081"/>
+                    </a:xfrm>
+                    <a:prstGeom prst="rect">
+                      <a:avLst/>
+                    </a:prstGeom>
+                    <a:noFill/>
+                    <a:ln w="9525">
+                      <a:noFill/>
+                      <a:headEnd/>
+                      <a:tailEnd/>
+                    </a:ln>
+                  </pic:spPr>
+                </pic:pic>
+              </a:graphicData>
+            </a:graphic>
+          </wp:inline>
+        </w:drawing>
       </w:r>
     </w:p>
     <w:p>
@@ -7769,8 +9563,8 @@
         <w:t xml:space="preserve">mmd-diagrams/architecture/16-transformer-hierarchy.mmd</w:t>
       </w:r>
     </w:p>
-    <w:bookmarkEnd w:id="145"/>
-    <w:bookmarkStart w:id="146" w:name="описание-45"/>
+    <w:bookmarkEnd w:id="283"/>
+    <w:bookmarkStart w:id="284" w:name="описание-45"/>
     <w:p>
       <w:pPr>
         <w:pStyle w:val="Heading2"/>
@@ -7787,8 +9581,8 @@
         <w:t xml:space="preserve">Архитектурная диаграмма «Transformer Hierarchy» из набора architecture представлена в формате flowchart. Уровень детализации: System / Component. Показывает: the Template Method pattern and all provider-specific transformers.. Количество узлов: 35. Примечание: Decomposed into 16a-transformer-base, 16b-transformer-pub-other.</w:t>
       </w:r>
     </w:p>
-    <w:bookmarkEnd w:id="146"/>
-    <w:bookmarkStart w:id="147" w:name="метаданные-45"/>
+    <w:bookmarkEnd w:id="284"/>
+    <w:bookmarkStart w:id="285" w:name="метаданные-45"/>
     <w:p>
       <w:pPr>
         <w:pStyle w:val="Heading2"/>
@@ -7881,8 +9675,8 @@
         <w:t xml:space="preserve">35</w:t>
       </w:r>
     </w:p>
-    <w:bookmarkEnd w:id="147"/>
-    <w:bookmarkStart w:id="148" w:name="X6db4417e30180b443957a0157a97d8c5bd27db3"/>
+    <w:bookmarkEnd w:id="285"/>
+    <w:bookmarkStart w:id="289" w:name="X6db4417e30180b443957a0157a97d8c5bd27db3"/>
     <w:p>
       <w:pPr>
         <w:pStyle w:val="Heading2"/>
@@ -7896,7 +9690,46 @@
         <w:pStyle w:val="FirstParagraph"/>
       </w:pPr>
       <w:r>
-        <w:t xml:space="preserve">16a-transformer-base</w:t>
+        <w:drawing>
+          <wp:inline>
+            <wp:extent cx="5334000" cy="729047"/>
+            <wp:effectExtent b="0" l="0" r="0" t="0"/>
+            <wp:docPr descr="16a-transformer-base" title="" id="287" name="Picture"/>
+            <a:graphic>
+              <a:graphicData uri="http://schemas.openxmlformats.org/drawingml/2006/picture">
+                <pic:pic>
+                  <pic:nvPicPr>
+                    <pic:cNvPr descr="architecture/png/16a-transformer-base.png" id="288" name="Picture"/>
+                    <pic:cNvPicPr>
+                      <a:picLocks noChangeArrowheads="1" noChangeAspect="1"/>
+                    </pic:cNvPicPr>
+                  </pic:nvPicPr>
+                  <pic:blipFill>
+                    <a:blip r:embed="rId286"/>
+                    <a:stretch>
+                      <a:fillRect/>
+                    </a:stretch>
+                  </pic:blipFill>
+                  <pic:spPr bwMode="auto">
+                    <a:xfrm>
+                      <a:off x="0" y="0"/>
+                      <a:ext cx="5334000" cy="729047"/>
+                    </a:xfrm>
+                    <a:prstGeom prst="rect">
+                      <a:avLst/>
+                    </a:prstGeom>
+                    <a:noFill/>
+                    <a:ln w="9525">
+                      <a:noFill/>
+                      <a:headEnd/>
+                      <a:tailEnd/>
+                    </a:ln>
+                  </pic:spPr>
+                </pic:pic>
+              </a:graphicData>
+            </a:graphic>
+          </wp:inline>
+        </w:drawing>
       </w:r>
     </w:p>
     <w:p>
@@ -7920,8 +9753,8 @@
         <w:t xml:space="preserve">mmd-diagrams/architecture/16a-transformer-base.mmd</w:t>
       </w:r>
     </w:p>
-    <w:bookmarkEnd w:id="148"/>
-    <w:bookmarkStart w:id="149" w:name="описание-46"/>
+    <w:bookmarkEnd w:id="289"/>
+    <w:bookmarkStart w:id="290" w:name="описание-46"/>
     <w:p>
       <w:pPr>
         <w:pStyle w:val="Heading2"/>
@@ -7938,8 +9771,8 @@
         <w:t xml:space="preserve">Архитектурная диаграмма «Base Transformer and ChEMBL Transformers» из набора architecture представлена в формате flowchart. Уровень детализации: System / Component. Количество узлов: 17.</w:t>
       </w:r>
     </w:p>
-    <w:bookmarkEnd w:id="149"/>
-    <w:bookmarkStart w:id="150" w:name="метаданные-46"/>
+    <w:bookmarkEnd w:id="290"/>
+    <w:bookmarkStart w:id="291" w:name="метаданные-46"/>
     <w:p>
       <w:pPr>
         <w:pStyle w:val="Heading2"/>
@@ -8032,8 +9865,8 @@
         <w:t xml:space="preserve">17</w:t>
       </w:r>
     </w:p>
-    <w:bookmarkEnd w:id="150"/>
-    <w:bookmarkStart w:id="151" w:name="X2eb9849dfbdb9a3e1d99c8c021d5b046dacbba0"/>
+    <w:bookmarkEnd w:id="291"/>
+    <w:bookmarkStart w:id="295" w:name="X2eb9849dfbdb9a3e1d99c8c021d5b046dacbba0"/>
     <w:p>
       <w:pPr>
         <w:pStyle w:val="Heading2"/>
@@ -8047,7 +9880,46 @@
         <w:pStyle w:val="FirstParagraph"/>
       </w:pPr>
       <w:r>
-        <w:t xml:space="preserve">16b-transformer-pub-other</w:t>
+        <w:drawing>
+          <wp:inline>
+            <wp:extent cx="5334000" cy="1264276"/>
+            <wp:effectExtent b="0" l="0" r="0" t="0"/>
+            <wp:docPr descr="16b-transformer-pub-other" title="" id="293" name="Picture"/>
+            <a:graphic>
+              <a:graphicData uri="http://schemas.openxmlformats.org/drawingml/2006/picture">
+                <pic:pic>
+                  <pic:nvPicPr>
+                    <pic:cNvPr descr="architecture/png/16b-transformer-pub-other.png" id="294" name="Picture"/>
+                    <pic:cNvPicPr>
+                      <a:picLocks noChangeArrowheads="1" noChangeAspect="1"/>
+                    </pic:cNvPicPr>
+                  </pic:nvPicPr>
+                  <pic:blipFill>
+                    <a:blip r:embed="rId292"/>
+                    <a:stretch>
+                      <a:fillRect/>
+                    </a:stretch>
+                  </pic:blipFill>
+                  <pic:spPr bwMode="auto">
+                    <a:xfrm>
+                      <a:off x="0" y="0"/>
+                      <a:ext cx="5334000" cy="1264276"/>
+                    </a:xfrm>
+                    <a:prstGeom prst="rect">
+                      <a:avLst/>
+                    </a:prstGeom>
+                    <a:noFill/>
+                    <a:ln w="9525">
+                      <a:noFill/>
+                      <a:headEnd/>
+                      <a:tailEnd/>
+                    </a:ln>
+                  </pic:spPr>
+                </pic:pic>
+              </a:graphicData>
+            </a:graphic>
+          </wp:inline>
+        </w:drawing>
       </w:r>
     </w:p>
     <w:p>
@@ -8071,8 +9943,8 @@
         <w:t xml:space="preserve">mmd-diagrams/architecture/16b-transformer-pub-other.mmd</w:t>
       </w:r>
     </w:p>
-    <w:bookmarkEnd w:id="151"/>
-    <w:bookmarkStart w:id="152" w:name="описание-47"/>
+    <w:bookmarkEnd w:id="295"/>
+    <w:bookmarkStart w:id="296" w:name="описание-47"/>
     <w:p>
       <w:pPr>
         <w:pStyle w:val="Heading2"/>
@@ -8089,8 +9961,8 @@
         <w:t xml:space="preserve">Архитектурная диаграмма «Publication, UniProt, Other Transformers and Extractors» из набора architecture представлена в формате flowchart. Уровень детализации: System / Component. Количество узлов: 18.</w:t>
       </w:r>
     </w:p>
-    <w:bookmarkEnd w:id="152"/>
-    <w:bookmarkStart w:id="153" w:name="метаданные-47"/>
+    <w:bookmarkEnd w:id="296"/>
+    <w:bookmarkStart w:id="297" w:name="метаданные-47"/>
     <w:p>
       <w:pPr>
         <w:pStyle w:val="Heading2"/>
@@ -8183,8 +10055,8 @@
         <w:t xml:space="preserve">18</w:t>
       </w:r>
     </w:p>
-    <w:bookmarkEnd w:id="153"/>
-    <w:bookmarkStart w:id="154" w:name="X95d5a1670fb1bae1099c74a776b0a15337980d2"/>
+    <w:bookmarkEnd w:id="297"/>
+    <w:bookmarkStart w:id="301" w:name="X95d5a1670fb1bae1099c74a776b0a15337980d2"/>
     <w:p>
       <w:pPr>
         <w:pStyle w:val="Heading2"/>
@@ -8198,7 +10070,46 @@
         <w:pStyle w:val="FirstParagraph"/>
       </w:pPr>
       <w:r>
-        <w:t xml:space="preserve">17-security-pii-audit</w:t>
+        <w:drawing>
+          <wp:inline>
+            <wp:extent cx="5334000" cy="6426403"/>
+            <wp:effectExtent b="0" l="0" r="0" t="0"/>
+            <wp:docPr descr="17-security-pii-audit" title="" id="299" name="Picture"/>
+            <a:graphic>
+              <a:graphicData uri="http://schemas.openxmlformats.org/drawingml/2006/picture">
+                <pic:pic>
+                  <pic:nvPicPr>
+                    <pic:cNvPr descr="architecture/png/17-security-pii-audit.png" id="300" name="Picture"/>
+                    <pic:cNvPicPr>
+                      <a:picLocks noChangeArrowheads="1" noChangeAspect="1"/>
+                    </pic:cNvPicPr>
+                  </pic:nvPicPr>
+                  <pic:blipFill>
+                    <a:blip r:embed="rId298"/>
+                    <a:stretch>
+                      <a:fillRect/>
+                    </a:stretch>
+                  </pic:blipFill>
+                  <pic:spPr bwMode="auto">
+                    <a:xfrm>
+                      <a:off x="0" y="0"/>
+                      <a:ext cx="5334000" cy="6426403"/>
+                    </a:xfrm>
+                    <a:prstGeom prst="rect">
+                      <a:avLst/>
+                    </a:prstGeom>
+                    <a:noFill/>
+                    <a:ln w="9525">
+                      <a:noFill/>
+                      <a:headEnd/>
+                      <a:tailEnd/>
+                    </a:ln>
+                  </pic:spPr>
+                </pic:pic>
+              </a:graphicData>
+            </a:graphic>
+          </wp:inline>
+        </w:drawing>
       </w:r>
     </w:p>
     <w:p>
@@ -8222,8 +10133,8 @@
         <w:t xml:space="preserve">mmd-diagrams/architecture/17-security-pii-audit.mmd</w:t>
       </w:r>
     </w:p>
-    <w:bookmarkEnd w:id="154"/>
-    <w:bookmarkStart w:id="155" w:name="описание-48"/>
+    <w:bookmarkEnd w:id="301"/>
+    <w:bookmarkStart w:id="302" w:name="описание-48"/>
     <w:p>
       <w:pPr>
         <w:pStyle w:val="Heading2"/>
@@ -8240,8 +10151,8 @@
         <w:t xml:space="preserve">Архитектурная диаграмма «Security, PII Hashing, and Audit Trail» из набора architecture представлена в формате flowchart. Уровень детализации: System / Component. Показывает: how PII is handled and audit trail is maintained.. Количество узлов: 16.</w:t>
       </w:r>
     </w:p>
-    <w:bookmarkEnd w:id="155"/>
-    <w:bookmarkStart w:id="156" w:name="метаданные-48"/>
+    <w:bookmarkEnd w:id="302"/>
+    <w:bookmarkStart w:id="303" w:name="метаданные-48"/>
     <w:p>
       <w:pPr>
         <w:pStyle w:val="Heading2"/>
@@ -8334,8 +10245,8 @@
         <w:t xml:space="preserve">16</w:t>
       </w:r>
     </w:p>
-    <w:bookmarkEnd w:id="156"/>
-    <w:bookmarkStart w:id="157" w:name="X39f363dbe3996ddfe7385c8d0e9407cd0a3f11d"/>
+    <w:bookmarkEnd w:id="303"/>
+    <w:bookmarkStart w:id="307" w:name="X39f363dbe3996ddfe7385c8d0e9407cd0a3f11d"/>
     <w:p>
       <w:pPr>
         <w:pStyle w:val="Heading2"/>
@@ -8349,7 +10260,46 @@
         <w:pStyle w:val="FirstParagraph"/>
       </w:pPr>
       <w:r>
-        <w:t xml:space="preserve">18-lock-checkpoint-shutdown</w:t>
+        <w:drawing>
+          <wp:inline>
+            <wp:extent cx="5334000" cy="2906768"/>
+            <wp:effectExtent b="0" l="0" r="0" t="0"/>
+            <wp:docPr descr="18-lock-checkpoint-shutdown" title="" id="305" name="Picture"/>
+            <a:graphic>
+              <a:graphicData uri="http://schemas.openxmlformats.org/drawingml/2006/picture">
+                <pic:pic>
+                  <pic:nvPicPr>
+                    <pic:cNvPr descr="architecture/png/18-lock-checkpoint-shutdown.png" id="306" name="Picture"/>
+                    <pic:cNvPicPr>
+                      <a:picLocks noChangeArrowheads="1" noChangeAspect="1"/>
+                    </pic:cNvPicPr>
+                  </pic:nvPicPr>
+                  <pic:blipFill>
+                    <a:blip r:embed="rId304"/>
+                    <a:stretch>
+                      <a:fillRect/>
+                    </a:stretch>
+                  </pic:blipFill>
+                  <pic:spPr bwMode="auto">
+                    <a:xfrm>
+                      <a:off x="0" y="0"/>
+                      <a:ext cx="5334000" cy="2906768"/>
+                    </a:xfrm>
+                    <a:prstGeom prst="rect">
+                      <a:avLst/>
+                    </a:prstGeom>
+                    <a:noFill/>
+                    <a:ln w="9525">
+                      <a:noFill/>
+                      <a:headEnd/>
+                      <a:tailEnd/>
+                    </a:ln>
+                  </pic:spPr>
+                </pic:pic>
+              </a:graphicData>
+            </a:graphic>
+          </wp:inline>
+        </w:drawing>
       </w:r>
     </w:p>
     <w:p>
@@ -8373,8 +10323,8 @@
         <w:t xml:space="preserve">mmd-diagrams/architecture/18-lock-checkpoint-shutdown.mmd</w:t>
       </w:r>
     </w:p>
-    <w:bookmarkEnd w:id="157"/>
-    <w:bookmarkStart w:id="158" w:name="описание-49"/>
+    <w:bookmarkEnd w:id="307"/>
+    <w:bookmarkStart w:id="308" w:name="описание-49"/>
     <w:p>
       <w:pPr>
         <w:pStyle w:val="Heading2"/>
@@ -8391,8 +10341,8 @@
         <w:t xml:space="preserve">Архитектурная диаграмма «Locking, Checkpoint, and Graceful Shutdown» из набора architecture представлена в формате flowchart. Уровень детализации: System / Component. Показывает: distributed safety mechanisms.. Количество узлов: 22. Примечание: Decomposed into 18a-lock-system, 18b-checkpoint-shutdown.</w:t>
       </w:r>
     </w:p>
-    <w:bookmarkEnd w:id="158"/>
-    <w:bookmarkStart w:id="159" w:name="метаданные-49"/>
+    <w:bookmarkEnd w:id="308"/>
+    <w:bookmarkStart w:id="309" w:name="метаданные-49"/>
     <w:p>
       <w:pPr>
         <w:pStyle w:val="Heading2"/>
@@ -8485,8 +10435,8 @@
         <w:t xml:space="preserve">22</w:t>
       </w:r>
     </w:p>
-    <w:bookmarkEnd w:id="159"/>
-    <w:bookmarkStart w:id="160" w:name="X898668cc371d5687bee0a6ffdb4aa12c4710058"/>
+    <w:bookmarkEnd w:id="309"/>
+    <w:bookmarkStart w:id="313" w:name="X898668cc371d5687bee0a6ffdb4aa12c4710058"/>
     <w:p>
       <w:pPr>
         <w:pStyle w:val="Heading2"/>
@@ -8500,7 +10450,46 @@
         <w:pStyle w:val="FirstParagraph"/>
       </w:pPr>
       <w:r>
-        <w:t xml:space="preserve">18a-lock-system</w:t>
+        <w:drawing>
+          <wp:inline>
+            <wp:extent cx="5334000" cy="5548504"/>
+            <wp:effectExtent b="0" l="0" r="0" t="0"/>
+            <wp:docPr descr="18a-lock-system" title="" id="311" name="Picture"/>
+            <a:graphic>
+              <a:graphicData uri="http://schemas.openxmlformats.org/drawingml/2006/picture">
+                <pic:pic>
+                  <pic:nvPicPr>
+                    <pic:cNvPr descr="architecture/png/18a-lock-system.png" id="312" name="Picture"/>
+                    <pic:cNvPicPr>
+                      <a:picLocks noChangeArrowheads="1" noChangeAspect="1"/>
+                    </pic:cNvPicPr>
+                  </pic:nvPicPr>
+                  <pic:blipFill>
+                    <a:blip r:embed="rId310"/>
+                    <a:stretch>
+                      <a:fillRect/>
+                    </a:stretch>
+                  </pic:blipFill>
+                  <pic:spPr bwMode="auto">
+                    <a:xfrm>
+                      <a:off x="0" y="0"/>
+                      <a:ext cx="5334000" cy="5548504"/>
+                    </a:xfrm>
+                    <a:prstGeom prst="rect">
+                      <a:avLst/>
+                    </a:prstGeom>
+                    <a:noFill/>
+                    <a:ln w="9525">
+                      <a:noFill/>
+                      <a:headEnd/>
+                      <a:tailEnd/>
+                    </a:ln>
+                  </pic:spPr>
+                </pic:pic>
+              </a:graphicData>
+            </a:graphic>
+          </wp:inline>
+        </w:drawing>
       </w:r>
     </w:p>
     <w:p>
@@ -8524,8 +10513,8 @@
         <w:t xml:space="preserve">mmd-diagrams/architecture/18a-lock-system.mmd</w:t>
       </w:r>
     </w:p>
-    <w:bookmarkEnd w:id="160"/>
-    <w:bookmarkStart w:id="161" w:name="описание-50"/>
+    <w:bookmarkEnd w:id="313"/>
+    <w:bookmarkStart w:id="314" w:name="описание-50"/>
     <w:p>
       <w:pPr>
         <w:pStyle w:val="Heading2"/>
@@ -8542,8 +10531,8 @@
         <w:t xml:space="preserve">Архитектурная диаграмма «Lock System» из набора architecture представлена в формате flowchart. Уровень детализации: System / Component. Количество узлов: 8.</w:t>
       </w:r>
     </w:p>
-    <w:bookmarkEnd w:id="161"/>
-    <w:bookmarkStart w:id="162" w:name="метаданные-50"/>
+    <w:bookmarkEnd w:id="314"/>
+    <w:bookmarkStart w:id="315" w:name="метаданные-50"/>
     <w:p>
       <w:pPr>
         <w:pStyle w:val="Heading2"/>
@@ -8636,8 +10625,8 @@
         <w:t xml:space="preserve">8</w:t>
       </w:r>
     </w:p>
-    <w:bookmarkEnd w:id="162"/>
-    <w:bookmarkStart w:id="163" w:name="X269a2de74e5c259e2549d2d7cec809056b33277"/>
+    <w:bookmarkEnd w:id="315"/>
+    <w:bookmarkStart w:id="319" w:name="X269a2de74e5c259e2549d2d7cec809056b33277"/>
     <w:p>
       <w:pPr>
         <w:pStyle w:val="Heading2"/>
@@ -8651,7 +10640,46 @@
         <w:pStyle w:val="FirstParagraph"/>
       </w:pPr>
       <w:r>
-        <w:t xml:space="preserve">18b-checkpoint-shutdown</w:t>
+        <w:drawing>
+          <wp:inline>
+            <wp:extent cx="5334000" cy="1537264"/>
+            <wp:effectExtent b="0" l="0" r="0" t="0"/>
+            <wp:docPr descr="18b-checkpoint-shutdown" title="" id="317" name="Picture"/>
+            <a:graphic>
+              <a:graphicData uri="http://schemas.openxmlformats.org/drawingml/2006/picture">
+                <pic:pic>
+                  <pic:nvPicPr>
+                    <pic:cNvPr descr="architecture/png/18b-checkpoint-shutdown.png" id="318" name="Picture"/>
+                    <pic:cNvPicPr>
+                      <a:picLocks noChangeArrowheads="1" noChangeAspect="1"/>
+                    </pic:cNvPicPr>
+                  </pic:nvPicPr>
+                  <pic:blipFill>
+                    <a:blip r:embed="rId316"/>
+                    <a:stretch>
+                      <a:fillRect/>
+                    </a:stretch>
+                  </pic:blipFill>
+                  <pic:spPr bwMode="auto">
+                    <a:xfrm>
+                      <a:off x="0" y="0"/>
+                      <a:ext cx="5334000" cy="1537264"/>
+                    </a:xfrm>
+                    <a:prstGeom prst="rect">
+                      <a:avLst/>
+                    </a:prstGeom>
+                    <a:noFill/>
+                    <a:ln w="9525">
+                      <a:noFill/>
+                      <a:headEnd/>
+                      <a:tailEnd/>
+                    </a:ln>
+                  </pic:spPr>
+                </pic:pic>
+              </a:graphicData>
+            </a:graphic>
+          </wp:inline>
+        </w:drawing>
       </w:r>
     </w:p>
     <w:p>
@@ -8675,8 +10703,8 @@
         <w:t xml:space="preserve">mmd-diagrams/architecture/18b-checkpoint-shutdown.mmd</w:t>
       </w:r>
     </w:p>
-    <w:bookmarkEnd w:id="163"/>
-    <w:bookmarkStart w:id="164" w:name="описание-51"/>
+    <w:bookmarkEnd w:id="319"/>
+    <w:bookmarkStart w:id="320" w:name="описание-51"/>
     <w:p>
       <w:pPr>
         <w:pStyle w:val="Heading2"/>
@@ -8693,8 +10721,8 @@
         <w:t xml:space="preserve">Архитектурная диаграмма «Checkpoint and Shutdown System» из набора architecture представлена в формате flowchart. Уровень детализации: System / Component. Количество узлов: 14.</w:t>
       </w:r>
     </w:p>
-    <w:bookmarkEnd w:id="164"/>
-    <w:bookmarkStart w:id="165" w:name="метаданные-51"/>
+    <w:bookmarkEnd w:id="320"/>
+    <w:bookmarkStart w:id="321" w:name="метаданные-51"/>
     <w:p>
       <w:pPr>
         <w:pStyle w:val="Heading2"/>
@@ -8787,8 +10815,8 @@
         <w:t xml:space="preserve">14</w:t>
       </w:r>
     </w:p>
-    <w:bookmarkEnd w:id="165"/>
-    <w:bookmarkEnd w:id="166"/>
+    <w:bookmarkEnd w:id="321"/>
+    <w:bookmarkEnd w:id="322"/>
     <w:sectPr>
       <w:footnotePr>
         <w:numRestart w:val="eachSect"/>

</xml_diff>

<commit_message>
Refactor debt scorecard and diagram tooling
Restructure architecture debt configuration and update diagram tooling/docs. Rework configs/quality/debt_scorecard.yaml and architecture_metric_exemptions.yaml: normalize keys, tighten governance settings, add a ProviderRegistry exemption entry, adjust baselines/quarterly targets and hotspot budgets. Add generated report markdowns and task snapshot files. Introduce scripts/diagrams/diagram_paths (py + sh) and update many diagram-related scripts and agent helpers to use centralized DIAGRAM_* paths and bundle helpers (bundle_markdown_path, theme dir, render script), plus related mkdocs and script imports. Add postrun metadata/service collaborator modules, CLI orchestration contracts/models and provider registry defaults; update source code and tests to match the new contracts and naming conventions. Numerous docs updated to use snake_case YAML examples and normalized diagram paths.
</commit_message>
<xml_diff>
--- a/docs/02-architecture/mmd-diagrams/architecture-diagrams-with-descriptions.docx
+++ b/docs/02-architecture/mmd-diagrams/architecture-diagrams-with-descriptions.docx
@@ -20,7 +20,7 @@
         </w:numPr>
       </w:pPr>
       <w:r>
-        <w:t xml:space="preserve">Generated: 2026-03-12T14:16:19</w:t>
+        <w:t xml:space="preserve">Generated: 2026-03-19T08:19:01</w:t>
       </w:r>
     </w:p>
     <w:p>
@@ -550,7 +550,7 @@
           <w:rPr>
             <w:rStyle w:val="Hyperlink"/>
           </w:rPr>
-          <w:t xml:space="preserve">12a-bootstrap-factories — Bootstrap: Factories and Registries</w:t>
+          <w:t xml:space="preserve">12a-bootstrap-factories — Bootstrap: Registries, Public APIs, and Factory Seams</w:t>
         </w:r>
       </w:hyperlink>
     </w:p>
@@ -567,7 +567,7 @@
           <w:rPr>
             <w:rStyle w:val="Hyperlink"/>
           </w:rPr>
-          <w:t xml:space="preserve">12b-bootstrap-wiring — Bootstrap: Wiring Graph</w:t>
+          <w:t xml:space="preserve">12b-bootstrap-wiring — Bootstrap: Runtime and Admin Wiring</w:t>
         </w:r>
       </w:hyperlink>
     </w:p>
@@ -788,7 +788,7 @@
           <w:rPr>
             <w:rStyle w:val="Hyperlink"/>
           </w:rPr>
-          <w:t xml:space="preserve">14b-cli-routing — CLI: Routing to Composition &amp; Application</w:t>
+          <w:t xml:space="preserve">14b-cli-routing — CLI: Routing to Composition Boundary</w:t>
         </w:r>
       </w:hyperlink>
     </w:p>
@@ -856,7 +856,7 @@
           <w:rPr>
             <w:rStyle w:val="Hyperlink"/>
           </w:rPr>
-          <w:t xml:space="preserve">16b-transformer-pub-other — Publication, UniProt, Other Transformers and Extractors</w:t>
+          <w:t xml:space="preserve">16b-transformer-pub-other — Publication, UniProt, Other Transformers and Blocks</w:t>
         </w:r>
       </w:hyperlink>
     </w:p>
@@ -1194,7 +1194,7 @@
         <w:pStyle w:val="FirstParagraph"/>
       </w:pPr>
       <w:r>
-        <w:t xml:space="preserve">Диаграмма «Hexagonal Overview» из architecture-набора детализирует конкретный архитектурный компонент или подсистему BioETL. Она представлена в формате блок-схема потоков (flowchart) и служит ориентиром на уровне детализации «System / Component». На схеме отражено примерно 11 узлов и 14 связей, поэтому её удобно использовать для проверки влияния изменений, согласования интерфейсов и подготовки рефакторинга. Ключевые блоки/подграфы: Interfaces Layer, Composition Layer, Application Layer, Domain Layer, Infrastructure Layer. Показательные узлы для быстрого чтения: CLI Commands (Click), Orchestration, Bootstrap / Assembly, Application Core, Port Protocols, Provider Adapters.</w:t>
+        <w:t xml:space="preserve">Диаграмма «Hexagonal Overview» из architecture-набора детализирует конкретный архитектурный компонент или подсистему BioETL. Она представлена в формате блок-схема потоков (flowchart) и служит ориентиром на уровне детализации «System / Component». В комментариях исходника зафиксирован фокус диаграммы: Covers 5 architectural layers, external systems, and main dependency directions.. На схеме отражено примерно 11 узлов и 14 связей, поэтому её удобно использовать для проверки влияния изменений, согласования интерфейсов и подготовки рефакторинга. Ключевые блоки/подграфы: Interfaces Layer, Composition Layer, Application Layer, Domain Layer, Infrastructure Layer. Показательные узлы для быстрого чтения: CLI Commands (Click), Orchestration, Bootstrap / Assembly, Application Core, Port Protocols, Provider Adapters.</w:t>
       </w:r>
     </w:p>
     <w:bookmarkEnd w:id="19"/>
@@ -1376,7 +1376,7 @@
         <w:pStyle w:val="FirstParagraph"/>
       </w:pPr>
       <w:r>
-        <w:t xml:space="preserve">Диаграмма «Hexagonal Domain and Application» из architecture-набора детализирует конкретный архитектурный компонент или подсистему BioETL. Она представлена в формате блок-схема потоков (flowchart) и служит ориентиром на уровне детализации «System / Component». На схеме отражено примерно 13 узлов и 7 связей, поэтому её удобно использовать для проверки влияния изменений, согласования интерфейсов и подготовки рефакторинга. Ключевые блоки/подграфы: Application Layer, Domain Layer. Показательные узлы для быстрого чтения: Core (Runner, Executor, Transformer, Writer), Services (DQ, Export, Health, Lifecycle), Composite Pipeline (Coordinator, Merger, FSM), Pipeline Transformers (per provider), PipelineObserver, Port Protocols.</w:t>
+        <w:t xml:space="preserve">Диаграмма «Hexagonal Domain and Application» из architecture-набора детализирует конкретный архитектурный компонент или подсистему BioETL. Она представлена в формате блок-схема потоков (flowchart) и служит ориентиром на уровне детализации «System / Component». В комментариях исходника зафиксирован фокус диаграммы: Covers domain contracts and core application services that depend on them.. На схеме отражено примерно 13 узлов и 7 связей, поэтому её удобно использовать для проверки влияния изменений, согласования интерфейсов и подготовки рефакторинга. Ключевые блоки/подграфы: Application Layer, Domain Layer. Показательные узлы для быстрого чтения: Core (Runner, Executor, Transformer, Writer), Services (DQ, Export, Health, Lifecycle), Composite Pipeline (Coordinator, Merger, FSM), Pipeline Transformers (per provider), PipelineObserver, Port Protocols.</w:t>
       </w:r>
     </w:p>
     <w:bookmarkEnd w:id="25"/>
@@ -1558,7 +1558,7 @@
         <w:pStyle w:val="FirstParagraph"/>
       </w:pPr>
       <w:r>
-        <w:t xml:space="preserve">Диаграмма «Hexagonal Infrastructure and Composition» из architecture-набора детализирует конкретный архитектурный компонент или подсистему BioETL. Она представлена в формате блок-схема потоков (flowchart) и служит ориентиром на уровне детализации «System / Component». На схеме отражено примерно 14 узлов и 11 связей, поэтому её удобно использовать для проверки влияния изменений, согласования интерфейсов и подготовки рефакторинга. Ключевые блоки/подграфы: Composition Layer, Infrastructure Layer, Domain Layer. Показательные узлы для быстрого чтения: Bootstrap / Assembly, Factories, Provider Registry, Runtime Builders, HTTP Adapters, Storage.</w:t>
+        <w:t xml:space="preserve">Диаграмма «Hexagonal Infrastructure and Composition» из architecture-набора детализирует конкретный архитектурный компонент или подсистему BioETL. Она представлена в формате блок-схема потоков (flowchart) и служит ориентиром на уровне детализации «System / Component». В комментариях исходника зафиксирован фокус диаграммы: Covers infrastructure adapters and composition-root wiring points.. На схеме отражено примерно 14 узлов и 11 связей, поэтому её удобно использовать для проверки влияния изменений, согласования интерфейсов и подготовки рефакторинга. Ключевые блоки/подграфы: Composition Layer, Infrastructure Layer, Domain Layer. Показательные узлы для быстрого чтения: Bootstrap / Assembly, Factories, Provider Registry, Runtime Builders, HTTP Adapters, Storage.</w:t>
       </w:r>
     </w:p>
     <w:bookmarkEnd w:id="31"/>
@@ -1740,7 +1740,7 @@
         <w:pStyle w:val="FirstParagraph"/>
       </w:pPr>
       <w:r>
-        <w:t xml:space="preserve">Диаграмма «Hexagonal Overview (Rounded Nodes)» из architecture-набора детализирует конкретный архитектурный компонент или подсистему BioETL. Она представлена в формате блок-схема потоков (flowchart) и служит ориентиром на уровне детализации «System / Component». На схеме отражено примерно 11 узлов и 14 связей, поэтому её удобно использовать для проверки влияния изменений, согласования интерфейсов и подготовки рефакторинга. Ключевые блоки/подграфы: Interfaces Layer, Composition Layer, Application Layer, Domain Layer, Infrastructure Layer. Показательные узлы для быстрого чтения: CLI Commands (Click), Orchestration, Bootstrap / Assembly, Application Core, Port Protocols, Provider Adapters.</w:t>
+        <w:t xml:space="preserve">Диаграмма «Hexagonal Overview (Rounded Nodes)» из architecture-набора детализирует конкретный архитектурный компонент или подсистему BioETL. Она представлена в формате блок-схема потоков (flowchart) и служит ориентиром на уровне детализации «System / Component». В комментариях исходника зафиксирован фокус диаграммы: Covers 5 architectural layers, external systems, and main dependency directions.. На схеме отражено примерно 11 узлов и 14 связей, поэтому её удобно использовать для проверки влияния изменений, согласования интерфейсов и подготовки рефакторинга. Ключевые блоки/подграфы: Interfaces Layer, Composition Layer, Application Layer, Domain Layer, Infrastructure Layer. Показательные узлы для быстрого чтения: CLI Commands (Click), Orchestration, Bootstrap / Assembly, Application Core, Port Protocols, Provider Adapters.</w:t>
       </w:r>
     </w:p>
     <w:bookmarkEnd w:id="37"/>
@@ -1922,7 +1922,7 @@
         <w:pStyle w:val="FirstParagraph"/>
       </w:pPr>
       <w:r>
-        <w:t xml:space="preserve">Диаграмма «Layer Dependency Matrix (ARCH-001)» из architecture-набора детализирует конкретный архитектурный компонент или подсистему BioETL. Она представлена в формате блок-схема потоков (flowchart) и служит ориентиром на уровне детализации «System / Component». На схеме отражено примерно 5 узлов и 14 связей, поэтому её удобно использовать для проверки влияния изменений, согласования интерфейсов и подготовки рефакторинга. Ключевые блоки/подграфы: Legend, Architectural Layers. Показательные узлы для быстрого чтения: ✅ Allowed, ❌ Forbidden, domain (pure business logic, no I/O, no frameworks), application (use cases, orchestration, transformers), infrastructure (adapters, storage, observability), composition (DI wiring, factories, bootstrap).</w:t>
+        <w:t xml:space="preserve">Диаграмма «Layer Dependency Matrix (ARCH-001)» из architecture-набора детализирует конкретный архитектурный компонент или подсистему BioETL. Она представлена в формате блок-схема потоков (flowchart) и служит ориентиром на уровне детализации «System / Component». В комментариях исходника зафиксирован фокус диаграммы: Enforced import boundaries between architectural layers.. На схеме отражено примерно 5 узлов и 14 связей, поэтому её удобно использовать для проверки влияния изменений, согласования интерфейсов и подготовки рефакторинга. Ключевые блоки/подграфы: Legend, Architectural Layers. Показательные узлы для быстрого чтения: ✅ Allowed, ❌ Forbidden, domain (pure business logic, no I/O, no frameworks), application (use cases, orchestration, transformers), infrastructure (adapters, storage, observability), composition (DI wiring, factories, bootstrap).</w:t>
       </w:r>
     </w:p>
     <w:bookmarkEnd w:id="43"/>
@@ -2286,7 +2286,7 @@
         <w:pStyle w:val="FirstParagraph"/>
       </w:pPr>
       <w:r>
-        <w:t xml:space="preserve">Диаграмма «Medallion Layers Overview» из architecture-набора детализирует конкретный архитектурный компонент или подсистему BioETL. Она представлена в формате блок-схема потоков (flowchart) и служит ориентиром на уровне детализации «System / Component». На схеме отражено примерно 12 узлов и 9 связей, поэтому её удобно использовать для проверки влияния изменений, согласования интерфейсов и подготовки рефакторинга. Ключевые блоки/подграфы: Ingestion, Processing, Serving. Показательные узлы для быстрого чтения: Provider APIs, Bronze Layer</w:t>
+        <w:t xml:space="preserve">Диаграмма «Medallion Layers Overview» из architecture-набора детализирует конкретный архитектурный компонент или подсистему BioETL. Она представлена в формате блок-схема потоков (flowchart) и служит ориентиром на уровне детализации «System / Component». В комментариях исходника зафиксирован фокус диаграммы: Compact decomposition view for 03-medallion-data-flow.mmd (layer-level semantics). На схеме отражено примерно 12 узлов и 9 связей, поэтому её удобно использовать для проверки влияния изменений, согласования интерфейсов и подготовки рефакторинга. Ключевые блоки/подграфы: Ingestion, Processing, Serving. Показательные узлы для быстрого чтения: Provider APIs, Bronze Layer</w:t>
       </w:r>
       <w:r>
         <w:t xml:space="preserve">JSON, Normalize + Validate, Silver Layer</w:t>
@@ -2495,7 +2495,7 @@
         <w:pStyle w:val="FirstParagraph"/>
       </w:pPr>
       <w:r>
-        <w:t xml:space="preserve">Диаграмма «Pipeline Execution Lifecycle» из architecture-набора детализирует конкретный архитектурный компонент или подсистему BioETL. Она представлена в формате диаграмма последовательности (sequence) и служит ориентиром на уровне детализации «System / Component». На схеме отражено примерно 12 узлов и 9 связей, поэтому её удобно использовать для проверки влияния изменений, согласования интерфейсов и подготовки рефакторинга.</w:t>
+        <w:t xml:space="preserve">Диаграмма «Pipeline Execution Lifecycle» из architecture-набора детализирует конкретный архитектурный компонент или подсистему BioETL. Она представлена в формате диаграмма последовательности (sequence) и служит ориентиром на уровне детализации «System / Component». В комментариях исходника зафиксирован фокус диаграммы: Sequence of phases in a single pipeline run.. На схеме отражено примерно 12 узлов и 9 связей, поэтому её удобно использовать для проверки влияния изменений, согласования интерфейсов и подготовки рефакторинга.</w:t>
       </w:r>
     </w:p>
     <w:bookmarkEnd w:id="61"/>
@@ -2859,7 +2859,7 @@
         <w:pStyle w:val="FirstParagraph"/>
       </w:pPr>
       <w:r>
-        <w:t xml:space="preserve">Диаграмма «Adapter Hierarchy: Base Types» из architecture-набора детализирует конкретный архитектурный компонент или подсистему BioETL. Она представлена в формате блок-схема потоков (flowchart) и служит ориентиром на уровне детализации «System / Component». На схеме отражено примерно 12 узлов и 8 связей, поэтому её удобно использовать для проверки влияния изменений, согласования интерфейсов и подготовки рефакторинга. Ключевые блоки/подграфы: Domain Layer, Infrastructure Layer. Показательные узлы для быстрого чтения: DataSourcePort, HealthCheckPort, HealthCheckProviderMixin, NotSupportedMultiFilterMixin, FilterableStubMixin, PaginatedFetcherMixin.</w:t>
+        <w:t xml:space="preserve">Диаграмма «Adapter Hierarchy: Base Types» из architecture-набора детализирует конкретный архитектурный компонент или подсистему BioETL. Она представлена в формате блок-схема потоков (flowchart) и служит ориентиром на уровне детализации «System / Component». В комментариях исходника зафиксирован фокус диаграммы: Covers core ports, base adapters, reusable mixins, and adapter decorators.. На схеме отражено примерно 12 узлов и 8 связей, поэтому её удобно использовать для проверки влияния изменений, согласования интерфейсов и подготовки рефакторинга. Ключевые блоки/подграфы: Domain Layer, Infrastructure Layer. Показательные узлы для быстрого чтения: DataSourcePort, HealthCheckPort, HealthCheckProviderMixin, NotSupportedMultiFilterMixin, FilterableStubMixin, PaginatedFetcherMixin.</w:t>
       </w:r>
     </w:p>
     <w:bookmarkEnd w:id="73"/>
@@ -3041,7 +3041,7 @@
         <w:pStyle w:val="FirstParagraph"/>
       </w:pPr>
       <w:r>
-        <w:t xml:space="preserve">Диаграмма «Adapter Hierarchy: Provider Implementations» из architecture-набора детализирует конкретный архитектурный компонент или подсистему BioETL. Она представлена в формате блок-схема потоков (flowchart) и служит ориентиром на уровне детализации «System / Component». На схеме отражено примерно 15 узлов и 12 связей, поэтому её удобно использовать для проверки влияния изменений, согласования интерфейсов и подготовки рефакторинга. Ключевые блоки/подграфы: Infrastructure Layer. Показательные узлы для быстрого чтения: BaseHttpAdapter, BaseSyncAdapter, ChemblAdapter, PubMedAdapter, UniProtAdapter, CrossRefAdapter.</w:t>
+        <w:t xml:space="preserve">Диаграмма «Adapter Hierarchy: Provider Implementations» из architecture-набора детализирует конкретный архитектурный компонент или подсистему BioETL. Она представлена в формате блок-схема потоков (flowchart) и служит ориентиром на уровне детализации «System / Component». В комментариях исходника зафиксирован фокус диаграммы: Covers concrete provider adapters and provider-specific mixins.. На схеме отражено примерно 15 узлов и 12 связей, поэтому её удобно использовать для проверки влияния изменений, согласования интерфейсов и подготовки рефакторинга. Ключевые блоки/подграфы: Infrastructure Layer. Показательные узлы для быстрого чтения: BaseHttpAdapter, BaseSyncAdapter, ChemblAdapter, PubMedAdapter, UniProtAdapter, CrossRefAdapter.</w:t>
       </w:r>
     </w:p>
     <w:bookmarkEnd w:id="79"/>
@@ -3161,7 +3161,7 @@
       <w:r>
         <w:drawing>
           <wp:inline>
-            <wp:extent cx="5334000" cy="5295724"/>
+            <wp:extent cx="5334000" cy="4724982"/>
             <wp:effectExtent b="0" l="0" r="0" t="0"/>
             <wp:docPr descr="06-storage-layer" title="" id="83" name="Picture"/>
             <a:graphic>
@@ -3182,7 +3182,7 @@
                   <pic:spPr bwMode="auto">
                     <a:xfrm>
                       <a:off x="0" y="0"/>
-                      <a:ext cx="5334000" cy="5295724"/>
+                      <a:ext cx="5334000" cy="4724982"/>
                     </a:xfrm>
                     <a:prstGeom prst="rect">
                       <a:avLst/>
@@ -3223,7 +3223,7 @@
         <w:pStyle w:val="FirstParagraph"/>
       </w:pPr>
       <w:r>
-        <w:t xml:space="preserve">Диаграмма «Storage Layer Components» из architecture-набора детализирует конкретный архитектурный компонент или подсистему BioETL. Она представлена в формате блок-схема потоков (flowchart) и служит ориентиром на уровне детализации «System / Component». В комментариях исходника зафиксирован фокус диаграммы: Bronze/Silver/Gold writers, Delta Lake, metadata, and validation.. На схеме отражено примерно 21 узлов и 23 связей, поэтому её удобно использовать для проверки влияния изменений, согласования интерфейсов и подготовки рефакторинга. Ключевые блоки/подграфы: Domain Port, Storage Writers, Bronze Storage, Silver Storage, Gold Storage, Delta Reader. Показательные узлы для быстрого чтения: StoragePort (Protocol), AtomicWriteGroup ━━━━━━━━━━━━━━━━━ Atomic multi-file writes with rollback, GoldWriter csv_exporter + audit + metadata_writer write_gold / clear_gold, ArrowDataConverter (records → PyArrow), RetentionManager (vacuum/retention), MetadataWriter (_metadata.yaml). Примечание: Decomposed into 06a-storage-writers, 06b-storage-support.</w:t>
+        <w:t xml:space="preserve">Диаграмма «Storage Layer Components» из architecture-набора детализирует конкретный архитектурный компонент или подсистему BioETL. Она представлена в формате блок-схема потоков (flowchart) и служит ориентиром на уровне детализации «System / Component». В комментариях исходника зафиксирован фокус диаграммы: Bronze/Silver/Gold writers, metadata sidecar zones, Delta Lake, and validation.. На схеме отражено примерно 23 узлов и 27 связей, поэтому её удобно использовать для проверки влияния изменений, согласования интерфейсов и подготовки рефакторинга. Ключевые блоки/подграфы: Domain Port, Storage Writers, Bronze Storage, Silver Storage, Gold Storage, Delta Reader. Показательные узлы для быстрого чтения: StoragePort (Protocol), AtomicWriteGroup ━━━━━━━━━━━━━━━━━ Atomic multi-file writes with rollback, ArrowDataConverter (records → PyArrow), RetentionPolicy (vacuum/retention), MetadataWriter write_bronze / write_silver / write_gold, CsvExporter (Delta → CSV export). Примечание: Decomposed into 06a-storage-writers, 06b-storage-support.</w:t>
       </w:r>
     </w:p>
     <w:bookmarkEnd w:id="85"/>
@@ -3296,7 +3296,7 @@
         <w:rPr>
           <w:rStyle w:val="VerbatimChar"/>
         </w:rPr>
-        <w:t xml:space="preserve">2026-02-24</w:t>
+        <w:t xml:space="preserve">2026-03-19</w:t>
       </w:r>
     </w:p>
     <w:p>
@@ -3317,7 +3317,7 @@
         <w:rPr>
           <w:rStyle w:val="VerbatimChar"/>
         </w:rPr>
-        <w:t xml:space="preserve">21</w:t>
+        <w:t xml:space="preserve">23</w:t>
       </w:r>
     </w:p>
     <w:p>
@@ -3405,7 +3405,7 @@
         <w:pStyle w:val="FirstParagraph"/>
       </w:pPr>
       <w:r>
-        <w:t xml:space="preserve">Диаграмма «Storage Writers» из architecture-набора детализирует конкретный архитектурный компонент или подсистему BioETL. Она представлена в формате блок-схема потоков (flowchart) и служит ориентиром на уровне детализации «System / Component». На схеме отражено примерно 10 узлов и 10 связей, поэтому её удобно использовать для проверки влияния изменений, согласования интерфейсов и подготовки рефакторинга. Ключевые блоки/подграфы: Domain Port, Bronze Storage, Silver Storage, Gold Storage, Delta Reader, File System Layout. Показательные узлы для быстрого чтения: StoragePort (Protocol), BronzeWriter write_bronze() / aclose(), AtomicWriteGroup atomic multi-file writes, BaseDeltaWriter get_table_path() / clear(), SilverWriter write_silver() / merge_silver(), GoldWriter write_gold() / clear_gold().</w:t>
+        <w:t xml:space="preserve">Диаграмма «Storage Writers» из architecture-набора детализирует конкретный архитектурный компонент или подсистему BioETL. Она представлена в формате блок-схема потоков (flowchart) и служит ориентиром на уровне детализации «System / Component». В комментариях исходника зафиксирован фокус диаграммы: Bronze/Silver/Gold writers with Delta Lake base class, port contract, and file system layout.. На схеме отражено примерно 10 узлов и 10 связей, поэтому её удобно использовать для проверки влияния изменений, согласования интерфейсов и подготовки рефакторинга. Ключевые блоки/подграфы: Domain Port, Bronze Storage, Silver Storage, Gold Storage, Delta Reader, File System Layout. Показательные узлы для быстрого чтения: StoragePort (Protocol), BronzeWriter write_bronze() / aclose(), AtomicWriteGroup atomic multi-file writes, BaseDeltaWriter get_table_path() / clear(), SilverWriter write_silver() / merge_silver(), GoldWriter write_gold() / clear_gold().</w:t>
       </w:r>
     </w:p>
     <w:bookmarkEnd w:id="91"/>
@@ -3525,7 +3525,7 @@
       <w:r>
         <w:drawing>
           <wp:inline>
-            <wp:extent cx="5334000" cy="616979"/>
+            <wp:extent cx="5334000" cy="497260"/>
             <wp:effectExtent b="0" l="0" r="0" t="0"/>
             <wp:docPr descr="06b-storage-support" title="" id="95" name="Picture"/>
             <a:graphic>
@@ -3546,7 +3546,7 @@
                   <pic:spPr bwMode="auto">
                     <a:xfrm>
                       <a:off x="0" y="0"/>
-                      <a:ext cx="5334000" cy="616979"/>
+                      <a:ext cx="5334000" cy="497260"/>
                     </a:xfrm>
                     <a:prstGeom prst="rect">
                       <a:avLst/>
@@ -3587,7 +3587,7 @@
         <w:pStyle w:val="FirstParagraph"/>
       </w:pPr>
       <w:r>
-        <w:t xml:space="preserve">Диаграмма «Storage Support Components» из architecture-набора детализирует конкретный архитектурный компонент или подсистему BioETL. Она представлена в формате блок-схема потоков (flowchart) и служит ориентиром на уровне детализации «System / Component». На схеме отражено примерно 11 узлов и 7 связей, поэтому её удобно использовать для проверки влияния изменений, согласования интерфейсов и подготовки рефакторинга. Ключевые блоки/подграфы: Support Components, Validation, Metadata Builders. Показательные узлы для быстрого чтения: ArrowDataConverter records → PyArrow, RetentionManager vacuum / retention, MetadataWriter _metadata.yaml, CsvExporter Delta → CSV export, DQReportWriter DQ reports JSON, PanderaSilverValidator SilverValidatorPort impl.</w:t>
+        <w:t xml:space="preserve">Диаграмма «Storage Support Components» из architecture-набора детализирует конкретный архитектурный компонент или подсистему BioETL. Она представлена в формате блок-схема потоков (flowchart) и служит ориентиром на уровне детализации «System / Component». В комментариях исходника зафиксирован фокус диаграммы: Support utilities, metadata write-preparation zones, validators, and metadata builders for the storage layer.. На схеме отражено примерно 14 узлов и 11 связей, поэтому её удобно использовать для проверки влияния изменений, согласования интерфейсов и подготовки рефакторинга. Ключевые блоки/подграфы: Support Components, Validation, Metadata Builders. Показательные узлы для быстрого чтения: ArrowDataConverter records → PyArrow, RetentionPolicy vacuum / retention, MetadataWriter layer-specific metadata writes, metadata_writer_operations target + YAML + retry telemetry, CsvExporter Delta → CSV export, DQReportWriter DQ reports JSON.</w:t>
       </w:r>
     </w:p>
     <w:bookmarkEnd w:id="97"/>
@@ -3660,7 +3660,7 @@
         <w:rPr>
           <w:rStyle w:val="VerbatimChar"/>
         </w:rPr>
-        <w:t xml:space="preserve">2026-02-27</w:t>
+        <w:t xml:space="preserve">2026-03-19</w:t>
       </w:r>
     </w:p>
     <w:p>
@@ -3681,7 +3681,7 @@
         <w:rPr>
           <w:rStyle w:val="VerbatimChar"/>
         </w:rPr>
-        <w:t xml:space="preserve">11</w:t>
+        <w:t xml:space="preserve">14</w:t>
       </w:r>
     </w:p>
     <w:p>
@@ -3951,7 +3951,7 @@
         <w:pStyle w:val="FirstParagraph"/>
       </w:pPr>
       <w:r>
-        <w:t xml:space="preserve">Диаграмма «DQ Analysis Services» из architecture-набора детализирует конкретный архитектурный компонент или подсистему BioETL. Она представлена в формате блок-схема потоков (flowchart) и служит ориентиром на уровне детализации «System / Component». На схеме отражено примерно 12 узлов и 11 связей, поэтому её удобно использовать для проверки влияния изменений, согласования интерфейсов и подготовки рефакторинга. Ключевые блоки/подграфы: Domain Ports, Application Services, DQ Analyzers, Anomaly Detection. Показательные узлы для быстрого чтения: DQMonitorPort, BronzeDQAnalyzerPort, SilverDQAnalyzerPort, GoldDQAnalyzerPort, DQReportWriterPort, DataQualityService evaluate(context, executor).</w:t>
+        <w:t xml:space="preserve">Диаграмма «DQ Analysis Services» из architecture-набора детализирует конкретный архитектурный компонент или подсистему BioETL. Она представлена в формате блок-схема потоков (flowchart) и служит ориентиром на уровне детализации «System / Component». В комментариях исходника зафиксирован фокус диаграммы: Domain ports, application services, analyzers, and anomaly detection for Data Quality.. На схеме отражено примерно 12 узлов и 11 связей, поэтому её удобно использовать для проверки влияния изменений, согласования интерфейсов и подготовки рефакторинга. Ключевые блоки/подграфы: Domain Ports, Application Services, DQ Analyzers, Anomaly Detection. Показательные узлы для быстрого чтения: DQMonitorPort, BronzeDQAnalyzerPort, SilverDQAnalyzerPort, GoldDQAnalyzerPort, DQReportWriterPort, DataQualityService evaluate(context, executor).</w:t>
       </w:r>
     </w:p>
     <w:bookmarkEnd w:id="109"/>
@@ -4133,7 +4133,7 @@
         <w:pStyle w:val="FirstParagraph"/>
       </w:pPr>
       <w:r>
-        <w:t xml:space="preserve">Диаграмма «DQ Pipeline Integration» из architecture-набора детализирует конкретный архитектурный компонент или подсистему BioETL. Она представлена в формате блок-схема потоков (flowchart) и служит ориентиром на уровне детализации «System / Component». На схеме отражено примерно 10 узлов и 4 связей, поэтому её удобно использовать для проверки влияния изменений, согласования интерфейсов и подготовки рефакторинга. Ключевые блоки/подграфы: Pipeline Integration, Domain Value Objects, Infrastructure Implementations. Показательные узлы для быстрого чтения: BatchTransformer _check_dq_thresholds(), QuarantineManager quarantines failed records, ErrorClassifier recoverable vs fatal, DQMetrics null_rate / duplicate_rate, DQResult passed / error_rate, DQReport layer / table_name / results.</w:t>
+        <w:t xml:space="preserve">Диаграмма «DQ Pipeline Integration» из architecture-набора детализирует конкретный архитектурный компонент или подсистему BioETL. Она представлена в формате блок-схема потоков (flowchart) и служит ориентиром на уровне детализации «System / Component». В комментариях исходника зафиксирован фокус диаграммы: Pipeline DQ checks, domain value objects, and infrastructure config/report writers.. На схеме отражено примерно 10 узлов и 4 связей, поэтому её удобно использовать для проверки влияния изменений, согласования интерфейсов и подготовки рефакторинга. Ключевые блоки/подграфы: Pipeline Integration, Domain Value Objects, Infrastructure Implementations. Показательные узлы для быстрого чтения: BatchTransformer _check_dq_thresholds(), QuarantineManager quarantines failed records, ErrorClassifier recoverable vs fatal, DQMetrics null_rate / duplicate_rate, DQResult passed / error_rate, DQReport layer / table_name / results.</w:t>
       </w:r>
     </w:p>
     <w:bookmarkEnd w:id="115"/>
@@ -4497,7 +4497,7 @@
         <w:pStyle w:val="FirstParagraph"/>
       </w:pPr>
       <w:r>
-        <w:t xml:space="preserve">Диаграмма «Composite Pipeline Configuration &amp; FSM» из architecture-набора детализирует конкретный архитектурный компонент или подсистему BioETL. Она представлена в формате блок-схема потоков (flowchart) и служит ориентиром на уровне детализации «System / Component». На схеме отражено примерно 13 узлов и 13 связей, поэтому её удобно использовать для проверки влияния изменений, согласования интерфейсов и подготовки рефакторинга. Ключевые блоки/подграфы: Composite Configuration, State Machine. Показательные узлы для быстрого чтения: CompositeConfig name / seed / deps / enrichers / merge, SeedConfig, DependencyConfig, EnricherConfig, MergeConfig, Config Details: seed → deps → enrichers → merge.</w:t>
+        <w:t xml:space="preserve">Диаграмма «Composite Pipeline Configuration &amp; FSM» из architecture-набора детализирует конкретный архитектурный компонент или подсистему BioETL. Она представлена в формате блок-схема потоков (flowchart) и служит ориентиром на уровне детализации «System / Component». В комментариях исходника зафиксирован фокус диаграммы: Config hierarchy (CompositeConfig → sub-configs) and execution state machine.. На схеме отражено примерно 13 узлов и 13 связей, поэтому её удобно использовать для проверки влияния изменений, согласования интерфейсов и подготовки рефакторинга. Ключевые блоки/подграфы: Composite Configuration, State Machine. Показательные узлы для быстрого чтения: CompositeConfig name / seed / deps / enrichers / merge, SeedConfig, DependencyConfig, EnricherConfig, MergeConfig, Config Details: seed → deps → enrichers → merge.</w:t>
       </w:r>
     </w:p>
     <w:bookmarkEnd w:id="127"/>
@@ -4679,7 +4679,7 @@
         <w:pStyle w:val="FirstParagraph"/>
       </w:pPr>
       <w:r>
-        <w:t xml:space="preserve">Диаграмма «Composite Pipeline Execution» из architecture-набора детализирует конкретный архитектурный компонент или подсистему BioETL. Она представлена в формате блок-схема потоков (flowchart) и служит ориентиром на уровне детализации «System / Component». На схеме отражено примерно 20 узлов и 20 связей, поэтому её удобно использовать для проверки влияния изменений, согласования интерфейсов и подготовки рефакторинга. Ключевые блоки/подграфы: CompositePipelineRunner, Preflight, Execution Components, Dependencies (Sequential), Enrichers (Parallel Fan-Out), Merge Phase. Показательные узлы для быстрого чтения: CompositePipelineRunner orchestrates full execution, PreflightValidator, Seed Pipeline, DependencyCoordinator, Dependency 1, EnrichmentCoordinator.</w:t>
+        <w:t xml:space="preserve">Диаграмма «Composite Pipeline Execution» из architecture-набора детализирует конкретный архитектурный компонент или подсистему BioETL. Она представлена в формате блок-схема потоков (flowchart) и служит ориентиром на уровне детализации «System / Component». В комментариях исходника зафиксирован фокус диаграммы: Runner orchestration: seed → deps → enrichers (parallel) → merge, with checkpointing and cross-validation.. На схеме отражено примерно 20 узлов и 20 связей, поэтому её удобно использовать для проверки влияния изменений, согласования интерфейсов и подготовки рефакторинга. Ключевые блоки/подграфы: CompositePipelineRunner, Preflight, Execution Components, Dependencies (Sequential), Enrichers (Parallel Fan-Out), Merge Phase. Показательные узлы для быстрого чтения: CompositePipelineRunner orchestrates full execution, PreflightValidator, Seed Pipeline, DependencyCoordinator, Dependency 1, EnrichmentCoordinator.</w:t>
       </w:r>
     </w:p>
     <w:bookmarkEnd w:id="133"/>
@@ -4861,7 +4861,7 @@
         <w:pStyle w:val="FirstParagraph"/>
       </w:pPr>
       <w:r>
-        <w:t xml:space="preserve">Диаграмма «Observability Stack» из architecture-набора детализирует конкретный архитектурный компонент или подсистему BioETL. Она представлена в формате блок-схема потоков (flowchart) и служит ориентиром на уровне детализации «System / Component». На схеме отражено примерно 24 узлов и 14 связей, поэтому её удобно использовать для проверки влияния изменений, согласования интерфейсов и подготовки рефакторинга. Ключевые блоки/подграфы: Domain Ports, Application Observability, Infrastructure: Logging, Infrastructure: Metrics, Infrastructure: Tracing, Infrastructure: Anomaly Detection. Показательные узлы для быстрого чтения: LoggerPort (Protocol) bind + info/warn/error/debug/exception, MetricsPort (Protocol) observe_histogram + increment_counter set_gauge + close, TracingPort (Protocol) get_tracer + close, DQMonitorPort (Protocol) add_metric + check_quality update_baseline, PipelineObserver logger + metrics + tracing hooks, BatchMetricsRecorder track size/processed/error/quarantine. Примечание: Decomposed into 09a-observability-app, 09b-observability-infra.</w:t>
+        <w:t xml:space="preserve">Диаграмма «Observability Stack» из architecture-набора детализирует конкретный архитектурный компонент или подсистему BioETL. Она представлена в формате блок-схема потоков (flowchart) и служит ориентиром на уровне детализации «System / Component». В комментариях исходника зафиксирован фокус диаграммы: Logging, Metrics, Tracing architecture.. На схеме отражено примерно 24 узлов и 14 связей, поэтому её удобно использовать для проверки влияния изменений, согласования интерфейсов и подготовки рефакторинга. Ключевые блоки/подграфы: Domain Ports, Application Observability, Infrastructure: Logging, Infrastructure: Metrics, Infrastructure: Tracing, Infrastructure: Anomaly Detection. Показательные узлы для быстрого чтения: LoggerPort (Protocol) bind + info/warn/error/debug/exception, MetricsPort (Protocol) observe_histogram + increment_counter set_gauge + close, TracingPort (Protocol) get_tracer + close, DQMonitorPort (Protocol) add_metric + check_quality update_baseline, PipelineObserver logger + metrics + tracing hooks, BatchMetricsRecorder track size/processed/error/quarantine. Примечание: Decomposed into 09a-observability-app, 09b-observability-infra.</w:t>
       </w:r>
     </w:p>
     <w:bookmarkEnd w:id="139"/>
@@ -5043,7 +5043,7 @@
         <w:pStyle w:val="FirstParagraph"/>
       </w:pPr>
       <w:r>
-        <w:t xml:space="preserve">Диаграмма «Observability: Application Layer» из architecture-набора детализирует конкретный архитектурный компонент или подсистему BioETL. Она представлена в формате блок-схема потоков (flowchart) и служит ориентиром на уровне детализации «System / Component». На схеме отражено примерно 8 узлов и 4 связей, поэтому её удобно использовать для проверки влияния изменений, согласования интерфейсов и подготовки рефакторинга. Ключевые блоки/подграфы: Domain Ports, Application Observability, Adapter-Level Metrics. Показательные узлы для быстрого чтения: LoggerPort (Protocol), MetricsPort (Protocol), TracingPort (Protocol), DQMonitorPort (Protocol), PipelineObserver, BatchMetricsRecorder.</w:t>
+        <w:t xml:space="preserve">Диаграмма «Observability: Application Layer» из architecture-набора детализирует конкретный архитектурный компонент или подсистему BioETL. Она представлена в формате блок-схема потоков (flowchart) и служит ориентиром на уровне детализации «System / Component». В комментариях исходника зафиксирован фокус диаграммы: Application-level observability: ports, pipeline observer, batch metrics, adapter metrics.. На схеме отражено примерно 8 узлов и 4 связей, поэтому её удобно использовать для проверки влияния изменений, согласования интерфейсов и подготовки рефакторинга. Ключевые блоки/подграфы: Domain Ports, Application Observability, Adapter-Level Metrics. Показательные узлы для быстрого чтения: LoggerPort (Protocol), MetricsPort (Protocol), TracingPort (Protocol), DQMonitorPort (Protocol), PipelineObserver, BatchMetricsRecorder.</w:t>
       </w:r>
     </w:p>
     <w:bookmarkEnd w:id="145"/>
@@ -5225,7 +5225,7 @@
         <w:pStyle w:val="FirstParagraph"/>
       </w:pPr>
       <w:r>
-        <w:t xml:space="preserve">Диаграмма «Observability: Infrastructure Layer» из architecture-набора детализирует конкретный архитектурный компонент или подсистему BioETL. Она представлена в формате блок-схема потоков (flowchart) и служит ориентиром на уровне детализации «System / Component». На схеме отражено примерно 13 узлов и 7 связей, поэтому её удобно использовать для проверки влияния изменений, согласования интерфейсов и подготовки рефакторинга. Ключевые блоки/подграфы: Infrastructure: Logging, Infrastructure: Metrics, Infrastructure: Tracing, Infrastructure: Anomaly Detection, External Systems. Показательные узлы для быстрого чтения: UnifiedLogger (impl LoggerPort), MetricsCollector (impl MetricsPort), PrometheusMetrics (impl MetricsPort), MetricsServerAdapter, NoOpMetrics, OpenTelemetryTracer (impl TracingPort).</w:t>
+        <w:t xml:space="preserve">Диаграмма «Observability: Infrastructure Layer» из architecture-набора детализирует конкретный архитектурный компонент или подсистему BioETL. Она представлена в формате блок-схема потоков (flowchart) и служит ориентиром на уровне детализации «System / Component». В комментариях исходника зафиксирован фокус диаграммы: Infrastructure implementations: logging, metrics, tracing, anomaly detection, external systems.. На схеме отражено примерно 13 узлов и 7 связей, поэтому её удобно использовать для проверки влияния изменений, согласования интерфейсов и подготовки рефакторинга. Ключевые блоки/подграфы: Infrastructure: Logging, Infrastructure: Metrics, Infrastructure: Tracing, Infrastructure: Anomaly Detection, External Systems. Показательные узлы для быстрого чтения: UnifiedLogger (impl LoggerPort), MetricsCollector (impl MetricsPort), PrometheusMetrics (impl MetricsPort), MetricsServerAdapter, NoOpMetrics, OpenTelemetryTracer (impl TracingPort).</w:t>
       </w:r>
     </w:p>
     <w:bookmarkEnd w:id="151"/>
@@ -5407,7 +5407,7 @@
         <w:pStyle w:val="FirstParagraph"/>
       </w:pPr>
       <w:r>
-        <w:t xml:space="preserve">Диаграмма «Resilience Patterns» из architecture-набора детализирует конкретный архитектурный компонент или подсистему BioETL. Она представлена в формате блок-схема потоков (flowchart) и служит ориентиром на уровне детализации «System / Component». На схеме отражено примерно 15 узлов и 13 связей, поэтому её удобно использовать для проверки влияния изменений, согласования интерфейсов и подготовки рефакторинга. Ключевые блоки/подграфы: Domain Ports, Circuit Breaker Pattern, State Machine, Rate Limiter (Token Bucket), Provider Rate Limits, Retry Logic. Показательные узлы для быстрого чтения: CircuitBreakerPort (Protocol) ——– + get_state() + call(fn), RateLimiterPort (Protocol) ——– + acquire(tokens) + try_acquire(), HealthCheckPort (Protocol) ——– + check_health(), CircuitBreaker ——– provider failure_threshold recovery_timeout, CLOSED (normal operation), OPEN (fail fast).</w:t>
+        <w:t xml:space="preserve">Диаграмма «Resilience Patterns» из architecture-набора детализирует конкретный архитектурный компонент или подсистему BioETL. Она представлена в формате блок-схема потоков (flowchart) и служит ориентиром на уровне детализации «System / Component». В комментариях исходника зафиксирован фокус диаграммы: Circuit Breaker, Rate Limiter, Retry, Health Check patterns.. На схеме отражено примерно 15 узлов и 13 связей, поэтому её удобно использовать для проверки влияния изменений, согласования интерфейсов и подготовки рефакторинга. Ключевые блоки/подграфы: Domain Ports, Circuit Breaker Pattern, State Machine, Rate Limiter (Token Bucket), Provider Rate Limits, Retry Logic. Показательные узлы для быстрого чтения: CircuitBreakerPort (Protocol) ——– + get_state() + call(fn), RateLimiterPort (Protocol) ——– + acquire(tokens) + try_acquire(), HealthCheckPort (Protocol) ——– + check_health(), CircuitBreaker ——– provider failure_threshold recovery_timeout, CLOSED (normal operation), OPEN (fail fast).</w:t>
       </w:r>
     </w:p>
     <w:bookmarkEnd w:id="157"/>
@@ -5527,7 +5527,7 @@
       <w:r>
         <w:drawing>
           <wp:inline>
-            <wp:extent cx="5334000" cy="2368773"/>
+            <wp:extent cx="5334000" cy="2169468"/>
             <wp:effectExtent b="0" l="0" r="0" t="0"/>
             <wp:docPr descr="11-configuration-system" title="" id="161" name="Picture"/>
             <a:graphic>
@@ -5548,7 +5548,7 @@
                   <pic:spPr bwMode="auto">
                     <a:xfrm>
                       <a:off x="0" y="0"/>
-                      <a:ext cx="5334000" cy="2368773"/>
+                      <a:ext cx="5334000" cy="2169468"/>
                     </a:xfrm>
                     <a:prstGeom prst="rect">
                       <a:avLst/>
@@ -5589,37 +5589,27 @@
         <w:pStyle w:val="FirstParagraph"/>
       </w:pPr>
       <w:r>
-        <w:t xml:space="preserve">Диаграмма «Configuration System» из architecture-набора детализирует конкретный архитектурный компонент или подсистему BioETL. Она представлена в формате блок-схема потоков (flowchart) и служит ориентиром на уровне детализации «System / Component». В комментариях исходника зафиксирован фокус диаграммы: how YAML configs are loaded, validated, and used across the system.. На схеме отражено примерно 29 узлов и 20 связей, поэтому её удобно использовать для проверки влияния изменений, согласования интерфейсов и подготовки рефакторинга. Ключевые блоки/подграфы: YAML Config Files, Infrastructure Config Loaders, Infrastructure Schemas (Pydantic), Domain Configuration, Composite Domain Config, Application Config. Показательные узлы для быстрого чтения: configs/entities/</w:t>
+        <w:t xml:space="preserve">Диаграмма «Configuration System» из architecture-набора детализирует конкретный архитектурный компонент или подсистему BioETL. Она представлена в формате блок-схема потоков (flowchart) и служит ориентиром на уровне детализации «System / Component». В комментариях исходника зафиксирован фокус диаграммы: how YAML configs are loaded, validated, and used across the system.. На схеме отражено примерно 27 узлов и 25 связей, поэтому её удобно использовать для проверки влияния изменений, согласования интерфейсов и подготовки рефакторинга. Ключевые блоки/подграфы: YAML Config Files, Infrastructure Config Loaders, Infrastructure Schemas (Pydantic), Domain Configuration, Composite Domain Config, Application Config. Показательные узлы для быстрого чтения: configs/base/</w:t>
       </w:r>
       <w:r>
         <w:rPr>
           <w:i/>
           <w:iCs/>
         </w:rPr>
-        <w:t xml:space="preserve">/</w:t>
-      </w:r>
-      <w:r>
-        <w:t xml:space="preserve">.yaml pipeline configs, configs/quality/</w:t>
+        <w:t xml:space="preserve">.yaml pipeline and quality defaults, configs/providers/</w:t>
+      </w:r>
+      <w:r>
+        <w:t xml:space="preserve">.yaml source plus provider defaults, configs/entities/</w:t>
       </w:r>
       <w:r>
         <w:rPr>
           <w:i/>
           <w:iCs/>
         </w:rPr>
-        <w:t xml:space="preserve">.yaml DQ rules, configs/filters/</w:t>
-      </w:r>
-      <w:r>
-        <w:t xml:space="preserve">.yaml filter configs, configs/composites/</w:t>
-      </w:r>
-      <w:r>
-        <w:rPr>
-          <w:i/>
-          <w:iCs/>
-        </w:rPr>
-        <w:t xml:space="preserve">.yaml composite configs, configs/field_groups/</w:t>
-      </w:r>
-      <w:r>
-        <w:t xml:space="preserve">.yaml field groups, PipelineConfigLoader load(path) -&gt; PipelineConfig. Примечание: Decomposed into 11a-config-loading, 11b-config-domain.</w:t>
+        <w:t xml:space="preserve">/</w:t>
+      </w:r>
+      <w:r>
+        <w:t xml:space="preserve">.yaml unified entity configs, configs/composites/*.yaml composite configs, PipelineConfigLoader load(path) -&gt; PipelineConfig, DQConfigLoader load(path) -&gt; DQConfig. Примечание: Decomposed into 11a-config-loading, 11b-config-domain.</w:t>
       </w:r>
     </w:p>
     <w:bookmarkEnd w:id="163"/>
@@ -5713,7 +5703,7 @@
         <w:rPr>
           <w:rStyle w:val="VerbatimChar"/>
         </w:rPr>
-        <w:t xml:space="preserve">29</w:t>
+        <w:t xml:space="preserve">27</w:t>
       </w:r>
     </w:p>
     <w:p>
@@ -5739,7 +5729,7 @@
       <w:r>
         <w:drawing>
           <wp:inline>
-            <wp:extent cx="5334000" cy="2254536"/>
+            <wp:extent cx="5334000" cy="1809399"/>
             <wp:effectExtent b="0" l="0" r="0" t="0"/>
             <wp:docPr descr="11a-config-loading" title="" id="167" name="Picture"/>
             <a:graphic>
@@ -5760,7 +5750,7 @@
                   <pic:spPr bwMode="auto">
                     <a:xfrm>
                       <a:off x="0" y="0"/>
-                      <a:ext cx="5334000" cy="2254536"/>
+                      <a:ext cx="5334000" cy="1809399"/>
                     </a:xfrm>
                     <a:prstGeom prst="rect">
                       <a:avLst/>
@@ -5801,37 +5791,27 @@
         <w:pStyle w:val="FirstParagraph"/>
       </w:pPr>
       <w:r>
-        <w:t xml:space="preserve">Диаграмма «Configuration: Loading Pipeline» из architecture-набора детализирует конкретный архитектурный компонент или подсистему BioETL. Она представлена в формате блок-схема потоков (flowchart) и служит ориентиром на уровне детализации «System / Component». На схеме отражено примерно 13 узлов и 11 связей, поэтому её удобно использовать для проверки влияния изменений, согласования интерфейсов и подготовки рефакторинга. Ключевые блоки/подграфы: YAML Config Files, Infrastructure Config Loaders, Infrastructure Schemas (Pydantic). Показательные узлы для быстрого чтения: configs/entities/</w:t>
+        <w:t xml:space="preserve">Диаграмма «Configuration: Loading Pipeline» из architecture-набора детализирует конкретный архитектурный компонент или подсистему BioETL. Она представлена в формате блок-схема потоков (flowchart) и служит ориентиром на уровне детализации «System / Component». В комментариях исходника зафиксирован фокус диаграммы: YAML files, config loaders, and infrastructure schemas (Pydantic validation).. На схеме отражено примерно 11 узлов и 16 связей, поэтому её удобно использовать для проверки влияния изменений, согласования интерфейсов и подготовки рефакторинга. Ключевые блоки/подграфы: YAML Config Files, Infrastructure Config Loaders, Infrastructure Schemas (Pydantic). Показательные узлы для быстрого чтения: configs/base/</w:t>
       </w:r>
       <w:r>
         <w:rPr>
           <w:i/>
           <w:iCs/>
         </w:rPr>
-        <w:t xml:space="preserve">/</w:t>
-      </w:r>
-      <w:r>
-        <w:t xml:space="preserve">.yaml, configs/quality/</w:t>
+        <w:t xml:space="preserve">.yaml, configs/providers/</w:t>
+      </w:r>
+      <w:r>
+        <w:t xml:space="preserve">.yaml, configs/entities/</w:t>
       </w:r>
       <w:r>
         <w:rPr>
           <w:i/>
           <w:iCs/>
         </w:rPr>
-        <w:t xml:space="preserve">.yaml, configs/filters/</w:t>
-      </w:r>
-      <w:r>
-        <w:t xml:space="preserve">.yaml, configs/composites/</w:t>
-      </w:r>
-      <w:r>
-        <w:rPr>
-          <w:i/>
-          <w:iCs/>
-        </w:rPr>
-        <w:t xml:space="preserve">.yaml, configs/field_groups/</w:t>
-      </w:r>
-      <w:r>
-        <w:t xml:space="preserve">.yaml, BaseConfigLoader.</w:t>
+        <w:t xml:space="preserve">/</w:t>
+      </w:r>
+      <w:r>
+        <w:t xml:space="preserve">.yaml, configs/composites/*.yaml, BaseConfigLoader, PipelineConfigLoader.</w:t>
       </w:r>
     </w:p>
     <w:bookmarkEnd w:id="169"/>
@@ -5925,7 +5905,7 @@
         <w:rPr>
           <w:rStyle w:val="VerbatimChar"/>
         </w:rPr>
-        <w:t xml:space="preserve">13</w:t>
+        <w:t xml:space="preserve">11</w:t>
       </w:r>
     </w:p>
     <w:p>
@@ -6013,7 +5993,7 @@
         <w:pStyle w:val="FirstParagraph"/>
       </w:pPr>
       <w:r>
-        <w:t xml:space="preserve">Диаграмма «Configuration: Domain &amp; Application Config» из architecture-набора детализирует конкретный архитектурный компонент или подсистему BioETL. Она представлена в формате блок-схема потоков (flowchart) и служит ориентиром на уровне детализации «System / Component». На схеме отражено примерно 16 узлов и 6 связей, поэтому её удобно использовать для проверки влияния изменений, согласования интерфейсов и подготовки рефакторинга. Ключевые блоки/подграфы: Infrastructure Schemas, Domain Configuration, Composite Domain Config, Application Config, Infrastructure Settings. Показательные узлы для быстрого чтения: ApiConfig, SourceConfig, CircuitBreakerConfig, PipelineContractPolicy, PipelineConfig, TableConfig.</w:t>
+        <w:t xml:space="preserve">Диаграмма «Configuration: Domain &amp; Application Config» из architecture-набора детализирует конкретный архитектурный компонент или подсистему BioETL. Она представлена в формате блок-схема потоков (flowchart) и служит ориентиром на уровне детализации «System / Component». В комментариях исходника зафиксирован фокус диаграммы: Domain config objects, composite config, application config, and infrastructure settings.. На схеме отражено примерно 16 узлов и 6 связей, поэтому её удобно использовать для проверки влияния изменений, согласования интерфейсов и подготовки рефакторинга. Ключевые блоки/подграфы: Infrastructure Schemas, Domain Configuration, Composite Domain Config, Application Config, Infrastructure Settings. Показательные узлы для быстрого чтения: ApiConfig, SourceConfig, CircuitBreakerConfig, PipelineContractPolicy, PipelineConfig, TableConfig.</w:t>
       </w:r>
     </w:p>
     <w:bookmarkEnd w:id="175"/>
@@ -6133,7 +6113,7 @@
       <w:r>
         <w:drawing>
           <wp:inline>
-            <wp:extent cx="5334000" cy="4125745"/>
+            <wp:extent cx="5334000" cy="5877786"/>
             <wp:effectExtent b="0" l="0" r="0" t="0"/>
             <wp:docPr descr="12-bootstrap-di-container" title="" id="179" name="Picture"/>
             <a:graphic>
@@ -6154,7 +6134,7 @@
                   <pic:spPr bwMode="auto">
                     <a:xfrm>
                       <a:off x="0" y="0"/>
-                      <a:ext cx="5334000" cy="4125745"/>
+                      <a:ext cx="5334000" cy="5877786"/>
                     </a:xfrm>
                     <a:prstGeom prst="rect">
                       <a:avLst/>
@@ -6195,7 +6175,7 @@
         <w:pStyle w:val="FirstParagraph"/>
       </w:pPr>
       <w:r>
-        <w:t xml:space="preserve">Диаграмма «Bootstrap / DI Container (Composition Root)» из architecture-набора детализирует конкретный архитектурный компонент или подсистему BioETL. Она представлена в формате блок-схема потоков (flowchart) и служит ориентиром на уровне детализации «System / Component». В комментариях исходника зафиксирован фокус диаграммы: how dependencies are assembled and wired together.. На схеме отражено примерно 29 узлов и 38 связей, поэтому её удобно использовать для проверки влияния изменений, согласования интерфейсов и подготовки рефакторинга. Ключевые блоки/подграфы: Entry Points, composition layer, Bootstrap Assembly, Factories, Provider Registry, Runtime Builders. Показательные узлы для быстрого чтения: CLI Commands (Click), HTTP Interface, RuntimeAssembly central DI wiring point creates infra + app components, RunnerBootstrap ━━━━━━━━━━━━━━━━━ + assemble_runner(), StorageBootstrap ━━━━━━━━━━━━━━━━━ + assemble_storage(), HealthBootstrap ━━━━━━━━━━━━━━━━━ + assemble_health(). Примечание: Decomposed into 12a, 12b sub-diagrams.</w:t>
+        <w:t xml:space="preserve">Диаграмма «Bootstrap / DI Container (Composition Root)» из architecture-набора детализирует конкретный архитектурный компонент или подсистему BioETL. Она представлена в формате блок-схема потоков (flowchart) и служит ориентиром на уровне детализации «System / Component». В комментариях исходника зафиксирован фокус диаграммы: the current narrow public APIs plus retained broad seam used to assemble runtime and admin services.. На схеме отражено примерно 20 узлов и 31 связей, поэтому её удобно использовать для проверки влияния изменений, согласования интерфейсов и подготовки рефакторинга. Ключевые блоки/подграфы: Public composition seams, Internal composition modules, Registries + factories, Runtime bootstrap, CLI/bootstrap services, Created collaborators. Показательные узлы для быстрого чтения: Entry callers CLI + tests/scripts + future API, composition.execution_api preferred execution seam, composition.services_api preferred services seam, composition.resources_api preferred resource seam, composition.entrypoints retained broad facade, composition.bootstrap runtime / cli / assembly. Примечание: Decomposed into 12a, 12b sub-diagrams.</w:t>
       </w:r>
     </w:p>
     <w:bookmarkEnd w:id="181"/>
@@ -6268,7 +6248,7 @@
         <w:rPr>
           <w:rStyle w:val="VerbatimChar"/>
         </w:rPr>
-        <w:t xml:space="preserve">2026-02-24</w:t>
+        <w:t xml:space="preserve">2026-03-19</w:t>
       </w:r>
     </w:p>
     <w:p>
@@ -6289,7 +6269,7 @@
         <w:rPr>
           <w:rStyle w:val="VerbatimChar"/>
         </w:rPr>
-        <w:t xml:space="preserve">29</w:t>
+        <w:t xml:space="preserve">20</w:t>
       </w:r>
     </w:p>
     <w:p>
@@ -6299,13 +6279,13 @@
     </w:p>
     <w:bookmarkEnd w:id="182"/>
     <w:bookmarkEnd w:id="183"/>
-    <w:bookmarkStart w:id="189" w:name="X7e4c7e8242a61a604566b90e48f21dfd78aa516"/>
+    <w:bookmarkStart w:id="189" w:name="X4e42804fcbdea14f0e51e0f6baae61c6de72e9c"/>
     <w:p>
       <w:pPr>
         <w:pStyle w:val="Heading2"/>
       </w:pPr>
       <w:r>
-        <w:t xml:space="preserve">12a-bootstrap-factories — Bootstrap: Factories and Registries</w:t>
+        <w:t xml:space="preserve">12a-bootstrap-factories — Bootstrap: Registries, Public APIs, and Factory Seams</w:t>
       </w:r>
     </w:p>
     <w:p>
@@ -6315,7 +6295,7 @@
       <w:r>
         <w:drawing>
           <wp:inline>
-            <wp:extent cx="5334000" cy="3331909"/>
+            <wp:extent cx="5334000" cy="2611348"/>
             <wp:effectExtent b="0" l="0" r="0" t="0"/>
             <wp:docPr descr="12a-bootstrap-factories" title="" id="185" name="Picture"/>
             <a:graphic>
@@ -6336,7 +6316,7 @@
                   <pic:spPr bwMode="auto">
                     <a:xfrm>
                       <a:off x="0" y="0"/>
-                      <a:ext cx="5334000" cy="3331909"/>
+                      <a:ext cx="5334000" cy="2611348"/>
                     </a:xfrm>
                     <a:prstGeom prst="rect">
                       <a:avLst/>
@@ -6377,7 +6357,7 @@
         <w:pStyle w:val="FirstParagraph"/>
       </w:pPr>
       <w:r>
-        <w:t xml:space="preserve">Диаграмма «Bootstrap: Factories and Registries» из architecture-набора детализирует конкретный архитектурный компонент или подсистему BioETL. Она представлена в формате блок-схема потоков (flowchart) и служит ориентиром на уровне детализации «System / Component». На схеме отражено примерно 10 узлов и 10 связей, поэтому её удобно использовать для проверки влияния изменений, согласования интерфейсов и подготовки рефакторинга. Ключевые блоки/подграфы: Interfaces Layer, Composition Layer. Показательные узлы для быстрого чтения: CLI Commands (Click), HTTP Interface, bootstrap_pipeline_runner, DataSourceRegistry, GenericPipelineFactory, RunnerFactory.</w:t>
+        <w:t xml:space="preserve">Диаграмма «Bootstrap: Registries, Public APIs, and Factory Seams» из architecture-набора детализирует конкретный архитектурный компонент или подсистему BioETL. Она представлена в формате блок-схема потоков (flowchart) и служит ориентиром на уровне детализации «System / Component». В комментариях исходника зафиксирован фокус диаграммы: Focuses on current public composition APIs, registries, provider wiring, and canonical factory seams.. На схеме отражено примерно 11 узлов и 12 связей, поэтому её удобно использовать для проверки влияния изменений, согласования интерфейсов и подготовки рефакторинга. Ключевые блоки/подграфы: Registries + factories. Показательные узлы для быстрого чтения: composition.execution_api, composition.services_api, composition.resources_api, composition.entrypoints retained broad seam, composition.bootstrap, ProviderRegistry.</w:t>
       </w:r>
     </w:p>
     <w:bookmarkEnd w:id="187"/>
@@ -6450,7 +6430,7 @@
         <w:rPr>
           <w:rStyle w:val="VerbatimChar"/>
         </w:rPr>
-        <w:t xml:space="preserve">2026-02-25</w:t>
+        <w:t xml:space="preserve">2026-03-19</w:t>
       </w:r>
     </w:p>
     <w:p>
@@ -6471,7 +6451,7 @@
         <w:rPr>
           <w:rStyle w:val="VerbatimChar"/>
         </w:rPr>
-        <w:t xml:space="preserve">10</w:t>
+        <w:t xml:space="preserve">11</w:t>
       </w:r>
     </w:p>
     <w:p>
@@ -6481,13 +6461,13 @@
     </w:p>
     <w:bookmarkEnd w:id="188"/>
     <w:bookmarkEnd w:id="189"/>
-    <w:bookmarkStart w:id="195" w:name="X3bfd228a342ebc42c6d847794b6af96adba84de"/>
+    <w:bookmarkStart w:id="195" w:name="X50ca97d6eb5afda6f57037a65c706057fd88597"/>
     <w:p>
       <w:pPr>
         <w:pStyle w:val="Heading2"/>
       </w:pPr>
       <w:r>
-        <w:t xml:space="preserve">12b-bootstrap-wiring — Bootstrap: Wiring Graph</w:t>
+        <w:t xml:space="preserve">12b-bootstrap-wiring — Bootstrap: Runtime and Admin Wiring</w:t>
       </w:r>
     </w:p>
     <w:p>
@@ -6497,7 +6477,7 @@
       <w:r>
         <w:drawing>
           <wp:inline>
-            <wp:extent cx="5334000" cy="1776751"/>
+            <wp:extent cx="5334000" cy="4223051"/>
             <wp:effectExtent b="0" l="0" r="0" t="0"/>
             <wp:docPr descr="12b-bootstrap-wiring" title="" id="191" name="Picture"/>
             <a:graphic>
@@ -6518,7 +6498,7 @@
                   <pic:spPr bwMode="auto">
                     <a:xfrm>
                       <a:off x="0" y="0"/>
-                      <a:ext cx="5334000" cy="1776751"/>
+                      <a:ext cx="5334000" cy="4223051"/>
                     </a:xfrm>
                     <a:prstGeom prst="rect">
                       <a:avLst/>
@@ -6559,7 +6539,7 @@
         <w:pStyle w:val="FirstParagraph"/>
       </w:pPr>
       <w:r>
-        <w:t xml:space="preserve">Диаграмма «Bootstrap: Wiring Graph» из architecture-набора детализирует конкретный архитектурный компонент или подсистему BioETL. Она представлена в формате блок-схема потоков (flowchart) и служит ориентиром на уровне детализации «System / Component». На схеме отражено примерно 15 узлов и 22 связей, поэтому её удобно использовать для проверки влияния изменений, согласования интерфейсов и подготовки рефакторинга. Ключевые блоки/подграфы: Composition Layer, Infrastructure Layer, Application Layer. Показательные узлы для быстрого чтения: bootstrap_pipeline_runner, RunnerBootstrap, StorageBootstrap, CheckpointBootstrap, LockBootstrap, Provider Adapter (DataSourcePort).</w:t>
+        <w:t xml:space="preserve">Диаграмма «Bootstrap: Runtime and Admin Wiring» из architecture-набора детализирует конкретный архитектурный компонент или подсистему BioETL. Она представлена в формате блок-схема потоков (flowchart) и служит ориентиром на уровне детализации «System / Component». В комментариях исходника зафиксирован фокус диаграммы: Covers how narrow public composition APIs and the retained broad seam expose runtime/admin assembly outputs.. На схеме отражено примерно 19 узлов и 24 связей, поэтому её удобно использовать для проверки влияния изменений, согласования интерфейсов и подготовки рефакторинга. Ключевые блоки/подграфы: Public composition APIs, Composition bootstrap, Infrastructure collaborators, Created services. Показательные узлы для быстрого чтения: execution_api, services_api, resources_api, entrypoints retained broad seam, bootstrap.runtime, bootstrap.cli.</w:t>
       </w:r>
     </w:p>
     <w:bookmarkEnd w:id="193"/>
@@ -6632,7 +6612,7 @@
         <w:rPr>
           <w:rStyle w:val="VerbatimChar"/>
         </w:rPr>
-        <w:t xml:space="preserve">2026-02-25</w:t>
+        <w:t xml:space="preserve">2026-03-19</w:t>
       </w:r>
     </w:p>
     <w:p>
@@ -6653,7 +6633,7 @@
         <w:rPr>
           <w:rStyle w:val="VerbatimChar"/>
         </w:rPr>
-        <w:t xml:space="preserve">15</w:t>
+        <w:t xml:space="preserve">19</w:t>
       </w:r>
     </w:p>
     <w:p>
@@ -6741,7 +6721,7 @@
         <w:pStyle w:val="FirstParagraph"/>
       </w:pPr>
       <w:r>
-        <w:t xml:space="preserve">Диаграмма «Port/Protocol Contracts (Full Map)» из architecture-набора детализирует конкретный архитектурный компонент или подсистему BioETL. Она представлена в формате блок-схема потоков (flowchart) и служит ориентиром на уровне детализации «System / Component». На схеме отражено примерно 68 узлов, поэтому её удобно использовать для проверки влияния изменений, согласования интерфейсов и подготовки рефакторинга. Ключевые блоки/подграфы: Domain Ports (Protocols), Infrastructure Implementations, Application Implementations. Показательные узлы для быстрого чтения: DataSourcePort, FilterableDataSourcePort, StoragePort, LockPort, CheckpointPort, QuarantinePort. Примечание: Decomposed into 13a, 13b, 13c, 13d sub-diagrams.</w:t>
+        <w:t xml:space="preserve">Диаграмма «Port/Protocol Contracts (Full Map)» из architecture-набора детализирует конкретный архитектурный компонент или подсистему BioETL. Она представлена в формате блок-схема потоков (flowchart) и служит ориентиром на уровне детализации «System / Component». В комментариях исходника зафиксирован фокус диаграммы: All domain Ports and their infrastructure implementations.. На схеме отражено примерно 68 узлов, поэтому её удобно использовать для проверки влияния изменений, согласования интерфейсов и подготовки рефакторинга. Ключевые блоки/подграфы: Domain Ports (Protocols), Infrastructure Implementations, Application Implementations. Показательные узлы для быстрого чтения: DataSourcePort, FilterableDataSourcePort, StoragePort, LockPort, CheckpointPort, QuarantinePort. Примечание: Decomposed into 13a, 13b, 13c, 13d sub-diagrams.</w:t>
       </w:r>
     </w:p>
     <w:bookmarkEnd w:id="199"/>
@@ -6923,7 +6903,7 @@
         <w:pStyle w:val="FirstParagraph"/>
       </w:pPr>
       <w:r>
-        <w:t xml:space="preserve">Диаграмма «DataSource and Storage Ports» из architecture-набора детализирует конкретный архитектурный компонент или подсистему BioETL. Она представлена в формате блок-схема потоков (flowchart) и служит ориентиром на уровне детализации «System / Component». На схеме отражено примерно 20 узлов, поэтому её удобно использовать для проверки влияния изменений, согласования интерфейсов и подготовки рефакторинга. Ключевые блоки/подграфы: Domain Ports, Implementations. Показательные узлы для быстрого чтения: fa:fa-plug DataSourcePort, fa:fa-filter FilterableDataSourcePort, fa:fa-database StoragePort, fa:fa-book-open DeltaReaderPort, fa:fa-file-import InputFilterPort, ChemblAdapter.</w:t>
+        <w:t xml:space="preserve">Диаграмма «DataSource and Storage Ports» из architecture-набора детализирует конкретный архитектурный компонент или подсистему BioETL. Она представлена в формате блок-схема потоков (flowchart) и служит ориентиром на уровне детализации «System / Component». В комментариях исходника зафиксирован фокус диаграммы: All data acquisition and storage ports.. На схеме отражено примерно 20 узлов, поэтому её удобно использовать для проверки влияния изменений, согласования интерфейсов и подготовки рефакторинга. Ключевые блоки/подграфы: Domain Ports, Implementations. Показательные узлы для быстрого чтения: fa:fa-plug DataSourcePort, fa:fa-filter FilterableDataSourcePort, fa:fa-database StoragePort, fa:fa-book-open DeltaReaderPort, fa:fa-file-import InputFilterPort, ChemblAdapter.</w:t>
       </w:r>
     </w:p>
     <w:bookmarkEnd w:id="205"/>
@@ -7105,7 +7085,7 @@
         <w:pStyle w:val="FirstParagraph"/>
       </w:pPr>
       <w:r>
-        <w:t xml:space="preserve">Диаграмма «Port Contracts: Data Sources» из architecture-набора детализирует конкретный архитектурный компонент или подсистему BioETL. Она представлена в формате блок-схема потоков (flowchart) и служит ориентиром на уровне детализации «System / Component». На схеме отражено примерно 9 узлов, поэтому её удобно использовать для проверки влияния изменений, согласования интерфейсов и подготовки рефакторинга. Ключевые блоки/подграфы: Domain Layer, Infrastructure Layer. Показательные узлы для быстрого чтения: DataSourcePort, FilterableDataSourcePort, ChemblAdapter.</w:t>
+        <w:t xml:space="preserve">Диаграмма «Port Contracts: Data Sources» из architecture-набора детализирует конкретный архитектурный компонент или подсистему BioETL. Она представлена в формате блок-схема потоков (flowchart) и служит ориентиром на уровне детализации «System / Component». В комментариях исходника зафиксирован фокус диаграммы: Covers DataSourcePort and FilterableDataSourcePort implementations per provider.. На схеме отражено примерно 9 узлов, поэтому её удобно использовать для проверки влияния изменений, согласования интерфейсов и подготовки рефакторинга. Ключевые блоки/подграфы: Domain Layer, Infrastructure Layer. Показательные узлы для быстрого чтения: DataSourcePort, FilterableDataSourcePort, ChemblAdapter.</w:t>
       </w:r>
     </w:p>
     <w:bookmarkEnd w:id="211"/>
@@ -7287,7 +7267,7 @@
         <w:pStyle w:val="FirstParagraph"/>
       </w:pPr>
       <w:r>
-        <w:t xml:space="preserve">Диаграмма «Operational and Observability Ports» из architecture-набора детализирует конкретный архитектурный компонент или подсистему BioETL. Она представлена в формате блок-схема потоков (flowchart) и служит ориентиром на уровне детализации «System / Component». На схеме отражено примерно 25 узлов, поэтому её удобно использовать для проверки влияния изменений, согласования интерфейсов и подготовки рефакторинга. Ключевые блоки/подграфы: Domain Ports, Implementations. Показательные узлы для быстрого чтения: fa:fa-lock LockPort, fa:fa-flag CheckpointPort, fa:fa-list LoggerPort, fa:fa-chart-line MetricsPort, fa:fa-wave-square TracingPort, fa:fa-bolt CircuitBreakerPort. Примечание: Decomposed into 13e-operational-ports-domain, 13f-operational-ports-infra.</w:t>
+        <w:t xml:space="preserve">Диаграмма «Operational and Observability Ports» из architecture-набора детализирует конкретный архитектурный компонент или подсистему BioETL. Она представлена в формате блок-схема потоков (flowchart) и служит ориентиром на уровне детализации «System / Component». В комментариях исходника зафиксирован фокус диаграммы: Monitoring, logging, and operational control ports.. На схеме отражено примерно 25 узлов, поэтому её удобно использовать для проверки влияния изменений, согласования интерфейсов и подготовки рефакторинга. Ключевые блоки/подграфы: Domain Ports, Implementations. Показательные узлы для быстрого чтения: fa:fa-lock LockPort, fa:fa-flag CheckpointPort, fa:fa-list LoggerPort, fa:fa-chart-line MetricsPort, fa:fa-wave-square TracingPort, fa:fa-bolt CircuitBreakerPort. Примечание: Decomposed into 13e-operational-ports-domain, 13f-operational-ports-infra.</w:t>
       </w:r>
     </w:p>
     <w:bookmarkEnd w:id="217"/>
@@ -7407,7 +7387,7 @@
       <w:r>
         <w:drawing>
           <wp:inline>
-            <wp:extent cx="5334000" cy="6179080"/>
+            <wp:extent cx="5334000" cy="4928000"/>
             <wp:effectExtent b="0" l="0" r="0" t="0"/>
             <wp:docPr descr="13b-port-contracts-storage" title="" id="221" name="Picture"/>
             <a:graphic>
@@ -7428,7 +7408,7 @@
                   <pic:spPr bwMode="auto">
                     <a:xfrm>
                       <a:off x="0" y="0"/>
-                      <a:ext cx="5334000" cy="6179080"/>
+                      <a:ext cx="5334000" cy="4928000"/>
                     </a:xfrm>
                     <a:prstGeom prst="rect">
                       <a:avLst/>
@@ -7469,7 +7449,7 @@
         <w:pStyle w:val="FirstParagraph"/>
       </w:pPr>
       <w:r>
-        <w:t xml:space="preserve">Диаграмма «Port Contracts: Storage» из architecture-набора детализирует конкретный архитектурный компонент или подсистему BioETL. Она представлена в формате блок-схема потоков (flowchart) и служит ориентиром на уровне детализации «System / Component». На схеме отражено примерно 9 узлов, поэтому её удобно использовать для проверки влияния изменений, согласования интерфейсов и подготовки рефакторинга. Ключевые блоки/подграфы: Domain Layer, Infrastructure Layer. Показательные узлы для быстрого чтения: StoragePort, DeltaReaderPort, MetadataWriterPort, BronzeWriter, DeltaReader, MetadataWriter.</w:t>
+        <w:t xml:space="preserve">Диаграмма «Port Contracts: Storage» из architecture-набора детализирует конкретный архитектурный компонент или подсистему BioETL. Она представлена в формате блок-схема потоков (flowchart) и служит ориентиром на уровне детализации «System / Component». В комментариях исходника зафиксирован фокус диаграммы: Covers StoragePort, DeltaReaderPort, and layer-specific MetadataWriterPort implementations.. На схеме отражено примерно 9 узлов, поэтому её удобно использовать для проверки влияния изменений, согласования интерфейсов и подготовки рефакторинга. Ключевые блоки/подграфы: Domain Layer, Infrastructure Layer. Показательные узлы для быстрого чтения: StoragePort, DeltaReaderPort, MetadataWriterPort write_bronze / write_silver / write_gold, BronzeWriter, DeltaReader, MetadataWriter atomic metadata sidecars.</w:t>
       </w:r>
     </w:p>
     <w:bookmarkEnd w:id="223"/>
@@ -7542,7 +7522,7 @@
         <w:rPr>
           <w:rStyle w:val="VerbatimChar"/>
         </w:rPr>
-        <w:t xml:space="preserve">2026-02-25</w:t>
+        <w:t xml:space="preserve">2026-03-19</w:t>
       </w:r>
     </w:p>
     <w:p>
@@ -7651,7 +7631,7 @@
         <w:pStyle w:val="FirstParagraph"/>
       </w:pPr>
       <w:r>
-        <w:t xml:space="preserve">Диаграмма «Port Contracts: Observability and Resilience» из architecture-набора детализирует конкретный архитектурный компонент или подсистему BioETL. Она представлена в формате блок-схема потоков (flowchart) и служит ориентиром на уровне детализации «System / Component». На схеме отражено примерно 15 узлов, поэтому её удобно использовать для проверки влияния изменений, согласования интерфейсов и подготовки рефакторинга. Ключевые блоки/подграфы: Domain Layer, Infrastructure Layer. Показательные узлы для быстрого чтения: LoggerPort, MetricsPort, TracingPort, CircuitBreakerPort, RateLimiterPort, UnifiedLogger.</w:t>
+        <w:t xml:space="preserve">Диаграмма «Port Contracts: Observability and Resilience» из architecture-набора детализирует конкретный архитектурный компонент или подсистему BioETL. Она представлена в формате блок-схема потоков (flowchart) и служит ориентиром на уровне детализации «System / Component». В комментариях исходника зафиксирован фокус диаграммы: Covers Logger/Metrics/Tracing ports plus resilience control ports.. На схеме отражено примерно 15 узлов, поэтому её удобно использовать для проверки влияния изменений, согласования интерфейсов и подготовки рефакторинга. Ключевые блоки/подграфы: Domain Layer, Infrastructure Layer. Показательные узлы для быстрого чтения: LoggerPort, MetricsPort, TracingPort, CircuitBreakerPort, RateLimiterPort, UnifiedLogger.</w:t>
       </w:r>
     </w:p>
     <w:bookmarkEnd w:id="229"/>
@@ -7833,7 +7813,7 @@
         <w:pStyle w:val="FirstParagraph"/>
       </w:pPr>
       <w:r>
-        <w:t xml:space="preserve">Диаграмма «Validation and Data Quality Ports» из architecture-набора детализирует конкретный архитектурный компонент или подсистему BioETL. Она представлена в формате блок-схема потоков (flowchart) и служит ориентиром на уровне детализации «System / Component». На схеме отражено примерно 20 узлов, поэтому её удобно использовать для проверки влияния изменений, согласования интерфейсов и подготовки рефакторинга. Ключевые блоки/подграфы: Domain Ports, Infrastructure, Application. Показательные узлы для быстрого чтения: SilverValidatorPort, GoldValidatorPort, BronzeDQ AnalyzerPort, SilverDQ AnalyzerPort, GoldDQ AnalyzerPort, DQReportWriterPort.</w:t>
+        <w:t xml:space="preserve">Диаграмма «Validation and Data Quality Ports» из architecture-набора детализирует конкретный архитектурный компонент или подсистему BioETL. Она представлена в формате блок-схема потоков (flowchart) и служит ориентиром на уровне детализации «System / Component». В комментариях исходника зафиксирован фокус диаграммы: Ports for ensuring data correctness and quality reporting.. На схеме отражено примерно 20 узлов, поэтому её удобно использовать для проверки влияния изменений, согласования интерфейсов и подготовки рефакторинга. Ключевые блоки/подграфы: Domain Ports, Infrastructure, Application. Показательные узлы для быстрого чтения: SilverValidatorPort, GoldValidatorPort, BronzeDQ AnalyzerPort, SilverDQ AnalyzerPort, GoldDQ AnalyzerPort, DQReportWriterPort.</w:t>
       </w:r>
     </w:p>
     <w:bookmarkEnd w:id="235"/>
@@ -8015,7 +7995,7 @@
         <w:pStyle w:val="FirstParagraph"/>
       </w:pPr>
       <w:r>
-        <w:t xml:space="preserve">Диаграмма «Port Contracts: Services and Controls» из architecture-набора детализирует конкретный архитектурный компонент или подсистему BioETL. Она представлена в формате блок-схема потоков (flowchart) и служит ориентиром на уровне детализации «System / Component». На схеме отражено примерно 20 узлов и 2 связей, поэтому её удобно использовать для проверки влияния изменений, согласования интерфейсов и подготовки рефакторинга. Ключевые блоки/подграфы: Domain Layer, Infrastructure Layer, Application Layer, NoOp Implementations (fallback defaults). Показательные узлы для быстрого чтения: LockPort, CheckpointPort, QuarantinePort, AuditPort, PiiHasherPort, InputFilterPort.</w:t>
+        <w:t xml:space="preserve">Диаграмма «Port Contracts: Services and Controls» из architecture-набора детализирует конкретный архитектурный компонент или подсистему BioETL. Она представлена в формате блок-схема потоков (flowchart) и служит ориентиром на уровне детализации «System / Component». В комментариях исходника зафиксирован фокус диаграммы: Covers control ports, data quality service ports, and related implementations.. На схеме отражено примерно 20 узлов и 2 связей, поэтому её удобно использовать для проверки влияния изменений, согласования интерфейсов и подготовки рефакторинга. Ключевые блоки/подграфы: Domain Layer, Infrastructure Layer, Application Layer, NoOp Implementations (fallback defaults). Показательные узлы для быстрого чтения: LockPort, CheckpointPort, QuarantinePort, AuditPort, PiiHasherPort, InputFilterPort.</w:t>
       </w:r>
     </w:p>
     <w:bookmarkEnd w:id="241"/>
@@ -8197,7 +8177,7 @@
         <w:pStyle w:val="FirstParagraph"/>
       </w:pPr>
       <w:r>
-        <w:t xml:space="preserve">Диаграмма «Domain Operational Ports» из architecture-набора детализирует конкретный архитектурный компонент или подсистему BioETL. Она представлена в формате блок-схема потоков (flowchart) и служит ориентиром на уровне детализации «System / Component». На схеме отражено примерно 8 узлов, поэтому её удобно использовать для проверки влияния изменений, согласования интерфейсов и подготовки рефакторинга. Ключевые блоки/подграфы: Domain Operational Ports. Показательные узлы для быстрого чтения: fa:fa-lock LockPort, fa:fa-flag CheckpointPort, fa:fa-list LoggerPort, fa:fa-chart-line MetricsPort, fa:fa-wave-square TracingPort, fa:fa-bolt CircuitBreakerPort.</w:t>
+        <w:t xml:space="preserve">Диаграмма «Domain Operational Ports» из architecture-набора детализирует конкретный архитектурный компонент или подсистему BioETL. Она представлена в формате блок-схема потоков (flowchart) и служит ориентиром на уровне детализации «System / Component». В комментариях исходника зафиксирован фокус диаграммы: Independent protocol definitions for operational concerns (lock, checkpoint, observability, shutdown).. На схеме отражено примерно 8 узлов, поэтому её удобно использовать для проверки влияния изменений, согласования интерфейсов и подготовки рефакторинга. Ключевые блоки/подграфы: Domain Operational Ports. Показательные узлы для быстрого чтения: fa:fa-lock LockPort, fa:fa-flag CheckpointPort, fa:fa-list LoggerPort, fa:fa-chart-line MetricsPort, fa:fa-wave-square TracingPort, fa:fa-bolt CircuitBreakerPort.</w:t>
       </w:r>
     </w:p>
     <w:bookmarkEnd w:id="247"/>
@@ -8379,7 +8359,7 @@
         <w:pStyle w:val="FirstParagraph"/>
       </w:pPr>
       <w:r>
-        <w:t xml:space="preserve">Диаграмма «Infrastructure Operational Implementations» из architecture-набора детализирует конкретный архитектурный компонент или подсистему BioETL. Она представлена в формате блок-схема потоков (flowchart) и служит ориентиром на уровне детализации «System / Component». На схеме отражено примерно 7 узлов, поэтому её удобно использовать для проверки влияния изменений, согласования интерфейсов и подготовки рефакторинга. Ключевые блоки/подграфы: Infrastructure Implementations. Показательные узлы для быстрого чтения: MemoryLock, LocalCheckpoint, UnifiedLogger, MetricsCollector, OpenTelemetryTracer, CircuitBreaker.</w:t>
+        <w:t xml:space="preserve">Диаграмма «Infrastructure Operational Implementations» из architecture-набора детализирует конкретный архитектурный компонент или подсистему BioETL. Она представлена в формате блок-схема потоков (flowchart) и служит ориентиром на уровне детализации «System / Component». В комментариях исходника зафиксирован фокус диаграммы: Independent adapter implementations of operational ports.. На схеме отражено примерно 7 узлов, поэтому её удобно использовать для проверки влияния изменений, согласования интерфейсов и подготовки рефакторинга. Ключевые блоки/подграфы: Infrastructure Implementations. Показательные узлы для быстрого чтения: MemoryLock, LocalCheckpoint, UnifiedLogger, MetricsCollector, OpenTelemetryTracer, CircuitBreaker.</w:t>
       </w:r>
     </w:p>
     <w:bookmarkEnd w:id="253"/>
@@ -8499,7 +8479,7 @@
       <w:r>
         <w:drawing>
           <wp:inline>
-            <wp:extent cx="5334000" cy="5446390"/>
+            <wp:extent cx="5334000" cy="1805781"/>
             <wp:effectExtent b="0" l="0" r="0" t="0"/>
             <wp:docPr descr="14-cli-interface-layer" title="" id="257" name="Picture"/>
             <a:graphic>
@@ -8520,7 +8500,7 @@
                   <pic:spPr bwMode="auto">
                     <a:xfrm>
                       <a:off x="0" y="0"/>
-                      <a:ext cx="5334000" cy="5446390"/>
+                      <a:ext cx="5334000" cy="1805781"/>
                     </a:xfrm>
                     <a:prstGeom prst="rect">
                       <a:avLst/>
@@ -8561,7 +8541,7 @@
         <w:pStyle w:val="FirstParagraph"/>
       </w:pPr>
       <w:r>
-        <w:t xml:space="preserve">Диаграмма «CLI / Interface Layer» из architecture-набора детализирует конкретный архитектурный компонент или подсистему BioETL. Она представлена в формате блок-схема потоков (flowchart) и служит ориентиром на уровне детализации «System / Component». В комментариях исходника зафиксирован фокус диаграммы: CLI commands, their routing, and interaction with composition.. На схеме отражено примерно 24 узлов и 17 связей, поэтому её удобно использовать для проверки влияния изменений, согласования интерфейсов и подготовки рефакторинга. Ключевые блоки/подграфы: User, CLI Interface (Click), Run Commands, Health Commands, Data Commands, Maintenance Commands. Показательные узлы для быстрого чтения: Terminal, bioetl (main group), bioetl run –provider –entity –run-type –limit –resume –dry-run, bioetl run-composite ━━━━━━━━━━━━━━━━━ –config –run-type –resume, bioetl health ━━━━━━━━━━━━━━━━━ –provider Check API health, bioetl export ━━━━━━━━━━━━━━━━━ –table –format csv. Примечание: Decomposed into 14a-cli-commands, 14b-cli-routing.</w:t>
+        <w:t xml:space="preserve">Диаграмма «CLI / Interface Layer» из architecture-набора детализирует конкретный архитектурный компонент или подсистему BioETL. Она представлена в формате блок-схема потоков (flowchart) и служит ориентиром на уровне детализации «System / Component». В комментариях исходника зафиксирован фокус диаграммы: current CLI routing through registry helpers, narrow composition APIs, and runtime/bootstrap services.. На схеме отражено примерно 17 узлов и 20 связей, поэтому её удобно использовать для проверки влияния изменений, согласования интерфейсов и подготовки рефакторинга. Ключевые блоки/подграфы: interfaces/cli, composition boundary, Created runtime services. Показательные узлы для быстрого чтения: Terminal user, cli.main Click group, registry_helpers fresh explicit PipelineRegistry, run / run-all, run-composite, health / export / quarantine / checkpoint config / lock / maintenance. Примечание: Decomposed into 14a-cli-commands, 14b-cli-routing.</w:t>
       </w:r>
     </w:p>
     <w:bookmarkEnd w:id="259"/>
@@ -8634,7 +8614,7 @@
         <w:rPr>
           <w:rStyle w:val="VerbatimChar"/>
         </w:rPr>
-        <w:t xml:space="preserve">2026-02-24</w:t>
+        <w:t xml:space="preserve">2026-03-19</w:t>
       </w:r>
     </w:p>
     <w:p>
@@ -8655,7 +8635,7 @@
         <w:rPr>
           <w:rStyle w:val="VerbatimChar"/>
         </w:rPr>
-        <w:t xml:space="preserve">24</w:t>
+        <w:t xml:space="preserve">17</w:t>
       </w:r>
     </w:p>
     <w:p>
@@ -8681,7 +8661,7 @@
       <w:r>
         <w:drawing>
           <wp:inline>
-            <wp:extent cx="5334000" cy="5007511"/>
+            <wp:extent cx="5334000" cy="2841355"/>
             <wp:effectExtent b="0" l="0" r="0" t="0"/>
             <wp:docPr descr="14a-cli-commands" title="" id="263" name="Picture"/>
             <a:graphic>
@@ -8702,7 +8682,7 @@
                   <pic:spPr bwMode="auto">
                     <a:xfrm>
                       <a:off x="0" y="0"/>
-                      <a:ext cx="5334000" cy="5007511"/>
+                      <a:ext cx="5334000" cy="2841355"/>
                     </a:xfrm>
                     <a:prstGeom prst="rect">
                       <a:avLst/>
@@ -8743,7 +8723,7 @@
         <w:pStyle w:val="FirstParagraph"/>
       </w:pPr>
       <w:r>
-        <w:t xml:space="preserve">Диаграмма «CLI: Command Structure» из architecture-набора детализирует конкретный архитектурный компонент или подсистему BioETL. Она представлена в формате блок-схема потоков (flowchart) и служит ориентиром на уровне детализации «System / Component». На схеме отражено примерно 12 узлов и 3 связей, поэтому её удобно использовать для проверки влияния изменений, согласования интерфейсов и подготовки рефакторинга. Ключевые блоки/подграфы: User, CLI Interface (Click), Run Commands, Health Commands, Data Commands, Maintenance Commands. Показательные узлы для быстрого чтения: Terminal, bioetl group, bioetl run, bioetl run-composite, bioetl health, bioetl export.</w:t>
+        <w:t xml:space="preserve">Диаграмма «CLI: Command Structure» из architecture-набора детализирует конкретный архитектурный компонент или подсистему BioETL. Она представлена в формате блок-схема потоков (flowchart) и служит ориентиром на уровне детализации «System / Component». В комментариях исходника зафиксирован фокус диаграммы: Terminal entrypoint, main group, and the current command families registered in cli.main.. На схеме отражено примерно 12 узлов и 7 связей, поэтому её удобно использовать для проверки влияния изменений, согласования интерфейсов и подготовки рефакторинга. Ключевые блоки/подграфы: cli.main command groups. Показательные узлы для быстрого чтения: Terminal, bioetl group, run / run-all, run-composite, health / export / quarantine checkpoint / config / lock, maintenance vacuum / vacuum-all / archive bronze-cleanup / cleanup-preview.</w:t>
       </w:r>
     </w:p>
     <w:bookmarkEnd w:id="265"/>
@@ -8816,7 +8796,7 @@
         <w:rPr>
           <w:rStyle w:val="VerbatimChar"/>
         </w:rPr>
-        <w:t xml:space="preserve">2026-02-27</w:t>
+        <w:t xml:space="preserve">2026-03-16</w:t>
       </w:r>
     </w:p>
     <w:p>
@@ -8847,13 +8827,13 @@
     </w:p>
     <w:bookmarkEnd w:id="266"/>
     <w:bookmarkEnd w:id="267"/>
-    <w:bookmarkStart w:id="273" w:name="X9b297c8cc0edb0ec53d4e5fd93e9c20358b385c"/>
+    <w:bookmarkStart w:id="273" w:name="Xe9a822886457739354820df17f520d5f6238bbb"/>
     <w:p>
       <w:pPr>
         <w:pStyle w:val="Heading2"/>
       </w:pPr>
       <w:r>
-        <w:t xml:space="preserve">14b-cli-routing — CLI: Routing to Composition &amp; Application</w:t>
+        <w:t xml:space="preserve">14b-cli-routing — CLI: Routing to Composition Boundary</w:t>
       </w:r>
     </w:p>
     <w:p>
@@ -8863,7 +8843,7 @@
       <w:r>
         <w:drawing>
           <wp:inline>
-            <wp:extent cx="5334000" cy="910209"/>
+            <wp:extent cx="5334000" cy="2458958"/>
             <wp:effectExtent b="0" l="0" r="0" t="0"/>
             <wp:docPr descr="14b-cli-routing" title="" id="269" name="Picture"/>
             <a:graphic>
@@ -8884,7 +8864,7 @@
                   <pic:spPr bwMode="auto">
                     <a:xfrm>
                       <a:off x="0" y="0"/>
-                      <a:ext cx="5334000" cy="910209"/>
+                      <a:ext cx="5334000" cy="2458958"/>
                     </a:xfrm>
                     <a:prstGeom prst="rect">
                       <a:avLst/>
@@ -8925,7 +8905,7 @@
         <w:pStyle w:val="FirstParagraph"/>
       </w:pPr>
       <w:r>
-        <w:t xml:space="preserve">Диаграмма «CLI: Routing to Composition &amp; Application» из architecture-набора детализирует конкретный архитектурный компонент или подсистему BioETL. Она представлена в формате блок-схема потоков (flowchart) и служит ориентиром на уровне детализации «System / Component». На схеме отражено примерно 12 узлов и 11 связей, поэтому её удобно использовать для проверки влияния изменений, согласования интерфейсов и подготовки рефакторинга. Ключевые блоки/подграфы: Composition Layer, Application Layer. Показательные узлы для быстрого чтения: bioetl run, bioetl run-composite, bioetl health, bioetl export, bioetl quarantine, bioetl checkpoint.</w:t>
+        <w:t xml:space="preserve">Диаграмма «CLI: Routing to Composition Boundary» из architecture-набора детализирует конкретный архитектурный компонент или подсистему BioETL. Она представлена в формате блок-схема потоков (flowchart) и служит ориентиром на уровне детализации «System / Component». В комментариях исходника зафиксирован фокус диаграммы: how command families route through registry helpers and narrow composition APIs, while entrypoints remains a retained broad seam.. На схеме отражено примерно 14 узлов и 15 связей, поэтому её удобно использовать для проверки влияния изменений, согласования интерфейсов и подготовки рефакторинга. Ключевые блоки/подграфы: interfaces/cli helpers, composition boundary, Runtime services. Показательные узлы для быстрого чтения: run / run-all, run-composite, health / export / quarantine checkpoint / config / lock / maintenance, registry_helpers, execution_api, services_api.</w:t>
       </w:r>
     </w:p>
     <w:bookmarkEnd w:id="271"/>
@@ -8998,7 +8978,7 @@
         <w:rPr>
           <w:rStyle w:val="VerbatimChar"/>
         </w:rPr>
-        <w:t xml:space="preserve">2026-02-27</w:t>
+        <w:t xml:space="preserve">2026-03-19</w:t>
       </w:r>
     </w:p>
     <w:p>
@@ -9019,7 +8999,7 @@
         <w:rPr>
           <w:rStyle w:val="VerbatimChar"/>
         </w:rPr>
-        <w:t xml:space="preserve">12</w:t>
+        <w:t xml:space="preserve">14</w:t>
       </w:r>
     </w:p>
     <w:p>
@@ -9227,7 +9207,7 @@
       <w:r>
         <w:drawing>
           <wp:inline>
-            <wp:extent cx="5334000" cy="1678081"/>
+            <wp:extent cx="5334000" cy="1445768"/>
             <wp:effectExtent b="0" l="0" r="0" t="0"/>
             <wp:docPr descr="16-transformer-hierarchy" title="" id="281" name="Picture"/>
             <a:graphic>
@@ -9248,7 +9228,7 @@
                   <pic:spPr bwMode="auto">
                     <a:xfrm>
                       <a:off x="0" y="0"/>
-                      <a:ext cx="5334000" cy="1678081"/>
+                      <a:ext cx="5334000" cy="1445768"/>
                     </a:xfrm>
                     <a:prstGeom prst="rect">
                       <a:avLst/>
@@ -9289,7 +9269,7 @@
         <w:pStyle w:val="FirstParagraph"/>
       </w:pPr>
       <w:r>
-        <w:t xml:space="preserve">Диаграмма «Transformer Hierarchy» из architecture-набора детализирует конкретный архитектурный компонент или подсистему BioETL. Она представлена в формате блок-схема потоков (flowchart) и служит ориентиром на уровне детализации «System / Component». В комментариях исходника зафиксирован фокус диаграммы: the Template Method pattern and all provider-specific transformers.. На схеме отражено примерно 35 узлов и 10 связей, поэтому её удобно использовать для проверки влияния изменений, согласования интерфейсов и подготовки рефакторинга. Ключевые блоки/подграфы: Template Method Pattern, ChEMBL Transformers, Publication Transformers, UniProt Transformers, Other Transformers, Extractor Pattern. Показательные узлы для быстрого чтения: BaseChemblTransformer entity_class + primary_id_field _extract_business_data(), ActivityTransformer, PubMedPublicationTransformer XML parsing + extractor stack, UniProtProteinTransformer taxonomy/gene/feature extractors, IDMappingTransformer, PubChemCompoundTransformer. Примечание: Decomposed into 16a-transformer-base, 16b-transformer-pub-other.</w:t>
+        <w:t xml:space="preserve">Диаграмма «Transformer Hierarchy» из architecture-набора детализирует конкретный архитектурный компонент или подсистему BioETL. Она представлена в формате блок-схема потоков (flowchart) и служит ориентиром на уровне детализации «System / Component». В комментариях исходника зафиксирован фокус диаграммы: the Template Method pattern, declarative publication blocks, and provider-specific helper seams.. На схеме отражено примерно 27 узлов и 10 связей, поэтому её удобно использовать для проверки влияния изменений, согласования интерфейсов и подготовки рефакторинга. Ключевые блоки/подграфы: Template Method Pattern, ChEMBL Transformers, Publication Transformers, UniProt Transformers, Other Transformers, Block + Helper Strategy. Показательные узлы для быстрого чтения: BaseChemblTransformer entity_class + primary_id_field _extract_business_data(), ActivityTransformer, PubMedPublicationTransformer cached XML root + extraction_blocks, UniProtProteinTransformer taxonomy/gene/feature extractors, IDMappingTransformer, PubChemCompoundTransformer. Примечание: Decomposed into 16a-transformer-base, 16b-transformer-pub-other.</w:t>
       </w:r>
     </w:p>
     <w:bookmarkEnd w:id="283"/>
@@ -9362,7 +9342,7 @@
         <w:rPr>
           <w:rStyle w:val="VerbatimChar"/>
         </w:rPr>
-        <w:t xml:space="preserve">2026-02-24</w:t>
+        <w:t xml:space="preserve">2026-03-19</w:t>
       </w:r>
     </w:p>
     <w:p>
@@ -9383,7 +9363,7 @@
         <w:rPr>
           <w:rStyle w:val="VerbatimChar"/>
         </w:rPr>
-        <w:t xml:space="preserve">35</w:t>
+        <w:t xml:space="preserve">27</w:t>
       </w:r>
     </w:p>
     <w:p>
@@ -9471,7 +9451,7 @@
         <w:pStyle w:val="FirstParagraph"/>
       </w:pPr>
       <w:r>
-        <w:t xml:space="preserve">Диаграмма «Base Transformer and ChEMBL Transformers» из architecture-набора детализирует конкретный архитектурный компонент или подсистему BioETL. Она представлена в формате блок-схема потоков (flowchart) и служит ориентиром на уровне детализации «System / Component». На схеме отражено примерно 17 узлов и 2 связей, поэтому её удобно использовать для проверки влияния изменений, согласования интерфейсов и подготовки рефакторинга. Ключевые блоки/подграфы: Template Method Pattern, ChEMBL Transformers, Extractor Root. Показательные узлы для быстрого чтения: BaseTransformer ABC, BaseChemblTransformer, ActivityTransformer, AssayTransformer, ApprovedProductTransformer, MechanismTransformer.</w:t>
+        <w:t xml:space="preserve">Диаграмма «Base Transformer and ChEMBL Transformers» из architecture-набора детализирует конкретный архитектурный компонент или подсистему BioETL. Она представлена в формате блок-схема потоков (flowchart) и служит ориентиром на уровне детализации «System / Component». В комментариях исходника зафиксирован фокус диаграммы: Template Method base class, ChEMBL provider transformers, and extractor root.. На схеме отражено примерно 17 узлов и 2 связей, поэтому её удобно использовать для проверки влияния изменений, согласования интерфейсов и подготовки рефакторинга. Ключевые блоки/подграфы: Template Method Pattern, ChEMBL Transformers, Extractor Root. Показательные узлы для быстрого чтения: BaseTransformer ABC, BaseChemblTransformer, ActivityTransformer, AssayTransformer, ApprovedProductTransformer, MechanismTransformer.</w:t>
       </w:r>
     </w:p>
     <w:bookmarkEnd w:id="289"/>
@@ -9575,13 +9555,13 @@
     </w:p>
     <w:bookmarkEnd w:id="290"/>
     <w:bookmarkEnd w:id="291"/>
-    <w:bookmarkStart w:id="297" w:name="X2a28fd8cf9e0b31f9117c4280e0111692f3c09a"/>
+    <w:bookmarkStart w:id="297" w:name="Xa09305cff5535e5b7dc63cc9ec3c61fbaea00a4"/>
     <w:p>
       <w:pPr>
         <w:pStyle w:val="Heading2"/>
       </w:pPr>
       <w:r>
-        <w:t xml:space="preserve">16b-transformer-pub-other — Publication, UniProt, Other Transformers and Extractors</w:t>
+        <w:t xml:space="preserve">16b-transformer-pub-other — Publication, UniProt, Other Transformers and Blocks</w:t>
       </w:r>
     </w:p>
     <w:p>
@@ -9591,7 +9571,7 @@
       <w:r>
         <w:drawing>
           <wp:inline>
-            <wp:extent cx="5334000" cy="1264276"/>
+            <wp:extent cx="5334000" cy="1676160"/>
             <wp:effectExtent b="0" l="0" r="0" t="0"/>
             <wp:docPr descr="16b-transformer-pub-other" title="" id="293" name="Picture"/>
             <a:graphic>
@@ -9612,7 +9592,7 @@
                   <pic:spPr bwMode="auto">
                     <a:xfrm>
                       <a:off x="0" y="0"/>
-                      <a:ext cx="5334000" cy="1264276"/>
+                      <a:ext cx="5334000" cy="1676160"/>
                     </a:xfrm>
                     <a:prstGeom prst="rect">
                       <a:avLst/>
@@ -9653,7 +9633,7 @@
         <w:pStyle w:val="FirstParagraph"/>
       </w:pPr>
       <w:r>
-        <w:t xml:space="preserve">Диаграмма «Publication, UniProt, Other Transformers and Extractors» из architecture-набора детализирует конкретный архитектурный компонент или подсистему BioETL. Она представлена в формате блок-схема потоков (flowchart) и служит ориентиром на уровне детализации «System / Component». На схеме отражено примерно 18 узлов и 3 связей, поэтому её удобно использовать для проверки влияния изменений, согласования интерфейсов и подготовки рефакторинга. Ключевые блоки/подграфы: Publication Transformers, UniProt Transformers, Other Transformers, Field Extractors. Показательные узлы для быстрого чтения: BasePublicationTransformer, PubMedPublicationTransformer, CrossRefTransformer, OpenAlexTransformer, SemanticScholarTransformer, UniProtProteinTransformer.</w:t>
+        <w:t xml:space="preserve">Диаграмма «Publication, UniProt, Other Transformers and Blocks» из architecture-набора детализирует конкретный архитектурный компонент или подсистему BioETL. Она представлена в формате блок-схема потоков (flowchart) и служит ориентиром на уровне детализации «System / Component». В комментариях исходника зафиксирован фокус диаграммы: Provider-specific transformers, declarative PubMed blocks, and helper extractor seams.. На схеме отражено примерно 16 узлов и 5 связей, поэтому её удобно использовать для проверки влияния изменений, согласования интерфейсов и подготовки рефакторинга. Ключевые блоки/подграфы: Publication Transformers, UniProt Transformers, Other Transformers, Blocks + Helper Extractors. Показательные узлы для быстрого чтения: BasePublicationTransformer, PubMedPublicationTransformer, CrossRefPublicationTransformer, OpenAlexPublicationTransformer, SemanticScholarPublicationTransformer, UniProtProteinTransformer.</w:t>
       </w:r>
     </w:p>
     <w:bookmarkEnd w:id="295"/>
@@ -9726,7 +9706,7 @@
         <w:rPr>
           <w:rStyle w:val="VerbatimChar"/>
         </w:rPr>
-        <w:t xml:space="preserve">2026-02-27</w:t>
+        <w:t xml:space="preserve">2026-03-19</w:t>
       </w:r>
     </w:p>
     <w:p>
@@ -9747,7 +9727,7 @@
         <w:rPr>
           <w:rStyle w:val="VerbatimChar"/>
         </w:rPr>
-        <w:t xml:space="preserve">18</w:t>
+        <w:t xml:space="preserve">16</w:t>
       </w:r>
     </w:p>
     <w:p>
@@ -9955,7 +9935,7 @@
       <w:r>
         <w:drawing>
           <wp:inline>
-            <wp:extent cx="5334000" cy="2906768"/>
+            <wp:extent cx="5334000" cy="2862146"/>
             <wp:effectExtent b="0" l="0" r="0" t="0"/>
             <wp:docPr descr="18-lock-checkpoint-shutdown" title="" id="305" name="Picture"/>
             <a:graphic>
@@ -9976,7 +9956,7 @@
                   <pic:spPr bwMode="auto">
                     <a:xfrm>
                       <a:off x="0" y="0"/>
-                      <a:ext cx="5334000" cy="2906768"/>
+                      <a:ext cx="5334000" cy="2862146"/>
                     </a:xfrm>
                     <a:prstGeom prst="rect">
                       <a:avLst/>
@@ -10017,7 +9997,7 @@
         <w:pStyle w:val="FirstParagraph"/>
       </w:pPr>
       <w:r>
-        <w:t xml:space="preserve">Диаграмма «Locking, Checkpoint, and Graceful Shutdown» из architecture-набора детализирует конкретный архитектурный компонент или подсистему BioETL. Она представлена в формате блок-схема потоков (flowchart) и служит ориентиром на уровне детализации «System / Component». В комментариях исходника зафиксирован фокус диаграммы: distributed safety mechanisms.. На схеме отражено примерно 22 узлов и 15 связей, поэтому её удобно использовать для проверки влияния изменений, согласования интерфейсов и подготовки рефакторинга. Ключевые блоки/подграфы: Domain Ports, Domain Lock Types, Application: LockCoordinator, Application: CheckpointManager, Application: Shutdown, Infrastructure: MemoryLock. Показательные узлы для быстрого чтения: LockPort (Protocol) acquire/release/heartbeat validate_owner + validate_token, CheckpointPort (Protocol) save/load/list/delete, ShutdownPort (Protocol), FencingToken sequence + key + owner_id + issued_at, LockNotHeldError, LockCoordinator lock + run_id + shutdown_signal acquire/release/validate. Примечание: Decomposed into 18a-lock-system, 18b-checkpoint-shutdown.</w:t>
+        <w:t xml:space="preserve">Диаграмма «Locking, Checkpoint, and Graceful Shutdown» из architecture-набора детализирует конкретный архитектурный компонент или подсистему BioETL. Она представлена в формате блок-схема потоков (flowchart) и служит ориентиром на уровне детализации «System / Component». В комментариях исходника зафиксирован фокус диаграммы: Distinguishes general pipeline lifecycle from composite runtime specifics.. На схеме отражено примерно 20 узлов и 16 связей, поэтому её удобно использовать для проверки влияния изменений, согласования интерфейсов и подготовки рефакторинга. Ключевые блоки/подграфы: Domain Ports, Domain Lock Types, Application: LockCoordinator, Application: Checkpoint Services, Application: Shutdown, Infrastructure: MemoryLock. Показательные узлы для быстрого чтения: LockPort (Protocol) acquire/release/heartbeat validate_owner + validate_token, CheckpointPort (Protocol) save/load/list/delete, CompositeCheckpointPort (composite phase checkpoints), ShutdownPort (Protocol), FencingToken + LockNotHeldError, LockCoordinator lock + run_id + shutdown_signal acquire/release/validate. Примечание: Decomposed into 18a-lock-system, 18b-checkpoint-shutdown.</w:t>
       </w:r>
     </w:p>
     <w:bookmarkEnd w:id="307"/>
@@ -10090,7 +10070,7 @@
         <w:rPr>
           <w:rStyle w:val="VerbatimChar"/>
         </w:rPr>
-        <w:t xml:space="preserve">2026-02-24</w:t>
+        <w:t xml:space="preserve">2026-03-16</w:t>
       </w:r>
     </w:p>
     <w:p>
@@ -10111,7 +10091,7 @@
         <w:rPr>
           <w:rStyle w:val="VerbatimChar"/>
         </w:rPr>
-        <w:t xml:space="preserve">22</w:t>
+        <w:t xml:space="preserve">20</w:t>
       </w:r>
     </w:p>
     <w:p>
@@ -10137,7 +10117,7 @@
       <w:r>
         <w:drawing>
           <wp:inline>
-            <wp:extent cx="5334000" cy="5548504"/>
+            <wp:extent cx="5334000" cy="5469037"/>
             <wp:effectExtent b="0" l="0" r="0" t="0"/>
             <wp:docPr descr="18a-lock-system" title="" id="311" name="Picture"/>
             <a:graphic>
@@ -10158,7 +10138,7 @@
                   <pic:spPr bwMode="auto">
                     <a:xfrm>
                       <a:off x="0" y="0"/>
-                      <a:ext cx="5334000" cy="5548504"/>
+                      <a:ext cx="5334000" cy="5469037"/>
                     </a:xfrm>
                     <a:prstGeom prst="rect">
                       <a:avLst/>
@@ -10199,7 +10179,7 @@
         <w:pStyle w:val="FirstParagraph"/>
       </w:pPr>
       <w:r>
-        <w:t xml:space="preserve">Диаграмма «Lock System» из architecture-набора детализирует конкретный архитектурный компонент или подсистему BioETL. Она представлена в формате блок-схема потоков (flowchart) и служит ориентиром на уровне детализации «System / Component». На схеме отражено примерно 8 узлов и 5 связей, поэтому её удобно использовать для проверки влияния изменений, согласования интерфейсов и подготовки рефакторинга. Ключевые блоки/подграфы: Domain Port, Domain Lock Types, Application: LockCoordinator, Infrastructure: MemoryLock, Safety Guard. Показательные узлы для быстрого чтения: fa:fa-lock LockPort, FencingToken, LockNotHeldError, LockCoordinator, HeartbeatTask, MemoryLock.</w:t>
+        <w:t xml:space="preserve">Диаграмма «Lock System» из architecture-набора детализирует конкретный архитектурный компонент или подсистему BioETL. Она представлена в формате блок-схема потоков (flowchart) и служит ориентиром на уровне детализации «System / Component». В комментариях исходника зафиксирован фокус диаграммы: Distinguishes the general LockCoordinator path from the composite runner’s direct LockPort path.. На схеме отражено примерно 10 узлов и 7 связей, поэтому её удобно использовать для проверки влияния изменений, согласования интерфейсов и подготовки рефакторинга. Ключевые блоки/подграфы: Domain lock contracts, General pipeline lifecycle, Composite runtime path, Infrastructure. Показательные узлы для быстрого чтения: LockPort, FencingToken, LockNotHeldError, LockCoordinator, HeartbeatTask, CompositePipelineRunnerService.</w:t>
       </w:r>
     </w:p>
     <w:bookmarkEnd w:id="313"/>
@@ -10272,7 +10252,7 @@
         <w:rPr>
           <w:rStyle w:val="VerbatimChar"/>
         </w:rPr>
-        <w:t xml:space="preserve">2026-02-27</w:t>
+        <w:t xml:space="preserve">2026-03-16</w:t>
       </w:r>
     </w:p>
     <w:p>
@@ -10293,7 +10273,7 @@
         <w:rPr>
           <w:rStyle w:val="VerbatimChar"/>
         </w:rPr>
-        <w:t xml:space="preserve">8</w:t>
+        <w:t xml:space="preserve">10</w:t>
       </w:r>
     </w:p>
     <w:p>
@@ -10319,7 +10299,7 @@
       <w:r>
         <w:drawing>
           <wp:inline>
-            <wp:extent cx="5334000" cy="1537264"/>
+            <wp:extent cx="5334000" cy="4307840"/>
             <wp:effectExtent b="0" l="0" r="0" t="0"/>
             <wp:docPr descr="18b-checkpoint-shutdown" title="" id="317" name="Picture"/>
             <a:graphic>
@@ -10340,7 +10320,7 @@
                   <pic:spPr bwMode="auto">
                     <a:xfrm>
                       <a:off x="0" y="0"/>
-                      <a:ext cx="5334000" cy="1537264"/>
+                      <a:ext cx="5334000" cy="4307840"/>
                     </a:xfrm>
                     <a:prstGeom prst="rect">
                       <a:avLst/>
@@ -10381,7 +10361,7 @@
         <w:pStyle w:val="FirstParagraph"/>
       </w:pPr>
       <w:r>
-        <w:t xml:space="preserve">Диаграмма «Checkpoint and Shutdown System» из architecture-набора детализирует конкретный архитектурный компонент или подсистему BioETL. Она представлена в формате блок-схема потоков (flowchart) и служит ориентиром на уровне детализации «System / Component». На схеме отражено примерно 14 узлов и 10 связей, поэтому её удобно использовать для проверки влияния изменений, согласования интерфейсов и подготовки рефакторинга. Ключевые блоки/подграфы: Domain Ports, Application: CheckpointManager, Application: Shutdown, Infrastructure: LocalCheckpoint, Pipeline Lifecycle. Показательные узлы для быстрого чтения: fa:fa-flag CheckpointPort, fa:fa-power-off ShutdownPort, CheckpointManager, ShutdownSignal, ShutdownReason, LocalCheckpoint.</w:t>
+        <w:t xml:space="preserve">Диаграмма «Checkpoint and Shutdown System» из architecture-набора детализирует конкретный архитектурный компонент или подсистему BioETL. Она представлена в формате блок-схема потоков (flowchart) и служит ориентиром на уровне детализации «System / Component». В комментариях исходника зафиксирован фокус диаграммы: Separates general checkpoint/shutdown services from the composite checkpoint path.. На схеме отражено примерно 12 узлов и 9 связей, поэтому её удобно использовать для проверки влияния изменений, согласования интерфейсов и подготовки рефакторинга. Ключевые блоки/подграфы: Domain ports, Application services, Infrastructure, Lifecycle integration. Показательные узлы для быстрого чтения: CheckpointPort, CompositeCheckpointPort, ShutdownPort, CheckpointManagerService, CompositeCheckpointService, ShutdownSignal / ShutdownReason.</w:t>
       </w:r>
     </w:p>
     <w:bookmarkEnd w:id="319"/>
@@ -10454,7 +10434,7 @@
         <w:rPr>
           <w:rStyle w:val="VerbatimChar"/>
         </w:rPr>
-        <w:t xml:space="preserve">2026-02-27</w:t>
+        <w:t xml:space="preserve">2026-03-16</w:t>
       </w:r>
     </w:p>
     <w:p>
@@ -10475,7 +10455,7 @@
         <w:rPr>
           <w:rStyle w:val="VerbatimChar"/>
         </w:rPr>
-        <w:t xml:space="preserve">14</w:t>
+        <w:t xml:space="preserve">12</w:t>
       </w:r>
     </w:p>
     <w:bookmarkEnd w:id="320"/>

</xml_diff>